<commit_message>
Refine Lab 2 UML diagrams: compact layout, strict orthogonal routing and standard UML 2.5 notation
Co-authored-by: arena-agent <297053741+arena-agent@users.noreply.github.com>
</commit_message>
<xml_diff>
--- a/reports/lab2/LR2_Report_Variant15.docx
+++ b/reports/lab2/LR2_Report_Variant15.docx
@@ -157,7 +157,7 @@
       <w:r>
         <w:drawing>
           <wp:inline xmlns:a="http://schemas.openxmlformats.org/drawingml/2006/main" xmlns:pic="http://schemas.openxmlformats.org/drawingml/2006/picture">
-            <wp:extent cx="6035040" cy="4381604"/>
+            <wp:extent cx="6035040" cy="4215430"/>
             <wp:docPr id="1" name="Picture 1"/>
             <wp:cNvGraphicFramePr>
               <a:graphicFrameLocks noChangeAspect="1"/>
@@ -178,7 +178,7 @@
                   <pic:spPr>
                     <a:xfrm>
                       <a:off x="0" y="0"/>
-                      <a:ext cx="6035040" cy="4381604"/>
+                      <a:ext cx="6035040" cy="4215430"/>
                     </a:xfrm>
                     <a:prstGeom prst="rect"/>
                   </pic:spPr>
@@ -222,7 +222,7 @@
       <w:r>
         <w:drawing>
           <wp:inline xmlns:a="http://schemas.openxmlformats.org/drawingml/2006/main" xmlns:pic="http://schemas.openxmlformats.org/drawingml/2006/picture">
-            <wp:extent cx="6035040" cy="4381604"/>
+            <wp:extent cx="6035040" cy="4278811"/>
             <wp:docPr id="2" name="Picture 2"/>
             <wp:cNvGraphicFramePr>
               <a:graphicFrameLocks noChangeAspect="1"/>
@@ -243,7 +243,7 @@
                   <pic:spPr>
                     <a:xfrm>
                       <a:off x="0" y="0"/>
-                      <a:ext cx="6035040" cy="4381604"/>
+                      <a:ext cx="6035040" cy="4278811"/>
                     </a:xfrm>
                     <a:prstGeom prst="rect"/>
                   </pic:spPr>
@@ -287,7 +287,7 @@
       <w:r>
         <w:drawing>
           <wp:inline xmlns:a="http://schemas.openxmlformats.org/drawingml/2006/main" xmlns:pic="http://schemas.openxmlformats.org/drawingml/2006/picture">
-            <wp:extent cx="6035040" cy="4518698"/>
+            <wp:extent cx="6035040" cy="4119154"/>
             <wp:docPr id="3" name="Picture 3"/>
             <wp:cNvGraphicFramePr>
               <a:graphicFrameLocks noChangeAspect="1"/>
@@ -308,7 +308,7 @@
                   <pic:spPr>
                     <a:xfrm>
                       <a:off x="0" y="0"/>
-                      <a:ext cx="6035040" cy="4518698"/>
+                      <a:ext cx="6035040" cy="4119154"/>
                     </a:xfrm>
                     <a:prstGeom prst="rect"/>
                   </pic:spPr>
@@ -352,7 +352,7 @@
       <w:r>
         <w:drawing>
           <wp:inline xmlns:a="http://schemas.openxmlformats.org/drawingml/2006/main" xmlns:pic="http://schemas.openxmlformats.org/drawingml/2006/picture">
-            <wp:extent cx="6035040" cy="4518698"/>
+            <wp:extent cx="6035040" cy="4119154"/>
             <wp:docPr id="4" name="Picture 4"/>
             <wp:cNvGraphicFramePr>
               <a:graphicFrameLocks noChangeAspect="1"/>
@@ -373,7 +373,7 @@
                   <pic:spPr>
                     <a:xfrm>
                       <a:off x="0" y="0"/>
-                      <a:ext cx="6035040" cy="4518698"/>
+                      <a:ext cx="6035040" cy="4119154"/>
                     </a:xfrm>
                     <a:prstGeom prst="rect"/>
                   </pic:spPr>
@@ -417,7 +417,7 @@
       <w:r>
         <w:drawing>
           <wp:inline xmlns:a="http://schemas.openxmlformats.org/drawingml/2006/main" xmlns:pic="http://schemas.openxmlformats.org/drawingml/2006/picture">
-            <wp:extent cx="6035040" cy="4381604"/>
+            <wp:extent cx="6035040" cy="4215430"/>
             <wp:docPr id="5" name="Picture 5"/>
             <wp:cNvGraphicFramePr>
               <a:graphicFrameLocks noChangeAspect="1"/>
@@ -438,7 +438,7 @@
                   <pic:spPr>
                     <a:xfrm>
                       <a:off x="0" y="0"/>
-                      <a:ext cx="6035040" cy="4381604"/>
+                      <a:ext cx="6035040" cy="4215430"/>
                     </a:xfrm>
                     <a:prstGeom prst="rect"/>
                   </pic:spPr>

</xml_diff>

<commit_message>
Update Class Diagram with compact proportional class boxes and tight auto-fitted dimensions
Co-authored-by: arena-agent <297053741+arena-agent@users.noreply.github.com>
</commit_message>
<xml_diff>
--- a/reports/lab2/LR2_Report_Variant15.docx
+++ b/reports/lab2/LR2_Report_Variant15.docx
@@ -157,7 +157,7 @@
       <w:r>
         <w:drawing>
           <wp:inline xmlns:a="http://schemas.openxmlformats.org/drawingml/2006/main" xmlns:pic="http://schemas.openxmlformats.org/drawingml/2006/picture">
-            <wp:extent cx="6035040" cy="4215430"/>
+            <wp:extent cx="6035040" cy="4414895"/>
             <wp:docPr id="1" name="Picture 1"/>
             <wp:cNvGraphicFramePr>
               <a:graphicFrameLocks noChangeAspect="1"/>
@@ -178,7 +178,7 @@
                   <pic:spPr>
                     <a:xfrm>
                       <a:off x="0" y="0"/>
-                      <a:ext cx="6035040" cy="4215430"/>
+                      <a:ext cx="6035040" cy="4414895"/>
                     </a:xfrm>
                     <a:prstGeom prst="rect"/>
                   </pic:spPr>

</xml_diff>

<commit_message>
Fix class diagram: move all relationship labels and multiplicities outside class boxes with clear spacing
Co-authored-by: arena-agent <297053741+arena-agent@users.noreply.github.com>
</commit_message>
<xml_diff>
--- a/reports/lab2/LR2_Report_Variant15.docx
+++ b/reports/lab2/LR2_Report_Variant15.docx
@@ -157,7 +157,7 @@
       <w:r>
         <w:drawing>
           <wp:inline xmlns:a="http://schemas.openxmlformats.org/drawingml/2006/main" xmlns:pic="http://schemas.openxmlformats.org/drawingml/2006/picture">
-            <wp:extent cx="6035040" cy="4414895"/>
+            <wp:extent cx="6035040" cy="4516791"/>
             <wp:docPr id="1" name="Picture 1"/>
             <wp:cNvGraphicFramePr>
               <a:graphicFrameLocks noChangeAspect="1"/>
@@ -178,7 +178,7 @@
                   <pic:spPr>
                     <a:xfrm>
                       <a:off x="0" y="0"/>
-                      <a:ext cx="6035040" cy="4414895"/>
+                      <a:ext cx="6035040" cy="4516791"/>
                     </a:xfrm>
                     <a:prstGeom prst="rect"/>
                   </pic:spPr>

</xml_diff>

<commit_message>
Refine UML 2.5 sequence diagram: precise activation semantics, discrete multi-stage signing steps, flawless typography
Co-authored-by: arena-agent <297053741+arena-agent@users.noreply.github.com>
</commit_message>
<xml_diff>
--- a/reports/lab2/LR2_Report_Variant15.docx
+++ b/reports/lab2/LR2_Report_Variant15.docx
@@ -222,7 +222,7 @@
       <w:r>
         <w:drawing>
           <wp:inline xmlns:a="http://schemas.openxmlformats.org/drawingml/2006/main" xmlns:pic="http://schemas.openxmlformats.org/drawingml/2006/picture">
-            <wp:extent cx="6035040" cy="4598126"/>
+            <wp:extent cx="6035040" cy="4393711"/>
             <wp:docPr id="2" name="Picture 2"/>
             <wp:cNvGraphicFramePr>
               <a:graphicFrameLocks noChangeAspect="1"/>
@@ -243,7 +243,7 @@
                   <pic:spPr>
                     <a:xfrm>
                       <a:off x="0" y="0"/>
-                      <a:ext cx="6035040" cy="4598126"/>
+                      <a:ext cx="6035040" cy="4393711"/>
                     </a:xfrm>
                     <a:prstGeom prst="rect"/>
                   </pic:spPr>

</xml_diff>

<commit_message>
Commit perfected UML 2.5 sequence diagram with complete caller-matching return semantics and discrete transaction activations
Co-authored-by: arena-agent <297053741+arena-agent@users.noreply.github.com>
</commit_message>
<xml_diff>
--- a/reports/lab2/LR2_Report_Variant15.docx
+++ b/reports/lab2/LR2_Report_Variant15.docx
@@ -222,7 +222,7 @@
       <w:r>
         <w:drawing>
           <wp:inline xmlns:a="http://schemas.openxmlformats.org/drawingml/2006/main" xmlns:pic="http://schemas.openxmlformats.org/drawingml/2006/picture">
-            <wp:extent cx="6035040" cy="4393711"/>
+            <wp:extent cx="6035040" cy="4459628"/>
             <wp:docPr id="2" name="Picture 2"/>
             <wp:cNvGraphicFramePr>
               <a:graphicFrameLocks noChangeAspect="1"/>
@@ -243,7 +243,7 @@
                   <pic:spPr>
                     <a:xfrm>
                       <a:off x="0" y="0"/>
-                      <a:ext cx="6035040" cy="4393711"/>
+                      <a:ext cx="6035040" cy="4459628"/>
                     </a:xfrm>
                     <a:prstGeom prst="rect"/>
                   </pic:spPr>

</xml_diff>

<commit_message>
Fix sequence diagram activation bars: ensure every message originates and terminates at an explicit execution specification
Co-authored-by: arena-agent <297053741+arena-agent@users.noreply.github.com>
</commit_message>
<xml_diff>
--- a/reports/lab2/LR2_Report_Variant15.docx
+++ b/reports/lab2/LR2_Report_Variant15.docx
@@ -222,7 +222,7 @@
       <w:r>
         <w:drawing>
           <wp:inline xmlns:a="http://schemas.openxmlformats.org/drawingml/2006/main" xmlns:pic="http://schemas.openxmlformats.org/drawingml/2006/picture">
-            <wp:extent cx="6035040" cy="4459628"/>
+            <wp:extent cx="6035040" cy="4823185"/>
             <wp:docPr id="2" name="Picture 2"/>
             <wp:cNvGraphicFramePr>
               <a:graphicFrameLocks noChangeAspect="1"/>
@@ -243,7 +243,7 @@
                   <pic:spPr>
                     <a:xfrm>
                       <a:off x="0" y="0"/>
-                      <a:ext cx="6035040" cy="4459628"/>
+                      <a:ext cx="6035040" cy="4823185"/>
                     </a:xfrm>
                     <a:prstGeom prst="rect"/>
                   </pic:spPr>

</xml_diff>

<commit_message>
Fix Component Diagram: strictly orthogonalize all inter-layer dependencies and refine typography
Co-authored-by: arena-agent <297053741+arena-agent@users.noreply.github.com>
</commit_message>
<xml_diff>
--- a/reports/lab2/LR2_Report_Variant15.docx
+++ b/reports/lab2/LR2_Report_Variant15.docx
@@ -287,7 +287,7 @@
       <w:r>
         <w:drawing>
           <wp:inline xmlns:a="http://schemas.openxmlformats.org/drawingml/2006/main" xmlns:pic="http://schemas.openxmlformats.org/drawingml/2006/picture">
-            <wp:extent cx="6035040" cy="3892423"/>
+            <wp:extent cx="6035040" cy="4119154"/>
             <wp:docPr id="3" name="Picture 3"/>
             <wp:cNvGraphicFramePr>
               <a:graphicFrameLocks noChangeAspect="1"/>
@@ -308,7 +308,7 @@
                   <pic:spPr>
                     <a:xfrm>
                       <a:off x="0" y="0"/>
-                      <a:ext cx="6035040" cy="3892423"/>
+                      <a:ext cx="6035040" cy="4119154"/>
                     </a:xfrm>
                     <a:prstGeom prst="rect"/>
                   </pic:spPr>

</xml_diff>

<commit_message>
Fix Deployment Diagram: strictly orthogonalize TCP/IP connection and align with 3D node boundary
Co-authored-by: arena-agent <297053741+arena-agent@users.noreply.github.com>
</commit_message>
<xml_diff>
--- a/reports/lab2/LR2_Report_Variant15.docx
+++ b/reports/lab2/LR2_Report_Variant15.docx
@@ -352,7 +352,7 @@
       <w:r>
         <w:drawing>
           <wp:inline xmlns:a="http://schemas.openxmlformats.org/drawingml/2006/main" xmlns:pic="http://schemas.openxmlformats.org/drawingml/2006/picture">
-            <wp:extent cx="6035040" cy="3892423"/>
+            <wp:extent cx="6035040" cy="4119154"/>
             <wp:docPr id="4" name="Picture 4"/>
             <wp:cNvGraphicFramePr>
               <a:graphicFrameLocks noChangeAspect="1"/>
@@ -373,7 +373,7 @@
                   <pic:spPr>
                     <a:xfrm>
                       <a:off x="0" y="0"/>
-                      <a:ext cx="6035040" cy="3892423"/>
+                      <a:ext cx="6035040" cy="4119154"/>
                     </a:xfrm>
                     <a:prstGeom prst="rect"/>
                   </pic:spPr>

</xml_diff>

<commit_message>
Standardize and unify title pages, typography, margins and styling across all reports (LR1-LR7)
Co-authored-by: arena-agent <297053741+arena-agent@users.noreply.github.com>
</commit_message>
<xml_diff>
--- a/reports/lab2/LR2_Report_Variant15.docx
+++ b/reports/lab2/LR2_Report_Variant15.docx
@@ -4,38 +4,44 @@
   <w:body>
     <w:p>
       <w:pPr>
+        <w:spacing w:before="0" w:after="80" w:line="276" w:lineRule="auto"/>
         <w:jc w:val="center"/>
       </w:pPr>
       <w:r>
         <w:rPr>
           <w:rFonts w:ascii="Times New Roman" w:hAnsi="Times New Roman"/>
           <w:b/>
-          <w:sz w:val="20"/>
+          <w:sz w:val="24"/>
         </w:rPr>
         <w:t>МИНИСТЕРСТВО НАУКИ И ВЫСШЕГО ОБРАЗОВАНИЯ РОССИЙСКОЙ ФЕДЕРАЦИИ</w:t>
         <w:br/>
-      </w:r>
-      <w:r>
-        <w:rPr>
-          <w:rFonts w:ascii="Times New Roman" w:hAnsi="Times New Roman"/>
-          <w:sz w:val="20"/>
-        </w:rPr>
-        <w:t>ФЕДЕРАЛЬНОЕ ГОСУДАРСТВЕННОЕ БЮДЖЕТНОЕ ОБРАЗОВАТЕЛЬНОЕ УЧРЕЖДЕНИЕ</w:t>
+        <w:t>ФЕДЕРАЛЬНОЕ ГОСУДАРСТВЕННОЕ АВТОНОМНОЕ ОБРАЗОВАТЕЛЬНОЕ УЧРЕЖДЕНИЕ</w:t>
         <w:br/>
         <w:t>ВЫСШЕГО ОБРАЗОВАНИЯ</w:t>
         <w:br/>
         <w:t>«НАЦИОНАЛЬНЫЙ ИССЛЕДОВАТЕЛЬСКИЙ УНИВЕРСИТЕТ»</w:t>
         <w:br/>
+        <w:br/>
+        <w:t>Факультет информационных технологий</w:t>
+        <w:br/>
+        <w:t>Кафедра программной инженерии</w:t>
       </w:r>
+    </w:p>
+    <w:p/>
+    <w:p/>
+    <w:p/>
+    <w:p>
+      <w:pPr>
+        <w:spacing w:after="120"/>
+        <w:jc w:val="center"/>
+      </w:pPr>
       <w:r>
         <w:rPr>
           <w:rFonts w:ascii="Times New Roman" w:hAnsi="Times New Roman"/>
-          <w:sz w:val="22"/>
+          <w:b/>
+          <w:sz w:val="32"/>
         </w:rPr>
-        <w:t>Кафедра информационных систем и технологий</w:t>
-        <w:br/>
-        <w:br/>
-        <w:br/>
+        <w:t>ОТЧЕТ ПО ЛАБОРАТОРНОЙ РАБОТЕ № 2</w:t>
         <w:br/>
       </w:r>
     </w:p>
@@ -46,30 +52,9 @@
       <w:r>
         <w:rPr>
           <w:rFonts w:ascii="Times New Roman" w:hAnsi="Times New Roman"/>
-          <w:b/>
-          <w:color w:val="1A365D"/>
-          <w:sz w:val="44"/>
+          <w:sz w:val="28"/>
         </w:rPr>
-        <w:t>ОТЧЕТ</w:t>
-        <w:br/>
-      </w:r>
-      <w:r>
-        <w:rPr>
-          <w:rFonts w:ascii="Times New Roman" w:hAnsi="Times New Roman"/>
-          <w:b/>
-          <w:color w:val="2B6CB0"/>
-          <w:sz w:val="32"/>
-        </w:rPr>
-        <w:t>ПО ЛАБОРАТОРНОЙ РАБОТЕ № 2</w:t>
-        <w:br/>
-      </w:r>
-      <w:r>
-        <w:rPr>
-          <w:rFonts w:ascii="Times New Roman" w:hAnsi="Times New Roman"/>
-          <w:i/>
-          <w:sz w:val="26"/>
-        </w:rPr>
-        <w:t>по дисциплине «Практикум по разработке корпоративного портала»</w:t>
+        <w:t>по дисциплине: «Практикум по разработке корпоративного портала»</w:t>
         <w:br/>
         <w:br/>
       </w:r>
@@ -77,52 +62,44 @@
         <w:rPr>
           <w:rFonts w:ascii="Times New Roman" w:hAnsi="Times New Roman"/>
           <w:b/>
-          <w:sz w:val="26"/>
+          <w:sz w:val="28"/>
         </w:rPr>
         <w:t>Тема: «Анализ и проектирование портала. Разворачивание программного обеспечения»</w:t>
         <w:br/>
-        <w:br/>
-      </w:r>
-      <w:r>
-        <w:rPr>
-          <w:rFonts w:ascii="Times New Roman" w:hAnsi="Times New Roman"/>
-          <w:b/>
-          <w:sz w:val="24"/>
-        </w:rPr>
-        <w:t>Вариант № 15: Университет. Центр Аккредитации и независимой оценки качества (АНОК)</w:t>
-        <w:br/>
-        <w:br/>
-        <w:br/>
-        <w:br/>
+        <w:t>Вариант № 15: «Университет. Центр аккредитации и независимой оценки качества образования (АНОК)»</w:t>
       </w:r>
     </w:p>
+    <w:p/>
+    <w:p/>
+    <w:p/>
     <w:p>
       <w:pPr>
+        <w:spacing w:line="276" w:lineRule="auto"/>
         <w:jc w:val="right"/>
       </w:pPr>
       <w:r>
         <w:rPr>
           <w:rFonts w:ascii="Times New Roman" w:hAnsi="Times New Roman"/>
-          <w:sz w:val="22"/>
+          <w:sz w:val="26"/>
         </w:rPr>
         <w:t>Выполнил:</w:t>
         <w:br/>
-        <w:t>студент группы _____________</w:t>
+        <w:t>студент группы ИВТ-401</w:t>
         <w:br/>
-        <w:t>___________________ (Ф.И.О.)</w:t>
+        <w:t>Иванов И.И.</w:t>
         <w:br/>
         <w:br/>
         <w:t>Проверил:</w:t>
         <w:br/>
-        <w:t>___________________ (должность)</w:t>
+        <w:t>к.т.н., доцент</w:t>
         <w:br/>
-        <w:t>___________________ (Ф.И.О.)</w:t>
-        <w:br/>
-        <w:br/>
-        <w:br/>
+        <w:t>Петров П.П.</w:t>
         <w:br/>
       </w:r>
     </w:p>
+    <w:p/>
+    <w:p/>
+    <w:p/>
     <w:p>
       <w:pPr>
         <w:jc w:val="center"/>
@@ -130,9 +107,9 @@
       <w:r>
         <w:rPr>
           <w:rFonts w:ascii="Times New Roman" w:hAnsi="Times New Roman"/>
-          <w:sz w:val="22"/>
+          <w:sz w:val="24"/>
         </w:rPr>
-        <w:t>2026 г.</w:t>
+        <w:t>Москва, 2026 г.</w:t>
       </w:r>
     </w:p>
     <w:p>
@@ -142,22 +119,304 @@
     </w:p>
     <w:p>
       <w:pPr>
-        <w:pStyle w:val="Heading1"/>
+        <w:spacing w:before="240" w:after="120"/>
+        <w:jc w:val="left"/>
       </w:pPr>
       <w:r>
-        <w:t>1. Диаграмма классов (Class Diagram)</w:t>
+        <w:rPr>
+          <w:rFonts w:ascii="Times New Roman" w:hAnsi="Times New Roman"/>
+          <w:b/>
+          <w:sz w:val="28"/>
+        </w:rPr>
+        <w:t>1. Введение и цели работы</w:t>
       </w:r>
     </w:p>
     <w:p>
+      <w:pPr>
+        <w:spacing w:line="276" w:lineRule="auto" w:after="120"/>
+        <w:ind w:firstLine="709"/>
+        <w:jc w:val="both"/>
+      </w:pPr>
       <w:r>
-        <w:t>Разработана объектно-ориентированная модель предметной области Центра АНОК:</w:t>
+        <w:rPr>
+          <w:rFonts w:ascii="Times New Roman" w:hAnsi="Times New Roman"/>
+          <w:sz w:val="28"/>
+        </w:rPr>
+      </w:r>
+      <w:r>
+        <w:rPr>
+          <w:rFonts w:ascii="Times New Roman" w:hAnsi="Times New Roman"/>
+          <w:b/>
+          <w:sz w:val="28"/>
+        </w:rPr>
+        <w:t>Цель лабораторной работы:</w:t>
+      </w:r>
+      <w:r>
+        <w:rPr>
+          <w:rFonts w:ascii="Times New Roman" w:hAnsi="Times New Roman"/>
+          <w:sz w:val="28"/>
+        </w:rPr>
+        <w:t xml:space="preserve"> Проектирование детальной архитектуры корпоративного веб-портала университета (модуль Центра АНОК), разработка объектной модели и схемы реляционной базы данных (MariaDB / SQLite), а также практическое разворачивание, конфигурирование и демонстрация работы полнофункционального прототипа программного обеспечения в соответствии с бизнес-правилами Варианта № 15.</w:t>
       </w:r>
     </w:p>
     <w:p>
+      <w:pPr>
+        <w:spacing w:before="160" w:after="80"/>
+        <w:jc w:val="left"/>
+      </w:pPr>
+      <w:r>
+        <w:rPr>
+          <w:rFonts w:ascii="Times New Roman" w:hAnsi="Times New Roman"/>
+          <w:b/>
+          <w:sz w:val="26"/>
+        </w:rPr>
+        <w:t>Задачи работы:</w:t>
+      </w:r>
+    </w:p>
+    <w:p>
+      <w:pPr>
+        <w:spacing w:line="276" w:lineRule="auto" w:after="60"/>
+        <w:ind w:left="709"/>
+        <w:jc w:val="both"/>
+      </w:pPr>
+      <w:r>
+        <w:rPr>
+          <w:rFonts w:ascii="Times New Roman" w:hAnsi="Times New Roman"/>
+          <w:b/>
+          <w:sz w:val="28"/>
+        </w:rPr>
+        <w:t xml:space="preserve">1. </w:t>
+      </w:r>
+      <w:r>
+        <w:rPr>
+          <w:rFonts w:ascii="Times New Roman" w:hAnsi="Times New Roman"/>
+          <w:sz w:val="28"/>
+        </w:rPr>
+        <w:t xml:space="preserve">Разработать </w:t>
+      </w:r>
+      <w:r>
+        <w:rPr>
+          <w:rFonts w:ascii="Times New Roman" w:hAnsi="Times New Roman"/>
+          <w:b/>
+          <w:sz w:val="28"/>
+        </w:rPr>
+        <w:t>диаграмму классов</w:t>
+      </w:r>
+      <w:r>
+        <w:rPr>
+          <w:rFonts w:ascii="Times New Roman" w:hAnsi="Times New Roman"/>
+          <w:sz w:val="28"/>
+        </w:rPr>
+        <w:t xml:space="preserve"> (Class Diagram) объектной модели портала.</w:t>
+      </w:r>
+    </w:p>
+    <w:p>
+      <w:pPr>
+        <w:spacing w:line="276" w:lineRule="auto" w:after="60"/>
+        <w:ind w:left="709"/>
+        <w:jc w:val="both"/>
+      </w:pPr>
+      <w:r>
+        <w:rPr>
+          <w:rFonts w:ascii="Times New Roman" w:hAnsi="Times New Roman"/>
+          <w:b/>
+          <w:sz w:val="28"/>
+        </w:rPr>
+        <w:t xml:space="preserve">2. </w:t>
+      </w:r>
+      <w:r>
+        <w:rPr>
+          <w:rFonts w:ascii="Times New Roman" w:hAnsi="Times New Roman"/>
+          <w:sz w:val="28"/>
+        </w:rPr>
+        <w:t xml:space="preserve">Спроектировать </w:t>
+      </w:r>
+      <w:r>
+        <w:rPr>
+          <w:rFonts w:ascii="Times New Roman" w:hAnsi="Times New Roman"/>
+          <w:b/>
+          <w:sz w:val="28"/>
+        </w:rPr>
+        <w:t>диаграмму последовательности</w:t>
+      </w:r>
+      <w:r>
+        <w:rPr>
+          <w:rFonts w:ascii="Times New Roman" w:hAnsi="Times New Roman"/>
+          <w:sz w:val="28"/>
+        </w:rPr>
+        <w:t xml:space="preserve"> (Sequence Diagram) для сквозного процесса экспертизы и визирования учебных планов.</w:t>
+      </w:r>
+    </w:p>
+    <w:p>
+      <w:pPr>
+        <w:spacing w:line="276" w:lineRule="auto" w:after="60"/>
+        <w:ind w:left="709"/>
+        <w:jc w:val="both"/>
+      </w:pPr>
+      <w:r>
+        <w:rPr>
+          <w:rFonts w:ascii="Times New Roman" w:hAnsi="Times New Roman"/>
+          <w:b/>
+          <w:sz w:val="28"/>
+        </w:rPr>
+        <w:t xml:space="preserve">3. </w:t>
+      </w:r>
+      <w:r>
+        <w:rPr>
+          <w:rFonts w:ascii="Times New Roman" w:hAnsi="Times New Roman"/>
+          <w:sz w:val="28"/>
+        </w:rPr>
+        <w:t xml:space="preserve">Разработать </w:t>
+      </w:r>
+      <w:r>
+        <w:rPr>
+          <w:rFonts w:ascii="Times New Roman" w:hAnsi="Times New Roman"/>
+          <w:b/>
+          <w:sz w:val="28"/>
+        </w:rPr>
+        <w:t>диаграмму компонентов</w:t>
+      </w:r>
+      <w:r>
+        <w:rPr>
+          <w:rFonts w:ascii="Times New Roman" w:hAnsi="Times New Roman"/>
+          <w:sz w:val="28"/>
+        </w:rPr>
+        <w:t xml:space="preserve"> (Component Diagram), отражающую модульную трехуровневую структуру портала.</w:t>
+      </w:r>
+    </w:p>
+    <w:p>
+      <w:pPr>
+        <w:spacing w:line="276" w:lineRule="auto" w:after="60"/>
+        <w:ind w:left="709"/>
+        <w:jc w:val="both"/>
+      </w:pPr>
+      <w:r>
+        <w:rPr>
+          <w:rFonts w:ascii="Times New Roman" w:hAnsi="Times New Roman"/>
+          <w:b/>
+          <w:sz w:val="28"/>
+        </w:rPr>
+        <w:t xml:space="preserve">4. </w:t>
+      </w:r>
+      <w:r>
+        <w:rPr>
+          <w:rFonts w:ascii="Times New Roman" w:hAnsi="Times New Roman"/>
+          <w:sz w:val="28"/>
+        </w:rPr>
+        <w:t xml:space="preserve">Разработать </w:t>
+      </w:r>
+      <w:r>
+        <w:rPr>
+          <w:rFonts w:ascii="Times New Roman" w:hAnsi="Times New Roman"/>
+          <w:b/>
+          <w:sz w:val="28"/>
+        </w:rPr>
+        <w:t>диаграмму развертывания</w:t>
+      </w:r>
+      <w:r>
+        <w:rPr>
+          <w:rFonts w:ascii="Times New Roman" w:hAnsi="Times New Roman"/>
+          <w:sz w:val="28"/>
+        </w:rPr>
+        <w:t xml:space="preserve"> (Deployment Diagram) физической топологии серверов и сетевых узлов.</w:t>
+      </w:r>
+    </w:p>
+    <w:p>
+      <w:pPr>
+        <w:spacing w:line="276" w:lineRule="auto" w:after="60"/>
+        <w:ind w:left="709"/>
+        <w:jc w:val="both"/>
+      </w:pPr>
+      <w:r>
+        <w:rPr>
+          <w:rFonts w:ascii="Times New Roman" w:hAnsi="Times New Roman"/>
+          <w:b/>
+          <w:sz w:val="28"/>
+        </w:rPr>
+        <w:t xml:space="preserve">5. </w:t>
+      </w:r>
+      <w:r>
+        <w:rPr>
+          <w:rFonts w:ascii="Times New Roman" w:hAnsi="Times New Roman"/>
+          <w:sz w:val="28"/>
+        </w:rPr>
+        <w:t xml:space="preserve">Спроектировать нормализованную </w:t>
+      </w:r>
+      <w:r>
+        <w:rPr>
+          <w:rFonts w:ascii="Times New Roman" w:hAnsi="Times New Roman"/>
+          <w:b/>
+          <w:sz w:val="28"/>
+        </w:rPr>
+        <w:t>схему реляционной базы данных</w:t>
+      </w:r>
+      <w:r>
+        <w:rPr>
+          <w:rFonts w:ascii="Times New Roman" w:hAnsi="Times New Roman"/>
+          <w:sz w:val="28"/>
+        </w:rPr>
+        <w:t xml:space="preserve"> (ERD) в 3-й нормальной форме.</w:t>
+      </w:r>
+    </w:p>
+    <w:p>
+      <w:pPr>
+        <w:spacing w:line="276" w:lineRule="auto" w:after="60"/>
+        <w:ind w:left="709"/>
+        <w:jc w:val="both"/>
+      </w:pPr>
+      <w:r>
+        <w:rPr>
+          <w:rFonts w:ascii="Times New Roman" w:hAnsi="Times New Roman"/>
+          <w:b/>
+          <w:sz w:val="28"/>
+        </w:rPr>
+        <w:t xml:space="preserve">6. </w:t>
+      </w:r>
+      <w:r>
+        <w:rPr>
+          <w:rFonts w:ascii="Times New Roman" w:hAnsi="Times New Roman"/>
+          <w:sz w:val="28"/>
+        </w:rPr>
+        <w:t>Развернуть и настроить серверную среду и продемонстрировать примеры работы установленного ПО.</w:t>
+      </w:r>
+    </w:p>
+    <w:p>
+      <w:pPr>
+        <w:spacing w:before="240" w:after="120"/>
+        <w:jc w:val="left"/>
+      </w:pPr>
+      <w:r>
+        <w:rPr>
+          <w:rFonts w:ascii="Times New Roman" w:hAnsi="Times New Roman"/>
+          <w:b/>
+          <w:sz w:val="28"/>
+        </w:rPr>
+        <w:t>2. Диаграмма классов (Class Diagram)</w:t>
+      </w:r>
+    </w:p>
+    <w:p>
+      <w:pPr>
+        <w:spacing w:line="276" w:lineRule="auto" w:after="120"/>
+        <w:ind w:firstLine="709"/>
+        <w:jc w:val="both"/>
+      </w:pPr>
+      <w:r>
+        <w:rPr>
+          <w:rFonts w:ascii="Times New Roman" w:hAnsi="Times New Roman"/>
+          <w:sz w:val="28"/>
+        </w:rPr>
+        <w:t>Объектно-ориентированная модель предметной области включает сущности пользователей и ролей (RBAC), организационной структуры вуза, образовательных программ, учебных планов с дисциплинами, служебных записок, маршрутов электронного визирования и протоколов валидации ФГОС.</w:t>
+      </w:r>
+    </w:p>
+    <w:p>
+      <w:pPr>
+        <w:spacing w:before="200" w:after="80"/>
+        <w:jc w:val="center"/>
+      </w:pPr>
       <w:r>
         <w:drawing>
           <wp:inline xmlns:a="http://schemas.openxmlformats.org/drawingml/2006/main" xmlns:pic="http://schemas.openxmlformats.org/drawingml/2006/picture">
-            <wp:extent cx="6035040" cy="4137229"/>
+            <wp:extent cx="5760000" cy="3948679"/>
             <wp:docPr id="1" name="Picture 1"/>
             <wp:cNvGraphicFramePr>
               <a:graphicFrameLocks noChangeAspect="1"/>
@@ -170,7 +429,7 @@
                     <pic:cNvPicPr/>
                   </pic:nvPicPr>
                   <pic:blipFill>
-                    <a:blip r:embed="rId9"/>
+                    <a:blip r:embed="rId10"/>
                     <a:stretch>
                       <a:fillRect/>
                     </a:stretch>
@@ -178,7 +437,7 @@
                   <pic:spPr>
                     <a:xfrm>
                       <a:off x="0" y="0"/>
-                      <a:ext cx="6035040" cy="4137229"/>
+                      <a:ext cx="5760000" cy="3948679"/>
                     </a:xfrm>
                     <a:prstGeom prst="rect"/>
                   </pic:spPr>
@@ -191,38 +450,321 @@
     </w:p>
     <w:p>
       <w:pPr>
+        <w:spacing w:before="80" w:after="240"/>
         <w:jc w:val="center"/>
       </w:pPr>
       <w:r>
         <w:rPr>
+          <w:rFonts w:ascii="Times New Roman" w:hAnsi="Times New Roman"/>
           <w:i/>
+          <w:sz w:val="24"/>
         </w:rPr>
-        <w:t>Рис. 1. Диаграмма классов корпоративного портала (Модуль АНОК)</w:t>
-      </w:r>
-    </w:p>
-    <w:p>
-      <w:r>
-        <w:br w:type="page"/>
+        <w:t>Рисунок 1 — Диаграмма классов</w:t>
       </w:r>
     </w:p>
     <w:p>
       <w:pPr>
-        <w:pStyle w:val="Heading1"/>
+        <w:spacing w:before="160" w:after="80"/>
+        <w:jc w:val="left"/>
       </w:pPr>
       <w:r>
-        <w:t>2. Диаграмма последовательности (Sequence Diagram)</w:t>
+        <w:rPr>
+          <w:rFonts w:ascii="Times New Roman" w:hAnsi="Times New Roman"/>
+          <w:b/>
+          <w:sz w:val="26"/>
+        </w:rPr>
+        <w:t>Основные классы системы:</w:t>
       </w:r>
     </w:p>
     <w:p>
+      <w:pPr>
+        <w:spacing w:line="276" w:lineRule="auto" w:after="60"/>
+        <w:ind w:left="709"/>
+        <w:jc w:val="both"/>
+      </w:pPr>
       <w:r>
-        <w:t>Отражает сквозной регламент согласования УП и внесения изменений по служебным запискам:</w:t>
+        <w:rPr>
+          <w:rFonts w:ascii="Times New Roman" w:hAnsi="Times New Roman"/>
+          <w:b/>
+          <w:sz w:val="28"/>
+        </w:rPr>
+        <w:t xml:space="preserve">1. </w:t>
+      </w:r>
+      <w:r>
+        <w:rPr>
+          <w:rFonts w:ascii="Times New Roman" w:hAnsi="Times New Roman"/>
+          <w:sz w:val="28"/>
+        </w:rPr>
+      </w:r>
+      <w:r>
+        <w:rPr>
+          <w:rFonts w:ascii="Times New Roman" w:hAnsi="Times New Roman"/>
+          <w:b/>
+          <w:sz w:val="28"/>
+        </w:rPr>
+        <w:t>`User` и `Role`</w:t>
+      </w:r>
+      <w:r>
+        <w:rPr>
+          <w:rFonts w:ascii="Times New Roman" w:hAnsi="Times New Roman"/>
+          <w:sz w:val="28"/>
+        </w:rPr>
+        <w:t>: обеспечивают гранулярное ролевое разграничение прав (руководитель выпускающей кафедры, обеспечивающая кафедра, эксперт АНОК, начальник АНОК, проректор по УР, ректор).</w:t>
       </w:r>
     </w:p>
     <w:p>
+      <w:pPr>
+        <w:spacing w:line="276" w:lineRule="auto" w:after="60"/>
+        <w:ind w:left="709"/>
+        <w:jc w:val="both"/>
+      </w:pPr>
+      <w:r>
+        <w:rPr>
+          <w:rFonts w:ascii="Times New Roman" w:hAnsi="Times New Roman"/>
+          <w:b/>
+          <w:sz w:val="28"/>
+        </w:rPr>
+        <w:t xml:space="preserve">2. </w:t>
+      </w:r>
+      <w:r>
+        <w:rPr>
+          <w:rFonts w:ascii="Times New Roman" w:hAnsi="Times New Roman"/>
+          <w:sz w:val="28"/>
+        </w:rPr>
+      </w:r>
+      <w:r>
+        <w:rPr>
+          <w:rFonts w:ascii="Times New Roman" w:hAnsi="Times New Roman"/>
+          <w:b/>
+          <w:sz w:val="28"/>
+        </w:rPr>
+        <w:t>`Department`</w:t>
+      </w:r>
+      <w:r>
+        <w:rPr>
+          <w:rFonts w:ascii="Times New Roman" w:hAnsi="Times New Roman"/>
+          <w:sz w:val="28"/>
+        </w:rPr>
+        <w:t>: классифицирует подразделения университета по типам (`RELEASING` — выпускающая, `IMPLEMENTING` — обеспечивающая, `EXPERT_ANOK` — экспертный центр АНОК, `MANAGEMENT` — ректорат).</w:t>
+      </w:r>
+    </w:p>
+    <w:p>
+      <w:pPr>
+        <w:spacing w:line="276" w:lineRule="auto" w:after="60"/>
+        <w:ind w:left="709"/>
+        <w:jc w:val="both"/>
+      </w:pPr>
+      <w:r>
+        <w:rPr>
+          <w:rFonts w:ascii="Times New Roman" w:hAnsi="Times New Roman"/>
+          <w:b/>
+          <w:sz w:val="28"/>
+        </w:rPr>
+        <w:t xml:space="preserve">3. </w:t>
+      </w:r>
+      <w:r>
+        <w:rPr>
+          <w:rFonts w:ascii="Times New Roman" w:hAnsi="Times New Roman"/>
+          <w:sz w:val="28"/>
+        </w:rPr>
+      </w:r>
+      <w:r>
+        <w:rPr>
+          <w:rFonts w:ascii="Times New Roman" w:hAnsi="Times New Roman"/>
+          <w:b/>
+          <w:sz w:val="28"/>
+        </w:rPr>
+        <w:t>`EducationalProgram` и `StandardFGOS`</w:t>
+      </w:r>
+      <w:r>
+        <w:rPr>
+          <w:rFonts w:ascii="Times New Roman" w:hAnsi="Times New Roman"/>
+          <w:sz w:val="28"/>
+        </w:rPr>
+        <w:t>: определяют параметры направления подготовки (код, профиль, квалификация) и нормативные ограничения стандарта ФГОС ВО 3++ (240 з.е., лимиты экзаменов в сессию, минимальные объемы практик и ГИА).</w:t>
+      </w:r>
+    </w:p>
+    <w:p>
+      <w:pPr>
+        <w:spacing w:line="276" w:lineRule="auto" w:after="60"/>
+        <w:ind w:left="709"/>
+        <w:jc w:val="both"/>
+      </w:pPr>
+      <w:r>
+        <w:rPr>
+          <w:rFonts w:ascii="Times New Roman" w:hAnsi="Times New Roman"/>
+          <w:b/>
+          <w:sz w:val="28"/>
+        </w:rPr>
+        <w:t xml:space="preserve">4. </w:t>
+      </w:r>
+      <w:r>
+        <w:rPr>
+          <w:rFonts w:ascii="Times New Roman" w:hAnsi="Times New Roman"/>
+          <w:sz w:val="28"/>
+        </w:rPr>
+      </w:r>
+      <w:r>
+        <w:rPr>
+          <w:rFonts w:ascii="Times New Roman" w:hAnsi="Times New Roman"/>
+          <w:b/>
+          <w:sz w:val="28"/>
+        </w:rPr>
+        <w:t>`Curriculum` и `CurriculumDiscipline`</w:t>
+      </w:r>
+      <w:r>
+        <w:rPr>
+          <w:rFonts w:ascii="Times New Roman" w:hAnsi="Times New Roman"/>
+          <w:sz w:val="28"/>
+        </w:rPr>
+        <w:t>: реализуют композиционную структуру учебного плана (семестры 1–8, трудоемкость в з.е. и академических часах, лекции, лабораторные, практики, СРС, формы контроля, закрепленные кафедры).</w:t>
+      </w:r>
+    </w:p>
+    <w:p>
+      <w:pPr>
+        <w:spacing w:line="276" w:lineRule="auto" w:after="60"/>
+        <w:ind w:left="709"/>
+        <w:jc w:val="both"/>
+      </w:pPr>
+      <w:r>
+        <w:rPr>
+          <w:rFonts w:ascii="Times New Roman" w:hAnsi="Times New Roman"/>
+          <w:b/>
+          <w:sz w:val="28"/>
+        </w:rPr>
+        <w:t xml:space="preserve">5. </w:t>
+      </w:r>
+      <w:r>
+        <w:rPr>
+          <w:rFonts w:ascii="Times New Roman" w:hAnsi="Times New Roman"/>
+          <w:sz w:val="28"/>
+        </w:rPr>
+      </w:r>
+      <w:r>
+        <w:rPr>
+          <w:rFonts w:ascii="Times New Roman" w:hAnsi="Times New Roman"/>
+          <w:b/>
+          <w:sz w:val="28"/>
+        </w:rPr>
+        <w:t>`ServiceNote` и `ServiceNoteItem`</w:t>
+      </w:r>
+      <w:r>
+        <w:rPr>
+          <w:rFonts w:ascii="Times New Roman" w:hAnsi="Times New Roman"/>
+          <w:sz w:val="28"/>
+        </w:rPr>
+        <w:t>: управляют жизненным циклом регламентных изменений учебного плана до начала семестра с фиксацией параметров («Было» / «Стало») в формате JSON.</w:t>
+      </w:r>
+    </w:p>
+    <w:p>
+      <w:pPr>
+        <w:spacing w:line="276" w:lineRule="auto" w:after="60"/>
+        <w:ind w:left="709"/>
+        <w:jc w:val="both"/>
+      </w:pPr>
+      <w:r>
+        <w:rPr>
+          <w:rFonts w:ascii="Times New Roman" w:hAnsi="Times New Roman"/>
+          <w:b/>
+          <w:sz w:val="28"/>
+        </w:rPr>
+        <w:t xml:space="preserve">6. </w:t>
+      </w:r>
+      <w:r>
+        <w:rPr>
+          <w:rFonts w:ascii="Times New Roman" w:hAnsi="Times New Roman"/>
+          <w:sz w:val="28"/>
+        </w:rPr>
+      </w:r>
+      <w:r>
+        <w:rPr>
+          <w:rFonts w:ascii="Times New Roman" w:hAnsi="Times New Roman"/>
+          <w:b/>
+          <w:sz w:val="28"/>
+        </w:rPr>
+        <w:t>`DocumentSignature`</w:t>
+      </w:r>
+      <w:r>
+        <w:rPr>
+          <w:rFonts w:ascii="Times New Roman" w:hAnsi="Times New Roman"/>
+          <w:sz w:val="28"/>
+        </w:rPr>
+        <w:t>: протоколирует электронное визирование документов с формированием цифрового SHA-256 хеша, отметки точного времени и статуса подписи.</w:t>
+      </w:r>
+    </w:p>
+    <w:p>
+      <w:pPr>
+        <w:spacing w:line="276" w:lineRule="auto" w:after="60"/>
+        <w:ind w:left="709"/>
+        <w:jc w:val="both"/>
+      </w:pPr>
+      <w:r>
+        <w:rPr>
+          <w:rFonts w:ascii="Times New Roman" w:hAnsi="Times New Roman"/>
+          <w:b/>
+          <w:sz w:val="28"/>
+        </w:rPr>
+        <w:t xml:space="preserve">7. </w:t>
+      </w:r>
+      <w:r>
+        <w:rPr>
+          <w:rFonts w:ascii="Times New Roman" w:hAnsi="Times New Roman"/>
+          <w:sz w:val="28"/>
+        </w:rPr>
+      </w:r>
+      <w:r>
+        <w:rPr>
+          <w:rFonts w:ascii="Times New Roman" w:hAnsi="Times New Roman"/>
+          <w:b/>
+          <w:sz w:val="28"/>
+        </w:rPr>
+        <w:t>`ValidationReport`</w:t>
+      </w:r>
+      <w:r>
+        <w:rPr>
+          <w:rFonts w:ascii="Times New Roman" w:hAnsi="Times New Roman"/>
+          <w:sz w:val="28"/>
+        </w:rPr>
+        <w:t>: аккумулирует результаты автоматической экспертизы учебного плана на соответствие нормативам ФГОС.</w:t>
+      </w:r>
+    </w:p>
+    <w:p>
+      <w:pPr>
+        <w:spacing w:before="240" w:after="120"/>
+        <w:jc w:val="left"/>
+      </w:pPr>
+      <w:r>
+        <w:rPr>
+          <w:rFonts w:ascii="Times New Roman" w:hAnsi="Times New Roman"/>
+          <w:b/>
+          <w:sz w:val="28"/>
+        </w:rPr>
+        <w:t>3. Диаграмма последовательности (Sequence Diagram)</w:t>
+      </w:r>
+    </w:p>
+    <w:p>
+      <w:pPr>
+        <w:spacing w:line="276" w:lineRule="auto" w:after="120"/>
+        <w:ind w:firstLine="709"/>
+        <w:jc w:val="both"/>
+      </w:pPr>
+      <w:r>
+        <w:rPr>
+          <w:rFonts w:ascii="Times New Roman" w:hAnsi="Times New Roman"/>
+          <w:sz w:val="28"/>
+        </w:rPr>
+        <w:t>Диаграмма последовательности отражает временную шкалу и порядок взаимодействия акторов и программных контроллеров в рамках сквозного бизнес-процесса согласования и актуализации УП.</w:t>
+      </w:r>
+    </w:p>
+    <w:p>
+      <w:pPr>
+        <w:spacing w:before="200" w:after="80"/>
+        <w:jc w:val="center"/>
+      </w:pPr>
       <w:r>
         <w:drawing>
           <wp:inline xmlns:a="http://schemas.openxmlformats.org/drawingml/2006/main" xmlns:pic="http://schemas.openxmlformats.org/drawingml/2006/picture">
-            <wp:extent cx="6035040" cy="4823185"/>
+            <wp:extent cx="5760000" cy="4603373"/>
             <wp:docPr id="2" name="Picture 2"/>
             <wp:cNvGraphicFramePr>
               <a:graphicFrameLocks noChangeAspect="1"/>
@@ -235,7 +777,7 @@
                     <pic:cNvPicPr/>
                   </pic:nvPicPr>
                   <pic:blipFill>
-                    <a:blip r:embed="rId10"/>
+                    <a:blip r:embed="rId11"/>
                     <a:stretch>
                       <a:fillRect/>
                     </a:stretch>
@@ -243,7 +785,7 @@
                   <pic:spPr>
                     <a:xfrm>
                       <a:off x="0" y="0"/>
-                      <a:ext cx="6035040" cy="4823185"/>
+                      <a:ext cx="5760000" cy="4603373"/>
                     </a:xfrm>
                     <a:prstGeom prst="rect"/>
                   </pic:spPr>
@@ -256,38 +798,177 @@
     </w:p>
     <w:p>
       <w:pPr>
+        <w:spacing w:before="80" w:after="240"/>
         <w:jc w:val="center"/>
       </w:pPr>
       <w:r>
         <w:rPr>
+          <w:rFonts w:ascii="Times New Roman" w:hAnsi="Times New Roman"/>
           <w:i/>
+          <w:sz w:val="24"/>
         </w:rPr>
-        <w:t>Рис. 2. Диаграмма последовательности сквозного процесса</w:t>
-      </w:r>
-    </w:p>
-    <w:p>
-      <w:r>
-        <w:br w:type="page"/>
+        <w:t>Рисунок 2 — Диаграмма последовательности</w:t>
       </w:r>
     </w:p>
     <w:p>
       <w:pPr>
-        <w:pStyle w:val="Heading1"/>
+        <w:spacing w:before="160" w:after="80"/>
+        <w:jc w:val="left"/>
       </w:pPr>
       <w:r>
-        <w:t>3. Диаграмма компонентов (Component Diagram)</w:t>
+        <w:rPr>
+          <w:rFonts w:ascii="Times New Roman" w:hAnsi="Times New Roman"/>
+          <w:b/>
+          <w:sz w:val="26"/>
+        </w:rPr>
+        <w:t>Фазы взаимодействия:</w:t>
       </w:r>
     </w:p>
     <w:p>
+      <w:pPr>
+        <w:spacing w:line="276" w:lineRule="auto" w:after="60"/>
+        <w:ind w:left="709"/>
+        <w:jc w:val="both"/>
+      </w:pPr>
       <w:r>
-        <w:t>Отражает трехуровневую компонентную архитектуру веб-портала:</w:t>
+        <w:rPr>
+          <w:rFonts w:ascii="Times New Roman" w:hAnsi="Times New Roman"/>
+          <w:b/>
+          <w:sz w:val="28"/>
+        </w:rPr>
+        <w:t xml:space="preserve">1. </w:t>
+      </w:r>
+      <w:r>
+        <w:rPr>
+          <w:rFonts w:ascii="Times New Roman" w:hAnsi="Times New Roman"/>
+          <w:sz w:val="28"/>
+        </w:rPr>
+      </w:r>
+      <w:r>
+        <w:rPr>
+          <w:rFonts w:ascii="Times New Roman" w:hAnsi="Times New Roman"/>
+          <w:b/>
+          <w:sz w:val="28"/>
+        </w:rPr>
+        <w:t>Фаза 1 (Разработка и экспертиза УП по ФГОС):</w:t>
+      </w:r>
+      <w:r>
+        <w:rPr>
+          <w:rFonts w:ascii="Times New Roman" w:hAnsi="Times New Roman"/>
+          <w:sz w:val="28"/>
+        </w:rPr>
+        <w:t xml:space="preserve"> Выпускающая кафедра формирует проект УП → Портал инициирует автоматическую валидацию через `FGOS Validator` → Эксперт АНОК верифицирует протокол и утверждает экспертное заключение.</w:t>
       </w:r>
     </w:p>
     <w:p>
+      <w:pPr>
+        <w:spacing w:line="276" w:lineRule="auto" w:after="60"/>
+        <w:ind w:left="709"/>
+        <w:jc w:val="both"/>
+      </w:pPr>
+      <w:r>
+        <w:rPr>
+          <w:rFonts w:ascii="Times New Roman" w:hAnsi="Times New Roman"/>
+          <w:b/>
+          <w:sz w:val="28"/>
+        </w:rPr>
+        <w:t xml:space="preserve">2. </w:t>
+      </w:r>
+      <w:r>
+        <w:rPr>
+          <w:rFonts w:ascii="Times New Roman" w:hAnsi="Times New Roman"/>
+          <w:sz w:val="28"/>
+        </w:rPr>
+      </w:r>
+      <w:r>
+        <w:rPr>
+          <w:rFonts w:ascii="Times New Roman" w:hAnsi="Times New Roman"/>
+          <w:b/>
+          <w:sz w:val="28"/>
+        </w:rPr>
+        <w:t>Фаза 2 (Маршрут подписания и ежегодного утверждения):</w:t>
+      </w:r>
+      <w:r>
+        <w:rPr>
+          <w:rFonts w:ascii="Times New Roman" w:hAnsi="Times New Roman"/>
+          <w:sz w:val="28"/>
+        </w:rPr>
+        <w:t xml:space="preserve"> Последовательное наложение цифровых виз (Зав. выпускающей кафедрой → Начальник АНОК → Проректор по УР) → Утверждение Ученым советом (номер и дата протокола) и Ректором → Публикация в реестре со статусом `APPROVED`.</w:t>
+      </w:r>
+    </w:p>
+    <w:p>
+      <w:pPr>
+        <w:spacing w:line="276" w:lineRule="auto" w:after="60"/>
+        <w:ind w:left="709"/>
+        <w:jc w:val="both"/>
+      </w:pPr>
+      <w:r>
+        <w:rPr>
+          <w:rFonts w:ascii="Times New Roman" w:hAnsi="Times New Roman"/>
+          <w:b/>
+          <w:sz w:val="28"/>
+        </w:rPr>
+        <w:t xml:space="preserve">3. </w:t>
+      </w:r>
+      <w:r>
+        <w:rPr>
+          <w:rFonts w:ascii="Times New Roman" w:hAnsi="Times New Roman"/>
+          <w:sz w:val="28"/>
+        </w:rPr>
+      </w:r>
+      <w:r>
+        <w:rPr>
+          <w:rFonts w:ascii="Times New Roman" w:hAnsi="Times New Roman"/>
+          <w:b/>
+          <w:sz w:val="28"/>
+        </w:rPr>
+        <w:t>Фаза 3 (Внесение изменений до начала семестра):</w:t>
+      </w:r>
+      <w:r>
+        <w:rPr>
+          <w:rFonts w:ascii="Times New Roman" w:hAnsi="Times New Roman"/>
+          <w:sz w:val="28"/>
+        </w:rPr>
+        <w:t xml:space="preserve"> Создание электронной служебной записки → Двустороннее согласование (выпускающая + обеспечивающая кафедры) → Передача в АНОК → Применение изменений, повторный контроль ФГОС и выпуск новой ревизии `v1.1`.</w:t>
+      </w:r>
+    </w:p>
+    <w:p>
+      <w:pPr>
+        <w:spacing w:before="240" w:after="120"/>
+        <w:jc w:val="left"/>
+      </w:pPr>
+      <w:r>
+        <w:rPr>
+          <w:rFonts w:ascii="Times New Roman" w:hAnsi="Times New Roman"/>
+          <w:b/>
+          <w:sz w:val="28"/>
+        </w:rPr>
+        <w:t>4. Диаграмма компонентов (Component Diagram)</w:t>
+      </w:r>
+    </w:p>
+    <w:p>
+      <w:pPr>
+        <w:spacing w:line="276" w:lineRule="auto" w:after="120"/>
+        <w:ind w:firstLine="709"/>
+        <w:jc w:val="both"/>
+      </w:pPr>
+      <w:r>
+        <w:rPr>
+          <w:rFonts w:ascii="Times New Roman" w:hAnsi="Times New Roman"/>
+          <w:sz w:val="28"/>
+        </w:rPr>
+        <w:t>Компонентная модель построена по трехуровневой архитектуре (Presentation, Business Logic, Data Access).</w:t>
+      </w:r>
+    </w:p>
+    <w:p>
+      <w:pPr>
+        <w:spacing w:before="200" w:after="80"/>
+        <w:jc w:val="center"/>
+      </w:pPr>
       <w:r>
         <w:drawing>
           <wp:inline xmlns:a="http://schemas.openxmlformats.org/drawingml/2006/main" xmlns:pic="http://schemas.openxmlformats.org/drawingml/2006/picture">
-            <wp:extent cx="6035040" cy="4119154"/>
+            <wp:extent cx="5760000" cy="3931429"/>
             <wp:docPr id="3" name="Picture 3"/>
             <wp:cNvGraphicFramePr>
               <a:graphicFrameLocks noChangeAspect="1"/>
@@ -300,7 +981,7 @@
                     <pic:cNvPicPr/>
                   </pic:nvPicPr>
                   <pic:blipFill>
-                    <a:blip r:embed="rId11"/>
+                    <a:blip r:embed="rId12"/>
                     <a:stretch>
                       <a:fillRect/>
                     </a:stretch>
@@ -308,7 +989,7 @@
                   <pic:spPr>
                     <a:xfrm>
                       <a:off x="0" y="0"/>
-                      <a:ext cx="6035040" cy="4119154"/>
+                      <a:ext cx="5760000" cy="3931429"/>
                     </a:xfrm>
                     <a:prstGeom prst="rect"/>
                   </pic:spPr>
@@ -321,38 +1002,308 @@
     </w:p>
     <w:p>
       <w:pPr>
+        <w:spacing w:before="80" w:after="240"/>
         <w:jc w:val="center"/>
       </w:pPr>
       <w:r>
         <w:rPr>
+          <w:rFonts w:ascii="Times New Roman" w:hAnsi="Times New Roman"/>
           <w:i/>
+          <w:sz w:val="24"/>
         </w:rPr>
-        <w:t>Рис. 3. Диаграмма компонентов корпоративного веб-портала</w:t>
-      </w:r>
-    </w:p>
-    <w:p>
-      <w:r>
-        <w:br w:type="page"/>
+        <w:t>Рисунок 3 — Диаграмма компонентов</w:t>
       </w:r>
     </w:p>
     <w:p>
       <w:pPr>
-        <w:pStyle w:val="Heading1"/>
+        <w:spacing w:before="160" w:after="80"/>
+        <w:jc w:val="left"/>
       </w:pPr>
       <w:r>
-        <w:t>4. Диаграмма развертывания (Deployment Diagram)</w:t>
+        <w:rPr>
+          <w:rFonts w:ascii="Times New Roman" w:hAnsi="Times New Roman"/>
+          <w:b/>
+          <w:sz w:val="26"/>
+        </w:rPr>
+        <w:t>Уровни и модули архитектуры:</w:t>
       </w:r>
     </w:p>
     <w:p>
+      <w:pPr>
+        <w:spacing w:line="276" w:lineRule="auto" w:after="60"/>
+        <w:ind w:left="709"/>
+        <w:jc w:val="both"/>
+      </w:pPr>
       <w:r>
-        <w:t>Определяет физическую топологию серверов и сетевых интерфейсов:</w:t>
+        <w:rPr>
+          <w:rFonts w:ascii="Times New Roman" w:hAnsi="Times New Roman"/>
+          <w:b w:val="0"/>
+          <w:sz w:val="28"/>
+        </w:rPr>
+        <w:t xml:space="preserve">• </w:t>
+      </w:r>
+      <w:r>
+        <w:rPr>
+          <w:rFonts w:ascii="Times New Roman" w:hAnsi="Times New Roman"/>
+          <w:sz w:val="28"/>
+        </w:rPr>
+      </w:r>
+      <w:r>
+        <w:rPr>
+          <w:rFonts w:ascii="Times New Roman" w:hAnsi="Times New Roman"/>
+          <w:b/>
+          <w:sz w:val="28"/>
+        </w:rPr>
+        <w:t>Presentation Layer (Уровень представления):</w:t>
+      </w:r>
+      <w:r>
+        <w:rPr>
+          <w:rFonts w:ascii="Times New Roman" w:hAnsi="Times New Roman"/>
+          <w:sz w:val="28"/>
+        </w:rPr>
+        <w:t xml:space="preserve"> `Portal Web UI` (адаптивные шаблоны HTML5/TailwindCSS), `REST API Controllers`, `Auth &amp; RBAC UI`.</w:t>
       </w:r>
     </w:p>
     <w:p>
+      <w:pPr>
+        <w:spacing w:line="276" w:lineRule="auto" w:after="60"/>
+        <w:ind w:left="709"/>
+        <w:jc w:val="both"/>
+      </w:pPr>
+      <w:r>
+        <w:rPr>
+          <w:rFonts w:ascii="Times New Roman" w:hAnsi="Times New Roman"/>
+          <w:b w:val="0"/>
+          <w:sz w:val="28"/>
+        </w:rPr>
+        <w:t xml:space="preserve">• </w:t>
+      </w:r>
+      <w:r>
+        <w:rPr>
+          <w:rFonts w:ascii="Times New Roman" w:hAnsi="Times New Roman"/>
+          <w:sz w:val="28"/>
+        </w:rPr>
+      </w:r>
+      <w:r>
+        <w:rPr>
+          <w:rFonts w:ascii="Times New Roman" w:hAnsi="Times New Roman"/>
+          <w:b/>
+          <w:sz w:val="28"/>
+        </w:rPr>
+        <w:t>Business Logic Layer (Уровень бизнес-логики):</w:t>
+      </w:r>
+      <w:r>
+        <w:rPr>
+          <w:rFonts w:ascii="Times New Roman" w:hAnsi="Times New Roman"/>
+          <w:sz w:val="28"/>
+        </w:rPr>
+      </w:r>
+    </w:p>
+    <w:p>
+      <w:pPr>
+        <w:spacing w:line="276" w:lineRule="auto" w:after="60"/>
+        <w:ind w:left="992"/>
+        <w:jc w:val="both"/>
+      </w:pPr>
+      <w:r>
+        <w:rPr>
+          <w:rFonts w:ascii="Times New Roman" w:hAnsi="Times New Roman"/>
+          <w:b w:val="0"/>
+          <w:sz w:val="28"/>
+        </w:rPr>
+        <w:t xml:space="preserve">• </w:t>
+      </w:r>
+      <w:r>
+        <w:rPr>
+          <w:rFonts w:ascii="Times New Roman" w:hAnsi="Times New Roman"/>
+          <w:sz w:val="28"/>
+        </w:rPr>
+        <w:t>`Curriculum Manager`: управление версиями, семестрами и структурой дисциплин УП;</w:t>
+      </w:r>
+    </w:p>
+    <w:p>
+      <w:pPr>
+        <w:spacing w:line="276" w:lineRule="auto" w:after="60"/>
+        <w:ind w:left="992"/>
+        <w:jc w:val="both"/>
+      </w:pPr>
+      <w:r>
+        <w:rPr>
+          <w:rFonts w:ascii="Times New Roman" w:hAnsi="Times New Roman"/>
+          <w:b w:val="0"/>
+          <w:sz w:val="28"/>
+        </w:rPr>
+        <w:t xml:space="preserve">• </w:t>
+      </w:r>
+      <w:r>
+        <w:rPr>
+          <w:rFonts w:ascii="Times New Roman" w:hAnsi="Times New Roman"/>
+          <w:sz w:val="28"/>
+        </w:rPr>
+        <w:t>`FGOS Validation Engine`: алгоритмическая верификация контрольных нормативов стандартов 3++;</w:t>
+      </w:r>
+    </w:p>
+    <w:p>
+      <w:pPr>
+        <w:spacing w:line="276" w:lineRule="auto" w:after="60"/>
+        <w:ind w:left="992"/>
+        <w:jc w:val="both"/>
+      </w:pPr>
+      <w:r>
+        <w:rPr>
+          <w:rFonts w:ascii="Times New Roman" w:hAnsi="Times New Roman"/>
+          <w:b w:val="0"/>
+          <w:sz w:val="28"/>
+        </w:rPr>
+        <w:t xml:space="preserve">• </w:t>
+      </w:r>
+      <w:r>
+        <w:rPr>
+          <w:rFonts w:ascii="Times New Roman" w:hAnsi="Times New Roman"/>
+          <w:sz w:val="28"/>
+        </w:rPr>
+        <w:t>`Workflow &amp; Sign Service`: маршрутизация электронных виз, криптографических штампов и состояний документов;</w:t>
+      </w:r>
+    </w:p>
+    <w:p>
+      <w:pPr>
+        <w:spacing w:line="276" w:lineRule="auto" w:after="60"/>
+        <w:ind w:left="992"/>
+        <w:jc w:val="both"/>
+      </w:pPr>
+      <w:r>
+        <w:rPr>
+          <w:rFonts w:ascii="Times New Roman" w:hAnsi="Times New Roman"/>
+          <w:b w:val="0"/>
+          <w:sz w:val="28"/>
+        </w:rPr>
+        <w:t xml:space="preserve">• </w:t>
+      </w:r>
+      <w:r>
+        <w:rPr>
+          <w:rFonts w:ascii="Times New Roman" w:hAnsi="Times New Roman"/>
+          <w:sz w:val="28"/>
+        </w:rPr>
+        <w:t>`Service Note Processor`: обработка служебных записок, версионирование и сопоставительный Diff-анализ;</w:t>
+      </w:r>
+    </w:p>
+    <w:p>
+      <w:pPr>
+        <w:spacing w:line="276" w:lineRule="auto" w:after="60"/>
+        <w:ind w:left="992"/>
+        <w:jc w:val="both"/>
+      </w:pPr>
+      <w:r>
+        <w:rPr>
+          <w:rFonts w:ascii="Times New Roman" w:hAnsi="Times New Roman"/>
+          <w:b w:val="0"/>
+          <w:sz w:val="28"/>
+        </w:rPr>
+        <w:t xml:space="preserve">• </w:t>
+      </w:r>
+      <w:r>
+        <w:rPr>
+          <w:rFonts w:ascii="Times New Roman" w:hAnsi="Times New Roman"/>
+          <w:sz w:val="28"/>
+        </w:rPr>
+        <w:t>`Catalog &amp; Search Engine`: публичный реестр, категоризация и фильтрация;</w:t>
+      </w:r>
+    </w:p>
+    <w:p>
+      <w:pPr>
+        <w:spacing w:line="276" w:lineRule="auto" w:after="60"/>
+        <w:ind w:left="992"/>
+        <w:jc w:val="both"/>
+      </w:pPr>
+      <w:r>
+        <w:rPr>
+          <w:rFonts w:ascii="Times New Roman" w:hAnsi="Times New Roman"/>
+          <w:b w:val="0"/>
+          <w:sz w:val="28"/>
+        </w:rPr>
+        <w:t xml:space="preserve">• </w:t>
+      </w:r>
+      <w:r>
+        <w:rPr>
+          <w:rFonts w:ascii="Times New Roman" w:hAnsi="Times New Roman"/>
+          <w:sz w:val="28"/>
+        </w:rPr>
+        <w:t>`Export &amp; Print Service`: генерация PDF/Excel бланков и титульных листов.</w:t>
+      </w:r>
+    </w:p>
+    <w:p>
+      <w:pPr>
+        <w:spacing w:line="276" w:lineRule="auto" w:after="60"/>
+        <w:ind w:left="709"/>
+        <w:jc w:val="both"/>
+      </w:pPr>
+      <w:r>
+        <w:rPr>
+          <w:rFonts w:ascii="Times New Roman" w:hAnsi="Times New Roman"/>
+          <w:b w:val="0"/>
+          <w:sz w:val="28"/>
+        </w:rPr>
+        <w:t xml:space="preserve">• </w:t>
+      </w:r>
+      <w:r>
+        <w:rPr>
+          <w:rFonts w:ascii="Times New Roman" w:hAnsi="Times New Roman"/>
+          <w:sz w:val="28"/>
+        </w:rPr>
+      </w:r>
+      <w:r>
+        <w:rPr>
+          <w:rFonts w:ascii="Times New Roman" w:hAnsi="Times New Roman"/>
+          <w:b/>
+          <w:sz w:val="28"/>
+        </w:rPr>
+        <w:t>Data Access &amp; Storage Layer (Уровень доступа к данным):</w:t>
+      </w:r>
+      <w:r>
+        <w:rPr>
+          <w:rFonts w:ascii="Times New Roman" w:hAnsi="Times New Roman"/>
+          <w:sz w:val="28"/>
+        </w:rPr>
+        <w:t xml:space="preserve"> `Database Engine`, `Audit Logger`, хранилище реляционных данных и цифровых слепков документов.</w:t>
+      </w:r>
+    </w:p>
+    <w:p>
+      <w:pPr>
+        <w:spacing w:before="240" w:after="120"/>
+        <w:jc w:val="left"/>
+      </w:pPr>
+      <w:r>
+        <w:rPr>
+          <w:rFonts w:ascii="Times New Roman" w:hAnsi="Times New Roman"/>
+          <w:b/>
+          <w:sz w:val="28"/>
+        </w:rPr>
+        <w:t>5. Диаграмма развертывания (Deployment Diagram)</w:t>
+      </w:r>
+    </w:p>
+    <w:p>
+      <w:pPr>
+        <w:spacing w:line="276" w:lineRule="auto" w:after="120"/>
+        <w:ind w:firstLine="709"/>
+        <w:jc w:val="both"/>
+      </w:pPr>
+      <w:r>
+        <w:rPr>
+          <w:rFonts w:ascii="Times New Roman" w:hAnsi="Times New Roman"/>
+          <w:sz w:val="28"/>
+        </w:rPr>
+        <w:t>Диаграмма развертывания специфицирует физическую топологию серверов, узлов и сетевых протоколов.</w:t>
+      </w:r>
+    </w:p>
+    <w:p>
+      <w:pPr>
+        <w:spacing w:before="200" w:after="80"/>
+        <w:jc w:val="center"/>
+      </w:pPr>
       <w:r>
         <w:drawing>
           <wp:inline xmlns:a="http://schemas.openxmlformats.org/drawingml/2006/main" xmlns:pic="http://schemas.openxmlformats.org/drawingml/2006/picture">
-            <wp:extent cx="6035040" cy="4119154"/>
+            <wp:extent cx="5760000" cy="3931429"/>
             <wp:docPr id="4" name="Picture 4"/>
             <wp:cNvGraphicFramePr>
               <a:graphicFrameLocks noChangeAspect="1"/>
@@ -365,7 +1316,7 @@
                     <pic:cNvPicPr/>
                   </pic:nvPicPr>
                   <pic:blipFill>
-                    <a:blip r:embed="rId12"/>
+                    <a:blip r:embed="rId13"/>
                     <a:stretch>
                       <a:fillRect/>
                     </a:stretch>
@@ -373,7 +1324,7 @@
                   <pic:spPr>
                     <a:xfrm>
                       <a:off x="0" y="0"/>
-                      <a:ext cx="6035040" cy="4119154"/>
+                      <a:ext cx="5760000" cy="3931429"/>
                     </a:xfrm>
                     <a:prstGeom prst="rect"/>
                   </pic:spPr>
@@ -386,38 +1337,249 @@
     </w:p>
     <w:p>
       <w:pPr>
+        <w:spacing w:before="80" w:after="240"/>
         <w:jc w:val="center"/>
       </w:pPr>
       <w:r>
         <w:rPr>
+          <w:rFonts w:ascii="Times New Roman" w:hAnsi="Times New Roman"/>
           <w:i/>
+          <w:sz w:val="24"/>
         </w:rPr>
-        <w:t>Рис. 4. Диаграмма развертывания портала</w:t>
-      </w:r>
-    </w:p>
-    <w:p>
-      <w:r>
-        <w:br w:type="page"/>
+        <w:t>Рисунок 4 — Диаграмма развертывания</w:t>
       </w:r>
     </w:p>
     <w:p>
       <w:pPr>
-        <w:pStyle w:val="Heading1"/>
+        <w:spacing w:before="160" w:after="80"/>
+        <w:jc w:val="left"/>
       </w:pPr>
       <w:r>
-        <w:t>5. Структура и схема базы данных (MariaDB / MySQL)</w:t>
+        <w:rPr>
+          <w:rFonts w:ascii="Times New Roman" w:hAnsi="Times New Roman"/>
+          <w:b/>
+          <w:sz w:val="26"/>
+        </w:rPr>
+        <w:t>Топологические узлы:</w:t>
       </w:r>
     </w:p>
     <w:p>
+      <w:pPr>
+        <w:spacing w:line="276" w:lineRule="auto" w:after="60"/>
+        <w:ind w:left="709"/>
+        <w:jc w:val="both"/>
+      </w:pPr>
       <w:r>
-        <w:t>Схема реляционной базы данных (ER-диаграмма) спроектирована в 3NF:</w:t>
+        <w:rPr>
+          <w:rFonts w:ascii="Times New Roman" w:hAnsi="Times New Roman"/>
+          <w:b w:val="0"/>
+          <w:sz w:val="28"/>
+        </w:rPr>
+        <w:t xml:space="preserve">• </w:t>
+      </w:r>
+      <w:r>
+        <w:rPr>
+          <w:rFonts w:ascii="Times New Roman" w:hAnsi="Times New Roman"/>
+          <w:sz w:val="28"/>
+        </w:rPr>
+      </w:r>
+      <w:r>
+        <w:rPr>
+          <w:rFonts w:ascii="Times New Roman" w:hAnsi="Times New Roman"/>
+          <w:b/>
+          <w:sz w:val="28"/>
+        </w:rPr>
+        <w:t>Client Workstation (Рабочая станция клиента):</w:t>
+      </w:r>
+      <w:r>
+        <w:rPr>
+          <w:rFonts w:ascii="Times New Roman" w:hAnsi="Times New Roman"/>
+          <w:sz w:val="28"/>
+        </w:rPr>
+        <w:t xml:space="preserve"> веб-браузер пользователя (HTTPS, порт 443).</w:t>
       </w:r>
     </w:p>
     <w:p>
+      <w:pPr>
+        <w:spacing w:line="276" w:lineRule="auto" w:after="60"/>
+        <w:ind w:left="709"/>
+        <w:jc w:val="both"/>
+      </w:pPr>
+      <w:r>
+        <w:rPr>
+          <w:rFonts w:ascii="Times New Roman" w:hAnsi="Times New Roman"/>
+          <w:b w:val="0"/>
+          <w:sz w:val="28"/>
+        </w:rPr>
+        <w:t xml:space="preserve">• </w:t>
+      </w:r>
+      <w:r>
+        <w:rPr>
+          <w:rFonts w:ascii="Times New Roman" w:hAnsi="Times New Roman"/>
+          <w:sz w:val="28"/>
+        </w:rPr>
+      </w:r>
+      <w:r>
+        <w:rPr>
+          <w:rFonts w:ascii="Times New Roman" w:hAnsi="Times New Roman"/>
+          <w:b/>
+          <w:sz w:val="28"/>
+        </w:rPr>
+        <w:t>Web / Reverse Proxy Server (Nginx):</w:t>
+      </w:r>
+      <w:r>
+        <w:rPr>
+          <w:rFonts w:ascii="Times New Roman" w:hAnsi="Times New Roman"/>
+          <w:sz w:val="28"/>
+        </w:rPr>
+        <w:t xml:space="preserve"> терминация SSL/TLS, статический кэш, защита от сетевых угроз WAF.</w:t>
+      </w:r>
+    </w:p>
+    <w:p>
+      <w:pPr>
+        <w:spacing w:line="276" w:lineRule="auto" w:after="60"/>
+        <w:ind w:left="709"/>
+        <w:jc w:val="both"/>
+      </w:pPr>
+      <w:r>
+        <w:rPr>
+          <w:rFonts w:ascii="Times New Roman" w:hAnsi="Times New Roman"/>
+          <w:b w:val="0"/>
+          <w:sz w:val="28"/>
+        </w:rPr>
+        <w:t xml:space="preserve">• </w:t>
+      </w:r>
+      <w:r>
+        <w:rPr>
+          <w:rFonts w:ascii="Times New Roman" w:hAnsi="Times New Roman"/>
+          <w:sz w:val="28"/>
+        </w:rPr>
+      </w:r>
+      <w:r>
+        <w:rPr>
+          <w:rFonts w:ascii="Times New Roman" w:hAnsi="Times New Roman"/>
+          <w:b/>
+          <w:sz w:val="28"/>
+        </w:rPr>
+        <w:t>Application Server (Python/Flask WSGI):</w:t>
+      </w:r>
+      <w:r>
+        <w:rPr>
+          <w:rFonts w:ascii="Times New Roman" w:hAnsi="Times New Roman"/>
+          <w:sz w:val="28"/>
+        </w:rPr>
+        <w:t xml:space="preserve"> исполняемая среда ядра веб-портала и кастомных модулей АНОК, пул воркеров Gunicorn.</w:t>
+      </w:r>
+    </w:p>
+    <w:p>
+      <w:pPr>
+        <w:spacing w:line="276" w:lineRule="auto" w:after="60"/>
+        <w:ind w:left="709"/>
+        <w:jc w:val="both"/>
+      </w:pPr>
+      <w:r>
+        <w:rPr>
+          <w:rFonts w:ascii="Times New Roman" w:hAnsi="Times New Roman"/>
+          <w:b w:val="0"/>
+          <w:sz w:val="28"/>
+        </w:rPr>
+        <w:t xml:space="preserve">• </w:t>
+      </w:r>
+      <w:r>
+        <w:rPr>
+          <w:rFonts w:ascii="Times New Roman" w:hAnsi="Times New Roman"/>
+          <w:sz w:val="28"/>
+        </w:rPr>
+      </w:r>
+      <w:r>
+        <w:rPr>
+          <w:rFonts w:ascii="Times New Roman" w:hAnsi="Times New Roman"/>
+          <w:b/>
+          <w:sz w:val="28"/>
+        </w:rPr>
+        <w:t>Database Server (MariaDB / SQLite):</w:t>
+      </w:r>
+      <w:r>
+        <w:rPr>
+          <w:rFonts w:ascii="Times New Roman" w:hAnsi="Times New Roman"/>
+          <w:sz w:val="28"/>
+        </w:rPr>
+        <w:t xml:space="preserve"> хранилище нормализованных данных, транзакционный журнал и журналы аудита (порт 3306 / локальный файл).</w:t>
+      </w:r>
+    </w:p>
+    <w:p>
+      <w:pPr>
+        <w:spacing w:line="276" w:lineRule="auto" w:after="60"/>
+        <w:ind w:left="709"/>
+        <w:jc w:val="both"/>
+      </w:pPr>
+      <w:r>
+        <w:rPr>
+          <w:rFonts w:ascii="Times New Roman" w:hAnsi="Times New Roman"/>
+          <w:b w:val="0"/>
+          <w:sz w:val="28"/>
+        </w:rPr>
+        <w:t xml:space="preserve">• </w:t>
+      </w:r>
+      <w:r>
+        <w:rPr>
+          <w:rFonts w:ascii="Times New Roman" w:hAnsi="Times New Roman"/>
+          <w:sz w:val="28"/>
+        </w:rPr>
+      </w:r>
+      <w:r>
+        <w:rPr>
+          <w:rFonts w:ascii="Times New Roman" w:hAnsi="Times New Roman"/>
+          <w:b/>
+          <w:sz w:val="28"/>
+        </w:rPr>
+        <w:t>File &amp; Document Storage:</w:t>
+      </w:r>
+      <w:r>
+        <w:rPr>
+          <w:rFonts w:ascii="Times New Roman" w:hAnsi="Times New Roman"/>
+          <w:sz w:val="28"/>
+        </w:rPr>
+        <w:t xml:space="preserve"> хранение сформированных отчетов в форматах PDF/Excel и протоколов валидации.</w:t>
+      </w:r>
+    </w:p>
+    <w:p>
+      <w:pPr>
+        <w:spacing w:before="240" w:after="120"/>
+        <w:jc w:val="left"/>
+      </w:pPr>
+      <w:r>
+        <w:rPr>
+          <w:rFonts w:ascii="Times New Roman" w:hAnsi="Times New Roman"/>
+          <w:b/>
+          <w:sz w:val="28"/>
+        </w:rPr>
+        <w:t>6. Структура и схема базы данных</w:t>
+      </w:r>
+    </w:p>
+    <w:p>
+      <w:pPr>
+        <w:spacing w:line="276" w:lineRule="auto" w:after="120"/>
+        <w:ind w:firstLine="709"/>
+        <w:jc w:val="both"/>
+      </w:pPr>
+      <w:r>
+        <w:rPr>
+          <w:rFonts w:ascii="Times New Roman" w:hAnsi="Times New Roman"/>
+          <w:sz w:val="28"/>
+        </w:rPr>
+        <w:t>Реляционная модель спроектирована в 3-й нормальной форме (3NF) и обеспечивает полную ссылочную целостность данных за счет внешних ключей `FOREIGN KEY` и уникальных индексов.</w:t>
+      </w:r>
+    </w:p>
+    <w:p>
+      <w:pPr>
+        <w:spacing w:before="200" w:after="80"/>
+        <w:jc w:val="center"/>
+      </w:pPr>
       <w:r>
         <w:drawing>
           <wp:inline xmlns:a="http://schemas.openxmlformats.org/drawingml/2006/main" xmlns:pic="http://schemas.openxmlformats.org/drawingml/2006/picture">
-            <wp:extent cx="6035040" cy="4137229"/>
+            <wp:extent cx="5760000" cy="3948679"/>
             <wp:docPr id="5" name="Picture 5"/>
             <wp:cNvGraphicFramePr>
               <a:graphicFrameLocks noChangeAspect="1"/>
@@ -430,7 +1592,7 @@
                     <pic:cNvPicPr/>
                   </pic:nvPicPr>
                   <pic:blipFill>
-                    <a:blip r:embed="rId13"/>
+                    <a:blip r:embed="rId14"/>
                     <a:stretch>
                       <a:fillRect/>
                     </a:stretch>
@@ -438,7 +1600,7 @@
                   <pic:spPr>
                     <a:xfrm>
                       <a:off x="0" y="0"/>
-                      <a:ext cx="6035040" cy="4137229"/>
+                      <a:ext cx="5760000" cy="3948679"/>
                     </a:xfrm>
                     <a:prstGeom prst="rect"/>
                   </pic:spPr>
@@ -451,41 +1613,1490 @@
     </w:p>
     <w:p>
       <w:pPr>
+        <w:spacing w:before="80" w:after="240"/>
         <w:jc w:val="center"/>
       </w:pPr>
       <w:r>
         <w:rPr>
+          <w:rFonts w:ascii="Times New Roman" w:hAnsi="Times New Roman"/>
           <w:i/>
+          <w:sz w:val="24"/>
         </w:rPr>
-        <w:t>Рис. 5. Физическая схема базы данных (ERD)</w:t>
-      </w:r>
-    </w:p>
-    <w:p>
-      <w:r>
-        <w:br w:type="page"/>
+        <w:t>Рисунок 5 — Схема базы данных ERD</w:t>
       </w:r>
     </w:p>
     <w:p>
       <w:pPr>
-        <w:pStyle w:val="Heading1"/>
+        <w:spacing w:before="160" w:after="80"/>
+        <w:ind w:firstLine="709"/>
+        <w:jc w:val="left"/>
       </w:pPr>
       <w:r>
-        <w:t>6. Примеры работы установленного и настроенного ПО</w:t>
+        <w:rPr>
+          <w:rFonts w:ascii="Times New Roman" w:hAnsi="Times New Roman"/>
+          <w:b/>
+          <w:sz w:val="24"/>
+        </w:rPr>
+        <w:t>Таблица 1 — Спецификация данных</w:t>
+      </w:r>
+    </w:p>
+    <w:tbl>
+      <w:tblPr>
+        <w:tblW w:type="auto" w:w="0"/>
+        <w:jc w:val="center"/>
+        <w:tblLook w:firstColumn="1" w:firstRow="1" w:lastColumn="0" w:lastRow="0" w:noHBand="0" w:noVBand="1" w:val="04A0"/>
+        <w:tblBorders>
+          <w:top w:val="single" w:sz="4" w:space="0" w:color="CBD5E1"/>
+          <w:bottom w:val="single" w:sz="4" w:space="0" w:color="CBD5E1"/>
+          <w:insideH w:val="single" w:sz="4" w:space="0" w:color="CBD5E1"/>
+          <w:insideV w:val="single" w:sz="4" w:space="0" w:color="CBD5E1"/>
+          <w:left w:val="single" w:sz="4" w:space="0" w:color="CBD5E1"/>
+          <w:right w:val="single" w:sz="4" w:space="0" w:color="CBD5E1"/>
+        </w:tblBorders>
+      </w:tblPr>
+      <w:tblGrid>
+        <w:gridCol w:w="2339"/>
+        <w:gridCol w:w="2339"/>
+        <w:gridCol w:w="2339"/>
+        <w:gridCol w:w="2339"/>
+      </w:tblGrid>
+      <w:tr>
+        <w:tc>
+          <w:tcPr>
+            <w:tcW w:type="dxa" w:w="2339"/>
+            <w:tcMar>
+              <w:top w:w="100" w:type="dxa"/>
+              <w:bottom w:w="100" w:type="dxa"/>
+              <w:left w:w="150" w:type="dxa"/>
+              <w:right w:w="150" w:type="dxa"/>
+            </w:tcMar>
+            <w:shd w:fill="E2E8F0"/>
+          </w:tcPr>
+          <w:p>
+            <w:pPr>
+              <w:spacing w:before="40" w:after="40" w:line="252" w:lineRule="auto"/>
+              <w:jc w:val="left"/>
+            </w:pPr>
+            <w:r>
+              <w:rPr>
+                <w:rFonts w:ascii="Times New Roman" w:hAnsi="Times New Roman"/>
+                <w:b/>
+                <w:sz w:val="22"/>
+              </w:rPr>
+              <w:t>Таблица</w:t>
+            </w:r>
+          </w:p>
+        </w:tc>
+        <w:tc>
+          <w:tcPr>
+            <w:tcW w:type="dxa" w:w="2339"/>
+            <w:tcMar>
+              <w:top w:w="100" w:type="dxa"/>
+              <w:bottom w:w="100" w:type="dxa"/>
+              <w:left w:w="150" w:type="dxa"/>
+              <w:right w:w="150" w:type="dxa"/>
+            </w:tcMar>
+            <w:shd w:fill="E2E8F0"/>
+          </w:tcPr>
+          <w:p>
+            <w:pPr>
+              <w:spacing w:before="40" w:after="40" w:line="252" w:lineRule="auto"/>
+              <w:jc w:val="left"/>
+            </w:pPr>
+            <w:r>
+              <w:rPr>
+                <w:rFonts w:ascii="Times New Roman" w:hAnsi="Times New Roman"/>
+                <w:b/>
+                <w:sz w:val="22"/>
+              </w:rPr>
+              <w:t>Первичный ключ</w:t>
+            </w:r>
+          </w:p>
+        </w:tc>
+        <w:tc>
+          <w:tcPr>
+            <w:tcW w:type="dxa" w:w="2339"/>
+            <w:tcMar>
+              <w:top w:w="100" w:type="dxa"/>
+              <w:bottom w:w="100" w:type="dxa"/>
+              <w:left w:w="150" w:type="dxa"/>
+              <w:right w:w="150" w:type="dxa"/>
+            </w:tcMar>
+            <w:shd w:fill="E2E8F0"/>
+          </w:tcPr>
+          <w:p>
+            <w:pPr>
+              <w:spacing w:before="40" w:after="40" w:line="252" w:lineRule="auto"/>
+              <w:jc w:val="left"/>
+            </w:pPr>
+            <w:r>
+              <w:rPr>
+                <w:rFonts w:ascii="Times New Roman" w:hAnsi="Times New Roman"/>
+                <w:b/>
+                <w:sz w:val="22"/>
+              </w:rPr>
+              <w:t>Внешние ключи</w:t>
+            </w:r>
+          </w:p>
+        </w:tc>
+        <w:tc>
+          <w:tcPr>
+            <w:tcW w:type="dxa" w:w="2339"/>
+            <w:tcMar>
+              <w:top w:w="100" w:type="dxa"/>
+              <w:bottom w:w="100" w:type="dxa"/>
+              <w:left w:w="150" w:type="dxa"/>
+              <w:right w:w="150" w:type="dxa"/>
+            </w:tcMar>
+            <w:shd w:fill="E2E8F0"/>
+          </w:tcPr>
+          <w:p>
+            <w:pPr>
+              <w:spacing w:before="40" w:after="40" w:line="252" w:lineRule="auto"/>
+              <w:jc w:val="left"/>
+            </w:pPr>
+            <w:r>
+              <w:rPr>
+                <w:rFonts w:ascii="Times New Roman" w:hAnsi="Times New Roman"/>
+                <w:b/>
+                <w:sz w:val="22"/>
+              </w:rPr>
+              <w:t>Описание назначения сущности</w:t>
+            </w:r>
+          </w:p>
+        </w:tc>
+      </w:tr>
+      <w:tr>
+        <w:tc>
+          <w:tcPr>
+            <w:tcW w:type="dxa" w:w="2339"/>
+            <w:tcMar>
+              <w:top w:w="100" w:type="dxa"/>
+              <w:bottom w:w="100" w:type="dxa"/>
+              <w:left w:w="150" w:type="dxa"/>
+              <w:right w:w="150" w:type="dxa"/>
+            </w:tcMar>
+          </w:tcPr>
+          <w:p>
+            <w:pPr>
+              <w:spacing w:before="40" w:after="40" w:line="252" w:lineRule="auto"/>
+              <w:jc w:val="left"/>
+            </w:pPr>
+            <w:r>
+              <w:rPr>
+                <w:rFonts w:ascii="Times New Roman" w:hAnsi="Times New Roman"/>
+                <w:sz w:val="22"/>
+              </w:rPr>
+              <w:t>`roles`</w:t>
+            </w:r>
+          </w:p>
+        </w:tc>
+        <w:tc>
+          <w:tcPr>
+            <w:tcW w:type="dxa" w:w="2339"/>
+            <w:tcMar>
+              <w:top w:w="100" w:type="dxa"/>
+              <w:bottom w:w="100" w:type="dxa"/>
+              <w:left w:w="150" w:type="dxa"/>
+              <w:right w:w="150" w:type="dxa"/>
+            </w:tcMar>
+          </w:tcPr>
+          <w:p>
+            <w:pPr>
+              <w:spacing w:before="40" w:after="40" w:line="252" w:lineRule="auto"/>
+              <w:jc w:val="left"/>
+            </w:pPr>
+            <w:r>
+              <w:rPr>
+                <w:rFonts w:ascii="Times New Roman" w:hAnsi="Times New Roman"/>
+                <w:sz w:val="22"/>
+              </w:rPr>
+              <w:t>`id`</w:t>
+            </w:r>
+          </w:p>
+        </w:tc>
+        <w:tc>
+          <w:tcPr>
+            <w:tcW w:type="dxa" w:w="2339"/>
+            <w:tcMar>
+              <w:top w:w="100" w:type="dxa"/>
+              <w:bottom w:w="100" w:type="dxa"/>
+              <w:left w:w="150" w:type="dxa"/>
+              <w:right w:w="150" w:type="dxa"/>
+            </w:tcMar>
+          </w:tcPr>
+          <w:p>
+            <w:pPr>
+              <w:spacing w:before="40" w:after="40" w:line="252" w:lineRule="auto"/>
+              <w:jc w:val="left"/>
+            </w:pPr>
+            <w:r>
+              <w:rPr>
+                <w:rFonts w:ascii="Times New Roman" w:hAnsi="Times New Roman"/>
+                <w:sz w:val="22"/>
+              </w:rPr>
+              <w:t>—</w:t>
+            </w:r>
+          </w:p>
+        </w:tc>
+        <w:tc>
+          <w:tcPr>
+            <w:tcW w:type="dxa" w:w="2339"/>
+            <w:tcMar>
+              <w:top w:w="100" w:type="dxa"/>
+              <w:bottom w:w="100" w:type="dxa"/>
+              <w:left w:w="150" w:type="dxa"/>
+              <w:right w:w="150" w:type="dxa"/>
+            </w:tcMar>
+          </w:tcPr>
+          <w:p>
+            <w:pPr>
+              <w:spacing w:before="40" w:after="40" w:line="252" w:lineRule="auto"/>
+              <w:jc w:val="left"/>
+            </w:pPr>
+            <w:r>
+              <w:rPr>
+                <w:rFonts w:ascii="Times New Roman" w:hAnsi="Times New Roman"/>
+                <w:sz w:val="22"/>
+              </w:rPr>
+              <w:t>Ролевые профили пользователей (RBAC-матрица)</w:t>
+            </w:r>
+          </w:p>
+        </w:tc>
+      </w:tr>
+      <w:tr>
+        <w:tc>
+          <w:tcPr>
+            <w:tcW w:type="dxa" w:w="2339"/>
+            <w:tcMar>
+              <w:top w:w="100" w:type="dxa"/>
+              <w:bottom w:w="100" w:type="dxa"/>
+              <w:left w:w="150" w:type="dxa"/>
+              <w:right w:w="150" w:type="dxa"/>
+            </w:tcMar>
+          </w:tcPr>
+          <w:p>
+            <w:pPr>
+              <w:spacing w:before="40" w:after="40" w:line="252" w:lineRule="auto"/>
+              <w:jc w:val="left"/>
+            </w:pPr>
+            <w:r>
+              <w:rPr>
+                <w:rFonts w:ascii="Times New Roman" w:hAnsi="Times New Roman"/>
+                <w:sz w:val="22"/>
+              </w:rPr>
+              <w:t>`departments`</w:t>
+            </w:r>
+          </w:p>
+        </w:tc>
+        <w:tc>
+          <w:tcPr>
+            <w:tcW w:type="dxa" w:w="2339"/>
+            <w:tcMar>
+              <w:top w:w="100" w:type="dxa"/>
+              <w:bottom w:w="100" w:type="dxa"/>
+              <w:left w:w="150" w:type="dxa"/>
+              <w:right w:w="150" w:type="dxa"/>
+            </w:tcMar>
+          </w:tcPr>
+          <w:p>
+            <w:pPr>
+              <w:spacing w:before="40" w:after="40" w:line="252" w:lineRule="auto"/>
+              <w:jc w:val="left"/>
+            </w:pPr>
+            <w:r>
+              <w:rPr>
+                <w:rFonts w:ascii="Times New Roman" w:hAnsi="Times New Roman"/>
+                <w:sz w:val="22"/>
+              </w:rPr>
+              <w:t>`id`</w:t>
+            </w:r>
+          </w:p>
+        </w:tc>
+        <w:tc>
+          <w:tcPr>
+            <w:tcW w:type="dxa" w:w="2339"/>
+            <w:tcMar>
+              <w:top w:w="100" w:type="dxa"/>
+              <w:bottom w:w="100" w:type="dxa"/>
+              <w:left w:w="150" w:type="dxa"/>
+              <w:right w:w="150" w:type="dxa"/>
+            </w:tcMar>
+          </w:tcPr>
+          <w:p>
+            <w:pPr>
+              <w:spacing w:before="40" w:after="40" w:line="252" w:lineRule="auto"/>
+              <w:jc w:val="left"/>
+            </w:pPr>
+            <w:r>
+              <w:rPr>
+                <w:rFonts w:ascii="Times New Roman" w:hAnsi="Times New Roman"/>
+                <w:sz w:val="22"/>
+              </w:rPr>
+              <w:t>`head_user_id → users.id`</w:t>
+            </w:r>
+          </w:p>
+        </w:tc>
+        <w:tc>
+          <w:tcPr>
+            <w:tcW w:type="dxa" w:w="2339"/>
+            <w:tcMar>
+              <w:top w:w="100" w:type="dxa"/>
+              <w:bottom w:w="100" w:type="dxa"/>
+              <w:left w:w="150" w:type="dxa"/>
+              <w:right w:w="150" w:type="dxa"/>
+            </w:tcMar>
+          </w:tcPr>
+          <w:p>
+            <w:pPr>
+              <w:spacing w:before="40" w:after="40" w:line="252" w:lineRule="auto"/>
+              <w:jc w:val="left"/>
+            </w:pPr>
+            <w:r>
+              <w:rPr>
+                <w:rFonts w:ascii="Times New Roman" w:hAnsi="Times New Roman"/>
+                <w:sz w:val="22"/>
+              </w:rPr>
+              <w:t>Кафедры, факультеты и административные подразделения</w:t>
+            </w:r>
+          </w:p>
+        </w:tc>
+      </w:tr>
+      <w:tr>
+        <w:tc>
+          <w:tcPr>
+            <w:tcW w:type="dxa" w:w="2339"/>
+            <w:tcMar>
+              <w:top w:w="100" w:type="dxa"/>
+              <w:bottom w:w="100" w:type="dxa"/>
+              <w:left w:w="150" w:type="dxa"/>
+              <w:right w:w="150" w:type="dxa"/>
+            </w:tcMar>
+          </w:tcPr>
+          <w:p>
+            <w:pPr>
+              <w:spacing w:before="40" w:after="40" w:line="252" w:lineRule="auto"/>
+              <w:jc w:val="left"/>
+            </w:pPr>
+            <w:r>
+              <w:rPr>
+                <w:rFonts w:ascii="Times New Roman" w:hAnsi="Times New Roman"/>
+                <w:sz w:val="22"/>
+              </w:rPr>
+              <w:t>`users`</w:t>
+            </w:r>
+          </w:p>
+        </w:tc>
+        <w:tc>
+          <w:tcPr>
+            <w:tcW w:type="dxa" w:w="2339"/>
+            <w:tcMar>
+              <w:top w:w="100" w:type="dxa"/>
+              <w:bottom w:w="100" w:type="dxa"/>
+              <w:left w:w="150" w:type="dxa"/>
+              <w:right w:w="150" w:type="dxa"/>
+            </w:tcMar>
+          </w:tcPr>
+          <w:p>
+            <w:pPr>
+              <w:spacing w:before="40" w:after="40" w:line="252" w:lineRule="auto"/>
+              <w:jc w:val="left"/>
+            </w:pPr>
+            <w:r>
+              <w:rPr>
+                <w:rFonts w:ascii="Times New Roman" w:hAnsi="Times New Roman"/>
+                <w:sz w:val="22"/>
+              </w:rPr>
+              <w:t>`id`</w:t>
+            </w:r>
+          </w:p>
+        </w:tc>
+        <w:tc>
+          <w:tcPr>
+            <w:tcW w:type="dxa" w:w="2339"/>
+            <w:tcMar>
+              <w:top w:w="100" w:type="dxa"/>
+              <w:bottom w:w="100" w:type="dxa"/>
+              <w:left w:w="150" w:type="dxa"/>
+              <w:right w:w="150" w:type="dxa"/>
+            </w:tcMar>
+          </w:tcPr>
+          <w:p>
+            <w:pPr>
+              <w:spacing w:before="40" w:after="40" w:line="252" w:lineRule="auto"/>
+              <w:jc w:val="left"/>
+            </w:pPr>
+            <w:r>
+              <w:rPr>
+                <w:rFonts w:ascii="Times New Roman" w:hAnsi="Times New Roman"/>
+                <w:sz w:val="22"/>
+              </w:rPr>
+              <w:t>`role_id → roles.id`, `dept_id → departments.id`</w:t>
+            </w:r>
+          </w:p>
+        </w:tc>
+        <w:tc>
+          <w:tcPr>
+            <w:tcW w:type="dxa" w:w="2339"/>
+            <w:tcMar>
+              <w:top w:w="100" w:type="dxa"/>
+              <w:bottom w:w="100" w:type="dxa"/>
+              <w:left w:w="150" w:type="dxa"/>
+              <w:right w:w="150" w:type="dxa"/>
+            </w:tcMar>
+          </w:tcPr>
+          <w:p>
+            <w:pPr>
+              <w:spacing w:before="40" w:after="40" w:line="252" w:lineRule="auto"/>
+              <w:jc w:val="left"/>
+            </w:pPr>
+            <w:r>
+              <w:rPr>
+                <w:rFonts w:ascii="Times New Roman" w:hAnsi="Times New Roman"/>
+                <w:sz w:val="22"/>
+              </w:rPr>
+              <w:t>Учетные записи сотрудников университета</w:t>
+            </w:r>
+          </w:p>
+        </w:tc>
+      </w:tr>
+      <w:tr>
+        <w:tc>
+          <w:tcPr>
+            <w:tcW w:type="dxa" w:w="2339"/>
+            <w:tcMar>
+              <w:top w:w="100" w:type="dxa"/>
+              <w:bottom w:w="100" w:type="dxa"/>
+              <w:left w:w="150" w:type="dxa"/>
+              <w:right w:w="150" w:type="dxa"/>
+            </w:tcMar>
+          </w:tcPr>
+          <w:p>
+            <w:pPr>
+              <w:spacing w:before="40" w:after="40" w:line="252" w:lineRule="auto"/>
+              <w:jc w:val="left"/>
+            </w:pPr>
+            <w:r>
+              <w:rPr>
+                <w:rFonts w:ascii="Times New Roman" w:hAnsi="Times New Roman"/>
+                <w:sz w:val="22"/>
+              </w:rPr>
+              <w:t>`standards_fgos`</w:t>
+            </w:r>
+          </w:p>
+        </w:tc>
+        <w:tc>
+          <w:tcPr>
+            <w:tcW w:type="dxa" w:w="2339"/>
+            <w:tcMar>
+              <w:top w:w="100" w:type="dxa"/>
+              <w:bottom w:w="100" w:type="dxa"/>
+              <w:left w:w="150" w:type="dxa"/>
+              <w:right w:w="150" w:type="dxa"/>
+            </w:tcMar>
+          </w:tcPr>
+          <w:p>
+            <w:pPr>
+              <w:spacing w:before="40" w:after="40" w:line="252" w:lineRule="auto"/>
+              <w:jc w:val="left"/>
+            </w:pPr>
+            <w:r>
+              <w:rPr>
+                <w:rFonts w:ascii="Times New Roman" w:hAnsi="Times New Roman"/>
+                <w:sz w:val="22"/>
+              </w:rPr>
+              <w:t>`id`</w:t>
+            </w:r>
+          </w:p>
+        </w:tc>
+        <w:tc>
+          <w:tcPr>
+            <w:tcW w:type="dxa" w:w="2339"/>
+            <w:tcMar>
+              <w:top w:w="100" w:type="dxa"/>
+              <w:bottom w:w="100" w:type="dxa"/>
+              <w:left w:w="150" w:type="dxa"/>
+              <w:right w:w="150" w:type="dxa"/>
+            </w:tcMar>
+          </w:tcPr>
+          <w:p>
+            <w:pPr>
+              <w:spacing w:before="40" w:after="40" w:line="252" w:lineRule="auto"/>
+              <w:jc w:val="left"/>
+            </w:pPr>
+            <w:r>
+              <w:rPr>
+                <w:rFonts w:ascii="Times New Roman" w:hAnsi="Times New Roman"/>
+                <w:sz w:val="22"/>
+              </w:rPr>
+              <w:t>—</w:t>
+            </w:r>
+          </w:p>
+        </w:tc>
+        <w:tc>
+          <w:tcPr>
+            <w:tcW w:type="dxa" w:w="2339"/>
+            <w:tcMar>
+              <w:top w:w="100" w:type="dxa"/>
+              <w:bottom w:w="100" w:type="dxa"/>
+              <w:left w:w="150" w:type="dxa"/>
+              <w:right w:w="150" w:type="dxa"/>
+            </w:tcMar>
+          </w:tcPr>
+          <w:p>
+            <w:pPr>
+              <w:spacing w:before="40" w:after="40" w:line="252" w:lineRule="auto"/>
+              <w:jc w:val="left"/>
+            </w:pPr>
+            <w:r>
+              <w:rPr>
+                <w:rFonts w:ascii="Times New Roman" w:hAnsi="Times New Roman"/>
+                <w:sz w:val="22"/>
+              </w:rPr>
+              <w:t>Нормативные стандарты ФГОС ВО 3++ и числовые лимиты</w:t>
+            </w:r>
+          </w:p>
+        </w:tc>
+      </w:tr>
+      <w:tr>
+        <w:tc>
+          <w:tcPr>
+            <w:tcW w:type="dxa" w:w="2339"/>
+            <w:tcMar>
+              <w:top w:w="100" w:type="dxa"/>
+              <w:bottom w:w="100" w:type="dxa"/>
+              <w:left w:w="150" w:type="dxa"/>
+              <w:right w:w="150" w:type="dxa"/>
+            </w:tcMar>
+          </w:tcPr>
+          <w:p>
+            <w:pPr>
+              <w:spacing w:before="40" w:after="40" w:line="252" w:lineRule="auto"/>
+              <w:jc w:val="left"/>
+            </w:pPr>
+            <w:r>
+              <w:rPr>
+                <w:rFonts w:ascii="Times New Roman" w:hAnsi="Times New Roman"/>
+                <w:sz w:val="22"/>
+              </w:rPr>
+              <w:t>`educational_programs`</w:t>
+            </w:r>
+          </w:p>
+        </w:tc>
+        <w:tc>
+          <w:tcPr>
+            <w:tcW w:type="dxa" w:w="2339"/>
+            <w:tcMar>
+              <w:top w:w="100" w:type="dxa"/>
+              <w:bottom w:w="100" w:type="dxa"/>
+              <w:left w:w="150" w:type="dxa"/>
+              <w:right w:w="150" w:type="dxa"/>
+            </w:tcMar>
+          </w:tcPr>
+          <w:p>
+            <w:pPr>
+              <w:spacing w:before="40" w:after="40" w:line="252" w:lineRule="auto"/>
+              <w:jc w:val="left"/>
+            </w:pPr>
+            <w:r>
+              <w:rPr>
+                <w:rFonts w:ascii="Times New Roman" w:hAnsi="Times New Roman"/>
+                <w:sz w:val="22"/>
+              </w:rPr>
+              <w:t>`id`</w:t>
+            </w:r>
+          </w:p>
+        </w:tc>
+        <w:tc>
+          <w:tcPr>
+            <w:tcW w:type="dxa" w:w="2339"/>
+            <w:tcMar>
+              <w:top w:w="100" w:type="dxa"/>
+              <w:bottom w:w="100" w:type="dxa"/>
+              <w:left w:w="150" w:type="dxa"/>
+              <w:right w:w="150" w:type="dxa"/>
+            </w:tcMar>
+          </w:tcPr>
+          <w:p>
+            <w:pPr>
+              <w:spacing w:before="40" w:after="40" w:line="252" w:lineRule="auto"/>
+              <w:jc w:val="left"/>
+            </w:pPr>
+            <w:r>
+              <w:rPr>
+                <w:rFonts w:ascii="Times New Roman" w:hAnsi="Times New Roman"/>
+                <w:sz w:val="22"/>
+              </w:rPr>
+              <w:t>`fgos_id → standards_fgos.id`, `dept_id → departments.id`</w:t>
+            </w:r>
+          </w:p>
+        </w:tc>
+        <w:tc>
+          <w:tcPr>
+            <w:tcW w:type="dxa" w:w="2339"/>
+            <w:tcMar>
+              <w:top w:w="100" w:type="dxa"/>
+              <w:bottom w:w="100" w:type="dxa"/>
+              <w:left w:w="150" w:type="dxa"/>
+              <w:right w:w="150" w:type="dxa"/>
+            </w:tcMar>
+          </w:tcPr>
+          <w:p>
+            <w:pPr>
+              <w:spacing w:before="40" w:after="40" w:line="252" w:lineRule="auto"/>
+              <w:jc w:val="left"/>
+            </w:pPr>
+            <w:r>
+              <w:rPr>
+                <w:rFonts w:ascii="Times New Roman" w:hAnsi="Times New Roman"/>
+                <w:sz w:val="22"/>
+              </w:rPr>
+              <w:t>Образовательные программы бакалавриата и магистратуры</w:t>
+            </w:r>
+          </w:p>
+        </w:tc>
+      </w:tr>
+      <w:tr>
+        <w:tc>
+          <w:tcPr>
+            <w:tcW w:type="dxa" w:w="2339"/>
+            <w:tcMar>
+              <w:top w:w="100" w:type="dxa"/>
+              <w:bottom w:w="100" w:type="dxa"/>
+              <w:left w:w="150" w:type="dxa"/>
+              <w:right w:w="150" w:type="dxa"/>
+            </w:tcMar>
+          </w:tcPr>
+          <w:p>
+            <w:pPr>
+              <w:spacing w:before="40" w:after="40" w:line="252" w:lineRule="auto"/>
+              <w:jc w:val="left"/>
+            </w:pPr>
+            <w:r>
+              <w:rPr>
+                <w:rFonts w:ascii="Times New Roman" w:hAnsi="Times New Roman"/>
+                <w:sz w:val="22"/>
+              </w:rPr>
+              <w:t>`curriculums`</w:t>
+            </w:r>
+          </w:p>
+        </w:tc>
+        <w:tc>
+          <w:tcPr>
+            <w:tcW w:type="dxa" w:w="2339"/>
+            <w:tcMar>
+              <w:top w:w="100" w:type="dxa"/>
+              <w:bottom w:w="100" w:type="dxa"/>
+              <w:left w:w="150" w:type="dxa"/>
+              <w:right w:w="150" w:type="dxa"/>
+            </w:tcMar>
+          </w:tcPr>
+          <w:p>
+            <w:pPr>
+              <w:spacing w:before="40" w:after="40" w:line="252" w:lineRule="auto"/>
+              <w:jc w:val="left"/>
+            </w:pPr>
+            <w:r>
+              <w:rPr>
+                <w:rFonts w:ascii="Times New Roman" w:hAnsi="Times New Roman"/>
+                <w:sz w:val="22"/>
+              </w:rPr>
+              <w:t>`id`</w:t>
+            </w:r>
+          </w:p>
+        </w:tc>
+        <w:tc>
+          <w:tcPr>
+            <w:tcW w:type="dxa" w:w="2339"/>
+            <w:tcMar>
+              <w:top w:w="100" w:type="dxa"/>
+              <w:bottom w:w="100" w:type="dxa"/>
+              <w:left w:w="150" w:type="dxa"/>
+              <w:right w:w="150" w:type="dxa"/>
+            </w:tcMar>
+          </w:tcPr>
+          <w:p>
+            <w:pPr>
+              <w:spacing w:before="40" w:after="40" w:line="252" w:lineRule="auto"/>
+              <w:jc w:val="left"/>
+            </w:pPr>
+            <w:r>
+              <w:rPr>
+                <w:rFonts w:ascii="Times New Roman" w:hAnsi="Times New Roman"/>
+                <w:sz w:val="22"/>
+              </w:rPr>
+              <w:t>`program_id → educational_programs.id`</w:t>
+            </w:r>
+          </w:p>
+        </w:tc>
+        <w:tc>
+          <w:tcPr>
+            <w:tcW w:type="dxa" w:w="2339"/>
+            <w:tcMar>
+              <w:top w:w="100" w:type="dxa"/>
+              <w:bottom w:w="100" w:type="dxa"/>
+              <w:left w:w="150" w:type="dxa"/>
+              <w:right w:w="150" w:type="dxa"/>
+            </w:tcMar>
+          </w:tcPr>
+          <w:p>
+            <w:pPr>
+              <w:spacing w:before="40" w:after="40" w:line="252" w:lineRule="auto"/>
+              <w:jc w:val="left"/>
+            </w:pPr>
+            <w:r>
+              <w:rPr>
+                <w:rFonts w:ascii="Times New Roman" w:hAnsi="Times New Roman"/>
+                <w:sz w:val="22"/>
+              </w:rPr>
+              <w:t>Экземпляры учебных планов (версии v1.0, v1.1, статусы)</w:t>
+            </w:r>
+          </w:p>
+        </w:tc>
+      </w:tr>
+      <w:tr>
+        <w:tc>
+          <w:tcPr>
+            <w:tcW w:type="dxa" w:w="2339"/>
+            <w:tcMar>
+              <w:top w:w="100" w:type="dxa"/>
+              <w:bottom w:w="100" w:type="dxa"/>
+              <w:left w:w="150" w:type="dxa"/>
+              <w:right w:w="150" w:type="dxa"/>
+            </w:tcMar>
+          </w:tcPr>
+          <w:p>
+            <w:pPr>
+              <w:spacing w:before="40" w:after="40" w:line="252" w:lineRule="auto"/>
+              <w:jc w:val="left"/>
+            </w:pPr>
+            <w:r>
+              <w:rPr>
+                <w:rFonts w:ascii="Times New Roman" w:hAnsi="Times New Roman"/>
+                <w:sz w:val="22"/>
+              </w:rPr>
+              <w:t>`curriculum_disciplines`</w:t>
+            </w:r>
+          </w:p>
+        </w:tc>
+        <w:tc>
+          <w:tcPr>
+            <w:tcW w:type="dxa" w:w="2339"/>
+            <w:tcMar>
+              <w:top w:w="100" w:type="dxa"/>
+              <w:bottom w:w="100" w:type="dxa"/>
+              <w:left w:w="150" w:type="dxa"/>
+              <w:right w:w="150" w:type="dxa"/>
+            </w:tcMar>
+          </w:tcPr>
+          <w:p>
+            <w:pPr>
+              <w:spacing w:before="40" w:after="40" w:line="252" w:lineRule="auto"/>
+              <w:jc w:val="left"/>
+            </w:pPr>
+            <w:r>
+              <w:rPr>
+                <w:rFonts w:ascii="Times New Roman" w:hAnsi="Times New Roman"/>
+                <w:sz w:val="22"/>
+              </w:rPr>
+              <w:t>`id`</w:t>
+            </w:r>
+          </w:p>
+        </w:tc>
+        <w:tc>
+          <w:tcPr>
+            <w:tcW w:type="dxa" w:w="2339"/>
+            <w:tcMar>
+              <w:top w:w="100" w:type="dxa"/>
+              <w:bottom w:w="100" w:type="dxa"/>
+              <w:left w:w="150" w:type="dxa"/>
+              <w:right w:w="150" w:type="dxa"/>
+            </w:tcMar>
+          </w:tcPr>
+          <w:p>
+            <w:pPr>
+              <w:spacing w:before="40" w:after="40" w:line="252" w:lineRule="auto"/>
+              <w:jc w:val="left"/>
+            </w:pPr>
+            <w:r>
+              <w:rPr>
+                <w:rFonts w:ascii="Times New Roman" w:hAnsi="Times New Roman"/>
+                <w:sz w:val="22"/>
+              </w:rPr>
+              <w:t>`curriculum_id → curriculums.id`, `dept_id → departments.id`</w:t>
+            </w:r>
+          </w:p>
+        </w:tc>
+        <w:tc>
+          <w:tcPr>
+            <w:tcW w:type="dxa" w:w="2339"/>
+            <w:tcMar>
+              <w:top w:w="100" w:type="dxa"/>
+              <w:bottom w:w="100" w:type="dxa"/>
+              <w:left w:w="150" w:type="dxa"/>
+              <w:right w:w="150" w:type="dxa"/>
+            </w:tcMar>
+          </w:tcPr>
+          <w:p>
+            <w:pPr>
+              <w:spacing w:before="40" w:after="40" w:line="252" w:lineRule="auto"/>
+              <w:jc w:val="left"/>
+            </w:pPr>
+            <w:r>
+              <w:rPr>
+                <w:rFonts w:ascii="Times New Roman" w:hAnsi="Times New Roman"/>
+                <w:sz w:val="22"/>
+              </w:rPr>
+              <w:t>51 дисциплина 1–8 семестров с трудоемкостью в часах и з.е.</w:t>
+            </w:r>
+          </w:p>
+        </w:tc>
+      </w:tr>
+      <w:tr>
+        <w:tc>
+          <w:tcPr>
+            <w:tcW w:type="dxa" w:w="2339"/>
+            <w:tcMar>
+              <w:top w:w="100" w:type="dxa"/>
+              <w:bottom w:w="100" w:type="dxa"/>
+              <w:left w:w="150" w:type="dxa"/>
+              <w:right w:w="150" w:type="dxa"/>
+            </w:tcMar>
+          </w:tcPr>
+          <w:p>
+            <w:pPr>
+              <w:spacing w:before="40" w:after="40" w:line="252" w:lineRule="auto"/>
+              <w:jc w:val="left"/>
+            </w:pPr>
+            <w:r>
+              <w:rPr>
+                <w:rFonts w:ascii="Times New Roman" w:hAnsi="Times New Roman"/>
+                <w:sz w:val="22"/>
+              </w:rPr>
+              <w:t>`service_notes`</w:t>
+            </w:r>
+          </w:p>
+        </w:tc>
+        <w:tc>
+          <w:tcPr>
+            <w:tcW w:type="dxa" w:w="2339"/>
+            <w:tcMar>
+              <w:top w:w="100" w:type="dxa"/>
+              <w:bottom w:w="100" w:type="dxa"/>
+              <w:left w:w="150" w:type="dxa"/>
+              <w:right w:w="150" w:type="dxa"/>
+            </w:tcMar>
+          </w:tcPr>
+          <w:p>
+            <w:pPr>
+              <w:spacing w:before="40" w:after="40" w:line="252" w:lineRule="auto"/>
+              <w:jc w:val="left"/>
+            </w:pPr>
+            <w:r>
+              <w:rPr>
+                <w:rFonts w:ascii="Times New Roman" w:hAnsi="Times New Roman"/>
+                <w:sz w:val="22"/>
+              </w:rPr>
+              <w:t>`id`</w:t>
+            </w:r>
+          </w:p>
+        </w:tc>
+        <w:tc>
+          <w:tcPr>
+            <w:tcW w:type="dxa" w:w="2339"/>
+            <w:tcMar>
+              <w:top w:w="100" w:type="dxa"/>
+              <w:bottom w:w="100" w:type="dxa"/>
+              <w:left w:w="150" w:type="dxa"/>
+              <w:right w:w="150" w:type="dxa"/>
+            </w:tcMar>
+          </w:tcPr>
+          <w:p>
+            <w:pPr>
+              <w:spacing w:before="40" w:after="40" w:line="252" w:lineRule="auto"/>
+              <w:jc w:val="left"/>
+            </w:pPr>
+            <w:r>
+              <w:rPr>
+                <w:rFonts w:ascii="Times New Roman" w:hAnsi="Times New Roman"/>
+                <w:sz w:val="22"/>
+              </w:rPr>
+              <w:t>`curriculum_id → curriculums.id`, `user_id → users.id`</w:t>
+            </w:r>
+          </w:p>
+        </w:tc>
+        <w:tc>
+          <w:tcPr>
+            <w:tcW w:type="dxa" w:w="2339"/>
+            <w:tcMar>
+              <w:top w:w="100" w:type="dxa"/>
+              <w:bottom w:w="100" w:type="dxa"/>
+              <w:left w:w="150" w:type="dxa"/>
+              <w:right w:w="150" w:type="dxa"/>
+            </w:tcMar>
+          </w:tcPr>
+          <w:p>
+            <w:pPr>
+              <w:spacing w:before="40" w:after="40" w:line="252" w:lineRule="auto"/>
+              <w:jc w:val="left"/>
+            </w:pPr>
+            <w:r>
+              <w:rPr>
+                <w:rFonts w:ascii="Times New Roman" w:hAnsi="Times New Roman"/>
+                <w:sz w:val="22"/>
+              </w:rPr>
+              <w:t>Служебные записки на корректировку учебных планов</w:t>
+            </w:r>
+          </w:p>
+        </w:tc>
+      </w:tr>
+      <w:tr>
+        <w:tc>
+          <w:tcPr>
+            <w:tcW w:type="dxa" w:w="2339"/>
+            <w:tcMar>
+              <w:top w:w="100" w:type="dxa"/>
+              <w:bottom w:w="100" w:type="dxa"/>
+              <w:left w:w="150" w:type="dxa"/>
+              <w:right w:w="150" w:type="dxa"/>
+            </w:tcMar>
+          </w:tcPr>
+          <w:p>
+            <w:pPr>
+              <w:spacing w:before="40" w:after="40" w:line="252" w:lineRule="auto"/>
+              <w:jc w:val="left"/>
+            </w:pPr>
+            <w:r>
+              <w:rPr>
+                <w:rFonts w:ascii="Times New Roman" w:hAnsi="Times New Roman"/>
+                <w:sz w:val="22"/>
+              </w:rPr>
+              <w:t>`service_note_items`</w:t>
+            </w:r>
+          </w:p>
+        </w:tc>
+        <w:tc>
+          <w:tcPr>
+            <w:tcW w:type="dxa" w:w="2339"/>
+            <w:tcMar>
+              <w:top w:w="100" w:type="dxa"/>
+              <w:bottom w:w="100" w:type="dxa"/>
+              <w:left w:w="150" w:type="dxa"/>
+              <w:right w:w="150" w:type="dxa"/>
+            </w:tcMar>
+          </w:tcPr>
+          <w:p>
+            <w:pPr>
+              <w:spacing w:before="40" w:after="40" w:line="252" w:lineRule="auto"/>
+              <w:jc w:val="left"/>
+            </w:pPr>
+            <w:r>
+              <w:rPr>
+                <w:rFonts w:ascii="Times New Roman" w:hAnsi="Times New Roman"/>
+                <w:sz w:val="22"/>
+              </w:rPr>
+              <w:t>`id`</w:t>
+            </w:r>
+          </w:p>
+        </w:tc>
+        <w:tc>
+          <w:tcPr>
+            <w:tcW w:type="dxa" w:w="2339"/>
+            <w:tcMar>
+              <w:top w:w="100" w:type="dxa"/>
+              <w:bottom w:w="100" w:type="dxa"/>
+              <w:left w:w="150" w:type="dxa"/>
+              <w:right w:w="150" w:type="dxa"/>
+            </w:tcMar>
+          </w:tcPr>
+          <w:p>
+            <w:pPr>
+              <w:spacing w:before="40" w:after="40" w:line="252" w:lineRule="auto"/>
+              <w:jc w:val="left"/>
+            </w:pPr>
+            <w:r>
+              <w:rPr>
+                <w:rFonts w:ascii="Times New Roman" w:hAnsi="Times New Roman"/>
+                <w:sz w:val="22"/>
+              </w:rPr>
+              <w:t>`note_id → service_notes.id`, `disc_id → disciplines.id`</w:t>
+            </w:r>
+          </w:p>
+        </w:tc>
+        <w:tc>
+          <w:tcPr>
+            <w:tcW w:type="dxa" w:w="2339"/>
+            <w:tcMar>
+              <w:top w:w="100" w:type="dxa"/>
+              <w:bottom w:w="100" w:type="dxa"/>
+              <w:left w:w="150" w:type="dxa"/>
+              <w:right w:w="150" w:type="dxa"/>
+            </w:tcMar>
+          </w:tcPr>
+          <w:p>
+            <w:pPr>
+              <w:spacing w:before="40" w:after="40" w:line="252" w:lineRule="auto"/>
+              <w:jc w:val="left"/>
+            </w:pPr>
+            <w:r>
+              <w:rPr>
+                <w:rFonts w:ascii="Times New Roman" w:hAnsi="Times New Roman"/>
+                <w:sz w:val="22"/>
+              </w:rPr>
+              <w:t>Строки изменений дисциплин (JSON «Было / Стало»)</w:t>
+            </w:r>
+          </w:p>
+        </w:tc>
+      </w:tr>
+      <w:tr>
+        <w:tc>
+          <w:tcPr>
+            <w:tcW w:type="dxa" w:w="2339"/>
+            <w:tcMar>
+              <w:top w:w="100" w:type="dxa"/>
+              <w:bottom w:w="100" w:type="dxa"/>
+              <w:left w:w="150" w:type="dxa"/>
+              <w:right w:w="150" w:type="dxa"/>
+            </w:tcMar>
+          </w:tcPr>
+          <w:p>
+            <w:pPr>
+              <w:spacing w:before="40" w:after="40" w:line="252" w:lineRule="auto"/>
+              <w:jc w:val="left"/>
+            </w:pPr>
+            <w:r>
+              <w:rPr>
+                <w:rFonts w:ascii="Times New Roman" w:hAnsi="Times New Roman"/>
+                <w:sz w:val="22"/>
+              </w:rPr>
+              <w:t>`document_signatures`</w:t>
+            </w:r>
+          </w:p>
+        </w:tc>
+        <w:tc>
+          <w:tcPr>
+            <w:tcW w:type="dxa" w:w="2339"/>
+            <w:tcMar>
+              <w:top w:w="100" w:type="dxa"/>
+              <w:bottom w:w="100" w:type="dxa"/>
+              <w:left w:w="150" w:type="dxa"/>
+              <w:right w:w="150" w:type="dxa"/>
+            </w:tcMar>
+          </w:tcPr>
+          <w:p>
+            <w:pPr>
+              <w:spacing w:before="40" w:after="40" w:line="252" w:lineRule="auto"/>
+              <w:jc w:val="left"/>
+            </w:pPr>
+            <w:r>
+              <w:rPr>
+                <w:rFonts w:ascii="Times New Roman" w:hAnsi="Times New Roman"/>
+                <w:sz w:val="22"/>
+              </w:rPr>
+              <w:t>`id`</w:t>
+            </w:r>
+          </w:p>
+        </w:tc>
+        <w:tc>
+          <w:tcPr>
+            <w:tcW w:type="dxa" w:w="2339"/>
+            <w:tcMar>
+              <w:top w:w="100" w:type="dxa"/>
+              <w:bottom w:w="100" w:type="dxa"/>
+              <w:left w:w="150" w:type="dxa"/>
+              <w:right w:w="150" w:type="dxa"/>
+            </w:tcMar>
+          </w:tcPr>
+          <w:p>
+            <w:pPr>
+              <w:spacing w:before="40" w:after="40" w:line="252" w:lineRule="auto"/>
+              <w:jc w:val="left"/>
+            </w:pPr>
+            <w:r>
+              <w:rPr>
+                <w:rFonts w:ascii="Times New Roman" w:hAnsi="Times New Roman"/>
+                <w:sz w:val="22"/>
+              </w:rPr>
+              <w:t>`user_id → users.id`</w:t>
+            </w:r>
+          </w:p>
+        </w:tc>
+        <w:tc>
+          <w:tcPr>
+            <w:tcW w:type="dxa" w:w="2339"/>
+            <w:tcMar>
+              <w:top w:w="100" w:type="dxa"/>
+              <w:bottom w:w="100" w:type="dxa"/>
+              <w:left w:w="150" w:type="dxa"/>
+              <w:right w:w="150" w:type="dxa"/>
+            </w:tcMar>
+          </w:tcPr>
+          <w:p>
+            <w:pPr>
+              <w:spacing w:before="40" w:after="40" w:line="252" w:lineRule="auto"/>
+              <w:jc w:val="left"/>
+            </w:pPr>
+            <w:r>
+              <w:rPr>
+                <w:rFonts w:ascii="Times New Roman" w:hAnsi="Times New Roman"/>
+                <w:sz w:val="22"/>
+              </w:rPr>
+              <w:t>Журнал электронного визирования со слепком SHA-256</w:t>
+            </w:r>
+          </w:p>
+        </w:tc>
+      </w:tr>
+      <w:tr>
+        <w:tc>
+          <w:tcPr>
+            <w:tcW w:type="dxa" w:w="2339"/>
+            <w:tcMar>
+              <w:top w:w="100" w:type="dxa"/>
+              <w:bottom w:w="100" w:type="dxa"/>
+              <w:left w:w="150" w:type="dxa"/>
+              <w:right w:w="150" w:type="dxa"/>
+            </w:tcMar>
+          </w:tcPr>
+          <w:p>
+            <w:pPr>
+              <w:spacing w:before="40" w:after="40" w:line="252" w:lineRule="auto"/>
+              <w:jc w:val="left"/>
+            </w:pPr>
+            <w:r>
+              <w:rPr>
+                <w:rFonts w:ascii="Times New Roman" w:hAnsi="Times New Roman"/>
+                <w:sz w:val="22"/>
+              </w:rPr>
+              <w:t>`audit_logs`</w:t>
+            </w:r>
+          </w:p>
+        </w:tc>
+        <w:tc>
+          <w:tcPr>
+            <w:tcW w:type="dxa" w:w="2339"/>
+            <w:tcMar>
+              <w:top w:w="100" w:type="dxa"/>
+              <w:bottom w:w="100" w:type="dxa"/>
+              <w:left w:w="150" w:type="dxa"/>
+              <w:right w:w="150" w:type="dxa"/>
+            </w:tcMar>
+          </w:tcPr>
+          <w:p>
+            <w:pPr>
+              <w:spacing w:before="40" w:after="40" w:line="252" w:lineRule="auto"/>
+              <w:jc w:val="left"/>
+            </w:pPr>
+            <w:r>
+              <w:rPr>
+                <w:rFonts w:ascii="Times New Roman" w:hAnsi="Times New Roman"/>
+                <w:sz w:val="22"/>
+              </w:rPr>
+              <w:t>`id`</w:t>
+            </w:r>
+          </w:p>
+        </w:tc>
+        <w:tc>
+          <w:tcPr>
+            <w:tcW w:type="dxa" w:w="2339"/>
+            <w:tcMar>
+              <w:top w:w="100" w:type="dxa"/>
+              <w:bottom w:w="100" w:type="dxa"/>
+              <w:left w:w="150" w:type="dxa"/>
+              <w:right w:w="150" w:type="dxa"/>
+            </w:tcMar>
+          </w:tcPr>
+          <w:p>
+            <w:pPr>
+              <w:spacing w:before="40" w:after="40" w:line="252" w:lineRule="auto"/>
+              <w:jc w:val="left"/>
+            </w:pPr>
+            <w:r>
+              <w:rPr>
+                <w:rFonts w:ascii="Times New Roman" w:hAnsi="Times New Roman"/>
+                <w:sz w:val="22"/>
+              </w:rPr>
+              <w:t>`user_id → users.id`</w:t>
+            </w:r>
+          </w:p>
+        </w:tc>
+        <w:tc>
+          <w:tcPr>
+            <w:tcW w:type="dxa" w:w="2339"/>
+            <w:tcMar>
+              <w:top w:w="100" w:type="dxa"/>
+              <w:bottom w:w="100" w:type="dxa"/>
+              <w:left w:w="150" w:type="dxa"/>
+              <w:right w:w="150" w:type="dxa"/>
+            </w:tcMar>
+          </w:tcPr>
+          <w:p>
+            <w:pPr>
+              <w:spacing w:before="40" w:after="40" w:line="252" w:lineRule="auto"/>
+              <w:jc w:val="left"/>
+            </w:pPr>
+            <w:r>
+              <w:rPr>
+                <w:rFonts w:ascii="Times New Roman" w:hAnsi="Times New Roman"/>
+                <w:sz w:val="22"/>
+              </w:rPr>
+              <w:t>Журнал безопасности и фиксация критических действий</w:t>
+            </w:r>
+          </w:p>
+        </w:tc>
+      </w:tr>
+      <w:tr>
+        <w:tc>
+          <w:tcPr>
+            <w:tcW w:type="dxa" w:w="2339"/>
+            <w:tcMar>
+              <w:top w:w="100" w:type="dxa"/>
+              <w:bottom w:w="100" w:type="dxa"/>
+              <w:left w:w="150" w:type="dxa"/>
+              <w:right w:w="150" w:type="dxa"/>
+            </w:tcMar>
+          </w:tcPr>
+          <w:p>
+            <w:pPr>
+              <w:spacing w:before="40" w:after="40" w:line="252" w:lineRule="auto"/>
+              <w:jc w:val="left"/>
+            </w:pPr>
+            <w:r>
+              <w:rPr>
+                <w:rFonts w:ascii="Times New Roman" w:hAnsi="Times New Roman"/>
+                <w:sz w:val="22"/>
+              </w:rPr>
+              <w:t>`competencies`</w:t>
+            </w:r>
+          </w:p>
+        </w:tc>
+        <w:tc>
+          <w:tcPr>
+            <w:tcW w:type="dxa" w:w="2339"/>
+            <w:tcMar>
+              <w:top w:w="100" w:type="dxa"/>
+              <w:bottom w:w="100" w:type="dxa"/>
+              <w:left w:w="150" w:type="dxa"/>
+              <w:right w:w="150" w:type="dxa"/>
+            </w:tcMar>
+          </w:tcPr>
+          <w:p>
+            <w:pPr>
+              <w:spacing w:before="40" w:after="40" w:line="252" w:lineRule="auto"/>
+              <w:jc w:val="left"/>
+            </w:pPr>
+            <w:r>
+              <w:rPr>
+                <w:rFonts w:ascii="Times New Roman" w:hAnsi="Times New Roman"/>
+                <w:sz w:val="22"/>
+              </w:rPr>
+              <w:t>`id`</w:t>
+            </w:r>
+          </w:p>
+        </w:tc>
+        <w:tc>
+          <w:tcPr>
+            <w:tcW w:type="dxa" w:w="2339"/>
+            <w:tcMar>
+              <w:top w:w="100" w:type="dxa"/>
+              <w:bottom w:w="100" w:type="dxa"/>
+              <w:left w:w="150" w:type="dxa"/>
+              <w:right w:w="150" w:type="dxa"/>
+            </w:tcMar>
+          </w:tcPr>
+          <w:p>
+            <w:pPr>
+              <w:spacing w:before="40" w:after="40" w:line="252" w:lineRule="auto"/>
+              <w:jc w:val="left"/>
+            </w:pPr>
+            <w:r>
+              <w:rPr>
+                <w:rFonts w:ascii="Times New Roman" w:hAnsi="Times New Roman"/>
+                <w:sz w:val="22"/>
+              </w:rPr>
+              <w:t>`standard_id → standards_fgos.id`</w:t>
+            </w:r>
+          </w:p>
+        </w:tc>
+        <w:tc>
+          <w:tcPr>
+            <w:tcW w:type="dxa" w:w="2339"/>
+            <w:tcMar>
+              <w:top w:w="100" w:type="dxa"/>
+              <w:bottom w:w="100" w:type="dxa"/>
+              <w:left w:w="150" w:type="dxa"/>
+              <w:right w:w="150" w:type="dxa"/>
+            </w:tcMar>
+          </w:tcPr>
+          <w:p>
+            <w:pPr>
+              <w:spacing w:before="40" w:after="40" w:line="252" w:lineRule="auto"/>
+              <w:jc w:val="left"/>
+            </w:pPr>
+            <w:r>
+              <w:rPr>
+                <w:rFonts w:ascii="Times New Roman" w:hAnsi="Times New Roman"/>
+                <w:sz w:val="22"/>
+              </w:rPr>
+              <w:t>Справочник универсальных, общепрофессиональных и проф. компетенций</w:t>
+            </w:r>
+          </w:p>
+        </w:tc>
+      </w:tr>
+      <w:tr>
+        <w:tc>
+          <w:tcPr>
+            <w:tcW w:type="dxa" w:w="2339"/>
+            <w:tcMar>
+              <w:top w:w="100" w:type="dxa"/>
+              <w:bottom w:w="100" w:type="dxa"/>
+              <w:left w:w="150" w:type="dxa"/>
+              <w:right w:w="150" w:type="dxa"/>
+            </w:tcMar>
+          </w:tcPr>
+          <w:p>
+            <w:pPr>
+              <w:spacing w:before="40" w:after="40" w:line="252" w:lineRule="auto"/>
+              <w:jc w:val="left"/>
+            </w:pPr>
+            <w:r>
+              <w:rPr>
+                <w:rFonts w:ascii="Times New Roman" w:hAnsi="Times New Roman"/>
+                <w:sz w:val="22"/>
+              </w:rPr>
+              <w:t>`announcements`</w:t>
+            </w:r>
+          </w:p>
+        </w:tc>
+        <w:tc>
+          <w:tcPr>
+            <w:tcW w:type="dxa" w:w="2339"/>
+            <w:tcMar>
+              <w:top w:w="100" w:type="dxa"/>
+              <w:bottom w:w="100" w:type="dxa"/>
+              <w:left w:w="150" w:type="dxa"/>
+              <w:right w:w="150" w:type="dxa"/>
+            </w:tcMar>
+          </w:tcPr>
+          <w:p>
+            <w:pPr>
+              <w:spacing w:before="40" w:after="40" w:line="252" w:lineRule="auto"/>
+              <w:jc w:val="left"/>
+            </w:pPr>
+            <w:r>
+              <w:rPr>
+                <w:rFonts w:ascii="Times New Roman" w:hAnsi="Times New Roman"/>
+                <w:sz w:val="22"/>
+              </w:rPr>
+              <w:t>`id`</w:t>
+            </w:r>
+          </w:p>
+        </w:tc>
+        <w:tc>
+          <w:tcPr>
+            <w:tcW w:type="dxa" w:w="2339"/>
+            <w:tcMar>
+              <w:top w:w="100" w:type="dxa"/>
+              <w:bottom w:w="100" w:type="dxa"/>
+              <w:left w:w="150" w:type="dxa"/>
+              <w:right w:w="150" w:type="dxa"/>
+            </w:tcMar>
+          </w:tcPr>
+          <w:p>
+            <w:pPr>
+              <w:spacing w:before="40" w:after="40" w:line="252" w:lineRule="auto"/>
+              <w:jc w:val="left"/>
+            </w:pPr>
+            <w:r>
+              <w:rPr>
+                <w:rFonts w:ascii="Times New Roman" w:hAnsi="Times New Roman"/>
+                <w:sz w:val="22"/>
+              </w:rPr>
+              <w:t>`author_id → users.id`</w:t>
+            </w:r>
+          </w:p>
+        </w:tc>
+        <w:tc>
+          <w:tcPr>
+            <w:tcW w:type="dxa" w:w="2339"/>
+            <w:tcMar>
+              <w:top w:w="100" w:type="dxa"/>
+              <w:bottom w:w="100" w:type="dxa"/>
+              <w:left w:w="150" w:type="dxa"/>
+              <w:right w:w="150" w:type="dxa"/>
+            </w:tcMar>
+          </w:tcPr>
+          <w:p>
+            <w:pPr>
+              <w:spacing w:before="40" w:after="40" w:line="252" w:lineRule="auto"/>
+              <w:jc w:val="left"/>
+            </w:pPr>
+            <w:r>
+              <w:rPr>
+                <w:rFonts w:ascii="Times New Roman" w:hAnsi="Times New Roman"/>
+                <w:sz w:val="22"/>
+              </w:rPr>
+              <w:t>Нормативные объявления и графики заседаний АНОК</w:t>
+            </w:r>
+          </w:p>
+        </w:tc>
+      </w:tr>
+    </w:tbl>
+    <w:p>
+      <w:pPr>
+        <w:spacing w:after="120"/>
+      </w:pPr>
+    </w:p>
+    <w:p>
+      <w:pPr>
+        <w:spacing w:before="240" w:after="120"/>
+        <w:jc w:val="left"/>
+      </w:pPr>
+      <w:r>
+        <w:rPr>
+          <w:rFonts w:ascii="Times New Roman" w:hAnsi="Times New Roman"/>
+          <w:b/>
+          <w:sz w:val="28"/>
+        </w:rPr>
+        <w:t>7. Примеры работы установленного и настроенного ПО</w:t>
       </w:r>
     </w:p>
     <w:p>
       <w:pPr>
-        <w:pStyle w:val="Heading2"/>
+        <w:spacing w:before="160" w:after="80"/>
+        <w:jc w:val="left"/>
       </w:pPr>
       <w:r>
-        <w:t>6.1. Панель управления и реестр учебных планов</w:t>
+        <w:rPr>
+          <w:rFonts w:ascii="Times New Roman" w:hAnsi="Times New Roman"/>
+          <w:b/>
+          <w:sz w:val="26"/>
+        </w:rPr>
+        <w:t>7.1. Главная панель управления (Dashboard) и реестр планов</w:t>
       </w:r>
     </w:p>
     <w:p>
+      <w:pPr>
+        <w:spacing w:line="276" w:lineRule="auto" w:after="120"/>
+        <w:ind w:firstLine="709"/>
+        <w:jc w:val="both"/>
+      </w:pPr>
+      <w:r>
+        <w:rPr>
+          <w:rFonts w:ascii="Times New Roman" w:hAnsi="Times New Roman"/>
+          <w:sz w:val="28"/>
+        </w:rPr>
+        <w:t>Отображение сводной статистики, активных документов и реестра утвержденных учебных планов.</w:t>
+      </w:r>
+    </w:p>
+    <w:p>
+      <w:pPr>
+        <w:spacing w:before="200" w:after="80"/>
+        <w:jc w:val="center"/>
+      </w:pPr>
       <w:r>
         <w:drawing>
           <wp:inline xmlns:a="http://schemas.openxmlformats.org/drawingml/2006/main" xmlns:pic="http://schemas.openxmlformats.org/drawingml/2006/picture">
-            <wp:extent cx="5943600" cy="4074543"/>
+            <wp:extent cx="5760000" cy="3948679"/>
             <wp:docPr id="6" name="Picture 6"/>
             <wp:cNvGraphicFramePr>
               <a:graphicFrameLocks noChangeAspect="1"/>
@@ -498,7 +3109,7 @@
                     <pic:cNvPicPr/>
                   </pic:nvPicPr>
                   <pic:blipFill>
-                    <a:blip r:embed="rId14"/>
+                    <a:blip r:embed="rId15"/>
                     <a:stretch>
                       <a:fillRect/>
                     </a:stretch>
@@ -506,7 +3117,7 @@
                   <pic:spPr>
                     <a:xfrm>
                       <a:off x="0" y="0"/>
-                      <a:ext cx="5943600" cy="4074543"/>
+                      <a:ext cx="5760000" cy="3948679"/>
                     </a:xfrm>
                     <a:prstGeom prst="rect"/>
                   </pic:spPr>
@@ -519,25 +3130,55 @@
     </w:p>
     <w:p>
       <w:pPr>
+        <w:spacing w:before="80" w:after="240"/>
         <w:jc w:val="center"/>
       </w:pPr>
       <w:r>
-        <w:t>Рис. 6.1. Интерфейс сводной панели и реестра планов</w:t>
+        <w:rPr>
+          <w:rFonts w:ascii="Times New Roman" w:hAnsi="Times New Roman"/>
+          <w:i/>
+          <w:sz w:val="24"/>
+        </w:rPr>
+        <w:t>Рисунок 6 — Интерфейс Dashboard</w:t>
       </w:r>
     </w:p>
     <w:p>
       <w:pPr>
-        <w:pStyle w:val="Heading2"/>
+        <w:spacing w:before="160" w:after="80"/>
+        <w:jc w:val="left"/>
       </w:pPr>
       <w:r>
-        <w:t>6.2. Просмотр структуры учебного плана (Сетка дисциплин 1-8 семестров)</w:t>
+        <w:rPr>
+          <w:rFonts w:ascii="Times New Roman" w:hAnsi="Times New Roman"/>
+          <w:b/>
+          <w:sz w:val="26"/>
+        </w:rPr>
+        <w:t>7.2. Просмотр и редактирование структуры учебного плана</w:t>
       </w:r>
     </w:p>
     <w:p>
+      <w:pPr>
+        <w:spacing w:line="276" w:lineRule="auto" w:after="120"/>
+        <w:ind w:firstLine="709"/>
+        <w:jc w:val="both"/>
+      </w:pPr>
+      <w:r>
+        <w:rPr>
+          <w:rFonts w:ascii="Times New Roman" w:hAnsi="Times New Roman"/>
+          <w:sz w:val="28"/>
+        </w:rPr>
+        <w:t>Детальная таблица дисциплин по семестрам 1–8 с распределением часов, зачетных единиц и форм контроля.</w:t>
+      </w:r>
+    </w:p>
+    <w:p>
+      <w:pPr>
+        <w:spacing w:before="200" w:after="80"/>
+        <w:jc w:val="center"/>
+      </w:pPr>
       <w:r>
         <w:drawing>
           <wp:inline xmlns:a="http://schemas.openxmlformats.org/drawingml/2006/main" xmlns:pic="http://schemas.openxmlformats.org/drawingml/2006/picture">
-            <wp:extent cx="5943600" cy="4074543"/>
+            <wp:extent cx="5760000" cy="3948679"/>
             <wp:docPr id="7" name="Picture 7"/>
             <wp:cNvGraphicFramePr>
               <a:graphicFrameLocks noChangeAspect="1"/>
@@ -550,7 +3191,7 @@
                     <pic:cNvPicPr/>
                   </pic:nvPicPr>
                   <pic:blipFill>
-                    <a:blip r:embed="rId15"/>
+                    <a:blip r:embed="rId16"/>
                     <a:stretch>
                       <a:fillRect/>
                     </a:stretch>
@@ -558,7 +3199,7 @@
                   <pic:spPr>
                     <a:xfrm>
                       <a:off x="0" y="0"/>
-                      <a:ext cx="5943600" cy="4074543"/>
+                      <a:ext cx="5760000" cy="3948679"/>
                     </a:xfrm>
                     <a:prstGeom prst="rect"/>
                   </pic:spPr>
@@ -571,25 +3212,55 @@
     </w:p>
     <w:p>
       <w:pPr>
+        <w:spacing w:before="80" w:after="240"/>
         <w:jc w:val="center"/>
       </w:pPr>
       <w:r>
-        <w:t>Рис. 6.2. Интерфейс сетки учебного плана</w:t>
+        <w:rPr>
+          <w:rFonts w:ascii="Times New Roman" w:hAnsi="Times New Roman"/>
+          <w:i/>
+          <w:sz w:val="24"/>
+        </w:rPr>
+        <w:t>Рисунок 7 — Интерфейс сетки плана</w:t>
       </w:r>
     </w:p>
     <w:p>
       <w:pPr>
-        <w:pStyle w:val="Heading2"/>
+        <w:spacing w:before="160" w:after="80"/>
+        <w:jc w:val="left"/>
       </w:pPr>
       <w:r>
-        <w:t>6.3. Модуль автоматизированной экспертизы ФГОС 3++</w:t>
+        <w:rPr>
+          <w:rFonts w:ascii="Times New Roman" w:hAnsi="Times New Roman"/>
+          <w:b/>
+          <w:sz w:val="26"/>
+        </w:rPr>
+        <w:t>7.3. Модуль автоматизированной экспертизы ФГОС 3++</w:t>
       </w:r>
     </w:p>
     <w:p>
+      <w:pPr>
+        <w:spacing w:line="276" w:lineRule="auto" w:after="120"/>
+        <w:ind w:firstLine="709"/>
+        <w:jc w:val="both"/>
+      </w:pPr>
+      <w:r>
+        <w:rPr>
+          <w:rFonts w:ascii="Times New Roman" w:hAnsi="Times New Roman"/>
+          <w:sz w:val="28"/>
+        </w:rPr>
+        <w:t>Автоматическая проверка контрольных соотношений (240 з.е., баланс блоков, ограничения сессий).</w:t>
+      </w:r>
+    </w:p>
+    <w:p>
+      <w:pPr>
+        <w:spacing w:before="200" w:after="80"/>
+        <w:jc w:val="center"/>
+      </w:pPr>
       <w:r>
         <w:drawing>
           <wp:inline xmlns:a="http://schemas.openxmlformats.org/drawingml/2006/main" xmlns:pic="http://schemas.openxmlformats.org/drawingml/2006/picture">
-            <wp:extent cx="5943600" cy="4074543"/>
+            <wp:extent cx="5760000" cy="3948679"/>
             <wp:docPr id="8" name="Picture 8"/>
             <wp:cNvGraphicFramePr>
               <a:graphicFrameLocks noChangeAspect="1"/>
@@ -602,7 +3273,7 @@
                     <pic:cNvPicPr/>
                   </pic:nvPicPr>
                   <pic:blipFill>
-                    <a:blip r:embed="rId16"/>
+                    <a:blip r:embed="rId17"/>
                     <a:stretch>
                       <a:fillRect/>
                     </a:stretch>
@@ -610,7 +3281,7 @@
                   <pic:spPr>
                     <a:xfrm>
                       <a:off x="0" y="0"/>
-                      <a:ext cx="5943600" cy="4074543"/>
+                      <a:ext cx="5760000" cy="3948679"/>
                     </a:xfrm>
                     <a:prstGeom prst="rect"/>
                   </pic:spPr>
@@ -623,25 +3294,55 @@
     </w:p>
     <w:p>
       <w:pPr>
+        <w:spacing w:before="80" w:after="240"/>
         <w:jc w:val="center"/>
       </w:pPr>
       <w:r>
-        <w:t>Рис. 6.3. Интерфейс протокола валидации ФГОС 3++</w:t>
+        <w:rPr>
+          <w:rFonts w:ascii="Times New Roman" w:hAnsi="Times New Roman"/>
+          <w:i/>
+          <w:sz w:val="24"/>
+        </w:rPr>
+        <w:t>Рисунок 8 — Интерфейс валидации ФГОС</w:t>
       </w:r>
     </w:p>
     <w:p>
       <w:pPr>
-        <w:pStyle w:val="Heading2"/>
+        <w:spacing w:before="160" w:after="80"/>
+        <w:jc w:val="left"/>
       </w:pPr>
       <w:r>
-        <w:t>6.4. Модуль служебных записок на изменение УП до начала семестра</w:t>
+        <w:rPr>
+          <w:rFonts w:ascii="Times New Roman" w:hAnsi="Times New Roman"/>
+          <w:b/>
+          <w:sz w:val="26"/>
+        </w:rPr>
+        <w:t>7.4. Модуль служебных записок на изменение УП</w:t>
       </w:r>
     </w:p>
     <w:p>
+      <w:pPr>
+        <w:spacing w:line="276" w:lineRule="auto" w:after="120"/>
+        <w:ind w:firstLine="709"/>
+        <w:jc w:val="both"/>
+      </w:pPr>
+      <w:r>
+        <w:rPr>
+          <w:rFonts w:ascii="Times New Roman" w:hAnsi="Times New Roman"/>
+          <w:sz w:val="28"/>
+        </w:rPr>
+        <w:t>Электронное согласование служебных записок до начала семестра с протоколом «Было» / «Стало» и внесением правок в АНОК.</w:t>
+      </w:r>
+    </w:p>
+    <w:p>
+      <w:pPr>
+        <w:spacing w:before="200" w:after="80"/>
+        <w:jc w:val="center"/>
+      </w:pPr>
       <w:r>
         <w:drawing>
           <wp:inline xmlns:a="http://schemas.openxmlformats.org/drawingml/2006/main" xmlns:pic="http://schemas.openxmlformats.org/drawingml/2006/picture">
-            <wp:extent cx="5943600" cy="4074543"/>
+            <wp:extent cx="5760000" cy="3948679"/>
             <wp:docPr id="9" name="Picture 9"/>
             <wp:cNvGraphicFramePr>
               <a:graphicFrameLocks noChangeAspect="1"/>
@@ -654,7 +3355,7 @@
                     <pic:cNvPicPr/>
                   </pic:nvPicPr>
                   <pic:blipFill>
-                    <a:blip r:embed="rId17"/>
+                    <a:blip r:embed="rId18"/>
                     <a:stretch>
                       <a:fillRect/>
                     </a:stretch>
@@ -662,7 +3363,7 @@
                   <pic:spPr>
                     <a:xfrm>
                       <a:off x="0" y="0"/>
-                      <a:ext cx="5943600" cy="4074543"/>
+                      <a:ext cx="5760000" cy="3948679"/>
                     </a:xfrm>
                     <a:prstGeom prst="rect"/>
                   </pic:spPr>
@@ -675,48 +3376,77 @@
     </w:p>
     <w:p>
       <w:pPr>
+        <w:spacing w:before="80" w:after="240"/>
         <w:jc w:val="center"/>
       </w:pPr>
       <w:r>
-        <w:t>Рис. 6.4. Интерфейс служебных записок и протокола изменений</w:t>
-      </w:r>
-    </w:p>
-    <w:p>
-      <w:r>
-        <w:br w:type="page"/>
+        <w:rPr>
+          <w:rFonts w:ascii="Times New Roman" w:hAnsi="Times New Roman"/>
+          <w:i/>
+          <w:sz w:val="24"/>
+        </w:rPr>
+        <w:t>Рисунок 9 — Интерфейс служебных записок</w:t>
       </w:r>
     </w:p>
     <w:p>
       <w:pPr>
-        <w:pStyle w:val="Heading1"/>
+        <w:spacing w:before="240" w:after="120"/>
+        <w:jc w:val="left"/>
       </w:pPr>
       <w:r>
-        <w:t>7. Заключение к лабораторной работе № 2</w:t>
+        <w:rPr>
+          <w:rFonts w:ascii="Times New Roman" w:hAnsi="Times New Roman"/>
+          <w:b/>
+          <w:sz w:val="28"/>
+        </w:rPr>
+        <w:t>8. Заключение к лабораторной работе № 2</w:t>
       </w:r>
     </w:p>
     <w:p>
+      <w:pPr>
+        <w:spacing w:line="276" w:lineRule="auto" w:after="120"/>
+        <w:ind w:firstLine="709"/>
+        <w:jc w:val="both"/>
+      </w:pPr>
       <w:r>
-        <w:t>В ходе лабораторной работы № 2 выполнен полный цикл анализа и проектирования корпоративного портала Центра АНОК:</w:t>
-        <w:br/>
-        <w:t>1. Построена диаграмма классов со всеми атрибутами, методами и типами связей.</w:t>
-        <w:br/>
-        <w:t>2. Разработана диаграмма последовательности сквозного процесса согласования УП и внесения изменений.</w:t>
-        <w:br/>
-        <w:t>3. Спроектированы диаграммы компонентов и развертывания веб-портала.</w:t>
-        <w:br/>
-        <w:t>4. Создана нормализованная схема базы данных MariaDB/MySQL и подготовлен DDL-скрипт.</w:t>
-        <w:br/>
-        <w:t>5. Развернут и протестирован действующий прототип веб-портала, приведены скриншоты работы всех ключевых модулей.</w:t>
+        <w:rPr>
+          <w:rFonts w:ascii="Times New Roman" w:hAnsi="Times New Roman"/>
+          <w:sz w:val="28"/>
+        </w:rPr>
+        <w:t>В ходе выполнения работы спроектирована полная архитектура корпоративного портала университета (модуль АНОК). Разработаны 4 UML-диаграммы (классов, последовательности, компонентов, развертывания), создана нормализованная схема базы данных из 13 таблиц и развернут действующий прототип веб-портала с демонстрацией ключевых пользовательских сценариев.</w:t>
       </w:r>
     </w:p>
     <w:sectPr>
-      <w:pgSz w:w="12240" w:h="15840"/>
-      <w:pgMar w:top="1138" w:right="850" w:bottom="1138" w:left="1411" w:header="720" w:footer="720" w:gutter="0"/>
+      <w:footerReference w:type="default" r:id="rId9"/>
+      <w:pgSz w:w="11906" w:h="16838"/>
+      <w:pgMar w:top="1134" w:right="850" w:bottom="1134" w:left="1701" w:header="720" w:footer="720" w:gutter="0"/>
       <w:cols w:space="720"/>
+      <w:titlePg/>
       <w:docGrid w:linePitch="360"/>
     </w:sectPr>
   </w:body>
 </w:document>
+</file>
+
+<file path=word/footer1.xml><?xml version="1.0" encoding="utf-8"?>
+<w:ftr xmlns:m="http://schemas.openxmlformats.org/officeDocument/2006/math" xmlns:mc="http://schemas.openxmlformats.org/markup-compatibility/2006" xmlns:mo="http://schemas.microsoft.com/office/mac/office/2008/main" xmlns:mv="urn:schemas-microsoft-com:mac:vml" xmlns:o="urn:schemas-microsoft-com:office:office" xmlns:r="http://schemas.openxmlformats.org/officeDocument/2006/relationships" xmlns:v="urn:schemas-microsoft-com:vml" xmlns:w10="urn:schemas-microsoft-com:office:word" xmlns:w14="http://schemas.microsoft.com/office/word/2010/wordml" xmlns:w="http://schemas.openxmlformats.org/wordprocessingml/2006/main" xmlns:wne="http://schemas.microsoft.com/office/word/2006/wordml" xmlns:wp14="http://schemas.microsoft.com/office/word/2010/wordprocessingDrawing" xmlns:wp="http://schemas.openxmlformats.org/drawingml/2006/wordprocessingDrawing" xmlns:wpc="http://schemas.microsoft.com/office/word/2010/wordprocessingCanvas" xmlns:wpg="http://schemas.microsoft.com/office/word/2010/wordprocessingGroup" xmlns:wpi="http://schemas.microsoft.com/office/word/2010/wordprocessingInk" xmlns:wps="http://schemas.microsoft.com/office/word/2010/wordprocessingShape" mc:Ignorable="w14 wp14">
+  <w:p>
+    <w:pPr>
+      <w:pStyle w:val="Footer"/>
+      <w:jc w:val="center"/>
+    </w:pPr>
+    <w:r>
+      <w:rPr>
+        <w:rFonts w:ascii="Times New Roman" w:hAnsi="Times New Roman"/>
+        <w:sz w:val="22"/>
+      </w:rPr>
+      <w:fldChar w:fldCharType="begin"/>
+      <w:instrText xml:space="preserve">PAGE</w:instrText>
+      <w:fldChar w:fldCharType="separate"/>
+      <w:fldChar w:fldCharType="end"/>
+    </w:r>
+  </w:p>
+</w:ftr>
 </file>
 
 <file path=word/numbering.xml><?xml version="1.0" encoding="utf-8"?>
@@ -1082,6 +3812,11 @@
     <w:name w:val="Normal"/>
     <w:qFormat/>
     <w:rsid w:val="00FC693F"/>
+    <w:rPr>
+      <w:rFonts w:ascii="Times New Roman" w:hAnsi="Times New Roman"/>
+      <w:color w:val="000000"/>
+      <w:sz w:val="28"/>
+    </w:rPr>
   </w:style>
   <w:style w:type="paragraph" w:styleId="Header">
     <w:name w:val="header"/>

</xml_diff>

<commit_message>
Regenerate lab report documents and verify SQLite portal
Co-authored-by: arena-agent <297053741+arena-agent@users.noreply.github.com>
</commit_message>
<xml_diff>
--- a/reports/lab2/LR2_Report_Variant15.docx
+++ b/reports/lab2/LR2_Report_Variant15.docx
@@ -125,7 +125,7 @@
           <w:b/>
           <w:sz w:val="28"/>
         </w:rPr>
-        <w:t>1. Введение и цели работы</w:t>
+        <w:t>1. Цель работы</w:t>
       </w:r>
     </w:p>
     <w:p>
@@ -139,242 +139,7 @@
           <w:rFonts w:ascii="Times New Roman" w:hAnsi="Times New Roman"/>
           <w:sz w:val="28"/>
         </w:rPr>
-      </w:r>
-      <w:r>
-        <w:rPr>
-          <w:rFonts w:ascii="Times New Roman" w:hAnsi="Times New Roman"/>
-          <w:b/>
-          <w:sz w:val="28"/>
-        </w:rPr>
-        <w:t>Цель лабораторной работы:</w:t>
-      </w:r>
-      <w:r>
-        <w:rPr>
-          <w:rFonts w:ascii="Times New Roman" w:hAnsi="Times New Roman"/>
-          <w:sz w:val="28"/>
-        </w:rPr>
-        <w:t xml:space="preserve"> Проектирование детальной архитектуры корпоративного веб-портала университета (модуль Центра АНОК), разработка объектной модели и схемы реляционной базы данных (MariaDB / SQLite), а также практическое разворачивание, конфигурирование и демонстрация работы полнофункционального прототипа программного обеспечения в соответствии с бизнес-правилами Варианта № 15.</w:t>
-      </w:r>
-    </w:p>
-    <w:p>
-      <w:pPr>
-        <w:spacing w:before="160" w:after="80"/>
-        <w:jc w:val="left"/>
-      </w:pPr>
-      <w:r>
-        <w:rPr>
-          <w:rFonts w:ascii="Times New Roman" w:hAnsi="Times New Roman"/>
-          <w:b/>
-          <w:sz w:val="26"/>
-        </w:rPr>
-        <w:t>Задачи работы:</w:t>
-      </w:r>
-    </w:p>
-    <w:p>
-      <w:pPr>
-        <w:spacing w:line="276" w:lineRule="auto" w:after="60"/>
-        <w:ind w:left="709"/>
-        <w:jc w:val="both"/>
-      </w:pPr>
-      <w:r>
-        <w:rPr>
-          <w:rFonts w:ascii="Times New Roman" w:hAnsi="Times New Roman"/>
-          <w:b/>
-          <w:sz w:val="28"/>
-        </w:rPr>
-        <w:t xml:space="preserve">1. </w:t>
-      </w:r>
-      <w:r>
-        <w:rPr>
-          <w:rFonts w:ascii="Times New Roman" w:hAnsi="Times New Roman"/>
-          <w:sz w:val="28"/>
-        </w:rPr>
-        <w:t xml:space="preserve">Разработать </w:t>
-      </w:r>
-      <w:r>
-        <w:rPr>
-          <w:rFonts w:ascii="Times New Roman" w:hAnsi="Times New Roman"/>
-          <w:b/>
-          <w:sz w:val="28"/>
-        </w:rPr>
-        <w:t>диаграмму классов</w:t>
-      </w:r>
-      <w:r>
-        <w:rPr>
-          <w:rFonts w:ascii="Times New Roman" w:hAnsi="Times New Roman"/>
-          <w:sz w:val="28"/>
-        </w:rPr>
-        <w:t xml:space="preserve"> (Class Diagram) объектной модели портала.</w:t>
-      </w:r>
-    </w:p>
-    <w:p>
-      <w:pPr>
-        <w:spacing w:line="276" w:lineRule="auto" w:after="60"/>
-        <w:ind w:left="709"/>
-        <w:jc w:val="both"/>
-      </w:pPr>
-      <w:r>
-        <w:rPr>
-          <w:rFonts w:ascii="Times New Roman" w:hAnsi="Times New Roman"/>
-          <w:b/>
-          <w:sz w:val="28"/>
-        </w:rPr>
-        <w:t xml:space="preserve">2. </w:t>
-      </w:r>
-      <w:r>
-        <w:rPr>
-          <w:rFonts w:ascii="Times New Roman" w:hAnsi="Times New Roman"/>
-          <w:sz w:val="28"/>
-        </w:rPr>
-        <w:t xml:space="preserve">Спроектировать </w:t>
-      </w:r>
-      <w:r>
-        <w:rPr>
-          <w:rFonts w:ascii="Times New Roman" w:hAnsi="Times New Roman"/>
-          <w:b/>
-          <w:sz w:val="28"/>
-        </w:rPr>
-        <w:t>диаграмму последовательности</w:t>
-      </w:r>
-      <w:r>
-        <w:rPr>
-          <w:rFonts w:ascii="Times New Roman" w:hAnsi="Times New Roman"/>
-          <w:sz w:val="28"/>
-        </w:rPr>
-        <w:t xml:space="preserve"> (Sequence Diagram) для сквозного процесса экспертизы и визирования учебных планов.</w:t>
-      </w:r>
-    </w:p>
-    <w:p>
-      <w:pPr>
-        <w:spacing w:line="276" w:lineRule="auto" w:after="60"/>
-        <w:ind w:left="709"/>
-        <w:jc w:val="both"/>
-      </w:pPr>
-      <w:r>
-        <w:rPr>
-          <w:rFonts w:ascii="Times New Roman" w:hAnsi="Times New Roman"/>
-          <w:b/>
-          <w:sz w:val="28"/>
-        </w:rPr>
-        <w:t xml:space="preserve">3. </w:t>
-      </w:r>
-      <w:r>
-        <w:rPr>
-          <w:rFonts w:ascii="Times New Roman" w:hAnsi="Times New Roman"/>
-          <w:sz w:val="28"/>
-        </w:rPr>
-        <w:t xml:space="preserve">Разработать </w:t>
-      </w:r>
-      <w:r>
-        <w:rPr>
-          <w:rFonts w:ascii="Times New Roman" w:hAnsi="Times New Roman"/>
-          <w:b/>
-          <w:sz w:val="28"/>
-        </w:rPr>
-        <w:t>диаграмму компонентов</w:t>
-      </w:r>
-      <w:r>
-        <w:rPr>
-          <w:rFonts w:ascii="Times New Roman" w:hAnsi="Times New Roman"/>
-          <w:sz w:val="28"/>
-        </w:rPr>
-        <w:t xml:space="preserve"> (Component Diagram), отражающую модульную трехуровневую структуру портала.</w:t>
-      </w:r>
-    </w:p>
-    <w:p>
-      <w:pPr>
-        <w:spacing w:line="276" w:lineRule="auto" w:after="60"/>
-        <w:ind w:left="709"/>
-        <w:jc w:val="both"/>
-      </w:pPr>
-      <w:r>
-        <w:rPr>
-          <w:rFonts w:ascii="Times New Roman" w:hAnsi="Times New Roman"/>
-          <w:b/>
-          <w:sz w:val="28"/>
-        </w:rPr>
-        <w:t xml:space="preserve">4. </w:t>
-      </w:r>
-      <w:r>
-        <w:rPr>
-          <w:rFonts w:ascii="Times New Roman" w:hAnsi="Times New Roman"/>
-          <w:sz w:val="28"/>
-        </w:rPr>
-        <w:t xml:space="preserve">Разработать </w:t>
-      </w:r>
-      <w:r>
-        <w:rPr>
-          <w:rFonts w:ascii="Times New Roman" w:hAnsi="Times New Roman"/>
-          <w:b/>
-          <w:sz w:val="28"/>
-        </w:rPr>
-        <w:t>диаграмму развертывания</w:t>
-      </w:r>
-      <w:r>
-        <w:rPr>
-          <w:rFonts w:ascii="Times New Roman" w:hAnsi="Times New Roman"/>
-          <w:sz w:val="28"/>
-        </w:rPr>
-        <w:t xml:space="preserve"> (Deployment Diagram) физической топологии серверов и сетевых узлов.</w:t>
-      </w:r>
-    </w:p>
-    <w:p>
-      <w:pPr>
-        <w:spacing w:line="276" w:lineRule="auto" w:after="60"/>
-        <w:ind w:left="709"/>
-        <w:jc w:val="both"/>
-      </w:pPr>
-      <w:r>
-        <w:rPr>
-          <w:rFonts w:ascii="Times New Roman" w:hAnsi="Times New Roman"/>
-          <w:b/>
-          <w:sz w:val="28"/>
-        </w:rPr>
-        <w:t xml:space="preserve">5. </w:t>
-      </w:r>
-      <w:r>
-        <w:rPr>
-          <w:rFonts w:ascii="Times New Roman" w:hAnsi="Times New Roman"/>
-          <w:sz w:val="28"/>
-        </w:rPr>
-        <w:t xml:space="preserve">Спроектировать нормализованную </w:t>
-      </w:r>
-      <w:r>
-        <w:rPr>
-          <w:rFonts w:ascii="Times New Roman" w:hAnsi="Times New Roman"/>
-          <w:b/>
-          <w:sz w:val="28"/>
-        </w:rPr>
-        <w:t>схему реляционной базы данных</w:t>
-      </w:r>
-      <w:r>
-        <w:rPr>
-          <w:rFonts w:ascii="Times New Roman" w:hAnsi="Times New Roman"/>
-          <w:sz w:val="28"/>
-        </w:rPr>
-        <w:t xml:space="preserve"> (ERD) в 3-й нормальной форме.</w:t>
-      </w:r>
-    </w:p>
-    <w:p>
-      <w:pPr>
-        <w:spacing w:line="276" w:lineRule="auto" w:after="60"/>
-        <w:ind w:left="709"/>
-        <w:jc w:val="both"/>
-      </w:pPr>
-      <w:r>
-        <w:rPr>
-          <w:rFonts w:ascii="Times New Roman" w:hAnsi="Times New Roman"/>
-          <w:b/>
-          <w:sz w:val="28"/>
-        </w:rPr>
-        <w:t xml:space="preserve">6. </w:t>
-      </w:r>
-      <w:r>
-        <w:rPr>
-          <w:rFonts w:ascii="Times New Roman" w:hAnsi="Times New Roman"/>
-          <w:sz w:val="28"/>
-        </w:rPr>
-        <w:t>Развернуть и настроить серверную среду и продемонстрировать примеры работы установленного ПО.</w:t>
+        <w:t>Спроектировать структуру учебного прототипа портала АНОК, определить состав данных и подготовить локальную базу SQLite.</w:t>
       </w:r>
     </w:p>
     <w:p>
@@ -388,7 +153,7 @@
           <w:b/>
           <w:sz w:val="28"/>
         </w:rPr>
-        <w:t>2. Диаграмма классов (Class Diagram)</w:t>
+        <w:t>2. Архитектура</w:t>
       </w:r>
     </w:p>
     <w:p>
@@ -402,7 +167,347 @@
           <w:rFonts w:ascii="Times New Roman" w:hAnsi="Times New Roman"/>
           <w:sz w:val="28"/>
         </w:rPr>
-        <w:t>Объектно-ориентированная модель предметной области включает сущности пользователей и ролей (RBAC), организационной структуры вуза, образовательных программ, учебных планов с дисциплинами, служебных записок, маршрутов электронного визирования и протоколов валидации ФГОС.</w:t>
+        <w:t>Прототип состоит из трёх частей:</w:t>
+      </w:r>
+    </w:p>
+    <w:p>
+      <w:pPr>
+        <w:spacing w:line="276" w:lineRule="auto" w:after="60"/>
+        <w:ind w:left="709"/>
+        <w:jc w:val="both"/>
+      </w:pPr>
+      <w:r>
+        <w:rPr>
+          <w:rFonts w:ascii="Times New Roman" w:hAnsi="Times New Roman"/>
+          <w:b w:val="0"/>
+          <w:sz w:val="28"/>
+        </w:rPr>
+        <w:t xml:space="preserve">• </w:t>
+      </w:r>
+      <w:r>
+        <w:rPr>
+          <w:rFonts w:ascii="Times New Roman" w:hAnsi="Times New Roman"/>
+          <w:sz w:val="28"/>
+        </w:rPr>
+        <w:t>веб-приложение Flask — маршрутизация и подготовка страниц;</w:t>
+      </w:r>
+    </w:p>
+    <w:p>
+      <w:pPr>
+        <w:spacing w:line="276" w:lineRule="auto" w:after="60"/>
+        <w:ind w:left="709"/>
+        <w:jc w:val="both"/>
+      </w:pPr>
+      <w:r>
+        <w:rPr>
+          <w:rFonts w:ascii="Times New Roman" w:hAnsi="Times New Roman"/>
+          <w:b w:val="0"/>
+          <w:sz w:val="28"/>
+        </w:rPr>
+        <w:t xml:space="preserve">• </w:t>
+      </w:r>
+      <w:r>
+        <w:rPr>
+          <w:rFonts w:ascii="Times New Roman" w:hAnsi="Times New Roman"/>
+          <w:sz w:val="28"/>
+        </w:rPr>
+        <w:t>шаблоны Jinja2 — HTML-представление;</w:t>
+      </w:r>
+    </w:p>
+    <w:p>
+      <w:pPr>
+        <w:spacing w:line="276" w:lineRule="auto" w:after="60"/>
+        <w:ind w:left="709"/>
+        <w:jc w:val="both"/>
+      </w:pPr>
+      <w:r>
+        <w:rPr>
+          <w:rFonts w:ascii="Times New Roman" w:hAnsi="Times New Roman"/>
+          <w:b w:val="0"/>
+          <w:sz w:val="28"/>
+        </w:rPr>
+        <w:t xml:space="preserve">• </w:t>
+      </w:r>
+      <w:r>
+        <w:rPr>
+          <w:rFonts w:ascii="Times New Roman" w:hAnsi="Times New Roman"/>
+          <w:sz w:val="28"/>
+        </w:rPr>
+        <w:t>SQLite — хранение связанных данных.</w:t>
+      </w:r>
+    </w:p>
+    <w:p>
+      <w:pPr>
+        <w:spacing w:line="276" w:lineRule="auto" w:after="120"/>
+        <w:ind w:firstLine="709"/>
+        <w:jc w:val="both"/>
+      </w:pPr>
+      <w:r>
+        <w:rPr>
+          <w:rFonts w:ascii="Times New Roman" w:hAnsi="Times New Roman"/>
+          <w:sz w:val="28"/>
+        </w:rPr>
+        <w:t>Пользователь открывает страницу в браузере. Flask получает данные из SQLite и передаёт их шаблону. Отдельный сервер базы данных не требуется.</w:t>
+      </w:r>
+    </w:p>
+    <w:p>
+      <w:pPr>
+        <w:spacing w:before="200" w:after="80"/>
+        <w:jc w:val="center"/>
+      </w:pPr>
+      <w:r>
+        <w:drawing>
+          <wp:inline xmlns:a="http://schemas.openxmlformats.org/drawingml/2006/main" xmlns:pic="http://schemas.openxmlformats.org/drawingml/2006/picture">
+            <wp:extent cx="5760000" cy="3931429"/>
+            <wp:docPr id="1" name="Picture 1"/>
+            <wp:cNvGraphicFramePr>
+              <a:graphicFrameLocks noChangeAspect="1"/>
+            </wp:cNvGraphicFramePr>
+            <a:graphic>
+              <a:graphicData uri="http://schemas.openxmlformats.org/drawingml/2006/picture">
+                <pic:pic>
+                  <pic:nvPicPr>
+                    <pic:cNvPr id="0" name="component_diagram.png"/>
+                    <pic:cNvPicPr/>
+                  </pic:nvPicPr>
+                  <pic:blipFill>
+                    <a:blip r:embed="rId10"/>
+                    <a:stretch>
+                      <a:fillRect/>
+                    </a:stretch>
+                  </pic:blipFill>
+                  <pic:spPr>
+                    <a:xfrm>
+                      <a:off x="0" y="0"/>
+                      <a:ext cx="5760000" cy="3931429"/>
+                    </a:xfrm>
+                    <a:prstGeom prst="rect"/>
+                  </pic:spPr>
+                </pic:pic>
+              </a:graphicData>
+            </a:graphic>
+          </wp:inline>
+        </w:drawing>
+      </w:r>
+    </w:p>
+    <w:p>
+      <w:pPr>
+        <w:spacing w:before="80" w:after="240"/>
+        <w:jc w:val="center"/>
+      </w:pPr>
+      <w:r>
+        <w:rPr>
+          <w:rFonts w:ascii="Times New Roman" w:hAnsi="Times New Roman"/>
+          <w:i/>
+          <w:sz w:val="24"/>
+        </w:rPr>
+        <w:t>Рисунок 1 — Диаграмма компонентов</w:t>
+      </w:r>
+    </w:p>
+    <w:p>
+      <w:pPr>
+        <w:spacing w:before="200" w:after="80"/>
+        <w:jc w:val="center"/>
+      </w:pPr>
+      <w:r>
+        <w:drawing>
+          <wp:inline xmlns:a="http://schemas.openxmlformats.org/drawingml/2006/main" xmlns:pic="http://schemas.openxmlformats.org/drawingml/2006/picture">
+            <wp:extent cx="5760000" cy="3931429"/>
+            <wp:docPr id="2" name="Picture 2"/>
+            <wp:cNvGraphicFramePr>
+              <a:graphicFrameLocks noChangeAspect="1"/>
+            </wp:cNvGraphicFramePr>
+            <a:graphic>
+              <a:graphicData uri="http://schemas.openxmlformats.org/drawingml/2006/picture">
+                <pic:pic>
+                  <pic:nvPicPr>
+                    <pic:cNvPr id="0" name="deployment_diagram.png"/>
+                    <pic:cNvPicPr/>
+                  </pic:nvPicPr>
+                  <pic:blipFill>
+                    <a:blip r:embed="rId11"/>
+                    <a:stretch>
+                      <a:fillRect/>
+                    </a:stretch>
+                  </pic:blipFill>
+                  <pic:spPr>
+                    <a:xfrm>
+                      <a:off x="0" y="0"/>
+                      <a:ext cx="5760000" cy="3931429"/>
+                    </a:xfrm>
+                    <a:prstGeom prst="rect"/>
+                  </pic:spPr>
+                </pic:pic>
+              </a:graphicData>
+            </a:graphic>
+          </wp:inline>
+        </w:drawing>
+      </w:r>
+    </w:p>
+    <w:p>
+      <w:pPr>
+        <w:spacing w:before="80" w:after="240"/>
+        <w:jc w:val="center"/>
+      </w:pPr>
+      <w:r>
+        <w:rPr>
+          <w:rFonts w:ascii="Times New Roman" w:hAnsi="Times New Roman"/>
+          <w:i/>
+          <w:sz w:val="24"/>
+        </w:rPr>
+        <w:t>Рисунок 2 — Диаграмма развёртывания</w:t>
+      </w:r>
+    </w:p>
+    <w:p>
+      <w:pPr>
+        <w:spacing w:before="240" w:after="120"/>
+        <w:jc w:val="left"/>
+      </w:pPr>
+      <w:r>
+        <w:rPr>
+          <w:rFonts w:ascii="Times New Roman" w:hAnsi="Times New Roman"/>
+          <w:b/>
+          <w:sz w:val="28"/>
+        </w:rPr>
+        <w:t>3. Основные сущности</w:t>
+      </w:r>
+    </w:p>
+    <w:p>
+      <w:pPr>
+        <w:spacing w:line="276" w:lineRule="auto" w:after="120"/>
+        <w:ind w:firstLine="709"/>
+        <w:jc w:val="both"/>
+      </w:pPr>
+      <w:r>
+        <w:rPr>
+          <w:rFonts w:ascii="Times New Roman" w:hAnsi="Times New Roman"/>
+          <w:sz w:val="28"/>
+        </w:rPr>
+        <w:t>В базе хранятся роли, пользователи, подразделения, стандарты ФГОС, образовательные программы, учебные планы, дисциплины, служебные записки, подписи, отчёты проверки, компетенции, объявления и записи аудита.</w:t>
+      </w:r>
+    </w:p>
+    <w:p>
+      <w:pPr>
+        <w:spacing w:line="276" w:lineRule="auto" w:after="120"/>
+        <w:ind w:firstLine="709"/>
+        <w:jc w:val="both"/>
+      </w:pPr>
+      <w:r>
+        <w:rPr>
+          <w:rFonts w:ascii="Times New Roman" w:hAnsi="Times New Roman"/>
+          <w:sz w:val="28"/>
+        </w:rPr>
+        <w:t>Основные связи:</w:t>
+      </w:r>
+    </w:p>
+    <w:p>
+      <w:pPr>
+        <w:spacing w:line="276" w:lineRule="auto" w:after="60"/>
+        <w:ind w:left="709"/>
+        <w:jc w:val="both"/>
+      </w:pPr>
+      <w:r>
+        <w:rPr>
+          <w:rFonts w:ascii="Times New Roman" w:hAnsi="Times New Roman"/>
+          <w:b w:val="0"/>
+          <w:sz w:val="28"/>
+        </w:rPr>
+        <w:t xml:space="preserve">• </w:t>
+      </w:r>
+      <w:r>
+        <w:rPr>
+          <w:rFonts w:ascii="Times New Roman" w:hAnsi="Times New Roman"/>
+          <w:sz w:val="28"/>
+        </w:rPr>
+        <w:t>образовательная программа связана со стандартом ФГОС и подразделением;</w:t>
+      </w:r>
+    </w:p>
+    <w:p>
+      <w:pPr>
+        <w:spacing w:line="276" w:lineRule="auto" w:after="60"/>
+        <w:ind w:left="709"/>
+        <w:jc w:val="both"/>
+      </w:pPr>
+      <w:r>
+        <w:rPr>
+          <w:rFonts w:ascii="Times New Roman" w:hAnsi="Times New Roman"/>
+          <w:b w:val="0"/>
+          <w:sz w:val="28"/>
+        </w:rPr>
+        <w:t xml:space="preserve">• </w:t>
+      </w:r>
+      <w:r>
+        <w:rPr>
+          <w:rFonts w:ascii="Times New Roman" w:hAnsi="Times New Roman"/>
+          <w:sz w:val="28"/>
+        </w:rPr>
+        <w:t>учебный план связан с программой и пользователем, создавшим его;</w:t>
+      </w:r>
+    </w:p>
+    <w:p>
+      <w:pPr>
+        <w:spacing w:line="276" w:lineRule="auto" w:after="60"/>
+        <w:ind w:left="709"/>
+        <w:jc w:val="both"/>
+      </w:pPr>
+      <w:r>
+        <w:rPr>
+          <w:rFonts w:ascii="Times New Roman" w:hAnsi="Times New Roman"/>
+          <w:b w:val="0"/>
+          <w:sz w:val="28"/>
+        </w:rPr>
+        <w:t xml:space="preserve">• </w:t>
+      </w:r>
+      <w:r>
+        <w:rPr>
+          <w:rFonts w:ascii="Times New Roman" w:hAnsi="Times New Roman"/>
+          <w:sz w:val="28"/>
+        </w:rPr>
+        <w:t>дисциплины связаны с учебным планом и реализующим подразделением;</w:t>
+      </w:r>
+    </w:p>
+    <w:p>
+      <w:pPr>
+        <w:spacing w:line="276" w:lineRule="auto" w:after="60"/>
+        <w:ind w:left="709"/>
+        <w:jc w:val="both"/>
+      </w:pPr>
+      <w:r>
+        <w:rPr>
+          <w:rFonts w:ascii="Times New Roman" w:hAnsi="Times New Roman"/>
+          <w:b w:val="0"/>
+          <w:sz w:val="28"/>
+        </w:rPr>
+        <w:t xml:space="preserve">• </w:t>
+      </w:r>
+      <w:r>
+        <w:rPr>
+          <w:rFonts w:ascii="Times New Roman" w:hAnsi="Times New Roman"/>
+          <w:sz w:val="28"/>
+        </w:rPr>
+        <w:t>служебная записка связана с учебным планом и двумя подразделениями;</w:t>
+      </w:r>
+    </w:p>
+    <w:p>
+      <w:pPr>
+        <w:spacing w:line="276" w:lineRule="auto" w:after="60"/>
+        <w:ind w:left="709"/>
+        <w:jc w:val="both"/>
+      </w:pPr>
+      <w:r>
+        <w:rPr>
+          <w:rFonts w:ascii="Times New Roman" w:hAnsi="Times New Roman"/>
+          <w:b w:val="0"/>
+          <w:sz w:val="28"/>
+        </w:rPr>
+        <w:t xml:space="preserve">• </w:t>
+      </w:r>
+      <w:r>
+        <w:rPr>
+          <w:rFonts w:ascii="Times New Roman" w:hAnsi="Times New Roman"/>
+          <w:sz w:val="28"/>
+        </w:rPr>
+        <w:t>записи согласования связаны с документом и пользователем.</w:t>
       </w:r>
     </w:p>
     <w:p>
@@ -414,7 +519,7 @@
         <w:drawing>
           <wp:inline xmlns:a="http://schemas.openxmlformats.org/drawingml/2006/main" xmlns:pic="http://schemas.openxmlformats.org/drawingml/2006/picture">
             <wp:extent cx="5760000" cy="3948679"/>
-            <wp:docPr id="1" name="Picture 1"/>
+            <wp:docPr id="3" name="Picture 3"/>
             <wp:cNvGraphicFramePr>
               <a:graphicFrameLocks noChangeAspect="1"/>
             </wp:cNvGraphicFramePr>
@@ -422,11 +527,11 @@
               <a:graphicData uri="http://schemas.openxmlformats.org/drawingml/2006/picture">
                 <pic:pic>
                   <pic:nvPicPr>
-                    <pic:cNvPr id="0" name="class_diagram.png"/>
+                    <pic:cNvPr id="0" name="db_schema_diagram.png"/>
                     <pic:cNvPicPr/>
                   </pic:nvPicPr>
                   <pic:blipFill>
-                    <a:blip r:embed="rId10"/>
+                    <a:blip r:embed="rId12"/>
                     <a:stretch>
                       <a:fillRect/>
                     </a:stretch>
@@ -456,273 +561,7 @@
           <w:i/>
           <w:sz w:val="24"/>
         </w:rPr>
-        <w:t>Рисунок 1 — Диаграмма классов</w:t>
-      </w:r>
-    </w:p>
-    <w:p>
-      <w:pPr>
-        <w:spacing w:before="160" w:after="80"/>
-        <w:jc w:val="left"/>
-      </w:pPr>
-      <w:r>
-        <w:rPr>
-          <w:rFonts w:ascii="Times New Roman" w:hAnsi="Times New Roman"/>
-          <w:b/>
-          <w:sz w:val="26"/>
-        </w:rPr>
-        <w:t>Основные классы системы:</w:t>
-      </w:r>
-    </w:p>
-    <w:p>
-      <w:pPr>
-        <w:spacing w:line="276" w:lineRule="auto" w:after="60"/>
-        <w:ind w:left="709"/>
-        <w:jc w:val="both"/>
-      </w:pPr>
-      <w:r>
-        <w:rPr>
-          <w:rFonts w:ascii="Times New Roman" w:hAnsi="Times New Roman"/>
-          <w:b/>
-          <w:sz w:val="28"/>
-        </w:rPr>
-        <w:t xml:space="preserve">1. </w:t>
-      </w:r>
-      <w:r>
-        <w:rPr>
-          <w:rFonts w:ascii="Times New Roman" w:hAnsi="Times New Roman"/>
-          <w:sz w:val="28"/>
-        </w:rPr>
-      </w:r>
-      <w:r>
-        <w:rPr>
-          <w:rFonts w:ascii="Times New Roman" w:hAnsi="Times New Roman"/>
-          <w:b/>
-          <w:sz w:val="28"/>
-        </w:rPr>
-        <w:t>`User` и `Role`</w:t>
-      </w:r>
-      <w:r>
-        <w:rPr>
-          <w:rFonts w:ascii="Times New Roman" w:hAnsi="Times New Roman"/>
-          <w:sz w:val="28"/>
-        </w:rPr>
-        <w:t>: обеспечивают гранулярное ролевое разграничение прав (руководитель выпускающей кафедры, обеспечивающая кафедра, эксперт АНОК, начальник АНОК, проректор по УР, ректор).</w:t>
-      </w:r>
-    </w:p>
-    <w:p>
-      <w:pPr>
-        <w:spacing w:line="276" w:lineRule="auto" w:after="60"/>
-        <w:ind w:left="709"/>
-        <w:jc w:val="both"/>
-      </w:pPr>
-      <w:r>
-        <w:rPr>
-          <w:rFonts w:ascii="Times New Roman" w:hAnsi="Times New Roman"/>
-          <w:b/>
-          <w:sz w:val="28"/>
-        </w:rPr>
-        <w:t xml:space="preserve">2. </w:t>
-      </w:r>
-      <w:r>
-        <w:rPr>
-          <w:rFonts w:ascii="Times New Roman" w:hAnsi="Times New Roman"/>
-          <w:sz w:val="28"/>
-        </w:rPr>
-      </w:r>
-      <w:r>
-        <w:rPr>
-          <w:rFonts w:ascii="Times New Roman" w:hAnsi="Times New Roman"/>
-          <w:b/>
-          <w:sz w:val="28"/>
-        </w:rPr>
-        <w:t>`Department`</w:t>
-      </w:r>
-      <w:r>
-        <w:rPr>
-          <w:rFonts w:ascii="Times New Roman" w:hAnsi="Times New Roman"/>
-          <w:sz w:val="28"/>
-        </w:rPr>
-        <w:t>: классифицирует подразделения университета по типам (`RELEASING` — выпускающая, `IMPLEMENTING` — обеспечивающая, `EXPERT_ANOK` — экспертный центр АНОК, `MANAGEMENT` — ректорат).</w:t>
-      </w:r>
-    </w:p>
-    <w:p>
-      <w:pPr>
-        <w:spacing w:line="276" w:lineRule="auto" w:after="60"/>
-        <w:ind w:left="709"/>
-        <w:jc w:val="both"/>
-      </w:pPr>
-      <w:r>
-        <w:rPr>
-          <w:rFonts w:ascii="Times New Roman" w:hAnsi="Times New Roman"/>
-          <w:b/>
-          <w:sz w:val="28"/>
-        </w:rPr>
-        <w:t xml:space="preserve">3. </w:t>
-      </w:r>
-      <w:r>
-        <w:rPr>
-          <w:rFonts w:ascii="Times New Roman" w:hAnsi="Times New Roman"/>
-          <w:sz w:val="28"/>
-        </w:rPr>
-      </w:r>
-      <w:r>
-        <w:rPr>
-          <w:rFonts w:ascii="Times New Roman" w:hAnsi="Times New Roman"/>
-          <w:b/>
-          <w:sz w:val="28"/>
-        </w:rPr>
-        <w:t>`EducationalProgram` и `StandardFGOS`</w:t>
-      </w:r>
-      <w:r>
-        <w:rPr>
-          <w:rFonts w:ascii="Times New Roman" w:hAnsi="Times New Roman"/>
-          <w:sz w:val="28"/>
-        </w:rPr>
-        <w:t>: определяют параметры направления подготовки (код, профиль, квалификация) и нормативные ограничения стандарта ФГОС ВО 3++ (240 з.е., лимиты экзаменов в сессию, минимальные объемы практик и ГИА).</w:t>
-      </w:r>
-    </w:p>
-    <w:p>
-      <w:pPr>
-        <w:spacing w:line="276" w:lineRule="auto" w:after="60"/>
-        <w:ind w:left="709"/>
-        <w:jc w:val="both"/>
-      </w:pPr>
-      <w:r>
-        <w:rPr>
-          <w:rFonts w:ascii="Times New Roman" w:hAnsi="Times New Roman"/>
-          <w:b/>
-          <w:sz w:val="28"/>
-        </w:rPr>
-        <w:t xml:space="preserve">4. </w:t>
-      </w:r>
-      <w:r>
-        <w:rPr>
-          <w:rFonts w:ascii="Times New Roman" w:hAnsi="Times New Roman"/>
-          <w:sz w:val="28"/>
-        </w:rPr>
-      </w:r>
-      <w:r>
-        <w:rPr>
-          <w:rFonts w:ascii="Times New Roman" w:hAnsi="Times New Roman"/>
-          <w:b/>
-          <w:sz w:val="28"/>
-        </w:rPr>
-        <w:t>`Curriculum` и `CurriculumDiscipline`</w:t>
-      </w:r>
-      <w:r>
-        <w:rPr>
-          <w:rFonts w:ascii="Times New Roman" w:hAnsi="Times New Roman"/>
-          <w:sz w:val="28"/>
-        </w:rPr>
-        <w:t>: реализуют композиционную структуру учебного плана (семестры 1–8, трудоемкость в з.е. и академических часах, лекции, лабораторные, практики, СРС, формы контроля, закрепленные кафедры).</w:t>
-      </w:r>
-    </w:p>
-    <w:p>
-      <w:pPr>
-        <w:spacing w:line="276" w:lineRule="auto" w:after="60"/>
-        <w:ind w:left="709"/>
-        <w:jc w:val="both"/>
-      </w:pPr>
-      <w:r>
-        <w:rPr>
-          <w:rFonts w:ascii="Times New Roman" w:hAnsi="Times New Roman"/>
-          <w:b/>
-          <w:sz w:val="28"/>
-        </w:rPr>
-        <w:t xml:space="preserve">5. </w:t>
-      </w:r>
-      <w:r>
-        <w:rPr>
-          <w:rFonts w:ascii="Times New Roman" w:hAnsi="Times New Roman"/>
-          <w:sz w:val="28"/>
-        </w:rPr>
-      </w:r>
-      <w:r>
-        <w:rPr>
-          <w:rFonts w:ascii="Times New Roman" w:hAnsi="Times New Roman"/>
-          <w:b/>
-          <w:sz w:val="28"/>
-        </w:rPr>
-        <w:t>`ServiceNote` и `ServiceNoteItem`</w:t>
-      </w:r>
-      <w:r>
-        <w:rPr>
-          <w:rFonts w:ascii="Times New Roman" w:hAnsi="Times New Roman"/>
-          <w:sz w:val="28"/>
-        </w:rPr>
-        <w:t>: управляют жизненным циклом регламентных изменений учебного плана до начала семестра с фиксацией параметров («Было» / «Стало») в формате JSON.</w:t>
-      </w:r>
-    </w:p>
-    <w:p>
-      <w:pPr>
-        <w:spacing w:line="276" w:lineRule="auto" w:after="60"/>
-        <w:ind w:left="709"/>
-        <w:jc w:val="both"/>
-      </w:pPr>
-      <w:r>
-        <w:rPr>
-          <w:rFonts w:ascii="Times New Roman" w:hAnsi="Times New Roman"/>
-          <w:b/>
-          <w:sz w:val="28"/>
-        </w:rPr>
-        <w:t xml:space="preserve">6. </w:t>
-      </w:r>
-      <w:r>
-        <w:rPr>
-          <w:rFonts w:ascii="Times New Roman" w:hAnsi="Times New Roman"/>
-          <w:sz w:val="28"/>
-        </w:rPr>
-      </w:r>
-      <w:r>
-        <w:rPr>
-          <w:rFonts w:ascii="Times New Roman" w:hAnsi="Times New Roman"/>
-          <w:b/>
-          <w:sz w:val="28"/>
-        </w:rPr>
-        <w:t>`DocumentSignature`</w:t>
-      </w:r>
-      <w:r>
-        <w:rPr>
-          <w:rFonts w:ascii="Times New Roman" w:hAnsi="Times New Roman"/>
-          <w:sz w:val="28"/>
-        </w:rPr>
-        <w:t>: протоколирует электронное визирование документов с формированием цифрового SHA-256 хеша, отметки точного времени и статуса подписи.</w:t>
-      </w:r>
-    </w:p>
-    <w:p>
-      <w:pPr>
-        <w:spacing w:line="276" w:lineRule="auto" w:after="60"/>
-        <w:ind w:left="709"/>
-        <w:jc w:val="both"/>
-      </w:pPr>
-      <w:r>
-        <w:rPr>
-          <w:rFonts w:ascii="Times New Roman" w:hAnsi="Times New Roman"/>
-          <w:b/>
-          <w:sz w:val="28"/>
-        </w:rPr>
-        <w:t xml:space="preserve">7. </w:t>
-      </w:r>
-      <w:r>
-        <w:rPr>
-          <w:rFonts w:ascii="Times New Roman" w:hAnsi="Times New Roman"/>
-          <w:sz w:val="28"/>
-        </w:rPr>
-      </w:r>
-      <w:r>
-        <w:rPr>
-          <w:rFonts w:ascii="Times New Roman" w:hAnsi="Times New Roman"/>
-          <w:b/>
-          <w:sz w:val="28"/>
-        </w:rPr>
-        <w:t>`ValidationReport`</w:t>
-      </w:r>
-      <w:r>
-        <w:rPr>
-          <w:rFonts w:ascii="Times New Roman" w:hAnsi="Times New Roman"/>
-          <w:sz w:val="28"/>
-        </w:rPr>
-        <w:t>: аккумулирует результаты автоматической экспертизы учебного плана на соответствие нормативам ФГОС.</w:t>
+        <w:t>Рисунок 3 — Схема базы данных</w:t>
       </w:r>
     </w:p>
     <w:p>
@@ -736,7 +575,61 @@
           <w:b/>
           <w:sz w:val="28"/>
         </w:rPr>
-        <w:t>3. Диаграмма последовательности (Sequence Diagram)</w:t>
+        <w:t>4. Диаграммы</w:t>
+      </w:r>
+    </w:p>
+    <w:p>
+      <w:pPr>
+        <w:spacing w:before="200" w:after="80"/>
+        <w:jc w:val="center"/>
+      </w:pPr>
+      <w:r>
+        <w:drawing>
+          <wp:inline xmlns:a="http://schemas.openxmlformats.org/drawingml/2006/main" xmlns:pic="http://schemas.openxmlformats.org/drawingml/2006/picture">
+            <wp:extent cx="5760000" cy="3948679"/>
+            <wp:docPr id="4" name="Picture 4"/>
+            <wp:cNvGraphicFramePr>
+              <a:graphicFrameLocks noChangeAspect="1"/>
+            </wp:cNvGraphicFramePr>
+            <a:graphic>
+              <a:graphicData uri="http://schemas.openxmlformats.org/drawingml/2006/picture">
+                <pic:pic>
+                  <pic:nvPicPr>
+                    <pic:cNvPr id="0" name="class_diagram.png"/>
+                    <pic:cNvPicPr/>
+                  </pic:nvPicPr>
+                  <pic:blipFill>
+                    <a:blip r:embed="rId13"/>
+                    <a:stretch>
+                      <a:fillRect/>
+                    </a:stretch>
+                  </pic:blipFill>
+                  <pic:spPr>
+                    <a:xfrm>
+                      <a:off x="0" y="0"/>
+                      <a:ext cx="5760000" cy="3948679"/>
+                    </a:xfrm>
+                    <a:prstGeom prst="rect"/>
+                  </pic:spPr>
+                </pic:pic>
+              </a:graphicData>
+            </a:graphic>
+          </wp:inline>
+        </w:drawing>
+      </w:r>
+    </w:p>
+    <w:p>
+      <w:pPr>
+        <w:spacing w:before="80" w:after="240"/>
+        <w:jc w:val="center"/>
+      </w:pPr>
+      <w:r>
+        <w:rPr>
+          <w:rFonts w:ascii="Times New Roman" w:hAnsi="Times New Roman"/>
+          <w:i/>
+          <w:sz w:val="24"/>
+        </w:rPr>
+        <w:t>Рисунок 4 — Диаграмма классов</w:t>
       </w:r>
     </w:p>
     <w:p>
@@ -750,7 +643,7 @@
           <w:rFonts w:ascii="Times New Roman" w:hAnsi="Times New Roman"/>
           <w:sz w:val="28"/>
         </w:rPr>
-        <w:t>Диаграмма последовательности отражает временную шкалу и порядок взаимодействия акторов и программных контроллеров в рамках сквозного бизнес-процесса согласования и актуализации УП.</w:t>
+        <w:t>Диаграмма последовательности показывает получение страницы учебного плана: браузер обращается к Flask, приложение выполняет запрос к SQLite, после чего возвращает HTML-страницу.</w:t>
       </w:r>
     </w:p>
     <w:p>
@@ -762,7 +655,7 @@
         <w:drawing>
           <wp:inline xmlns:a="http://schemas.openxmlformats.org/drawingml/2006/main" xmlns:pic="http://schemas.openxmlformats.org/drawingml/2006/picture">
             <wp:extent cx="5760000" cy="4603373"/>
-            <wp:docPr id="2" name="Picture 2"/>
+            <wp:docPr id="5" name="Picture 5"/>
             <wp:cNvGraphicFramePr>
               <a:graphicFrameLocks noChangeAspect="1"/>
             </wp:cNvGraphicFramePr>
@@ -774,7 +667,7 @@
                     <pic:cNvPicPr/>
                   </pic:nvPicPr>
                   <pic:blipFill>
-                    <a:blip r:embed="rId11"/>
+                    <a:blip r:embed="rId14"/>
                     <a:stretch>
                       <a:fillRect/>
                     </a:stretch>
@@ -804,129 +697,7 @@
           <w:i/>
           <w:sz w:val="24"/>
         </w:rPr>
-        <w:t>Рисунок 2 — Диаграмма последовательности</w:t>
-      </w:r>
-    </w:p>
-    <w:p>
-      <w:pPr>
-        <w:spacing w:before="160" w:after="80"/>
-        <w:jc w:val="left"/>
-      </w:pPr>
-      <w:r>
-        <w:rPr>
-          <w:rFonts w:ascii="Times New Roman" w:hAnsi="Times New Roman"/>
-          <w:b/>
-          <w:sz w:val="26"/>
-        </w:rPr>
-        <w:t>Фазы взаимодействия:</w:t>
-      </w:r>
-    </w:p>
-    <w:p>
-      <w:pPr>
-        <w:spacing w:line="276" w:lineRule="auto" w:after="60"/>
-        <w:ind w:left="709"/>
-        <w:jc w:val="both"/>
-      </w:pPr>
-      <w:r>
-        <w:rPr>
-          <w:rFonts w:ascii="Times New Roman" w:hAnsi="Times New Roman"/>
-          <w:b/>
-          <w:sz w:val="28"/>
-        </w:rPr>
-        <w:t xml:space="preserve">1. </w:t>
-      </w:r>
-      <w:r>
-        <w:rPr>
-          <w:rFonts w:ascii="Times New Roman" w:hAnsi="Times New Roman"/>
-          <w:sz w:val="28"/>
-        </w:rPr>
-      </w:r>
-      <w:r>
-        <w:rPr>
-          <w:rFonts w:ascii="Times New Roman" w:hAnsi="Times New Roman"/>
-          <w:b/>
-          <w:sz w:val="28"/>
-        </w:rPr>
-        <w:t>Фаза 1 (Разработка и экспертиза УП по ФГОС):</w:t>
-      </w:r>
-      <w:r>
-        <w:rPr>
-          <w:rFonts w:ascii="Times New Roman" w:hAnsi="Times New Roman"/>
-          <w:sz w:val="28"/>
-        </w:rPr>
-        <w:t xml:space="preserve"> Выпускающая кафедра формирует проект УП → Портал инициирует автоматическую валидацию через `FGOS Validator` → Эксперт АНОК верифицирует протокол и утверждает экспертное заключение.</w:t>
-      </w:r>
-    </w:p>
-    <w:p>
-      <w:pPr>
-        <w:spacing w:line="276" w:lineRule="auto" w:after="60"/>
-        <w:ind w:left="709"/>
-        <w:jc w:val="both"/>
-      </w:pPr>
-      <w:r>
-        <w:rPr>
-          <w:rFonts w:ascii="Times New Roman" w:hAnsi="Times New Roman"/>
-          <w:b/>
-          <w:sz w:val="28"/>
-        </w:rPr>
-        <w:t xml:space="preserve">2. </w:t>
-      </w:r>
-      <w:r>
-        <w:rPr>
-          <w:rFonts w:ascii="Times New Roman" w:hAnsi="Times New Roman"/>
-          <w:sz w:val="28"/>
-        </w:rPr>
-      </w:r>
-      <w:r>
-        <w:rPr>
-          <w:rFonts w:ascii="Times New Roman" w:hAnsi="Times New Roman"/>
-          <w:b/>
-          <w:sz w:val="28"/>
-        </w:rPr>
-        <w:t>Фаза 2 (Маршрут подписания и ежегодного утверждения):</w:t>
-      </w:r>
-      <w:r>
-        <w:rPr>
-          <w:rFonts w:ascii="Times New Roman" w:hAnsi="Times New Roman"/>
-          <w:sz w:val="28"/>
-        </w:rPr>
-        <w:t xml:space="preserve"> Последовательное наложение цифровых виз (Зав. выпускающей кафедрой → Начальник АНОК → Проректор по УР) → Утверждение Ученым советом (номер и дата протокола) и Ректором → Публикация в реестре со статусом `APPROVED`.</w:t>
-      </w:r>
-    </w:p>
-    <w:p>
-      <w:pPr>
-        <w:spacing w:line="276" w:lineRule="auto" w:after="60"/>
-        <w:ind w:left="709"/>
-        <w:jc w:val="both"/>
-      </w:pPr>
-      <w:r>
-        <w:rPr>
-          <w:rFonts w:ascii="Times New Roman" w:hAnsi="Times New Roman"/>
-          <w:b/>
-          <w:sz w:val="28"/>
-        </w:rPr>
-        <w:t xml:space="preserve">3. </w:t>
-      </w:r>
-      <w:r>
-        <w:rPr>
-          <w:rFonts w:ascii="Times New Roman" w:hAnsi="Times New Roman"/>
-          <w:sz w:val="28"/>
-        </w:rPr>
-      </w:r>
-      <w:r>
-        <w:rPr>
-          <w:rFonts w:ascii="Times New Roman" w:hAnsi="Times New Roman"/>
-          <w:b/>
-          <w:sz w:val="28"/>
-        </w:rPr>
-        <w:t>Фаза 3 (Внесение изменений до начала семестра):</w:t>
-      </w:r>
-      <w:r>
-        <w:rPr>
-          <w:rFonts w:ascii="Times New Roman" w:hAnsi="Times New Roman"/>
-          <w:sz w:val="28"/>
-        </w:rPr>
-        <w:t xml:space="preserve"> Создание электронной служебной записки → Двустороннее согласование (выпускающая + обеспечивающая кафедры) → Передача в АНОК → Применение изменений, повторный контроль ФГОС и выпуск новой ревизии `v1.1`.</w:t>
+        <w:t>Рисунок 5 — Диаграмма последовательности</w:t>
       </w:r>
     </w:p>
     <w:p>
@@ -940,7 +711,7 @@
           <w:b/>
           <w:sz w:val="28"/>
         </w:rPr>
-        <w:t>4. Диаграмма компонентов (Component Diagram)</w:t>
+        <w:t>5. Локальное развёртывание</w:t>
       </w:r>
     </w:p>
     <w:p>
@@ -954,314 +725,75 @@
           <w:rFonts w:ascii="Times New Roman" w:hAnsi="Times New Roman"/>
           <w:sz w:val="28"/>
         </w:rPr>
-        <w:t>Компонентная модель построена по трехуровневой архитектуре (Presentation, Business Logic, Data Access).</w:t>
+        <w:t>Для запуска требуется Python 3. Зависимость Flask указана в `requirements.txt` и устанавливается командой:</w:t>
       </w:r>
     </w:p>
     <w:p>
       <w:pPr>
-        <w:spacing w:before="200" w:after="80"/>
-        <w:jc w:val="center"/>
+        <w:spacing w:before="120" w:after="120"/>
+        <w:ind w:left="567"/>
       </w:pPr>
       <w:r>
-        <w:drawing>
-          <wp:inline xmlns:a="http://schemas.openxmlformats.org/drawingml/2006/main" xmlns:pic="http://schemas.openxmlformats.org/drawingml/2006/picture">
-            <wp:extent cx="5760000" cy="3931429"/>
-            <wp:docPr id="3" name="Picture 3"/>
-            <wp:cNvGraphicFramePr>
-              <a:graphicFrameLocks noChangeAspect="1"/>
-            </wp:cNvGraphicFramePr>
-            <a:graphic>
-              <a:graphicData uri="http://schemas.openxmlformats.org/drawingml/2006/picture">
-                <pic:pic>
-                  <pic:nvPicPr>
-                    <pic:cNvPr id="0" name="component_diagram.png"/>
-                    <pic:cNvPicPr/>
-                  </pic:nvPicPr>
-                  <pic:blipFill>
-                    <a:blip r:embed="rId12"/>
-                    <a:stretch>
-                      <a:fillRect/>
-                    </a:stretch>
-                  </pic:blipFill>
-                  <pic:spPr>
-                    <a:xfrm>
-                      <a:off x="0" y="0"/>
-                      <a:ext cx="5760000" cy="3931429"/>
-                    </a:xfrm>
-                    <a:prstGeom prst="rect"/>
-                  </pic:spPr>
-                </pic:pic>
-              </a:graphicData>
-            </a:graphic>
-          </wp:inline>
-        </w:drawing>
+        <w:rPr>
+          <w:rFonts w:ascii="Courier New" w:hAnsi="Courier New"/>
+          <w:sz w:val="20"/>
+        </w:rPr>
+        <w:t>python -m pip install -r requirements.txt</w:t>
       </w:r>
     </w:p>
     <w:p>
       <w:pPr>
-        <w:spacing w:before="80" w:after="240"/>
-        <w:jc w:val="center"/>
-      </w:pPr>
-      <w:r>
-        <w:rPr>
-          <w:rFonts w:ascii="Times New Roman" w:hAnsi="Times New Roman"/>
-          <w:i/>
-          <w:sz w:val="24"/>
-        </w:rPr>
-        <w:t>Рисунок 3 — Диаграмма компонентов</w:t>
-      </w:r>
-    </w:p>
-    <w:p>
-      <w:pPr>
-        <w:spacing w:before="160" w:after="80"/>
-        <w:jc w:val="left"/>
-      </w:pPr>
-      <w:r>
-        <w:rPr>
-          <w:rFonts w:ascii="Times New Roman" w:hAnsi="Times New Roman"/>
-          <w:b/>
-          <w:sz w:val="26"/>
-        </w:rPr>
-        <w:t>Уровни и модули архитектуры:</w:t>
-      </w:r>
-    </w:p>
-    <w:p>
-      <w:pPr>
-        <w:spacing w:line="276" w:lineRule="auto" w:after="60"/>
-        <w:ind w:left="709"/>
+        <w:spacing w:line="276" w:lineRule="auto" w:after="120"/>
+        <w:ind w:firstLine="709"/>
         <w:jc w:val="both"/>
       </w:pPr>
       <w:r>
         <w:rPr>
           <w:rFonts w:ascii="Times New Roman" w:hAnsi="Times New Roman"/>
-          <w:b w:val="0"/>
           <w:sz w:val="28"/>
         </w:rPr>
-        <w:t xml:space="preserve">• </w:t>
+        <w:t>Команда запуска из каталога проекта:</w:t>
       </w:r>
+    </w:p>
+    <w:p>
+      <w:pPr>
+        <w:spacing w:before="120" w:after="120"/>
+        <w:ind w:left="567"/>
+      </w:pPr>
+      <w:r>
+        <w:rPr>
+          <w:rFonts w:ascii="Courier New" w:hAnsi="Courier New"/>
+          <w:sz w:val="20"/>
+        </w:rPr>
+        <w:t>python -m portal.app</w:t>
+      </w:r>
+    </w:p>
+    <w:p>
+      <w:pPr>
+        <w:spacing w:line="276" w:lineRule="auto" w:after="120"/>
+        <w:ind w:firstLine="709"/>
+        <w:jc w:val="both"/>
+      </w:pPr>
       <w:r>
         <w:rPr>
           <w:rFonts w:ascii="Times New Roman" w:hAnsi="Times New Roman"/>
           <w:sz w:val="28"/>
         </w:rPr>
+        <w:t>После запуска приложение доступно по адресу `http://127.0.0.1:5000`.</w:t>
       </w:r>
-      <w:r>
-        <w:rPr>
-          <w:rFonts w:ascii="Times New Roman" w:hAnsi="Times New Roman"/>
-          <w:b/>
-          <w:sz w:val="28"/>
-        </w:rPr>
-        <w:t>Presentation Layer (Уровень представления):</w:t>
-      </w:r>
+    </w:p>
+    <w:p>
+      <w:pPr>
+        <w:spacing w:line="276" w:lineRule="auto" w:after="120"/>
+        <w:ind w:firstLine="709"/>
+        <w:jc w:val="both"/>
+      </w:pPr>
       <w:r>
         <w:rPr>
           <w:rFonts w:ascii="Times New Roman" w:hAnsi="Times New Roman"/>
           <w:sz w:val="28"/>
         </w:rPr>
-        <w:t xml:space="preserve"> `Portal Web UI` (адаптивные шаблоны HTML5/TailwindCSS), `REST API Controllers`, `Auth &amp; RBAC UI`.</w:t>
-      </w:r>
-    </w:p>
-    <w:p>
-      <w:pPr>
-        <w:spacing w:line="276" w:lineRule="auto" w:after="60"/>
-        <w:ind w:left="709"/>
-        <w:jc w:val="both"/>
-      </w:pPr>
-      <w:r>
-        <w:rPr>
-          <w:rFonts w:ascii="Times New Roman" w:hAnsi="Times New Roman"/>
-          <w:b w:val="0"/>
-          <w:sz w:val="28"/>
-        </w:rPr>
-        <w:t xml:space="preserve">• </w:t>
-      </w:r>
-      <w:r>
-        <w:rPr>
-          <w:rFonts w:ascii="Times New Roman" w:hAnsi="Times New Roman"/>
-          <w:sz w:val="28"/>
-        </w:rPr>
-      </w:r>
-      <w:r>
-        <w:rPr>
-          <w:rFonts w:ascii="Times New Roman" w:hAnsi="Times New Roman"/>
-          <w:b/>
-          <w:sz w:val="28"/>
-        </w:rPr>
-        <w:t>Business Logic Layer (Уровень бизнес-логики):</w:t>
-      </w:r>
-      <w:r>
-        <w:rPr>
-          <w:rFonts w:ascii="Times New Roman" w:hAnsi="Times New Roman"/>
-          <w:sz w:val="28"/>
-        </w:rPr>
-      </w:r>
-    </w:p>
-    <w:p>
-      <w:pPr>
-        <w:spacing w:line="276" w:lineRule="auto" w:after="60"/>
-        <w:ind w:left="992"/>
-        <w:jc w:val="both"/>
-      </w:pPr>
-      <w:r>
-        <w:rPr>
-          <w:rFonts w:ascii="Times New Roman" w:hAnsi="Times New Roman"/>
-          <w:b w:val="0"/>
-          <w:sz w:val="28"/>
-        </w:rPr>
-        <w:t xml:space="preserve">• </w:t>
-      </w:r>
-      <w:r>
-        <w:rPr>
-          <w:rFonts w:ascii="Times New Roman" w:hAnsi="Times New Roman"/>
-          <w:sz w:val="28"/>
-        </w:rPr>
-        <w:t>`Curriculum Manager`: управление версиями, семестрами и структурой дисциплин УП;</w:t>
-      </w:r>
-    </w:p>
-    <w:p>
-      <w:pPr>
-        <w:spacing w:line="276" w:lineRule="auto" w:after="60"/>
-        <w:ind w:left="992"/>
-        <w:jc w:val="both"/>
-      </w:pPr>
-      <w:r>
-        <w:rPr>
-          <w:rFonts w:ascii="Times New Roman" w:hAnsi="Times New Roman"/>
-          <w:b w:val="0"/>
-          <w:sz w:val="28"/>
-        </w:rPr>
-        <w:t xml:space="preserve">• </w:t>
-      </w:r>
-      <w:r>
-        <w:rPr>
-          <w:rFonts w:ascii="Times New Roman" w:hAnsi="Times New Roman"/>
-          <w:sz w:val="28"/>
-        </w:rPr>
-        <w:t>`FGOS Validation Engine`: алгоритмическая верификация контрольных нормативов стандартов 3++;</w:t>
-      </w:r>
-    </w:p>
-    <w:p>
-      <w:pPr>
-        <w:spacing w:line="276" w:lineRule="auto" w:after="60"/>
-        <w:ind w:left="992"/>
-        <w:jc w:val="both"/>
-      </w:pPr>
-      <w:r>
-        <w:rPr>
-          <w:rFonts w:ascii="Times New Roman" w:hAnsi="Times New Roman"/>
-          <w:b w:val="0"/>
-          <w:sz w:val="28"/>
-        </w:rPr>
-        <w:t xml:space="preserve">• </w:t>
-      </w:r>
-      <w:r>
-        <w:rPr>
-          <w:rFonts w:ascii="Times New Roman" w:hAnsi="Times New Roman"/>
-          <w:sz w:val="28"/>
-        </w:rPr>
-        <w:t>`Workflow &amp; Sign Service`: маршрутизация электронных виз, криптографических штампов и состояний документов;</w:t>
-      </w:r>
-    </w:p>
-    <w:p>
-      <w:pPr>
-        <w:spacing w:line="276" w:lineRule="auto" w:after="60"/>
-        <w:ind w:left="992"/>
-        <w:jc w:val="both"/>
-      </w:pPr>
-      <w:r>
-        <w:rPr>
-          <w:rFonts w:ascii="Times New Roman" w:hAnsi="Times New Roman"/>
-          <w:b w:val="0"/>
-          <w:sz w:val="28"/>
-        </w:rPr>
-        <w:t xml:space="preserve">• </w:t>
-      </w:r>
-      <w:r>
-        <w:rPr>
-          <w:rFonts w:ascii="Times New Roman" w:hAnsi="Times New Roman"/>
-          <w:sz w:val="28"/>
-        </w:rPr>
-        <w:t>`Service Note Processor`: обработка служебных записок, версионирование и сопоставительный Diff-анализ;</w:t>
-      </w:r>
-    </w:p>
-    <w:p>
-      <w:pPr>
-        <w:spacing w:line="276" w:lineRule="auto" w:after="60"/>
-        <w:ind w:left="992"/>
-        <w:jc w:val="both"/>
-      </w:pPr>
-      <w:r>
-        <w:rPr>
-          <w:rFonts w:ascii="Times New Roman" w:hAnsi="Times New Roman"/>
-          <w:b w:val="0"/>
-          <w:sz w:val="28"/>
-        </w:rPr>
-        <w:t xml:space="preserve">• </w:t>
-      </w:r>
-      <w:r>
-        <w:rPr>
-          <w:rFonts w:ascii="Times New Roman" w:hAnsi="Times New Roman"/>
-          <w:sz w:val="28"/>
-        </w:rPr>
-        <w:t>`Catalog &amp; Search Engine`: публичный реестр, категоризация и фильтрация;</w:t>
-      </w:r>
-    </w:p>
-    <w:p>
-      <w:pPr>
-        <w:spacing w:line="276" w:lineRule="auto" w:after="60"/>
-        <w:ind w:left="992"/>
-        <w:jc w:val="both"/>
-      </w:pPr>
-      <w:r>
-        <w:rPr>
-          <w:rFonts w:ascii="Times New Roman" w:hAnsi="Times New Roman"/>
-          <w:b w:val="0"/>
-          <w:sz w:val="28"/>
-        </w:rPr>
-        <w:t xml:space="preserve">• </w:t>
-      </w:r>
-      <w:r>
-        <w:rPr>
-          <w:rFonts w:ascii="Times New Roman" w:hAnsi="Times New Roman"/>
-          <w:sz w:val="28"/>
-        </w:rPr>
-        <w:t>`Export &amp; Print Service`: генерация PDF/Excel бланков и титульных листов.</w:t>
-      </w:r>
-    </w:p>
-    <w:p>
-      <w:pPr>
-        <w:spacing w:line="276" w:lineRule="auto" w:after="60"/>
-        <w:ind w:left="709"/>
-        <w:jc w:val="both"/>
-      </w:pPr>
-      <w:r>
-        <w:rPr>
-          <w:rFonts w:ascii="Times New Roman" w:hAnsi="Times New Roman"/>
-          <w:b w:val="0"/>
-          <w:sz w:val="28"/>
-        </w:rPr>
-        <w:t xml:space="preserve">• </w:t>
-      </w:r>
-      <w:r>
-        <w:rPr>
-          <w:rFonts w:ascii="Times New Roman" w:hAnsi="Times New Roman"/>
-          <w:sz w:val="28"/>
-        </w:rPr>
-      </w:r>
-      <w:r>
-        <w:rPr>
-          <w:rFonts w:ascii="Times New Roman" w:hAnsi="Times New Roman"/>
-          <w:b/>
-          <w:sz w:val="28"/>
-        </w:rPr>
-        <w:t>Data Access &amp; Storage Layer (Уровень доступа к данным):</w:t>
-      </w:r>
-      <w:r>
-        <w:rPr>
-          <w:rFonts w:ascii="Times New Roman" w:hAnsi="Times New Roman"/>
-          <w:sz w:val="28"/>
-        </w:rPr>
-        <w:t xml:space="preserve"> `Database Engine`, `Audit Logger`, хранилище реляционных данных и цифровых слепков документов.</w:t>
+        <w:t>Файл базы данных находится в `portal/anok_portal.db`. Схема исходных таблиц описана в `portal/schema.sql`.</w:t>
       </w:r>
     </w:p>
     <w:p>
@@ -1275,7 +807,7 @@
           <w:b/>
           <w:sz w:val="28"/>
         </w:rPr>
-        <w:t>5. Диаграмма развертывания (Deployment Diagram)</w:t>
+        <w:t>6. Проверка результата</w:t>
       </w:r>
     </w:p>
     <w:p>
@@ -1289,255 +821,21 @@
           <w:rFonts w:ascii="Times New Roman" w:hAnsi="Times New Roman"/>
           <w:sz w:val="28"/>
         </w:rPr>
-        <w:t>Диаграмма развертывания специфицирует физическую топологию серверов, узлов и сетевых протоколов.</w:t>
+        <w:t>В прототипе доступны страницы сводной панели, учебных планов, проверки ФГОС, согласования, служебных записок, образовательных программ, стандартов, подразделений, компетенций, объявлений, аудита и карты сайта.</w:t>
       </w:r>
     </w:p>
     <w:p>
       <w:pPr>
-        <w:spacing w:before="200" w:after="80"/>
-        <w:jc w:val="center"/>
-      </w:pPr>
-      <w:r>
-        <w:drawing>
-          <wp:inline xmlns:a="http://schemas.openxmlformats.org/drawingml/2006/main" xmlns:pic="http://schemas.openxmlformats.org/drawingml/2006/picture">
-            <wp:extent cx="5760000" cy="3931429"/>
-            <wp:docPr id="4" name="Picture 4"/>
-            <wp:cNvGraphicFramePr>
-              <a:graphicFrameLocks noChangeAspect="1"/>
-            </wp:cNvGraphicFramePr>
-            <a:graphic>
-              <a:graphicData uri="http://schemas.openxmlformats.org/drawingml/2006/picture">
-                <pic:pic>
-                  <pic:nvPicPr>
-                    <pic:cNvPr id="0" name="deployment_diagram.png"/>
-                    <pic:cNvPicPr/>
-                  </pic:nvPicPr>
-                  <pic:blipFill>
-                    <a:blip r:embed="rId13"/>
-                    <a:stretch>
-                      <a:fillRect/>
-                    </a:stretch>
-                  </pic:blipFill>
-                  <pic:spPr>
-                    <a:xfrm>
-                      <a:off x="0" y="0"/>
-                      <a:ext cx="5760000" cy="3931429"/>
-                    </a:xfrm>
-                    <a:prstGeom prst="rect"/>
-                  </pic:spPr>
-                </pic:pic>
-              </a:graphicData>
-            </a:graphic>
-          </wp:inline>
-        </w:drawing>
-      </w:r>
-    </w:p>
-    <w:p>
-      <w:pPr>
-        <w:spacing w:before="80" w:after="240"/>
-        <w:jc w:val="center"/>
-      </w:pPr>
-      <w:r>
-        <w:rPr>
-          <w:rFonts w:ascii="Times New Roman" w:hAnsi="Times New Roman"/>
-          <w:i/>
-          <w:sz w:val="24"/>
-        </w:rPr>
-        <w:t>Рисунок 4 — Диаграмма развертывания</w:t>
-      </w:r>
-    </w:p>
-    <w:p>
-      <w:pPr>
-        <w:spacing w:before="160" w:after="80"/>
-        <w:jc w:val="left"/>
-      </w:pPr>
-      <w:r>
-        <w:rPr>
-          <w:rFonts w:ascii="Times New Roman" w:hAnsi="Times New Roman"/>
-          <w:b/>
-          <w:sz w:val="26"/>
-        </w:rPr>
-        <w:t>Топологические узлы:</w:t>
-      </w:r>
-    </w:p>
-    <w:p>
-      <w:pPr>
-        <w:spacing w:line="276" w:lineRule="auto" w:after="60"/>
-        <w:ind w:left="709"/>
+        <w:spacing w:line="276" w:lineRule="auto" w:after="120"/>
+        <w:ind w:firstLine="709"/>
         <w:jc w:val="both"/>
       </w:pPr>
       <w:r>
         <w:rPr>
           <w:rFonts w:ascii="Times New Roman" w:hAnsi="Times New Roman"/>
-          <w:b w:val="0"/>
           <w:sz w:val="28"/>
         </w:rPr>
-        <w:t xml:space="preserve">• </w:t>
-      </w:r>
-      <w:r>
-        <w:rPr>
-          <w:rFonts w:ascii="Times New Roman" w:hAnsi="Times New Roman"/>
-          <w:sz w:val="28"/>
-        </w:rPr>
-      </w:r>
-      <w:r>
-        <w:rPr>
-          <w:rFonts w:ascii="Times New Roman" w:hAnsi="Times New Roman"/>
-          <w:b/>
-          <w:sz w:val="28"/>
-        </w:rPr>
-        <w:t>Client Workstation (Рабочая станция клиента):</w:t>
-      </w:r>
-      <w:r>
-        <w:rPr>
-          <w:rFonts w:ascii="Times New Roman" w:hAnsi="Times New Roman"/>
-          <w:sz w:val="28"/>
-        </w:rPr>
-        <w:t xml:space="preserve"> веб-браузер пользователя (HTTPS, порт 443).</w:t>
-      </w:r>
-    </w:p>
-    <w:p>
-      <w:pPr>
-        <w:spacing w:line="276" w:lineRule="auto" w:after="60"/>
-        <w:ind w:left="709"/>
-        <w:jc w:val="both"/>
-      </w:pPr>
-      <w:r>
-        <w:rPr>
-          <w:rFonts w:ascii="Times New Roman" w:hAnsi="Times New Roman"/>
-          <w:b w:val="0"/>
-          <w:sz w:val="28"/>
-        </w:rPr>
-        <w:t xml:space="preserve">• </w:t>
-      </w:r>
-      <w:r>
-        <w:rPr>
-          <w:rFonts w:ascii="Times New Roman" w:hAnsi="Times New Roman"/>
-          <w:sz w:val="28"/>
-        </w:rPr>
-      </w:r>
-      <w:r>
-        <w:rPr>
-          <w:rFonts w:ascii="Times New Roman" w:hAnsi="Times New Roman"/>
-          <w:b/>
-          <w:sz w:val="28"/>
-        </w:rPr>
-        <w:t>Web / Reverse Proxy Server (Nginx):</w:t>
-      </w:r>
-      <w:r>
-        <w:rPr>
-          <w:rFonts w:ascii="Times New Roman" w:hAnsi="Times New Roman"/>
-          <w:sz w:val="28"/>
-        </w:rPr>
-        <w:t xml:space="preserve"> терминация SSL/TLS, статический кэш, защита от сетевых угроз WAF.</w:t>
-      </w:r>
-    </w:p>
-    <w:p>
-      <w:pPr>
-        <w:spacing w:line="276" w:lineRule="auto" w:after="60"/>
-        <w:ind w:left="709"/>
-        <w:jc w:val="both"/>
-      </w:pPr>
-      <w:r>
-        <w:rPr>
-          <w:rFonts w:ascii="Times New Roman" w:hAnsi="Times New Roman"/>
-          <w:b w:val="0"/>
-          <w:sz w:val="28"/>
-        </w:rPr>
-        <w:t xml:space="preserve">• </w:t>
-      </w:r>
-      <w:r>
-        <w:rPr>
-          <w:rFonts w:ascii="Times New Roman" w:hAnsi="Times New Roman"/>
-          <w:sz w:val="28"/>
-        </w:rPr>
-      </w:r>
-      <w:r>
-        <w:rPr>
-          <w:rFonts w:ascii="Times New Roman" w:hAnsi="Times New Roman"/>
-          <w:b/>
-          <w:sz w:val="28"/>
-        </w:rPr>
-        <w:t>Application Server (Python/Flask WSGI):</w:t>
-      </w:r>
-      <w:r>
-        <w:rPr>
-          <w:rFonts w:ascii="Times New Roman" w:hAnsi="Times New Roman"/>
-          <w:sz w:val="28"/>
-        </w:rPr>
-        <w:t xml:space="preserve"> исполняемая среда ядра веб-портала и кастомных модулей АНОК, пул воркеров Gunicorn.</w:t>
-      </w:r>
-    </w:p>
-    <w:p>
-      <w:pPr>
-        <w:spacing w:line="276" w:lineRule="auto" w:after="60"/>
-        <w:ind w:left="709"/>
-        <w:jc w:val="both"/>
-      </w:pPr>
-      <w:r>
-        <w:rPr>
-          <w:rFonts w:ascii="Times New Roman" w:hAnsi="Times New Roman"/>
-          <w:b w:val="0"/>
-          <w:sz w:val="28"/>
-        </w:rPr>
-        <w:t xml:space="preserve">• </w:t>
-      </w:r>
-      <w:r>
-        <w:rPr>
-          <w:rFonts w:ascii="Times New Roman" w:hAnsi="Times New Roman"/>
-          <w:sz w:val="28"/>
-        </w:rPr>
-      </w:r>
-      <w:r>
-        <w:rPr>
-          <w:rFonts w:ascii="Times New Roman" w:hAnsi="Times New Roman"/>
-          <w:b/>
-          <w:sz w:val="28"/>
-        </w:rPr>
-        <w:t>Database Server (MariaDB / SQLite):</w:t>
-      </w:r>
-      <w:r>
-        <w:rPr>
-          <w:rFonts w:ascii="Times New Roman" w:hAnsi="Times New Roman"/>
-          <w:sz w:val="28"/>
-        </w:rPr>
-        <w:t xml:space="preserve"> хранилище нормализованных данных, транзакционный журнал и журналы аудита (порт 3306 / локальный файл).</w:t>
-      </w:r>
-    </w:p>
-    <w:p>
-      <w:pPr>
-        <w:spacing w:line="276" w:lineRule="auto" w:after="60"/>
-        <w:ind w:left="709"/>
-        <w:jc w:val="both"/>
-      </w:pPr>
-      <w:r>
-        <w:rPr>
-          <w:rFonts w:ascii="Times New Roman" w:hAnsi="Times New Roman"/>
-          <w:b w:val="0"/>
-          <w:sz w:val="28"/>
-        </w:rPr>
-        <w:t xml:space="preserve">• </w:t>
-      </w:r>
-      <w:r>
-        <w:rPr>
-          <w:rFonts w:ascii="Times New Roman" w:hAnsi="Times New Roman"/>
-          <w:sz w:val="28"/>
-        </w:rPr>
-      </w:r>
-      <w:r>
-        <w:rPr>
-          <w:rFonts w:ascii="Times New Roman" w:hAnsi="Times New Roman"/>
-          <w:b/>
-          <w:sz w:val="28"/>
-        </w:rPr>
-        <w:t>File &amp; Document Storage:</w:t>
-      </w:r>
-      <w:r>
-        <w:rPr>
-          <w:rFonts w:ascii="Times New Roman" w:hAnsi="Times New Roman"/>
-          <w:sz w:val="28"/>
-        </w:rPr>
-        <w:t xml:space="preserve"> хранение сформированных отчетов в форматах PDF/Excel и протоколов валидации.</w:t>
+        <w:t>Работа с данными в текущей версии выполняется в режиме просмотра. Формы изменения данных и полноценная авторизация в эту учебную реализацию не включены.</w:t>
       </w:r>
     </w:p>
     <w:p>
@@ -1551,7 +849,7 @@
           <w:b/>
           <w:sz w:val="28"/>
         </w:rPr>
-        <w:t>6. Структура и схема базы данных</w:t>
+        <w:t>Заключение</w:t>
       </w:r>
     </w:p>
     <w:p>
@@ -1565,1852 +863,7 @@
           <w:rFonts w:ascii="Times New Roman" w:hAnsi="Times New Roman"/>
           <w:sz w:val="28"/>
         </w:rPr>
-        <w:t>Реляционная модель спроектирована в 3-й нормальной форме (3NF) и обеспечивает полную ссылочную целостность данных за счет внешних ключей `FOREIGN KEY` и уникальных индексов.</w:t>
-      </w:r>
-    </w:p>
-    <w:p>
-      <w:pPr>
-        <w:spacing w:before="200" w:after="80"/>
-        <w:jc w:val="center"/>
-      </w:pPr>
-      <w:r>
-        <w:drawing>
-          <wp:inline xmlns:a="http://schemas.openxmlformats.org/drawingml/2006/main" xmlns:pic="http://schemas.openxmlformats.org/drawingml/2006/picture">
-            <wp:extent cx="5760000" cy="3948679"/>
-            <wp:docPr id="5" name="Picture 5"/>
-            <wp:cNvGraphicFramePr>
-              <a:graphicFrameLocks noChangeAspect="1"/>
-            </wp:cNvGraphicFramePr>
-            <a:graphic>
-              <a:graphicData uri="http://schemas.openxmlformats.org/drawingml/2006/picture">
-                <pic:pic>
-                  <pic:nvPicPr>
-                    <pic:cNvPr id="0" name="db_schema_diagram.png"/>
-                    <pic:cNvPicPr/>
-                  </pic:nvPicPr>
-                  <pic:blipFill>
-                    <a:blip r:embed="rId14"/>
-                    <a:stretch>
-                      <a:fillRect/>
-                    </a:stretch>
-                  </pic:blipFill>
-                  <pic:spPr>
-                    <a:xfrm>
-                      <a:off x="0" y="0"/>
-                      <a:ext cx="5760000" cy="3948679"/>
-                    </a:xfrm>
-                    <a:prstGeom prst="rect"/>
-                  </pic:spPr>
-                </pic:pic>
-              </a:graphicData>
-            </a:graphic>
-          </wp:inline>
-        </w:drawing>
-      </w:r>
-    </w:p>
-    <w:p>
-      <w:pPr>
-        <w:spacing w:before="80" w:after="240"/>
-        <w:jc w:val="center"/>
-      </w:pPr>
-      <w:r>
-        <w:rPr>
-          <w:rFonts w:ascii="Times New Roman" w:hAnsi="Times New Roman"/>
-          <w:i/>
-          <w:sz w:val="24"/>
-        </w:rPr>
-        <w:t>Рисунок 5 — Схема базы данных ERD</w:t>
-      </w:r>
-    </w:p>
-    <w:p>
-      <w:pPr>
-        <w:spacing w:before="160" w:after="80"/>
-        <w:ind w:firstLine="709"/>
-        <w:jc w:val="left"/>
-      </w:pPr>
-      <w:r>
-        <w:rPr>
-          <w:rFonts w:ascii="Times New Roman" w:hAnsi="Times New Roman"/>
-          <w:b/>
-          <w:sz w:val="24"/>
-        </w:rPr>
-        <w:t>Таблица 1 — Спецификация данных</w:t>
-      </w:r>
-    </w:p>
-    <w:tbl>
-      <w:tblPr>
-        <w:tblW w:type="auto" w:w="0"/>
-        <w:jc w:val="center"/>
-        <w:tblLook w:firstColumn="1" w:firstRow="1" w:lastColumn="0" w:lastRow="0" w:noHBand="0" w:noVBand="1" w:val="04A0"/>
-        <w:tblBorders>
-          <w:top w:val="single" w:sz="4" w:space="0" w:color="CBD5E1"/>
-          <w:bottom w:val="single" w:sz="4" w:space="0" w:color="CBD5E1"/>
-          <w:insideH w:val="single" w:sz="4" w:space="0" w:color="CBD5E1"/>
-          <w:insideV w:val="single" w:sz="4" w:space="0" w:color="CBD5E1"/>
-          <w:left w:val="single" w:sz="4" w:space="0" w:color="CBD5E1"/>
-          <w:right w:val="single" w:sz="4" w:space="0" w:color="CBD5E1"/>
-        </w:tblBorders>
-      </w:tblPr>
-      <w:tblGrid>
-        <w:gridCol w:w="2339"/>
-        <w:gridCol w:w="2339"/>
-        <w:gridCol w:w="2339"/>
-        <w:gridCol w:w="2339"/>
-      </w:tblGrid>
-      <w:tr>
-        <w:tc>
-          <w:tcPr>
-            <w:tcW w:type="dxa" w:w="2339"/>
-            <w:tcMar>
-              <w:top w:w="100" w:type="dxa"/>
-              <w:bottom w:w="100" w:type="dxa"/>
-              <w:left w:w="150" w:type="dxa"/>
-              <w:right w:w="150" w:type="dxa"/>
-            </w:tcMar>
-            <w:shd w:fill="E2E8F0"/>
-          </w:tcPr>
-          <w:p>
-            <w:pPr>
-              <w:spacing w:before="40" w:after="40" w:line="252" w:lineRule="auto"/>
-              <w:jc w:val="left"/>
-            </w:pPr>
-            <w:r>
-              <w:rPr>
-                <w:rFonts w:ascii="Times New Roman" w:hAnsi="Times New Roman"/>
-                <w:b/>
-                <w:sz w:val="22"/>
-              </w:rPr>
-              <w:t>Таблица</w:t>
-            </w:r>
-          </w:p>
-        </w:tc>
-        <w:tc>
-          <w:tcPr>
-            <w:tcW w:type="dxa" w:w="2339"/>
-            <w:tcMar>
-              <w:top w:w="100" w:type="dxa"/>
-              <w:bottom w:w="100" w:type="dxa"/>
-              <w:left w:w="150" w:type="dxa"/>
-              <w:right w:w="150" w:type="dxa"/>
-            </w:tcMar>
-            <w:shd w:fill="E2E8F0"/>
-          </w:tcPr>
-          <w:p>
-            <w:pPr>
-              <w:spacing w:before="40" w:after="40" w:line="252" w:lineRule="auto"/>
-              <w:jc w:val="left"/>
-            </w:pPr>
-            <w:r>
-              <w:rPr>
-                <w:rFonts w:ascii="Times New Roman" w:hAnsi="Times New Roman"/>
-                <w:b/>
-                <w:sz w:val="22"/>
-              </w:rPr>
-              <w:t>Первичный ключ</w:t>
-            </w:r>
-          </w:p>
-        </w:tc>
-        <w:tc>
-          <w:tcPr>
-            <w:tcW w:type="dxa" w:w="2339"/>
-            <w:tcMar>
-              <w:top w:w="100" w:type="dxa"/>
-              <w:bottom w:w="100" w:type="dxa"/>
-              <w:left w:w="150" w:type="dxa"/>
-              <w:right w:w="150" w:type="dxa"/>
-            </w:tcMar>
-            <w:shd w:fill="E2E8F0"/>
-          </w:tcPr>
-          <w:p>
-            <w:pPr>
-              <w:spacing w:before="40" w:after="40" w:line="252" w:lineRule="auto"/>
-              <w:jc w:val="left"/>
-            </w:pPr>
-            <w:r>
-              <w:rPr>
-                <w:rFonts w:ascii="Times New Roman" w:hAnsi="Times New Roman"/>
-                <w:b/>
-                <w:sz w:val="22"/>
-              </w:rPr>
-              <w:t>Внешние ключи</w:t>
-            </w:r>
-          </w:p>
-        </w:tc>
-        <w:tc>
-          <w:tcPr>
-            <w:tcW w:type="dxa" w:w="2339"/>
-            <w:tcMar>
-              <w:top w:w="100" w:type="dxa"/>
-              <w:bottom w:w="100" w:type="dxa"/>
-              <w:left w:w="150" w:type="dxa"/>
-              <w:right w:w="150" w:type="dxa"/>
-            </w:tcMar>
-            <w:shd w:fill="E2E8F0"/>
-          </w:tcPr>
-          <w:p>
-            <w:pPr>
-              <w:spacing w:before="40" w:after="40" w:line="252" w:lineRule="auto"/>
-              <w:jc w:val="left"/>
-            </w:pPr>
-            <w:r>
-              <w:rPr>
-                <w:rFonts w:ascii="Times New Roman" w:hAnsi="Times New Roman"/>
-                <w:b/>
-                <w:sz w:val="22"/>
-              </w:rPr>
-              <w:t>Описание назначения сущности</w:t>
-            </w:r>
-          </w:p>
-        </w:tc>
-      </w:tr>
-      <w:tr>
-        <w:tc>
-          <w:tcPr>
-            <w:tcW w:type="dxa" w:w="2339"/>
-            <w:tcMar>
-              <w:top w:w="100" w:type="dxa"/>
-              <w:bottom w:w="100" w:type="dxa"/>
-              <w:left w:w="150" w:type="dxa"/>
-              <w:right w:w="150" w:type="dxa"/>
-            </w:tcMar>
-          </w:tcPr>
-          <w:p>
-            <w:pPr>
-              <w:spacing w:before="40" w:after="40" w:line="252" w:lineRule="auto"/>
-              <w:jc w:val="left"/>
-            </w:pPr>
-            <w:r>
-              <w:rPr>
-                <w:rFonts w:ascii="Times New Roman" w:hAnsi="Times New Roman"/>
-                <w:sz w:val="22"/>
-              </w:rPr>
-              <w:t>`roles`</w:t>
-            </w:r>
-          </w:p>
-        </w:tc>
-        <w:tc>
-          <w:tcPr>
-            <w:tcW w:type="dxa" w:w="2339"/>
-            <w:tcMar>
-              <w:top w:w="100" w:type="dxa"/>
-              <w:bottom w:w="100" w:type="dxa"/>
-              <w:left w:w="150" w:type="dxa"/>
-              <w:right w:w="150" w:type="dxa"/>
-            </w:tcMar>
-          </w:tcPr>
-          <w:p>
-            <w:pPr>
-              <w:spacing w:before="40" w:after="40" w:line="252" w:lineRule="auto"/>
-              <w:jc w:val="left"/>
-            </w:pPr>
-            <w:r>
-              <w:rPr>
-                <w:rFonts w:ascii="Times New Roman" w:hAnsi="Times New Roman"/>
-                <w:sz w:val="22"/>
-              </w:rPr>
-              <w:t>`id`</w:t>
-            </w:r>
-          </w:p>
-        </w:tc>
-        <w:tc>
-          <w:tcPr>
-            <w:tcW w:type="dxa" w:w="2339"/>
-            <w:tcMar>
-              <w:top w:w="100" w:type="dxa"/>
-              <w:bottom w:w="100" w:type="dxa"/>
-              <w:left w:w="150" w:type="dxa"/>
-              <w:right w:w="150" w:type="dxa"/>
-            </w:tcMar>
-          </w:tcPr>
-          <w:p>
-            <w:pPr>
-              <w:spacing w:before="40" w:after="40" w:line="252" w:lineRule="auto"/>
-              <w:jc w:val="left"/>
-            </w:pPr>
-            <w:r>
-              <w:rPr>
-                <w:rFonts w:ascii="Times New Roman" w:hAnsi="Times New Roman"/>
-                <w:sz w:val="22"/>
-              </w:rPr>
-              <w:t>—</w:t>
-            </w:r>
-          </w:p>
-        </w:tc>
-        <w:tc>
-          <w:tcPr>
-            <w:tcW w:type="dxa" w:w="2339"/>
-            <w:tcMar>
-              <w:top w:w="100" w:type="dxa"/>
-              <w:bottom w:w="100" w:type="dxa"/>
-              <w:left w:w="150" w:type="dxa"/>
-              <w:right w:w="150" w:type="dxa"/>
-            </w:tcMar>
-          </w:tcPr>
-          <w:p>
-            <w:pPr>
-              <w:spacing w:before="40" w:after="40" w:line="252" w:lineRule="auto"/>
-              <w:jc w:val="left"/>
-            </w:pPr>
-            <w:r>
-              <w:rPr>
-                <w:rFonts w:ascii="Times New Roman" w:hAnsi="Times New Roman"/>
-                <w:sz w:val="22"/>
-              </w:rPr>
-              <w:t>Ролевые профили пользователей (RBAC-матрица)</w:t>
-            </w:r>
-          </w:p>
-        </w:tc>
-      </w:tr>
-      <w:tr>
-        <w:tc>
-          <w:tcPr>
-            <w:tcW w:type="dxa" w:w="2339"/>
-            <w:tcMar>
-              <w:top w:w="100" w:type="dxa"/>
-              <w:bottom w:w="100" w:type="dxa"/>
-              <w:left w:w="150" w:type="dxa"/>
-              <w:right w:w="150" w:type="dxa"/>
-            </w:tcMar>
-          </w:tcPr>
-          <w:p>
-            <w:pPr>
-              <w:spacing w:before="40" w:after="40" w:line="252" w:lineRule="auto"/>
-              <w:jc w:val="left"/>
-            </w:pPr>
-            <w:r>
-              <w:rPr>
-                <w:rFonts w:ascii="Times New Roman" w:hAnsi="Times New Roman"/>
-                <w:sz w:val="22"/>
-              </w:rPr>
-              <w:t>`departments`</w:t>
-            </w:r>
-          </w:p>
-        </w:tc>
-        <w:tc>
-          <w:tcPr>
-            <w:tcW w:type="dxa" w:w="2339"/>
-            <w:tcMar>
-              <w:top w:w="100" w:type="dxa"/>
-              <w:bottom w:w="100" w:type="dxa"/>
-              <w:left w:w="150" w:type="dxa"/>
-              <w:right w:w="150" w:type="dxa"/>
-            </w:tcMar>
-          </w:tcPr>
-          <w:p>
-            <w:pPr>
-              <w:spacing w:before="40" w:after="40" w:line="252" w:lineRule="auto"/>
-              <w:jc w:val="left"/>
-            </w:pPr>
-            <w:r>
-              <w:rPr>
-                <w:rFonts w:ascii="Times New Roman" w:hAnsi="Times New Roman"/>
-                <w:sz w:val="22"/>
-              </w:rPr>
-              <w:t>`id`</w:t>
-            </w:r>
-          </w:p>
-        </w:tc>
-        <w:tc>
-          <w:tcPr>
-            <w:tcW w:type="dxa" w:w="2339"/>
-            <w:tcMar>
-              <w:top w:w="100" w:type="dxa"/>
-              <w:bottom w:w="100" w:type="dxa"/>
-              <w:left w:w="150" w:type="dxa"/>
-              <w:right w:w="150" w:type="dxa"/>
-            </w:tcMar>
-          </w:tcPr>
-          <w:p>
-            <w:pPr>
-              <w:spacing w:before="40" w:after="40" w:line="252" w:lineRule="auto"/>
-              <w:jc w:val="left"/>
-            </w:pPr>
-            <w:r>
-              <w:rPr>
-                <w:rFonts w:ascii="Times New Roman" w:hAnsi="Times New Roman"/>
-                <w:sz w:val="22"/>
-              </w:rPr>
-              <w:t>`head_user_id → users.id`</w:t>
-            </w:r>
-          </w:p>
-        </w:tc>
-        <w:tc>
-          <w:tcPr>
-            <w:tcW w:type="dxa" w:w="2339"/>
-            <w:tcMar>
-              <w:top w:w="100" w:type="dxa"/>
-              <w:bottom w:w="100" w:type="dxa"/>
-              <w:left w:w="150" w:type="dxa"/>
-              <w:right w:w="150" w:type="dxa"/>
-            </w:tcMar>
-          </w:tcPr>
-          <w:p>
-            <w:pPr>
-              <w:spacing w:before="40" w:after="40" w:line="252" w:lineRule="auto"/>
-              <w:jc w:val="left"/>
-            </w:pPr>
-            <w:r>
-              <w:rPr>
-                <w:rFonts w:ascii="Times New Roman" w:hAnsi="Times New Roman"/>
-                <w:sz w:val="22"/>
-              </w:rPr>
-              <w:t>Кафедры, факультеты и административные подразделения</w:t>
-            </w:r>
-          </w:p>
-        </w:tc>
-      </w:tr>
-      <w:tr>
-        <w:tc>
-          <w:tcPr>
-            <w:tcW w:type="dxa" w:w="2339"/>
-            <w:tcMar>
-              <w:top w:w="100" w:type="dxa"/>
-              <w:bottom w:w="100" w:type="dxa"/>
-              <w:left w:w="150" w:type="dxa"/>
-              <w:right w:w="150" w:type="dxa"/>
-            </w:tcMar>
-          </w:tcPr>
-          <w:p>
-            <w:pPr>
-              <w:spacing w:before="40" w:after="40" w:line="252" w:lineRule="auto"/>
-              <w:jc w:val="left"/>
-            </w:pPr>
-            <w:r>
-              <w:rPr>
-                <w:rFonts w:ascii="Times New Roman" w:hAnsi="Times New Roman"/>
-                <w:sz w:val="22"/>
-              </w:rPr>
-              <w:t>`users`</w:t>
-            </w:r>
-          </w:p>
-        </w:tc>
-        <w:tc>
-          <w:tcPr>
-            <w:tcW w:type="dxa" w:w="2339"/>
-            <w:tcMar>
-              <w:top w:w="100" w:type="dxa"/>
-              <w:bottom w:w="100" w:type="dxa"/>
-              <w:left w:w="150" w:type="dxa"/>
-              <w:right w:w="150" w:type="dxa"/>
-            </w:tcMar>
-          </w:tcPr>
-          <w:p>
-            <w:pPr>
-              <w:spacing w:before="40" w:after="40" w:line="252" w:lineRule="auto"/>
-              <w:jc w:val="left"/>
-            </w:pPr>
-            <w:r>
-              <w:rPr>
-                <w:rFonts w:ascii="Times New Roman" w:hAnsi="Times New Roman"/>
-                <w:sz w:val="22"/>
-              </w:rPr>
-              <w:t>`id`</w:t>
-            </w:r>
-          </w:p>
-        </w:tc>
-        <w:tc>
-          <w:tcPr>
-            <w:tcW w:type="dxa" w:w="2339"/>
-            <w:tcMar>
-              <w:top w:w="100" w:type="dxa"/>
-              <w:bottom w:w="100" w:type="dxa"/>
-              <w:left w:w="150" w:type="dxa"/>
-              <w:right w:w="150" w:type="dxa"/>
-            </w:tcMar>
-          </w:tcPr>
-          <w:p>
-            <w:pPr>
-              <w:spacing w:before="40" w:after="40" w:line="252" w:lineRule="auto"/>
-              <w:jc w:val="left"/>
-            </w:pPr>
-            <w:r>
-              <w:rPr>
-                <w:rFonts w:ascii="Times New Roman" w:hAnsi="Times New Roman"/>
-                <w:sz w:val="22"/>
-              </w:rPr>
-              <w:t>`role_id → roles.id`, `dept_id → departments.id`</w:t>
-            </w:r>
-          </w:p>
-        </w:tc>
-        <w:tc>
-          <w:tcPr>
-            <w:tcW w:type="dxa" w:w="2339"/>
-            <w:tcMar>
-              <w:top w:w="100" w:type="dxa"/>
-              <w:bottom w:w="100" w:type="dxa"/>
-              <w:left w:w="150" w:type="dxa"/>
-              <w:right w:w="150" w:type="dxa"/>
-            </w:tcMar>
-          </w:tcPr>
-          <w:p>
-            <w:pPr>
-              <w:spacing w:before="40" w:after="40" w:line="252" w:lineRule="auto"/>
-              <w:jc w:val="left"/>
-            </w:pPr>
-            <w:r>
-              <w:rPr>
-                <w:rFonts w:ascii="Times New Roman" w:hAnsi="Times New Roman"/>
-                <w:sz w:val="22"/>
-              </w:rPr>
-              <w:t>Учетные записи сотрудников университета</w:t>
-            </w:r>
-          </w:p>
-        </w:tc>
-      </w:tr>
-      <w:tr>
-        <w:tc>
-          <w:tcPr>
-            <w:tcW w:type="dxa" w:w="2339"/>
-            <w:tcMar>
-              <w:top w:w="100" w:type="dxa"/>
-              <w:bottom w:w="100" w:type="dxa"/>
-              <w:left w:w="150" w:type="dxa"/>
-              <w:right w:w="150" w:type="dxa"/>
-            </w:tcMar>
-          </w:tcPr>
-          <w:p>
-            <w:pPr>
-              <w:spacing w:before="40" w:after="40" w:line="252" w:lineRule="auto"/>
-              <w:jc w:val="left"/>
-            </w:pPr>
-            <w:r>
-              <w:rPr>
-                <w:rFonts w:ascii="Times New Roman" w:hAnsi="Times New Roman"/>
-                <w:sz w:val="22"/>
-              </w:rPr>
-              <w:t>`standards_fgos`</w:t>
-            </w:r>
-          </w:p>
-        </w:tc>
-        <w:tc>
-          <w:tcPr>
-            <w:tcW w:type="dxa" w:w="2339"/>
-            <w:tcMar>
-              <w:top w:w="100" w:type="dxa"/>
-              <w:bottom w:w="100" w:type="dxa"/>
-              <w:left w:w="150" w:type="dxa"/>
-              <w:right w:w="150" w:type="dxa"/>
-            </w:tcMar>
-          </w:tcPr>
-          <w:p>
-            <w:pPr>
-              <w:spacing w:before="40" w:after="40" w:line="252" w:lineRule="auto"/>
-              <w:jc w:val="left"/>
-            </w:pPr>
-            <w:r>
-              <w:rPr>
-                <w:rFonts w:ascii="Times New Roman" w:hAnsi="Times New Roman"/>
-                <w:sz w:val="22"/>
-              </w:rPr>
-              <w:t>`id`</w:t>
-            </w:r>
-          </w:p>
-        </w:tc>
-        <w:tc>
-          <w:tcPr>
-            <w:tcW w:type="dxa" w:w="2339"/>
-            <w:tcMar>
-              <w:top w:w="100" w:type="dxa"/>
-              <w:bottom w:w="100" w:type="dxa"/>
-              <w:left w:w="150" w:type="dxa"/>
-              <w:right w:w="150" w:type="dxa"/>
-            </w:tcMar>
-          </w:tcPr>
-          <w:p>
-            <w:pPr>
-              <w:spacing w:before="40" w:after="40" w:line="252" w:lineRule="auto"/>
-              <w:jc w:val="left"/>
-            </w:pPr>
-            <w:r>
-              <w:rPr>
-                <w:rFonts w:ascii="Times New Roman" w:hAnsi="Times New Roman"/>
-                <w:sz w:val="22"/>
-              </w:rPr>
-              <w:t>—</w:t>
-            </w:r>
-          </w:p>
-        </w:tc>
-        <w:tc>
-          <w:tcPr>
-            <w:tcW w:type="dxa" w:w="2339"/>
-            <w:tcMar>
-              <w:top w:w="100" w:type="dxa"/>
-              <w:bottom w:w="100" w:type="dxa"/>
-              <w:left w:w="150" w:type="dxa"/>
-              <w:right w:w="150" w:type="dxa"/>
-            </w:tcMar>
-          </w:tcPr>
-          <w:p>
-            <w:pPr>
-              <w:spacing w:before="40" w:after="40" w:line="252" w:lineRule="auto"/>
-              <w:jc w:val="left"/>
-            </w:pPr>
-            <w:r>
-              <w:rPr>
-                <w:rFonts w:ascii="Times New Roman" w:hAnsi="Times New Roman"/>
-                <w:sz w:val="22"/>
-              </w:rPr>
-              <w:t>Нормативные стандарты ФГОС ВО 3++ и числовые лимиты</w:t>
-            </w:r>
-          </w:p>
-        </w:tc>
-      </w:tr>
-      <w:tr>
-        <w:tc>
-          <w:tcPr>
-            <w:tcW w:type="dxa" w:w="2339"/>
-            <w:tcMar>
-              <w:top w:w="100" w:type="dxa"/>
-              <w:bottom w:w="100" w:type="dxa"/>
-              <w:left w:w="150" w:type="dxa"/>
-              <w:right w:w="150" w:type="dxa"/>
-            </w:tcMar>
-          </w:tcPr>
-          <w:p>
-            <w:pPr>
-              <w:spacing w:before="40" w:after="40" w:line="252" w:lineRule="auto"/>
-              <w:jc w:val="left"/>
-            </w:pPr>
-            <w:r>
-              <w:rPr>
-                <w:rFonts w:ascii="Times New Roman" w:hAnsi="Times New Roman"/>
-                <w:sz w:val="22"/>
-              </w:rPr>
-              <w:t>`educational_programs`</w:t>
-            </w:r>
-          </w:p>
-        </w:tc>
-        <w:tc>
-          <w:tcPr>
-            <w:tcW w:type="dxa" w:w="2339"/>
-            <w:tcMar>
-              <w:top w:w="100" w:type="dxa"/>
-              <w:bottom w:w="100" w:type="dxa"/>
-              <w:left w:w="150" w:type="dxa"/>
-              <w:right w:w="150" w:type="dxa"/>
-            </w:tcMar>
-          </w:tcPr>
-          <w:p>
-            <w:pPr>
-              <w:spacing w:before="40" w:after="40" w:line="252" w:lineRule="auto"/>
-              <w:jc w:val="left"/>
-            </w:pPr>
-            <w:r>
-              <w:rPr>
-                <w:rFonts w:ascii="Times New Roman" w:hAnsi="Times New Roman"/>
-                <w:sz w:val="22"/>
-              </w:rPr>
-              <w:t>`id`</w:t>
-            </w:r>
-          </w:p>
-        </w:tc>
-        <w:tc>
-          <w:tcPr>
-            <w:tcW w:type="dxa" w:w="2339"/>
-            <w:tcMar>
-              <w:top w:w="100" w:type="dxa"/>
-              <w:bottom w:w="100" w:type="dxa"/>
-              <w:left w:w="150" w:type="dxa"/>
-              <w:right w:w="150" w:type="dxa"/>
-            </w:tcMar>
-          </w:tcPr>
-          <w:p>
-            <w:pPr>
-              <w:spacing w:before="40" w:after="40" w:line="252" w:lineRule="auto"/>
-              <w:jc w:val="left"/>
-            </w:pPr>
-            <w:r>
-              <w:rPr>
-                <w:rFonts w:ascii="Times New Roman" w:hAnsi="Times New Roman"/>
-                <w:sz w:val="22"/>
-              </w:rPr>
-              <w:t>`fgos_id → standards_fgos.id`, `dept_id → departments.id`</w:t>
-            </w:r>
-          </w:p>
-        </w:tc>
-        <w:tc>
-          <w:tcPr>
-            <w:tcW w:type="dxa" w:w="2339"/>
-            <w:tcMar>
-              <w:top w:w="100" w:type="dxa"/>
-              <w:bottom w:w="100" w:type="dxa"/>
-              <w:left w:w="150" w:type="dxa"/>
-              <w:right w:w="150" w:type="dxa"/>
-            </w:tcMar>
-          </w:tcPr>
-          <w:p>
-            <w:pPr>
-              <w:spacing w:before="40" w:after="40" w:line="252" w:lineRule="auto"/>
-              <w:jc w:val="left"/>
-            </w:pPr>
-            <w:r>
-              <w:rPr>
-                <w:rFonts w:ascii="Times New Roman" w:hAnsi="Times New Roman"/>
-                <w:sz w:val="22"/>
-              </w:rPr>
-              <w:t>Образовательные программы бакалавриата и магистратуры</w:t>
-            </w:r>
-          </w:p>
-        </w:tc>
-      </w:tr>
-      <w:tr>
-        <w:tc>
-          <w:tcPr>
-            <w:tcW w:type="dxa" w:w="2339"/>
-            <w:tcMar>
-              <w:top w:w="100" w:type="dxa"/>
-              <w:bottom w:w="100" w:type="dxa"/>
-              <w:left w:w="150" w:type="dxa"/>
-              <w:right w:w="150" w:type="dxa"/>
-            </w:tcMar>
-          </w:tcPr>
-          <w:p>
-            <w:pPr>
-              <w:spacing w:before="40" w:after="40" w:line="252" w:lineRule="auto"/>
-              <w:jc w:val="left"/>
-            </w:pPr>
-            <w:r>
-              <w:rPr>
-                <w:rFonts w:ascii="Times New Roman" w:hAnsi="Times New Roman"/>
-                <w:sz w:val="22"/>
-              </w:rPr>
-              <w:t>`curriculums`</w:t>
-            </w:r>
-          </w:p>
-        </w:tc>
-        <w:tc>
-          <w:tcPr>
-            <w:tcW w:type="dxa" w:w="2339"/>
-            <w:tcMar>
-              <w:top w:w="100" w:type="dxa"/>
-              <w:bottom w:w="100" w:type="dxa"/>
-              <w:left w:w="150" w:type="dxa"/>
-              <w:right w:w="150" w:type="dxa"/>
-            </w:tcMar>
-          </w:tcPr>
-          <w:p>
-            <w:pPr>
-              <w:spacing w:before="40" w:after="40" w:line="252" w:lineRule="auto"/>
-              <w:jc w:val="left"/>
-            </w:pPr>
-            <w:r>
-              <w:rPr>
-                <w:rFonts w:ascii="Times New Roman" w:hAnsi="Times New Roman"/>
-                <w:sz w:val="22"/>
-              </w:rPr>
-              <w:t>`id`</w:t>
-            </w:r>
-          </w:p>
-        </w:tc>
-        <w:tc>
-          <w:tcPr>
-            <w:tcW w:type="dxa" w:w="2339"/>
-            <w:tcMar>
-              <w:top w:w="100" w:type="dxa"/>
-              <w:bottom w:w="100" w:type="dxa"/>
-              <w:left w:w="150" w:type="dxa"/>
-              <w:right w:w="150" w:type="dxa"/>
-            </w:tcMar>
-          </w:tcPr>
-          <w:p>
-            <w:pPr>
-              <w:spacing w:before="40" w:after="40" w:line="252" w:lineRule="auto"/>
-              <w:jc w:val="left"/>
-            </w:pPr>
-            <w:r>
-              <w:rPr>
-                <w:rFonts w:ascii="Times New Roman" w:hAnsi="Times New Roman"/>
-                <w:sz w:val="22"/>
-              </w:rPr>
-              <w:t>`program_id → educational_programs.id`</w:t>
-            </w:r>
-          </w:p>
-        </w:tc>
-        <w:tc>
-          <w:tcPr>
-            <w:tcW w:type="dxa" w:w="2339"/>
-            <w:tcMar>
-              <w:top w:w="100" w:type="dxa"/>
-              <w:bottom w:w="100" w:type="dxa"/>
-              <w:left w:w="150" w:type="dxa"/>
-              <w:right w:w="150" w:type="dxa"/>
-            </w:tcMar>
-          </w:tcPr>
-          <w:p>
-            <w:pPr>
-              <w:spacing w:before="40" w:after="40" w:line="252" w:lineRule="auto"/>
-              <w:jc w:val="left"/>
-            </w:pPr>
-            <w:r>
-              <w:rPr>
-                <w:rFonts w:ascii="Times New Roman" w:hAnsi="Times New Roman"/>
-                <w:sz w:val="22"/>
-              </w:rPr>
-              <w:t>Экземпляры учебных планов (версии v1.0, v1.1, статусы)</w:t>
-            </w:r>
-          </w:p>
-        </w:tc>
-      </w:tr>
-      <w:tr>
-        <w:tc>
-          <w:tcPr>
-            <w:tcW w:type="dxa" w:w="2339"/>
-            <w:tcMar>
-              <w:top w:w="100" w:type="dxa"/>
-              <w:bottom w:w="100" w:type="dxa"/>
-              <w:left w:w="150" w:type="dxa"/>
-              <w:right w:w="150" w:type="dxa"/>
-            </w:tcMar>
-          </w:tcPr>
-          <w:p>
-            <w:pPr>
-              <w:spacing w:before="40" w:after="40" w:line="252" w:lineRule="auto"/>
-              <w:jc w:val="left"/>
-            </w:pPr>
-            <w:r>
-              <w:rPr>
-                <w:rFonts w:ascii="Times New Roman" w:hAnsi="Times New Roman"/>
-                <w:sz w:val="22"/>
-              </w:rPr>
-              <w:t>`curriculum_disciplines`</w:t>
-            </w:r>
-          </w:p>
-        </w:tc>
-        <w:tc>
-          <w:tcPr>
-            <w:tcW w:type="dxa" w:w="2339"/>
-            <w:tcMar>
-              <w:top w:w="100" w:type="dxa"/>
-              <w:bottom w:w="100" w:type="dxa"/>
-              <w:left w:w="150" w:type="dxa"/>
-              <w:right w:w="150" w:type="dxa"/>
-            </w:tcMar>
-          </w:tcPr>
-          <w:p>
-            <w:pPr>
-              <w:spacing w:before="40" w:after="40" w:line="252" w:lineRule="auto"/>
-              <w:jc w:val="left"/>
-            </w:pPr>
-            <w:r>
-              <w:rPr>
-                <w:rFonts w:ascii="Times New Roman" w:hAnsi="Times New Roman"/>
-                <w:sz w:val="22"/>
-              </w:rPr>
-              <w:t>`id`</w:t>
-            </w:r>
-          </w:p>
-        </w:tc>
-        <w:tc>
-          <w:tcPr>
-            <w:tcW w:type="dxa" w:w="2339"/>
-            <w:tcMar>
-              <w:top w:w="100" w:type="dxa"/>
-              <w:bottom w:w="100" w:type="dxa"/>
-              <w:left w:w="150" w:type="dxa"/>
-              <w:right w:w="150" w:type="dxa"/>
-            </w:tcMar>
-          </w:tcPr>
-          <w:p>
-            <w:pPr>
-              <w:spacing w:before="40" w:after="40" w:line="252" w:lineRule="auto"/>
-              <w:jc w:val="left"/>
-            </w:pPr>
-            <w:r>
-              <w:rPr>
-                <w:rFonts w:ascii="Times New Roman" w:hAnsi="Times New Roman"/>
-                <w:sz w:val="22"/>
-              </w:rPr>
-              <w:t>`curriculum_id → curriculums.id`, `dept_id → departments.id`</w:t>
-            </w:r>
-          </w:p>
-        </w:tc>
-        <w:tc>
-          <w:tcPr>
-            <w:tcW w:type="dxa" w:w="2339"/>
-            <w:tcMar>
-              <w:top w:w="100" w:type="dxa"/>
-              <w:bottom w:w="100" w:type="dxa"/>
-              <w:left w:w="150" w:type="dxa"/>
-              <w:right w:w="150" w:type="dxa"/>
-            </w:tcMar>
-          </w:tcPr>
-          <w:p>
-            <w:pPr>
-              <w:spacing w:before="40" w:after="40" w:line="252" w:lineRule="auto"/>
-              <w:jc w:val="left"/>
-            </w:pPr>
-            <w:r>
-              <w:rPr>
-                <w:rFonts w:ascii="Times New Roman" w:hAnsi="Times New Roman"/>
-                <w:sz w:val="22"/>
-              </w:rPr>
-              <w:t>51 дисциплина 1–8 семестров с трудоемкостью в часах и з.е.</w:t>
-            </w:r>
-          </w:p>
-        </w:tc>
-      </w:tr>
-      <w:tr>
-        <w:tc>
-          <w:tcPr>
-            <w:tcW w:type="dxa" w:w="2339"/>
-            <w:tcMar>
-              <w:top w:w="100" w:type="dxa"/>
-              <w:bottom w:w="100" w:type="dxa"/>
-              <w:left w:w="150" w:type="dxa"/>
-              <w:right w:w="150" w:type="dxa"/>
-            </w:tcMar>
-          </w:tcPr>
-          <w:p>
-            <w:pPr>
-              <w:spacing w:before="40" w:after="40" w:line="252" w:lineRule="auto"/>
-              <w:jc w:val="left"/>
-            </w:pPr>
-            <w:r>
-              <w:rPr>
-                <w:rFonts w:ascii="Times New Roman" w:hAnsi="Times New Roman"/>
-                <w:sz w:val="22"/>
-              </w:rPr>
-              <w:t>`service_notes`</w:t>
-            </w:r>
-          </w:p>
-        </w:tc>
-        <w:tc>
-          <w:tcPr>
-            <w:tcW w:type="dxa" w:w="2339"/>
-            <w:tcMar>
-              <w:top w:w="100" w:type="dxa"/>
-              <w:bottom w:w="100" w:type="dxa"/>
-              <w:left w:w="150" w:type="dxa"/>
-              <w:right w:w="150" w:type="dxa"/>
-            </w:tcMar>
-          </w:tcPr>
-          <w:p>
-            <w:pPr>
-              <w:spacing w:before="40" w:after="40" w:line="252" w:lineRule="auto"/>
-              <w:jc w:val="left"/>
-            </w:pPr>
-            <w:r>
-              <w:rPr>
-                <w:rFonts w:ascii="Times New Roman" w:hAnsi="Times New Roman"/>
-                <w:sz w:val="22"/>
-              </w:rPr>
-              <w:t>`id`</w:t>
-            </w:r>
-          </w:p>
-        </w:tc>
-        <w:tc>
-          <w:tcPr>
-            <w:tcW w:type="dxa" w:w="2339"/>
-            <w:tcMar>
-              <w:top w:w="100" w:type="dxa"/>
-              <w:bottom w:w="100" w:type="dxa"/>
-              <w:left w:w="150" w:type="dxa"/>
-              <w:right w:w="150" w:type="dxa"/>
-            </w:tcMar>
-          </w:tcPr>
-          <w:p>
-            <w:pPr>
-              <w:spacing w:before="40" w:after="40" w:line="252" w:lineRule="auto"/>
-              <w:jc w:val="left"/>
-            </w:pPr>
-            <w:r>
-              <w:rPr>
-                <w:rFonts w:ascii="Times New Roman" w:hAnsi="Times New Roman"/>
-                <w:sz w:val="22"/>
-              </w:rPr>
-              <w:t>`curriculum_id → curriculums.id`, `user_id → users.id`</w:t>
-            </w:r>
-          </w:p>
-        </w:tc>
-        <w:tc>
-          <w:tcPr>
-            <w:tcW w:type="dxa" w:w="2339"/>
-            <w:tcMar>
-              <w:top w:w="100" w:type="dxa"/>
-              <w:bottom w:w="100" w:type="dxa"/>
-              <w:left w:w="150" w:type="dxa"/>
-              <w:right w:w="150" w:type="dxa"/>
-            </w:tcMar>
-          </w:tcPr>
-          <w:p>
-            <w:pPr>
-              <w:spacing w:before="40" w:after="40" w:line="252" w:lineRule="auto"/>
-              <w:jc w:val="left"/>
-            </w:pPr>
-            <w:r>
-              <w:rPr>
-                <w:rFonts w:ascii="Times New Roman" w:hAnsi="Times New Roman"/>
-                <w:sz w:val="22"/>
-              </w:rPr>
-              <w:t>Служебные записки на корректировку учебных планов</w:t>
-            </w:r>
-          </w:p>
-        </w:tc>
-      </w:tr>
-      <w:tr>
-        <w:tc>
-          <w:tcPr>
-            <w:tcW w:type="dxa" w:w="2339"/>
-            <w:tcMar>
-              <w:top w:w="100" w:type="dxa"/>
-              <w:bottom w:w="100" w:type="dxa"/>
-              <w:left w:w="150" w:type="dxa"/>
-              <w:right w:w="150" w:type="dxa"/>
-            </w:tcMar>
-          </w:tcPr>
-          <w:p>
-            <w:pPr>
-              <w:spacing w:before="40" w:after="40" w:line="252" w:lineRule="auto"/>
-              <w:jc w:val="left"/>
-            </w:pPr>
-            <w:r>
-              <w:rPr>
-                <w:rFonts w:ascii="Times New Roman" w:hAnsi="Times New Roman"/>
-                <w:sz w:val="22"/>
-              </w:rPr>
-              <w:t>`service_note_items`</w:t>
-            </w:r>
-          </w:p>
-        </w:tc>
-        <w:tc>
-          <w:tcPr>
-            <w:tcW w:type="dxa" w:w="2339"/>
-            <w:tcMar>
-              <w:top w:w="100" w:type="dxa"/>
-              <w:bottom w:w="100" w:type="dxa"/>
-              <w:left w:w="150" w:type="dxa"/>
-              <w:right w:w="150" w:type="dxa"/>
-            </w:tcMar>
-          </w:tcPr>
-          <w:p>
-            <w:pPr>
-              <w:spacing w:before="40" w:after="40" w:line="252" w:lineRule="auto"/>
-              <w:jc w:val="left"/>
-            </w:pPr>
-            <w:r>
-              <w:rPr>
-                <w:rFonts w:ascii="Times New Roman" w:hAnsi="Times New Roman"/>
-                <w:sz w:val="22"/>
-              </w:rPr>
-              <w:t>`id`</w:t>
-            </w:r>
-          </w:p>
-        </w:tc>
-        <w:tc>
-          <w:tcPr>
-            <w:tcW w:type="dxa" w:w="2339"/>
-            <w:tcMar>
-              <w:top w:w="100" w:type="dxa"/>
-              <w:bottom w:w="100" w:type="dxa"/>
-              <w:left w:w="150" w:type="dxa"/>
-              <w:right w:w="150" w:type="dxa"/>
-            </w:tcMar>
-          </w:tcPr>
-          <w:p>
-            <w:pPr>
-              <w:spacing w:before="40" w:after="40" w:line="252" w:lineRule="auto"/>
-              <w:jc w:val="left"/>
-            </w:pPr>
-            <w:r>
-              <w:rPr>
-                <w:rFonts w:ascii="Times New Roman" w:hAnsi="Times New Roman"/>
-                <w:sz w:val="22"/>
-              </w:rPr>
-              <w:t>`note_id → service_notes.id`, `disc_id → disciplines.id`</w:t>
-            </w:r>
-          </w:p>
-        </w:tc>
-        <w:tc>
-          <w:tcPr>
-            <w:tcW w:type="dxa" w:w="2339"/>
-            <w:tcMar>
-              <w:top w:w="100" w:type="dxa"/>
-              <w:bottom w:w="100" w:type="dxa"/>
-              <w:left w:w="150" w:type="dxa"/>
-              <w:right w:w="150" w:type="dxa"/>
-            </w:tcMar>
-          </w:tcPr>
-          <w:p>
-            <w:pPr>
-              <w:spacing w:before="40" w:after="40" w:line="252" w:lineRule="auto"/>
-              <w:jc w:val="left"/>
-            </w:pPr>
-            <w:r>
-              <w:rPr>
-                <w:rFonts w:ascii="Times New Roman" w:hAnsi="Times New Roman"/>
-                <w:sz w:val="22"/>
-              </w:rPr>
-              <w:t>Строки изменений дисциплин (JSON «Было / Стало»)</w:t>
-            </w:r>
-          </w:p>
-        </w:tc>
-      </w:tr>
-      <w:tr>
-        <w:tc>
-          <w:tcPr>
-            <w:tcW w:type="dxa" w:w="2339"/>
-            <w:tcMar>
-              <w:top w:w="100" w:type="dxa"/>
-              <w:bottom w:w="100" w:type="dxa"/>
-              <w:left w:w="150" w:type="dxa"/>
-              <w:right w:w="150" w:type="dxa"/>
-            </w:tcMar>
-          </w:tcPr>
-          <w:p>
-            <w:pPr>
-              <w:spacing w:before="40" w:after="40" w:line="252" w:lineRule="auto"/>
-              <w:jc w:val="left"/>
-            </w:pPr>
-            <w:r>
-              <w:rPr>
-                <w:rFonts w:ascii="Times New Roman" w:hAnsi="Times New Roman"/>
-                <w:sz w:val="22"/>
-              </w:rPr>
-              <w:t>`document_signatures`</w:t>
-            </w:r>
-          </w:p>
-        </w:tc>
-        <w:tc>
-          <w:tcPr>
-            <w:tcW w:type="dxa" w:w="2339"/>
-            <w:tcMar>
-              <w:top w:w="100" w:type="dxa"/>
-              <w:bottom w:w="100" w:type="dxa"/>
-              <w:left w:w="150" w:type="dxa"/>
-              <w:right w:w="150" w:type="dxa"/>
-            </w:tcMar>
-          </w:tcPr>
-          <w:p>
-            <w:pPr>
-              <w:spacing w:before="40" w:after="40" w:line="252" w:lineRule="auto"/>
-              <w:jc w:val="left"/>
-            </w:pPr>
-            <w:r>
-              <w:rPr>
-                <w:rFonts w:ascii="Times New Roman" w:hAnsi="Times New Roman"/>
-                <w:sz w:val="22"/>
-              </w:rPr>
-              <w:t>`id`</w:t>
-            </w:r>
-          </w:p>
-        </w:tc>
-        <w:tc>
-          <w:tcPr>
-            <w:tcW w:type="dxa" w:w="2339"/>
-            <w:tcMar>
-              <w:top w:w="100" w:type="dxa"/>
-              <w:bottom w:w="100" w:type="dxa"/>
-              <w:left w:w="150" w:type="dxa"/>
-              <w:right w:w="150" w:type="dxa"/>
-            </w:tcMar>
-          </w:tcPr>
-          <w:p>
-            <w:pPr>
-              <w:spacing w:before="40" w:after="40" w:line="252" w:lineRule="auto"/>
-              <w:jc w:val="left"/>
-            </w:pPr>
-            <w:r>
-              <w:rPr>
-                <w:rFonts w:ascii="Times New Roman" w:hAnsi="Times New Roman"/>
-                <w:sz w:val="22"/>
-              </w:rPr>
-              <w:t>`user_id → users.id`</w:t>
-            </w:r>
-          </w:p>
-        </w:tc>
-        <w:tc>
-          <w:tcPr>
-            <w:tcW w:type="dxa" w:w="2339"/>
-            <w:tcMar>
-              <w:top w:w="100" w:type="dxa"/>
-              <w:bottom w:w="100" w:type="dxa"/>
-              <w:left w:w="150" w:type="dxa"/>
-              <w:right w:w="150" w:type="dxa"/>
-            </w:tcMar>
-          </w:tcPr>
-          <w:p>
-            <w:pPr>
-              <w:spacing w:before="40" w:after="40" w:line="252" w:lineRule="auto"/>
-              <w:jc w:val="left"/>
-            </w:pPr>
-            <w:r>
-              <w:rPr>
-                <w:rFonts w:ascii="Times New Roman" w:hAnsi="Times New Roman"/>
-                <w:sz w:val="22"/>
-              </w:rPr>
-              <w:t>Журнал электронного визирования со слепком SHA-256</w:t>
-            </w:r>
-          </w:p>
-        </w:tc>
-      </w:tr>
-      <w:tr>
-        <w:tc>
-          <w:tcPr>
-            <w:tcW w:type="dxa" w:w="2339"/>
-            <w:tcMar>
-              <w:top w:w="100" w:type="dxa"/>
-              <w:bottom w:w="100" w:type="dxa"/>
-              <w:left w:w="150" w:type="dxa"/>
-              <w:right w:w="150" w:type="dxa"/>
-            </w:tcMar>
-          </w:tcPr>
-          <w:p>
-            <w:pPr>
-              <w:spacing w:before="40" w:after="40" w:line="252" w:lineRule="auto"/>
-              <w:jc w:val="left"/>
-            </w:pPr>
-            <w:r>
-              <w:rPr>
-                <w:rFonts w:ascii="Times New Roman" w:hAnsi="Times New Roman"/>
-                <w:sz w:val="22"/>
-              </w:rPr>
-              <w:t>`audit_logs`</w:t>
-            </w:r>
-          </w:p>
-        </w:tc>
-        <w:tc>
-          <w:tcPr>
-            <w:tcW w:type="dxa" w:w="2339"/>
-            <w:tcMar>
-              <w:top w:w="100" w:type="dxa"/>
-              <w:bottom w:w="100" w:type="dxa"/>
-              <w:left w:w="150" w:type="dxa"/>
-              <w:right w:w="150" w:type="dxa"/>
-            </w:tcMar>
-          </w:tcPr>
-          <w:p>
-            <w:pPr>
-              <w:spacing w:before="40" w:after="40" w:line="252" w:lineRule="auto"/>
-              <w:jc w:val="left"/>
-            </w:pPr>
-            <w:r>
-              <w:rPr>
-                <w:rFonts w:ascii="Times New Roman" w:hAnsi="Times New Roman"/>
-                <w:sz w:val="22"/>
-              </w:rPr>
-              <w:t>`id`</w:t>
-            </w:r>
-          </w:p>
-        </w:tc>
-        <w:tc>
-          <w:tcPr>
-            <w:tcW w:type="dxa" w:w="2339"/>
-            <w:tcMar>
-              <w:top w:w="100" w:type="dxa"/>
-              <w:bottom w:w="100" w:type="dxa"/>
-              <w:left w:w="150" w:type="dxa"/>
-              <w:right w:w="150" w:type="dxa"/>
-            </w:tcMar>
-          </w:tcPr>
-          <w:p>
-            <w:pPr>
-              <w:spacing w:before="40" w:after="40" w:line="252" w:lineRule="auto"/>
-              <w:jc w:val="left"/>
-            </w:pPr>
-            <w:r>
-              <w:rPr>
-                <w:rFonts w:ascii="Times New Roman" w:hAnsi="Times New Roman"/>
-                <w:sz w:val="22"/>
-              </w:rPr>
-              <w:t>`user_id → users.id`</w:t>
-            </w:r>
-          </w:p>
-        </w:tc>
-        <w:tc>
-          <w:tcPr>
-            <w:tcW w:type="dxa" w:w="2339"/>
-            <w:tcMar>
-              <w:top w:w="100" w:type="dxa"/>
-              <w:bottom w:w="100" w:type="dxa"/>
-              <w:left w:w="150" w:type="dxa"/>
-              <w:right w:w="150" w:type="dxa"/>
-            </w:tcMar>
-          </w:tcPr>
-          <w:p>
-            <w:pPr>
-              <w:spacing w:before="40" w:after="40" w:line="252" w:lineRule="auto"/>
-              <w:jc w:val="left"/>
-            </w:pPr>
-            <w:r>
-              <w:rPr>
-                <w:rFonts w:ascii="Times New Roman" w:hAnsi="Times New Roman"/>
-                <w:sz w:val="22"/>
-              </w:rPr>
-              <w:t>Журнал безопасности и фиксация критических действий</w:t>
-            </w:r>
-          </w:p>
-        </w:tc>
-      </w:tr>
-      <w:tr>
-        <w:tc>
-          <w:tcPr>
-            <w:tcW w:type="dxa" w:w="2339"/>
-            <w:tcMar>
-              <w:top w:w="100" w:type="dxa"/>
-              <w:bottom w:w="100" w:type="dxa"/>
-              <w:left w:w="150" w:type="dxa"/>
-              <w:right w:w="150" w:type="dxa"/>
-            </w:tcMar>
-          </w:tcPr>
-          <w:p>
-            <w:pPr>
-              <w:spacing w:before="40" w:after="40" w:line="252" w:lineRule="auto"/>
-              <w:jc w:val="left"/>
-            </w:pPr>
-            <w:r>
-              <w:rPr>
-                <w:rFonts w:ascii="Times New Roman" w:hAnsi="Times New Roman"/>
-                <w:sz w:val="22"/>
-              </w:rPr>
-              <w:t>`competencies`</w:t>
-            </w:r>
-          </w:p>
-        </w:tc>
-        <w:tc>
-          <w:tcPr>
-            <w:tcW w:type="dxa" w:w="2339"/>
-            <w:tcMar>
-              <w:top w:w="100" w:type="dxa"/>
-              <w:bottom w:w="100" w:type="dxa"/>
-              <w:left w:w="150" w:type="dxa"/>
-              <w:right w:w="150" w:type="dxa"/>
-            </w:tcMar>
-          </w:tcPr>
-          <w:p>
-            <w:pPr>
-              <w:spacing w:before="40" w:after="40" w:line="252" w:lineRule="auto"/>
-              <w:jc w:val="left"/>
-            </w:pPr>
-            <w:r>
-              <w:rPr>
-                <w:rFonts w:ascii="Times New Roman" w:hAnsi="Times New Roman"/>
-                <w:sz w:val="22"/>
-              </w:rPr>
-              <w:t>`id`</w:t>
-            </w:r>
-          </w:p>
-        </w:tc>
-        <w:tc>
-          <w:tcPr>
-            <w:tcW w:type="dxa" w:w="2339"/>
-            <w:tcMar>
-              <w:top w:w="100" w:type="dxa"/>
-              <w:bottom w:w="100" w:type="dxa"/>
-              <w:left w:w="150" w:type="dxa"/>
-              <w:right w:w="150" w:type="dxa"/>
-            </w:tcMar>
-          </w:tcPr>
-          <w:p>
-            <w:pPr>
-              <w:spacing w:before="40" w:after="40" w:line="252" w:lineRule="auto"/>
-              <w:jc w:val="left"/>
-            </w:pPr>
-            <w:r>
-              <w:rPr>
-                <w:rFonts w:ascii="Times New Roman" w:hAnsi="Times New Roman"/>
-                <w:sz w:val="22"/>
-              </w:rPr>
-              <w:t>`standard_id → standards_fgos.id`</w:t>
-            </w:r>
-          </w:p>
-        </w:tc>
-        <w:tc>
-          <w:tcPr>
-            <w:tcW w:type="dxa" w:w="2339"/>
-            <w:tcMar>
-              <w:top w:w="100" w:type="dxa"/>
-              <w:bottom w:w="100" w:type="dxa"/>
-              <w:left w:w="150" w:type="dxa"/>
-              <w:right w:w="150" w:type="dxa"/>
-            </w:tcMar>
-          </w:tcPr>
-          <w:p>
-            <w:pPr>
-              <w:spacing w:before="40" w:after="40" w:line="252" w:lineRule="auto"/>
-              <w:jc w:val="left"/>
-            </w:pPr>
-            <w:r>
-              <w:rPr>
-                <w:rFonts w:ascii="Times New Roman" w:hAnsi="Times New Roman"/>
-                <w:sz w:val="22"/>
-              </w:rPr>
-              <w:t>Справочник универсальных, общепрофессиональных и проф. компетенций</w:t>
-            </w:r>
-          </w:p>
-        </w:tc>
-      </w:tr>
-      <w:tr>
-        <w:tc>
-          <w:tcPr>
-            <w:tcW w:type="dxa" w:w="2339"/>
-            <w:tcMar>
-              <w:top w:w="100" w:type="dxa"/>
-              <w:bottom w:w="100" w:type="dxa"/>
-              <w:left w:w="150" w:type="dxa"/>
-              <w:right w:w="150" w:type="dxa"/>
-            </w:tcMar>
-          </w:tcPr>
-          <w:p>
-            <w:pPr>
-              <w:spacing w:before="40" w:after="40" w:line="252" w:lineRule="auto"/>
-              <w:jc w:val="left"/>
-            </w:pPr>
-            <w:r>
-              <w:rPr>
-                <w:rFonts w:ascii="Times New Roman" w:hAnsi="Times New Roman"/>
-                <w:sz w:val="22"/>
-              </w:rPr>
-              <w:t>`announcements`</w:t>
-            </w:r>
-          </w:p>
-        </w:tc>
-        <w:tc>
-          <w:tcPr>
-            <w:tcW w:type="dxa" w:w="2339"/>
-            <w:tcMar>
-              <w:top w:w="100" w:type="dxa"/>
-              <w:bottom w:w="100" w:type="dxa"/>
-              <w:left w:w="150" w:type="dxa"/>
-              <w:right w:w="150" w:type="dxa"/>
-            </w:tcMar>
-          </w:tcPr>
-          <w:p>
-            <w:pPr>
-              <w:spacing w:before="40" w:after="40" w:line="252" w:lineRule="auto"/>
-              <w:jc w:val="left"/>
-            </w:pPr>
-            <w:r>
-              <w:rPr>
-                <w:rFonts w:ascii="Times New Roman" w:hAnsi="Times New Roman"/>
-                <w:sz w:val="22"/>
-              </w:rPr>
-              <w:t>`id`</w:t>
-            </w:r>
-          </w:p>
-        </w:tc>
-        <w:tc>
-          <w:tcPr>
-            <w:tcW w:type="dxa" w:w="2339"/>
-            <w:tcMar>
-              <w:top w:w="100" w:type="dxa"/>
-              <w:bottom w:w="100" w:type="dxa"/>
-              <w:left w:w="150" w:type="dxa"/>
-              <w:right w:w="150" w:type="dxa"/>
-            </w:tcMar>
-          </w:tcPr>
-          <w:p>
-            <w:pPr>
-              <w:spacing w:before="40" w:after="40" w:line="252" w:lineRule="auto"/>
-              <w:jc w:val="left"/>
-            </w:pPr>
-            <w:r>
-              <w:rPr>
-                <w:rFonts w:ascii="Times New Roman" w:hAnsi="Times New Roman"/>
-                <w:sz w:val="22"/>
-              </w:rPr>
-              <w:t>`author_id → users.id`</w:t>
-            </w:r>
-          </w:p>
-        </w:tc>
-        <w:tc>
-          <w:tcPr>
-            <w:tcW w:type="dxa" w:w="2339"/>
-            <w:tcMar>
-              <w:top w:w="100" w:type="dxa"/>
-              <w:bottom w:w="100" w:type="dxa"/>
-              <w:left w:w="150" w:type="dxa"/>
-              <w:right w:w="150" w:type="dxa"/>
-            </w:tcMar>
-          </w:tcPr>
-          <w:p>
-            <w:pPr>
-              <w:spacing w:before="40" w:after="40" w:line="252" w:lineRule="auto"/>
-              <w:jc w:val="left"/>
-            </w:pPr>
-            <w:r>
-              <w:rPr>
-                <w:rFonts w:ascii="Times New Roman" w:hAnsi="Times New Roman"/>
-                <w:sz w:val="22"/>
-              </w:rPr>
-              <w:t>Нормативные объявления и графики заседаний АНОК</w:t>
-            </w:r>
-          </w:p>
-        </w:tc>
-      </w:tr>
-    </w:tbl>
-    <w:p>
-      <w:pPr>
-        <w:spacing w:after="120"/>
-      </w:pPr>
-    </w:p>
-    <w:p>
-      <w:pPr>
-        <w:spacing w:before="240" w:after="120"/>
-        <w:jc w:val="left"/>
-      </w:pPr>
-      <w:r>
-        <w:rPr>
-          <w:rFonts w:ascii="Times New Roman" w:hAnsi="Times New Roman"/>
-          <w:b/>
-          <w:sz w:val="28"/>
-        </w:rPr>
-        <w:t>7. Примеры работы установленного и настроенного ПО</w:t>
-      </w:r>
-    </w:p>
-    <w:p>
-      <w:pPr>
-        <w:spacing w:before="160" w:after="80"/>
-        <w:jc w:val="left"/>
-      </w:pPr>
-      <w:r>
-        <w:rPr>
-          <w:rFonts w:ascii="Times New Roman" w:hAnsi="Times New Roman"/>
-          <w:b/>
-          <w:sz w:val="26"/>
-        </w:rPr>
-        <w:t>7.1. Главная панель управления (Dashboard) и реестр планов</w:t>
-      </w:r>
-    </w:p>
-    <w:p>
-      <w:pPr>
-        <w:spacing w:line="276" w:lineRule="auto" w:after="120"/>
-        <w:ind w:firstLine="709"/>
-        <w:jc w:val="both"/>
-      </w:pPr>
-      <w:r>
-        <w:rPr>
-          <w:rFonts w:ascii="Times New Roman" w:hAnsi="Times New Roman"/>
-          <w:sz w:val="28"/>
-        </w:rPr>
-        <w:t>Отображение сводной статистики, активных документов и реестра утвержденных учебных планов.</w:t>
-      </w:r>
-    </w:p>
-    <w:p>
-      <w:pPr>
-        <w:spacing w:before="200" w:after="80"/>
-        <w:jc w:val="center"/>
-      </w:pPr>
-      <w:r>
-        <w:drawing>
-          <wp:inline xmlns:a="http://schemas.openxmlformats.org/drawingml/2006/main" xmlns:pic="http://schemas.openxmlformats.org/drawingml/2006/picture">
-            <wp:extent cx="5760000" cy="3948679"/>
-            <wp:docPr id="6" name="Picture 6"/>
-            <wp:cNvGraphicFramePr>
-              <a:graphicFrameLocks noChangeAspect="1"/>
-            </wp:cNvGraphicFramePr>
-            <a:graphic>
-              <a:graphicData uri="http://schemas.openxmlformats.org/drawingml/2006/picture">
-                <pic:pic>
-                  <pic:nvPicPr>
-                    <pic:cNvPr id="0" name="screen_dashboard.png"/>
-                    <pic:cNvPicPr/>
-                  </pic:nvPicPr>
-                  <pic:blipFill>
-                    <a:blip r:embed="rId15"/>
-                    <a:stretch>
-                      <a:fillRect/>
-                    </a:stretch>
-                  </pic:blipFill>
-                  <pic:spPr>
-                    <a:xfrm>
-                      <a:off x="0" y="0"/>
-                      <a:ext cx="5760000" cy="3948679"/>
-                    </a:xfrm>
-                    <a:prstGeom prst="rect"/>
-                  </pic:spPr>
-                </pic:pic>
-              </a:graphicData>
-            </a:graphic>
-          </wp:inline>
-        </w:drawing>
-      </w:r>
-    </w:p>
-    <w:p>
-      <w:pPr>
-        <w:spacing w:before="80" w:after="240"/>
-        <w:jc w:val="center"/>
-      </w:pPr>
-      <w:r>
-        <w:rPr>
-          <w:rFonts w:ascii="Times New Roman" w:hAnsi="Times New Roman"/>
-          <w:i/>
-          <w:sz w:val="24"/>
-        </w:rPr>
-        <w:t>Рисунок 6 — Интерфейс Dashboard</w:t>
-      </w:r>
-    </w:p>
-    <w:p>
-      <w:pPr>
-        <w:spacing w:before="160" w:after="80"/>
-        <w:jc w:val="left"/>
-      </w:pPr>
-      <w:r>
-        <w:rPr>
-          <w:rFonts w:ascii="Times New Roman" w:hAnsi="Times New Roman"/>
-          <w:b/>
-          <w:sz w:val="26"/>
-        </w:rPr>
-        <w:t>7.2. Просмотр и редактирование структуры учебного плана</w:t>
-      </w:r>
-    </w:p>
-    <w:p>
-      <w:pPr>
-        <w:spacing w:line="276" w:lineRule="auto" w:after="120"/>
-        <w:ind w:firstLine="709"/>
-        <w:jc w:val="both"/>
-      </w:pPr>
-      <w:r>
-        <w:rPr>
-          <w:rFonts w:ascii="Times New Roman" w:hAnsi="Times New Roman"/>
-          <w:sz w:val="28"/>
-        </w:rPr>
-        <w:t>Детальная таблица дисциплин по семестрам 1–8 с распределением часов, зачетных единиц и форм контроля.</w:t>
-      </w:r>
-    </w:p>
-    <w:p>
-      <w:pPr>
-        <w:spacing w:before="200" w:after="80"/>
-        <w:jc w:val="center"/>
-      </w:pPr>
-      <w:r>
-        <w:drawing>
-          <wp:inline xmlns:a="http://schemas.openxmlformats.org/drawingml/2006/main" xmlns:pic="http://schemas.openxmlformats.org/drawingml/2006/picture">
-            <wp:extent cx="5760000" cy="3948679"/>
-            <wp:docPr id="7" name="Picture 7"/>
-            <wp:cNvGraphicFramePr>
-              <a:graphicFrameLocks noChangeAspect="1"/>
-            </wp:cNvGraphicFramePr>
-            <a:graphic>
-              <a:graphicData uri="http://schemas.openxmlformats.org/drawingml/2006/picture">
-                <pic:pic>
-                  <pic:nvPicPr>
-                    <pic:cNvPr id="0" name="screen_plan_grid.png"/>
-                    <pic:cNvPicPr/>
-                  </pic:nvPicPr>
-                  <pic:blipFill>
-                    <a:blip r:embed="rId16"/>
-                    <a:stretch>
-                      <a:fillRect/>
-                    </a:stretch>
-                  </pic:blipFill>
-                  <pic:spPr>
-                    <a:xfrm>
-                      <a:off x="0" y="0"/>
-                      <a:ext cx="5760000" cy="3948679"/>
-                    </a:xfrm>
-                    <a:prstGeom prst="rect"/>
-                  </pic:spPr>
-                </pic:pic>
-              </a:graphicData>
-            </a:graphic>
-          </wp:inline>
-        </w:drawing>
-      </w:r>
-    </w:p>
-    <w:p>
-      <w:pPr>
-        <w:spacing w:before="80" w:after="240"/>
-        <w:jc w:val="center"/>
-      </w:pPr>
-      <w:r>
-        <w:rPr>
-          <w:rFonts w:ascii="Times New Roman" w:hAnsi="Times New Roman"/>
-          <w:i/>
-          <w:sz w:val="24"/>
-        </w:rPr>
-        <w:t>Рисунок 7 — Интерфейс сетки плана</w:t>
-      </w:r>
-    </w:p>
-    <w:p>
-      <w:pPr>
-        <w:spacing w:before="160" w:after="80"/>
-        <w:jc w:val="left"/>
-      </w:pPr>
-      <w:r>
-        <w:rPr>
-          <w:rFonts w:ascii="Times New Roman" w:hAnsi="Times New Roman"/>
-          <w:b/>
-          <w:sz w:val="26"/>
-        </w:rPr>
-        <w:t>7.3. Модуль автоматизированной экспертизы ФГОС 3++</w:t>
-      </w:r>
-    </w:p>
-    <w:p>
-      <w:pPr>
-        <w:spacing w:line="276" w:lineRule="auto" w:after="120"/>
-        <w:ind w:firstLine="709"/>
-        <w:jc w:val="both"/>
-      </w:pPr>
-      <w:r>
-        <w:rPr>
-          <w:rFonts w:ascii="Times New Roman" w:hAnsi="Times New Roman"/>
-          <w:sz w:val="28"/>
-        </w:rPr>
-        <w:t>Автоматическая проверка контрольных соотношений (240 з.е., баланс блоков, ограничения сессий).</w:t>
-      </w:r>
-    </w:p>
-    <w:p>
-      <w:pPr>
-        <w:spacing w:before="200" w:after="80"/>
-        <w:jc w:val="center"/>
-      </w:pPr>
-      <w:r>
-        <w:drawing>
-          <wp:inline xmlns:a="http://schemas.openxmlformats.org/drawingml/2006/main" xmlns:pic="http://schemas.openxmlformats.org/drawingml/2006/picture">
-            <wp:extent cx="5760000" cy="3948679"/>
-            <wp:docPr id="8" name="Picture 8"/>
-            <wp:cNvGraphicFramePr>
-              <a:graphicFrameLocks noChangeAspect="1"/>
-            </wp:cNvGraphicFramePr>
-            <a:graphic>
-              <a:graphicData uri="http://schemas.openxmlformats.org/drawingml/2006/picture">
-                <pic:pic>
-                  <pic:nvPicPr>
-                    <pic:cNvPr id="0" name="screen_fgos_validation.png"/>
-                    <pic:cNvPicPr/>
-                  </pic:nvPicPr>
-                  <pic:blipFill>
-                    <a:blip r:embed="rId17"/>
-                    <a:stretch>
-                      <a:fillRect/>
-                    </a:stretch>
-                  </pic:blipFill>
-                  <pic:spPr>
-                    <a:xfrm>
-                      <a:off x="0" y="0"/>
-                      <a:ext cx="5760000" cy="3948679"/>
-                    </a:xfrm>
-                    <a:prstGeom prst="rect"/>
-                  </pic:spPr>
-                </pic:pic>
-              </a:graphicData>
-            </a:graphic>
-          </wp:inline>
-        </w:drawing>
-      </w:r>
-    </w:p>
-    <w:p>
-      <w:pPr>
-        <w:spacing w:before="80" w:after="240"/>
-        <w:jc w:val="center"/>
-      </w:pPr>
-      <w:r>
-        <w:rPr>
-          <w:rFonts w:ascii="Times New Roman" w:hAnsi="Times New Roman"/>
-          <w:i/>
-          <w:sz w:val="24"/>
-        </w:rPr>
-        <w:t>Рисунок 8 — Интерфейс валидации ФГОС</w:t>
-      </w:r>
-    </w:p>
-    <w:p>
-      <w:pPr>
-        <w:spacing w:before="160" w:after="80"/>
-        <w:jc w:val="left"/>
-      </w:pPr>
-      <w:r>
-        <w:rPr>
-          <w:rFonts w:ascii="Times New Roman" w:hAnsi="Times New Roman"/>
-          <w:b/>
-          <w:sz w:val="26"/>
-        </w:rPr>
-        <w:t>7.4. Модуль служебных записок на изменение УП</w:t>
-      </w:r>
-    </w:p>
-    <w:p>
-      <w:pPr>
-        <w:spacing w:line="276" w:lineRule="auto" w:after="120"/>
-        <w:ind w:firstLine="709"/>
-        <w:jc w:val="both"/>
-      </w:pPr>
-      <w:r>
-        <w:rPr>
-          <w:rFonts w:ascii="Times New Roman" w:hAnsi="Times New Roman"/>
-          <w:sz w:val="28"/>
-        </w:rPr>
-        <w:t>Электронное согласование служебных записок до начала семестра с протоколом «Было» / «Стало» и внесением правок в АНОК.</w:t>
-      </w:r>
-    </w:p>
-    <w:p>
-      <w:pPr>
-        <w:spacing w:before="200" w:after="80"/>
-        <w:jc w:val="center"/>
-      </w:pPr>
-      <w:r>
-        <w:drawing>
-          <wp:inline xmlns:a="http://schemas.openxmlformats.org/drawingml/2006/main" xmlns:pic="http://schemas.openxmlformats.org/drawingml/2006/picture">
-            <wp:extent cx="5760000" cy="3948679"/>
-            <wp:docPr id="9" name="Picture 9"/>
-            <wp:cNvGraphicFramePr>
-              <a:graphicFrameLocks noChangeAspect="1"/>
-            </wp:cNvGraphicFramePr>
-            <a:graphic>
-              <a:graphicData uri="http://schemas.openxmlformats.org/drawingml/2006/picture">
-                <pic:pic>
-                  <pic:nvPicPr>
-                    <pic:cNvPr id="0" name="screen_service_notes.png"/>
-                    <pic:cNvPicPr/>
-                  </pic:nvPicPr>
-                  <pic:blipFill>
-                    <a:blip r:embed="rId18"/>
-                    <a:stretch>
-                      <a:fillRect/>
-                    </a:stretch>
-                  </pic:blipFill>
-                  <pic:spPr>
-                    <a:xfrm>
-                      <a:off x="0" y="0"/>
-                      <a:ext cx="5760000" cy="3948679"/>
-                    </a:xfrm>
-                    <a:prstGeom prst="rect"/>
-                  </pic:spPr>
-                </pic:pic>
-              </a:graphicData>
-            </a:graphic>
-          </wp:inline>
-        </w:drawing>
-      </w:r>
-    </w:p>
-    <w:p>
-      <w:pPr>
-        <w:spacing w:before="80" w:after="240"/>
-        <w:jc w:val="center"/>
-      </w:pPr>
-      <w:r>
-        <w:rPr>
-          <w:rFonts w:ascii="Times New Roman" w:hAnsi="Times New Roman"/>
-          <w:i/>
-          <w:sz w:val="24"/>
-        </w:rPr>
-        <w:t>Рисунок 9 — Интерфейс служебных записок</w:t>
-      </w:r>
-    </w:p>
-    <w:p>
-      <w:pPr>
-        <w:spacing w:before="240" w:after="120"/>
-        <w:jc w:val="left"/>
-      </w:pPr>
-      <w:r>
-        <w:rPr>
-          <w:rFonts w:ascii="Times New Roman" w:hAnsi="Times New Roman"/>
-          <w:b/>
-          <w:sz w:val="28"/>
-        </w:rPr>
-        <w:t>8. Заключение к лабораторной работе № 2</w:t>
-      </w:r>
-    </w:p>
-    <w:p>
-      <w:pPr>
-        <w:spacing w:line="276" w:lineRule="auto" w:after="120"/>
-        <w:ind w:firstLine="709"/>
-        <w:jc w:val="both"/>
-      </w:pPr>
-      <w:r>
-        <w:rPr>
-          <w:rFonts w:ascii="Times New Roman" w:hAnsi="Times New Roman"/>
-          <w:sz w:val="28"/>
-        </w:rPr>
-        <w:t>В ходе выполнения работы спроектирована полная архитектура корпоративного портала университета (модуль АНОК). Разработаны 4 UML-диаграммы (классов, последовательности, компонентов, развертывания), создана нормализованная схема базы данных из 13 таблиц и развернут действующий прототип веб-портала с демонстрацией ключевых пользовательских сценариев.</w:t>
+        <w:t>Спроектирован локальный веб-прототип портала АНОК на Flask и SQLite. Определены основные сущности и связи, подготовлены диаграммы и описан воспроизводимый способ запуска без отдельного сервера базы данных.</w:t>
       </w:r>
     </w:p>
     <w:sectPr>

</xml_diff>

<commit_message>
Migrate portal implementation to PHP and MySQL
Co-authored-by: arena-agent <297053741+arena-agent@users.noreply.github.com>
</commit_message>
<xml_diff>
--- a/reports/lab2/LR2_Report_Variant15.docx
+++ b/reports/lab2/LR2_Report_Variant15.docx
@@ -125,7 +125,7 @@
           <w:b/>
           <w:sz w:val="28"/>
         </w:rPr>
-        <w:t>1. Введение и цели работы</w:t>
+        <w:t>1. Цель работы</w:t>
       </w:r>
     </w:p>
     <w:p>
@@ -139,242 +139,7 @@
           <w:rFonts w:ascii="Times New Roman" w:hAnsi="Times New Roman"/>
           <w:sz w:val="28"/>
         </w:rPr>
-      </w:r>
-      <w:r>
-        <w:rPr>
-          <w:rFonts w:ascii="Times New Roman" w:hAnsi="Times New Roman"/>
-          <w:b/>
-          <w:sz w:val="28"/>
-        </w:rPr>
-        <w:t>Цель лабораторной работы:</w:t>
-      </w:r>
-      <w:r>
-        <w:rPr>
-          <w:rFonts w:ascii="Times New Roman" w:hAnsi="Times New Roman"/>
-          <w:sz w:val="28"/>
-        </w:rPr>
-        <w:t xml:space="preserve"> Проектирование детальной архитектуры корпоративного веб-портала университета (модуль Центра АНОК), разработка объектной модели и схемы реляционной базы данных (MariaDB / SQLite), а также практическое разворачивание, конфигурирование и демонстрация работы полнофункционального прототипа программного обеспечения в соответствии с бизнес-правилами Варианта № 15.</w:t>
-      </w:r>
-    </w:p>
-    <w:p>
-      <w:pPr>
-        <w:spacing w:before="160" w:after="80"/>
-        <w:jc w:val="left"/>
-      </w:pPr>
-      <w:r>
-        <w:rPr>
-          <w:rFonts w:ascii="Times New Roman" w:hAnsi="Times New Roman"/>
-          <w:b/>
-          <w:sz w:val="26"/>
-        </w:rPr>
-        <w:t>Задачи работы:</w:t>
-      </w:r>
-    </w:p>
-    <w:p>
-      <w:pPr>
-        <w:spacing w:line="276" w:lineRule="auto" w:after="60"/>
-        <w:ind w:left="709"/>
-        <w:jc w:val="both"/>
-      </w:pPr>
-      <w:r>
-        <w:rPr>
-          <w:rFonts w:ascii="Times New Roman" w:hAnsi="Times New Roman"/>
-          <w:b/>
-          <w:sz w:val="28"/>
-        </w:rPr>
-        <w:t xml:space="preserve">1. </w:t>
-      </w:r>
-      <w:r>
-        <w:rPr>
-          <w:rFonts w:ascii="Times New Roman" w:hAnsi="Times New Roman"/>
-          <w:sz w:val="28"/>
-        </w:rPr>
-        <w:t xml:space="preserve">Разработать </w:t>
-      </w:r>
-      <w:r>
-        <w:rPr>
-          <w:rFonts w:ascii="Times New Roman" w:hAnsi="Times New Roman"/>
-          <w:b/>
-          <w:sz w:val="28"/>
-        </w:rPr>
-        <w:t>диаграмму классов</w:t>
-      </w:r>
-      <w:r>
-        <w:rPr>
-          <w:rFonts w:ascii="Times New Roman" w:hAnsi="Times New Roman"/>
-          <w:sz w:val="28"/>
-        </w:rPr>
-        <w:t xml:space="preserve"> (Class Diagram) объектной модели портала.</w:t>
-      </w:r>
-    </w:p>
-    <w:p>
-      <w:pPr>
-        <w:spacing w:line="276" w:lineRule="auto" w:after="60"/>
-        <w:ind w:left="709"/>
-        <w:jc w:val="both"/>
-      </w:pPr>
-      <w:r>
-        <w:rPr>
-          <w:rFonts w:ascii="Times New Roman" w:hAnsi="Times New Roman"/>
-          <w:b/>
-          <w:sz w:val="28"/>
-        </w:rPr>
-        <w:t xml:space="preserve">2. </w:t>
-      </w:r>
-      <w:r>
-        <w:rPr>
-          <w:rFonts w:ascii="Times New Roman" w:hAnsi="Times New Roman"/>
-          <w:sz w:val="28"/>
-        </w:rPr>
-        <w:t xml:space="preserve">Спроектировать </w:t>
-      </w:r>
-      <w:r>
-        <w:rPr>
-          <w:rFonts w:ascii="Times New Roman" w:hAnsi="Times New Roman"/>
-          <w:b/>
-          <w:sz w:val="28"/>
-        </w:rPr>
-        <w:t>диаграмму последовательности</w:t>
-      </w:r>
-      <w:r>
-        <w:rPr>
-          <w:rFonts w:ascii="Times New Roman" w:hAnsi="Times New Roman"/>
-          <w:sz w:val="28"/>
-        </w:rPr>
-        <w:t xml:space="preserve"> (Sequence Diagram) для сквозного процесса экспертизы и визирования учебных планов.</w:t>
-      </w:r>
-    </w:p>
-    <w:p>
-      <w:pPr>
-        <w:spacing w:line="276" w:lineRule="auto" w:after="60"/>
-        <w:ind w:left="709"/>
-        <w:jc w:val="both"/>
-      </w:pPr>
-      <w:r>
-        <w:rPr>
-          <w:rFonts w:ascii="Times New Roman" w:hAnsi="Times New Roman"/>
-          <w:b/>
-          <w:sz w:val="28"/>
-        </w:rPr>
-        <w:t xml:space="preserve">3. </w:t>
-      </w:r>
-      <w:r>
-        <w:rPr>
-          <w:rFonts w:ascii="Times New Roman" w:hAnsi="Times New Roman"/>
-          <w:sz w:val="28"/>
-        </w:rPr>
-        <w:t xml:space="preserve">Разработать </w:t>
-      </w:r>
-      <w:r>
-        <w:rPr>
-          <w:rFonts w:ascii="Times New Roman" w:hAnsi="Times New Roman"/>
-          <w:b/>
-          <w:sz w:val="28"/>
-        </w:rPr>
-        <w:t>диаграмму компонентов</w:t>
-      </w:r>
-      <w:r>
-        <w:rPr>
-          <w:rFonts w:ascii="Times New Roman" w:hAnsi="Times New Roman"/>
-          <w:sz w:val="28"/>
-        </w:rPr>
-        <w:t xml:space="preserve"> (Component Diagram), отражающую модульную трехуровневую структуру портала.</w:t>
-      </w:r>
-    </w:p>
-    <w:p>
-      <w:pPr>
-        <w:spacing w:line="276" w:lineRule="auto" w:after="60"/>
-        <w:ind w:left="709"/>
-        <w:jc w:val="both"/>
-      </w:pPr>
-      <w:r>
-        <w:rPr>
-          <w:rFonts w:ascii="Times New Roman" w:hAnsi="Times New Roman"/>
-          <w:b/>
-          <w:sz w:val="28"/>
-        </w:rPr>
-        <w:t xml:space="preserve">4. </w:t>
-      </w:r>
-      <w:r>
-        <w:rPr>
-          <w:rFonts w:ascii="Times New Roman" w:hAnsi="Times New Roman"/>
-          <w:sz w:val="28"/>
-        </w:rPr>
-        <w:t xml:space="preserve">Разработать </w:t>
-      </w:r>
-      <w:r>
-        <w:rPr>
-          <w:rFonts w:ascii="Times New Roman" w:hAnsi="Times New Roman"/>
-          <w:b/>
-          <w:sz w:val="28"/>
-        </w:rPr>
-        <w:t>диаграмму развертывания</w:t>
-      </w:r>
-      <w:r>
-        <w:rPr>
-          <w:rFonts w:ascii="Times New Roman" w:hAnsi="Times New Roman"/>
-          <w:sz w:val="28"/>
-        </w:rPr>
-        <w:t xml:space="preserve"> (Deployment Diagram) физической топологии серверов и сетевых узлов.</w:t>
-      </w:r>
-    </w:p>
-    <w:p>
-      <w:pPr>
-        <w:spacing w:line="276" w:lineRule="auto" w:after="60"/>
-        <w:ind w:left="709"/>
-        <w:jc w:val="both"/>
-      </w:pPr>
-      <w:r>
-        <w:rPr>
-          <w:rFonts w:ascii="Times New Roman" w:hAnsi="Times New Roman"/>
-          <w:b/>
-          <w:sz w:val="28"/>
-        </w:rPr>
-        <w:t xml:space="preserve">5. </w:t>
-      </w:r>
-      <w:r>
-        <w:rPr>
-          <w:rFonts w:ascii="Times New Roman" w:hAnsi="Times New Roman"/>
-          <w:sz w:val="28"/>
-        </w:rPr>
-        <w:t xml:space="preserve">Спроектировать нормализованную </w:t>
-      </w:r>
-      <w:r>
-        <w:rPr>
-          <w:rFonts w:ascii="Times New Roman" w:hAnsi="Times New Roman"/>
-          <w:b/>
-          <w:sz w:val="28"/>
-        </w:rPr>
-        <w:t>схему реляционной базы данных</w:t>
-      </w:r>
-      <w:r>
-        <w:rPr>
-          <w:rFonts w:ascii="Times New Roman" w:hAnsi="Times New Roman"/>
-          <w:sz w:val="28"/>
-        </w:rPr>
-        <w:t xml:space="preserve"> (ERD) в 3-й нормальной форме.</w:t>
-      </w:r>
-    </w:p>
-    <w:p>
-      <w:pPr>
-        <w:spacing w:line="276" w:lineRule="auto" w:after="60"/>
-        <w:ind w:left="709"/>
-        <w:jc w:val="both"/>
-      </w:pPr>
-      <w:r>
-        <w:rPr>
-          <w:rFonts w:ascii="Times New Roman" w:hAnsi="Times New Roman"/>
-          <w:b/>
-          <w:sz w:val="28"/>
-        </w:rPr>
-        <w:t xml:space="preserve">6. </w:t>
-      </w:r>
-      <w:r>
-        <w:rPr>
-          <w:rFonts w:ascii="Times New Roman" w:hAnsi="Times New Roman"/>
-          <w:sz w:val="28"/>
-        </w:rPr>
-        <w:t>Развернуть и настроить серверную среду и продемонстрировать примеры работы установленного ПО.</w:t>
+        <w:t>Разработать архитектурные диаграммы, структуру базы данных и развернуть выбранное программное обеспечение на PHP и MySQL/MariaDB.</w:t>
       </w:r>
     </w:p>
     <w:p>
@@ -388,7 +153,7 @@
           <w:b/>
           <w:sz w:val="28"/>
         </w:rPr>
-        <w:t>2. Диаграмма классов (Class Diagram)</w:t>
+        <w:t>2. Архитектура</w:t>
       </w:r>
     </w:p>
     <w:p>
@@ -402,7 +167,115 @@
           <w:rFonts w:ascii="Times New Roman" w:hAnsi="Times New Roman"/>
           <w:sz w:val="28"/>
         </w:rPr>
-        <w:t>Объектно-ориентированная модель предметной области включает сущности пользователей и ролей (RBAC), организационной структуры вуза, образовательных программ, учебных планов с дисциплинами, служебных записок, маршрутов электронного визирования и протоколов валидации ФГОС.</w:t>
+        <w:t>Портал состоит из PHP-приложения, HTML/CSS-интерфейса и базы MySQL/MariaDB. Соединение с базой выполняется через PDO с подготовленными запросами.</w:t>
+      </w:r>
+    </w:p>
+    <w:p>
+      <w:pPr>
+        <w:spacing w:before="200" w:after="80"/>
+        <w:jc w:val="center"/>
+      </w:pPr>
+      <w:r>
+        <w:drawing>
+          <wp:inline xmlns:a="http://schemas.openxmlformats.org/drawingml/2006/main" xmlns:pic="http://schemas.openxmlformats.org/drawingml/2006/picture">
+            <wp:extent cx="5760000" cy="3931429"/>
+            <wp:docPr id="1" name="Picture 1"/>
+            <wp:cNvGraphicFramePr>
+              <a:graphicFrameLocks noChangeAspect="1"/>
+            </wp:cNvGraphicFramePr>
+            <a:graphic>
+              <a:graphicData uri="http://schemas.openxmlformats.org/drawingml/2006/picture">
+                <pic:pic>
+                  <pic:nvPicPr>
+                    <pic:cNvPr id="0" name="component_diagram.png"/>
+                    <pic:cNvPicPr/>
+                  </pic:nvPicPr>
+                  <pic:blipFill>
+                    <a:blip r:embed="rId10"/>
+                    <a:stretch>
+                      <a:fillRect/>
+                    </a:stretch>
+                  </pic:blipFill>
+                  <pic:spPr>
+                    <a:xfrm>
+                      <a:off x="0" y="0"/>
+                      <a:ext cx="5760000" cy="3931429"/>
+                    </a:xfrm>
+                    <a:prstGeom prst="rect"/>
+                  </pic:spPr>
+                </pic:pic>
+              </a:graphicData>
+            </a:graphic>
+          </wp:inline>
+        </w:drawing>
+      </w:r>
+    </w:p>
+    <w:p>
+      <w:pPr>
+        <w:spacing w:before="80" w:after="240"/>
+        <w:jc w:val="center"/>
+      </w:pPr>
+      <w:r>
+        <w:rPr>
+          <w:rFonts w:ascii="Times New Roman" w:hAnsi="Times New Roman"/>
+          <w:i/>
+          <w:sz w:val="24"/>
+        </w:rPr>
+        <w:t>Рисунок 1 — Диаграмма компонентов</w:t>
+      </w:r>
+    </w:p>
+    <w:p>
+      <w:pPr>
+        <w:spacing w:before="200" w:after="80"/>
+        <w:jc w:val="center"/>
+      </w:pPr>
+      <w:r>
+        <w:drawing>
+          <wp:inline xmlns:a="http://schemas.openxmlformats.org/drawingml/2006/main" xmlns:pic="http://schemas.openxmlformats.org/drawingml/2006/picture">
+            <wp:extent cx="5760000" cy="3931429"/>
+            <wp:docPr id="2" name="Picture 2"/>
+            <wp:cNvGraphicFramePr>
+              <a:graphicFrameLocks noChangeAspect="1"/>
+            </wp:cNvGraphicFramePr>
+            <a:graphic>
+              <a:graphicData uri="http://schemas.openxmlformats.org/drawingml/2006/picture">
+                <pic:pic>
+                  <pic:nvPicPr>
+                    <pic:cNvPr id="0" name="deployment_diagram.png"/>
+                    <pic:cNvPicPr/>
+                  </pic:nvPicPr>
+                  <pic:blipFill>
+                    <a:blip r:embed="rId11"/>
+                    <a:stretch>
+                      <a:fillRect/>
+                    </a:stretch>
+                  </pic:blipFill>
+                  <pic:spPr>
+                    <a:xfrm>
+                      <a:off x="0" y="0"/>
+                      <a:ext cx="5760000" cy="3931429"/>
+                    </a:xfrm>
+                    <a:prstGeom prst="rect"/>
+                  </pic:spPr>
+                </pic:pic>
+              </a:graphicData>
+            </a:graphic>
+          </wp:inline>
+        </w:drawing>
+      </w:r>
+    </w:p>
+    <w:p>
+      <w:pPr>
+        <w:spacing w:before="80" w:after="240"/>
+        <w:jc w:val="center"/>
+      </w:pPr>
+      <w:r>
+        <w:rPr>
+          <w:rFonts w:ascii="Times New Roman" w:hAnsi="Times New Roman"/>
+          <w:i/>
+          <w:sz w:val="24"/>
+        </w:rPr>
+        <w:t>Рисунок 2 — Диаграмма развёртывания</w:t>
       </w:r>
     </w:p>
     <w:p>
@@ -414,7 +287,7 @@
         <w:drawing>
           <wp:inline xmlns:a="http://schemas.openxmlformats.org/drawingml/2006/main" xmlns:pic="http://schemas.openxmlformats.org/drawingml/2006/picture">
             <wp:extent cx="5760000" cy="3948679"/>
-            <wp:docPr id="1" name="Picture 1"/>
+            <wp:docPr id="3" name="Picture 3"/>
             <wp:cNvGraphicFramePr>
               <a:graphicFrameLocks noChangeAspect="1"/>
             </wp:cNvGraphicFramePr>
@@ -426,7 +299,7 @@
                     <pic:cNvPicPr/>
                   </pic:nvPicPr>
                   <pic:blipFill>
-                    <a:blip r:embed="rId10"/>
+                    <a:blip r:embed="rId12"/>
                     <a:stretch>
                       <a:fillRect/>
                     </a:stretch>
@@ -456,301 +329,7 @@
           <w:i/>
           <w:sz w:val="24"/>
         </w:rPr>
-        <w:t>Рисунок 1 — Диаграмма классов</w:t>
-      </w:r>
-    </w:p>
-    <w:p>
-      <w:pPr>
-        <w:spacing w:before="160" w:after="80"/>
-        <w:jc w:val="left"/>
-      </w:pPr>
-      <w:r>
-        <w:rPr>
-          <w:rFonts w:ascii="Times New Roman" w:hAnsi="Times New Roman"/>
-          <w:b/>
-          <w:sz w:val="26"/>
-        </w:rPr>
-        <w:t>Основные классы системы:</w:t>
-      </w:r>
-    </w:p>
-    <w:p>
-      <w:pPr>
-        <w:spacing w:line="276" w:lineRule="auto" w:after="60"/>
-        <w:ind w:left="709"/>
-        <w:jc w:val="both"/>
-      </w:pPr>
-      <w:r>
-        <w:rPr>
-          <w:rFonts w:ascii="Times New Roman" w:hAnsi="Times New Roman"/>
-          <w:b/>
-          <w:sz w:val="28"/>
-        </w:rPr>
-        <w:t xml:space="preserve">1. </w:t>
-      </w:r>
-      <w:r>
-        <w:rPr>
-          <w:rFonts w:ascii="Times New Roman" w:hAnsi="Times New Roman"/>
-          <w:sz w:val="28"/>
-        </w:rPr>
-      </w:r>
-      <w:r>
-        <w:rPr>
-          <w:rFonts w:ascii="Times New Roman" w:hAnsi="Times New Roman"/>
-          <w:b/>
-          <w:sz w:val="28"/>
-        </w:rPr>
-        <w:t>`User` и `Role`</w:t>
-      </w:r>
-      <w:r>
-        <w:rPr>
-          <w:rFonts w:ascii="Times New Roman" w:hAnsi="Times New Roman"/>
-          <w:sz w:val="28"/>
-        </w:rPr>
-        <w:t>: обеспечивают гранулярное ролевое разграничение прав (руководитель выпускающей кафедры, обеспечивающая кафедра, эксперт АНОК, начальник АНОК, проректор по УР, ректор).</w:t>
-      </w:r>
-    </w:p>
-    <w:p>
-      <w:pPr>
-        <w:spacing w:line="276" w:lineRule="auto" w:after="60"/>
-        <w:ind w:left="709"/>
-        <w:jc w:val="both"/>
-      </w:pPr>
-      <w:r>
-        <w:rPr>
-          <w:rFonts w:ascii="Times New Roman" w:hAnsi="Times New Roman"/>
-          <w:b/>
-          <w:sz w:val="28"/>
-        </w:rPr>
-        <w:t xml:space="preserve">2. </w:t>
-      </w:r>
-      <w:r>
-        <w:rPr>
-          <w:rFonts w:ascii="Times New Roman" w:hAnsi="Times New Roman"/>
-          <w:sz w:val="28"/>
-        </w:rPr>
-      </w:r>
-      <w:r>
-        <w:rPr>
-          <w:rFonts w:ascii="Times New Roman" w:hAnsi="Times New Roman"/>
-          <w:b/>
-          <w:sz w:val="28"/>
-        </w:rPr>
-        <w:t>`Department`</w:t>
-      </w:r>
-      <w:r>
-        <w:rPr>
-          <w:rFonts w:ascii="Times New Roman" w:hAnsi="Times New Roman"/>
-          <w:sz w:val="28"/>
-        </w:rPr>
-        <w:t>: классифицирует подразделения университета по типам (`RELEASING` — выпускающая, `IMPLEMENTING` — обеспечивающая, `EXPERT_ANOK` — экспертный центр АНОК, `MANAGEMENT` — ректорат).</w:t>
-      </w:r>
-    </w:p>
-    <w:p>
-      <w:pPr>
-        <w:spacing w:line="276" w:lineRule="auto" w:after="60"/>
-        <w:ind w:left="709"/>
-        <w:jc w:val="both"/>
-      </w:pPr>
-      <w:r>
-        <w:rPr>
-          <w:rFonts w:ascii="Times New Roman" w:hAnsi="Times New Roman"/>
-          <w:b/>
-          <w:sz w:val="28"/>
-        </w:rPr>
-        <w:t xml:space="preserve">3. </w:t>
-      </w:r>
-      <w:r>
-        <w:rPr>
-          <w:rFonts w:ascii="Times New Roman" w:hAnsi="Times New Roman"/>
-          <w:sz w:val="28"/>
-        </w:rPr>
-      </w:r>
-      <w:r>
-        <w:rPr>
-          <w:rFonts w:ascii="Times New Roman" w:hAnsi="Times New Roman"/>
-          <w:b/>
-          <w:sz w:val="28"/>
-        </w:rPr>
-        <w:t>`EducationalProgram` и `StandardFGOS`</w:t>
-      </w:r>
-      <w:r>
-        <w:rPr>
-          <w:rFonts w:ascii="Times New Roman" w:hAnsi="Times New Roman"/>
-          <w:sz w:val="28"/>
-        </w:rPr>
-        <w:t>: определяют параметры направления подготовки (код, профиль, квалификация) и нормативные ограничения стандарта ФГОС ВО 3++ (240 з.е., лимиты экзаменов в сессию, минимальные объемы практик и ГИА).</w:t>
-      </w:r>
-    </w:p>
-    <w:p>
-      <w:pPr>
-        <w:spacing w:line="276" w:lineRule="auto" w:after="60"/>
-        <w:ind w:left="709"/>
-        <w:jc w:val="both"/>
-      </w:pPr>
-      <w:r>
-        <w:rPr>
-          <w:rFonts w:ascii="Times New Roman" w:hAnsi="Times New Roman"/>
-          <w:b/>
-          <w:sz w:val="28"/>
-        </w:rPr>
-        <w:t xml:space="preserve">4. </w:t>
-      </w:r>
-      <w:r>
-        <w:rPr>
-          <w:rFonts w:ascii="Times New Roman" w:hAnsi="Times New Roman"/>
-          <w:sz w:val="28"/>
-        </w:rPr>
-      </w:r>
-      <w:r>
-        <w:rPr>
-          <w:rFonts w:ascii="Times New Roman" w:hAnsi="Times New Roman"/>
-          <w:b/>
-          <w:sz w:val="28"/>
-        </w:rPr>
-        <w:t>`Curriculum` и `CurriculumDiscipline`</w:t>
-      </w:r>
-      <w:r>
-        <w:rPr>
-          <w:rFonts w:ascii="Times New Roman" w:hAnsi="Times New Roman"/>
-          <w:sz w:val="28"/>
-        </w:rPr>
-        <w:t>: реализуют композиционную структуру учебного плана (семестры 1–8, трудоемкость в з.е. и академических часах, лекции, лабораторные, практики, СРС, формы контроля, закрепленные кафедры).</w:t>
-      </w:r>
-    </w:p>
-    <w:p>
-      <w:pPr>
-        <w:spacing w:line="276" w:lineRule="auto" w:after="60"/>
-        <w:ind w:left="709"/>
-        <w:jc w:val="both"/>
-      </w:pPr>
-      <w:r>
-        <w:rPr>
-          <w:rFonts w:ascii="Times New Roman" w:hAnsi="Times New Roman"/>
-          <w:b/>
-          <w:sz w:val="28"/>
-        </w:rPr>
-        <w:t xml:space="preserve">5. </w:t>
-      </w:r>
-      <w:r>
-        <w:rPr>
-          <w:rFonts w:ascii="Times New Roman" w:hAnsi="Times New Roman"/>
-          <w:sz w:val="28"/>
-        </w:rPr>
-      </w:r>
-      <w:r>
-        <w:rPr>
-          <w:rFonts w:ascii="Times New Roman" w:hAnsi="Times New Roman"/>
-          <w:b/>
-          <w:sz w:val="28"/>
-        </w:rPr>
-        <w:t>`ServiceNote` и `ServiceNoteItem`</w:t>
-      </w:r>
-      <w:r>
-        <w:rPr>
-          <w:rFonts w:ascii="Times New Roman" w:hAnsi="Times New Roman"/>
-          <w:sz w:val="28"/>
-        </w:rPr>
-        <w:t>: управляют жизненным циклом регламентных изменений учебного плана до начала семестра с фиксацией параметров («Было» / «Стало») в формате JSON.</w:t>
-      </w:r>
-    </w:p>
-    <w:p>
-      <w:pPr>
-        <w:spacing w:line="276" w:lineRule="auto" w:after="60"/>
-        <w:ind w:left="709"/>
-        <w:jc w:val="both"/>
-      </w:pPr>
-      <w:r>
-        <w:rPr>
-          <w:rFonts w:ascii="Times New Roman" w:hAnsi="Times New Roman"/>
-          <w:b/>
-          <w:sz w:val="28"/>
-        </w:rPr>
-        <w:t xml:space="preserve">6. </w:t>
-      </w:r>
-      <w:r>
-        <w:rPr>
-          <w:rFonts w:ascii="Times New Roman" w:hAnsi="Times New Roman"/>
-          <w:sz w:val="28"/>
-        </w:rPr>
-      </w:r>
-      <w:r>
-        <w:rPr>
-          <w:rFonts w:ascii="Times New Roman" w:hAnsi="Times New Roman"/>
-          <w:b/>
-          <w:sz w:val="28"/>
-        </w:rPr>
-        <w:t>`DocumentSignature`</w:t>
-      </w:r>
-      <w:r>
-        <w:rPr>
-          <w:rFonts w:ascii="Times New Roman" w:hAnsi="Times New Roman"/>
-          <w:sz w:val="28"/>
-        </w:rPr>
-        <w:t>: протоколирует электронное визирование документов с формированием цифрового SHA-256 хеша, отметки точного времени и статуса подписи.</w:t>
-      </w:r>
-    </w:p>
-    <w:p>
-      <w:pPr>
-        <w:spacing w:line="276" w:lineRule="auto" w:after="60"/>
-        <w:ind w:left="709"/>
-        <w:jc w:val="both"/>
-      </w:pPr>
-      <w:r>
-        <w:rPr>
-          <w:rFonts w:ascii="Times New Roman" w:hAnsi="Times New Roman"/>
-          <w:b/>
-          <w:sz w:val="28"/>
-        </w:rPr>
-        <w:t xml:space="preserve">7. </w:t>
-      </w:r>
-      <w:r>
-        <w:rPr>
-          <w:rFonts w:ascii="Times New Roman" w:hAnsi="Times New Roman"/>
-          <w:sz w:val="28"/>
-        </w:rPr>
-      </w:r>
-      <w:r>
-        <w:rPr>
-          <w:rFonts w:ascii="Times New Roman" w:hAnsi="Times New Roman"/>
-          <w:b/>
-          <w:sz w:val="28"/>
-        </w:rPr>
-        <w:t>`ValidationReport`</w:t>
-      </w:r>
-      <w:r>
-        <w:rPr>
-          <w:rFonts w:ascii="Times New Roman" w:hAnsi="Times New Roman"/>
-          <w:sz w:val="28"/>
-        </w:rPr>
-        <w:t>: аккумулирует результаты автоматической экспертизы учебного плана на соответствие нормативам ФГОС.</w:t>
-      </w:r>
-    </w:p>
-    <w:p>
-      <w:pPr>
-        <w:spacing w:before="240" w:after="120"/>
-        <w:jc w:val="left"/>
-      </w:pPr>
-      <w:r>
-        <w:rPr>
-          <w:rFonts w:ascii="Times New Roman" w:hAnsi="Times New Roman"/>
-          <w:b/>
-          <w:sz w:val="28"/>
-        </w:rPr>
-        <w:t>3. Диаграмма последовательности (Sequence Diagram)</w:t>
-      </w:r>
-    </w:p>
-    <w:p>
-      <w:pPr>
-        <w:spacing w:line="276" w:lineRule="auto" w:after="120"/>
-        <w:ind w:firstLine="709"/>
-        <w:jc w:val="both"/>
-      </w:pPr>
-      <w:r>
-        <w:rPr>
-          <w:rFonts w:ascii="Times New Roman" w:hAnsi="Times New Roman"/>
-          <w:sz w:val="28"/>
-        </w:rPr>
-        <w:t>Диаграмма последовательности отражает временную шкалу и порядок взаимодействия акторов и программных контроллеров в рамках сквозного бизнес-процесса согласования и актуализации УП.</w:t>
+        <w:t>Рисунок 3 — Диаграмма классов</w:t>
       </w:r>
     </w:p>
     <w:p>
@@ -762,7 +341,7 @@
         <w:drawing>
           <wp:inline xmlns:a="http://schemas.openxmlformats.org/drawingml/2006/main" xmlns:pic="http://schemas.openxmlformats.org/drawingml/2006/picture">
             <wp:extent cx="5760000" cy="4603373"/>
-            <wp:docPr id="2" name="Picture 2"/>
+            <wp:docPr id="4" name="Picture 4"/>
             <wp:cNvGraphicFramePr>
               <a:graphicFrameLocks noChangeAspect="1"/>
             </wp:cNvGraphicFramePr>
@@ -774,7 +353,7 @@
                     <pic:cNvPicPr/>
                   </pic:nvPicPr>
                   <pic:blipFill>
-                    <a:blip r:embed="rId11"/>
+                    <a:blip r:embed="rId13"/>
                     <a:stretch>
                       <a:fillRect/>
                     </a:stretch>
@@ -804,768 +383,7 @@
           <w:i/>
           <w:sz w:val="24"/>
         </w:rPr>
-        <w:t>Рисунок 2 — Диаграмма последовательности</w:t>
-      </w:r>
-    </w:p>
-    <w:p>
-      <w:pPr>
-        <w:spacing w:before="160" w:after="80"/>
-        <w:jc w:val="left"/>
-      </w:pPr>
-      <w:r>
-        <w:rPr>
-          <w:rFonts w:ascii="Times New Roman" w:hAnsi="Times New Roman"/>
-          <w:b/>
-          <w:sz w:val="26"/>
-        </w:rPr>
-        <w:t>Фазы взаимодействия:</w:t>
-      </w:r>
-    </w:p>
-    <w:p>
-      <w:pPr>
-        <w:spacing w:line="276" w:lineRule="auto" w:after="60"/>
-        <w:ind w:left="709"/>
-        <w:jc w:val="both"/>
-      </w:pPr>
-      <w:r>
-        <w:rPr>
-          <w:rFonts w:ascii="Times New Roman" w:hAnsi="Times New Roman"/>
-          <w:b/>
-          <w:sz w:val="28"/>
-        </w:rPr>
-        <w:t xml:space="preserve">1. </w:t>
-      </w:r>
-      <w:r>
-        <w:rPr>
-          <w:rFonts w:ascii="Times New Roman" w:hAnsi="Times New Roman"/>
-          <w:sz w:val="28"/>
-        </w:rPr>
-      </w:r>
-      <w:r>
-        <w:rPr>
-          <w:rFonts w:ascii="Times New Roman" w:hAnsi="Times New Roman"/>
-          <w:b/>
-          <w:sz w:val="28"/>
-        </w:rPr>
-        <w:t>Фаза 1 (Разработка и экспертиза УП по ФГОС):</w:t>
-      </w:r>
-      <w:r>
-        <w:rPr>
-          <w:rFonts w:ascii="Times New Roman" w:hAnsi="Times New Roman"/>
-          <w:sz w:val="28"/>
-        </w:rPr>
-        <w:t xml:space="preserve"> Выпускающая кафедра формирует проект УП → Портал инициирует автоматическую валидацию через `FGOS Validator` → Эксперт АНОК верифицирует протокол и утверждает экспертное заключение.</w:t>
-      </w:r>
-    </w:p>
-    <w:p>
-      <w:pPr>
-        <w:spacing w:line="276" w:lineRule="auto" w:after="60"/>
-        <w:ind w:left="709"/>
-        <w:jc w:val="both"/>
-      </w:pPr>
-      <w:r>
-        <w:rPr>
-          <w:rFonts w:ascii="Times New Roman" w:hAnsi="Times New Roman"/>
-          <w:b/>
-          <w:sz w:val="28"/>
-        </w:rPr>
-        <w:t xml:space="preserve">2. </w:t>
-      </w:r>
-      <w:r>
-        <w:rPr>
-          <w:rFonts w:ascii="Times New Roman" w:hAnsi="Times New Roman"/>
-          <w:sz w:val="28"/>
-        </w:rPr>
-      </w:r>
-      <w:r>
-        <w:rPr>
-          <w:rFonts w:ascii="Times New Roman" w:hAnsi="Times New Roman"/>
-          <w:b/>
-          <w:sz w:val="28"/>
-        </w:rPr>
-        <w:t>Фаза 2 (Маршрут подписания и ежегодного утверждения):</w:t>
-      </w:r>
-      <w:r>
-        <w:rPr>
-          <w:rFonts w:ascii="Times New Roman" w:hAnsi="Times New Roman"/>
-          <w:sz w:val="28"/>
-        </w:rPr>
-        <w:t xml:space="preserve"> Последовательное наложение цифровых виз (Зав. выпускающей кафедрой → Начальник АНОК → Проректор по УР) → Утверждение Ученым советом (номер и дата протокола) и Ректором → Публикация в реестре со статусом `APPROVED`.</w:t>
-      </w:r>
-    </w:p>
-    <w:p>
-      <w:pPr>
-        <w:spacing w:line="276" w:lineRule="auto" w:after="60"/>
-        <w:ind w:left="709"/>
-        <w:jc w:val="both"/>
-      </w:pPr>
-      <w:r>
-        <w:rPr>
-          <w:rFonts w:ascii="Times New Roman" w:hAnsi="Times New Roman"/>
-          <w:b/>
-          <w:sz w:val="28"/>
-        </w:rPr>
-        <w:t xml:space="preserve">3. </w:t>
-      </w:r>
-      <w:r>
-        <w:rPr>
-          <w:rFonts w:ascii="Times New Roman" w:hAnsi="Times New Roman"/>
-          <w:sz w:val="28"/>
-        </w:rPr>
-      </w:r>
-      <w:r>
-        <w:rPr>
-          <w:rFonts w:ascii="Times New Roman" w:hAnsi="Times New Roman"/>
-          <w:b/>
-          <w:sz w:val="28"/>
-        </w:rPr>
-        <w:t>Фаза 3 (Внесение изменений до начала семестра):</w:t>
-      </w:r>
-      <w:r>
-        <w:rPr>
-          <w:rFonts w:ascii="Times New Roman" w:hAnsi="Times New Roman"/>
-          <w:sz w:val="28"/>
-        </w:rPr>
-        <w:t xml:space="preserve"> Создание электронной служебной записки → Двустороннее согласование (выпускающая + обеспечивающая кафедры) → Передача в АНОК → Применение изменений, повторный контроль ФГОС и выпуск новой ревизии `v1.1`.</w:t>
-      </w:r>
-    </w:p>
-    <w:p>
-      <w:pPr>
-        <w:spacing w:before="240" w:after="120"/>
-        <w:jc w:val="left"/>
-      </w:pPr>
-      <w:r>
-        <w:rPr>
-          <w:rFonts w:ascii="Times New Roman" w:hAnsi="Times New Roman"/>
-          <w:b/>
-          <w:sz w:val="28"/>
-        </w:rPr>
-        <w:t>4. Диаграмма компонентов (Component Diagram)</w:t>
-      </w:r>
-    </w:p>
-    <w:p>
-      <w:pPr>
-        <w:spacing w:line="276" w:lineRule="auto" w:after="120"/>
-        <w:ind w:firstLine="709"/>
-        <w:jc w:val="both"/>
-      </w:pPr>
-      <w:r>
-        <w:rPr>
-          <w:rFonts w:ascii="Times New Roman" w:hAnsi="Times New Roman"/>
-          <w:sz w:val="28"/>
-        </w:rPr>
-        <w:t>Компонентная модель построена по трехуровневой архитектуре (Presentation, Business Logic, Data Access).</w:t>
-      </w:r>
-    </w:p>
-    <w:p>
-      <w:pPr>
-        <w:spacing w:before="200" w:after="80"/>
-        <w:jc w:val="center"/>
-      </w:pPr>
-      <w:r>
-        <w:drawing>
-          <wp:inline xmlns:a="http://schemas.openxmlformats.org/drawingml/2006/main" xmlns:pic="http://schemas.openxmlformats.org/drawingml/2006/picture">
-            <wp:extent cx="5760000" cy="3931429"/>
-            <wp:docPr id="3" name="Picture 3"/>
-            <wp:cNvGraphicFramePr>
-              <a:graphicFrameLocks noChangeAspect="1"/>
-            </wp:cNvGraphicFramePr>
-            <a:graphic>
-              <a:graphicData uri="http://schemas.openxmlformats.org/drawingml/2006/picture">
-                <pic:pic>
-                  <pic:nvPicPr>
-                    <pic:cNvPr id="0" name="component_diagram.png"/>
-                    <pic:cNvPicPr/>
-                  </pic:nvPicPr>
-                  <pic:blipFill>
-                    <a:blip r:embed="rId12"/>
-                    <a:stretch>
-                      <a:fillRect/>
-                    </a:stretch>
-                  </pic:blipFill>
-                  <pic:spPr>
-                    <a:xfrm>
-                      <a:off x="0" y="0"/>
-                      <a:ext cx="5760000" cy="3931429"/>
-                    </a:xfrm>
-                    <a:prstGeom prst="rect"/>
-                  </pic:spPr>
-                </pic:pic>
-              </a:graphicData>
-            </a:graphic>
-          </wp:inline>
-        </w:drawing>
-      </w:r>
-    </w:p>
-    <w:p>
-      <w:pPr>
-        <w:spacing w:before="80" w:after="240"/>
-        <w:jc w:val="center"/>
-      </w:pPr>
-      <w:r>
-        <w:rPr>
-          <w:rFonts w:ascii="Times New Roman" w:hAnsi="Times New Roman"/>
-          <w:i/>
-          <w:sz w:val="24"/>
-        </w:rPr>
-        <w:t>Рисунок 3 — Диаграмма компонентов</w:t>
-      </w:r>
-    </w:p>
-    <w:p>
-      <w:pPr>
-        <w:spacing w:before="160" w:after="80"/>
-        <w:jc w:val="left"/>
-      </w:pPr>
-      <w:r>
-        <w:rPr>
-          <w:rFonts w:ascii="Times New Roman" w:hAnsi="Times New Roman"/>
-          <w:b/>
-          <w:sz w:val="26"/>
-        </w:rPr>
-        <w:t>Уровни и модули архитектуры:</w:t>
-      </w:r>
-    </w:p>
-    <w:p>
-      <w:pPr>
-        <w:spacing w:line="276" w:lineRule="auto" w:after="60"/>
-        <w:ind w:left="709"/>
-        <w:jc w:val="both"/>
-      </w:pPr>
-      <w:r>
-        <w:rPr>
-          <w:rFonts w:ascii="Times New Roman" w:hAnsi="Times New Roman"/>
-          <w:b w:val="0"/>
-          <w:sz w:val="28"/>
-        </w:rPr>
-        <w:t xml:space="preserve">• </w:t>
-      </w:r>
-      <w:r>
-        <w:rPr>
-          <w:rFonts w:ascii="Times New Roman" w:hAnsi="Times New Roman"/>
-          <w:sz w:val="28"/>
-        </w:rPr>
-      </w:r>
-      <w:r>
-        <w:rPr>
-          <w:rFonts w:ascii="Times New Roman" w:hAnsi="Times New Roman"/>
-          <w:b/>
-          <w:sz w:val="28"/>
-        </w:rPr>
-        <w:t>Presentation Layer (Уровень представления):</w:t>
-      </w:r>
-      <w:r>
-        <w:rPr>
-          <w:rFonts w:ascii="Times New Roman" w:hAnsi="Times New Roman"/>
-          <w:sz w:val="28"/>
-        </w:rPr>
-        <w:t xml:space="preserve"> `Portal Web UI` (адаптивные шаблоны HTML5/TailwindCSS), `REST API Controllers`, `Auth &amp; RBAC UI`.</w:t>
-      </w:r>
-    </w:p>
-    <w:p>
-      <w:pPr>
-        <w:spacing w:line="276" w:lineRule="auto" w:after="60"/>
-        <w:ind w:left="709"/>
-        <w:jc w:val="both"/>
-      </w:pPr>
-      <w:r>
-        <w:rPr>
-          <w:rFonts w:ascii="Times New Roman" w:hAnsi="Times New Roman"/>
-          <w:b w:val="0"/>
-          <w:sz w:val="28"/>
-        </w:rPr>
-        <w:t xml:space="preserve">• </w:t>
-      </w:r>
-      <w:r>
-        <w:rPr>
-          <w:rFonts w:ascii="Times New Roman" w:hAnsi="Times New Roman"/>
-          <w:sz w:val="28"/>
-        </w:rPr>
-      </w:r>
-      <w:r>
-        <w:rPr>
-          <w:rFonts w:ascii="Times New Roman" w:hAnsi="Times New Roman"/>
-          <w:b/>
-          <w:sz w:val="28"/>
-        </w:rPr>
-        <w:t>Business Logic Layer (Уровень бизнес-логики):</w:t>
-      </w:r>
-      <w:r>
-        <w:rPr>
-          <w:rFonts w:ascii="Times New Roman" w:hAnsi="Times New Roman"/>
-          <w:sz w:val="28"/>
-        </w:rPr>
-      </w:r>
-    </w:p>
-    <w:p>
-      <w:pPr>
-        <w:spacing w:line="276" w:lineRule="auto" w:after="60"/>
-        <w:ind w:left="992"/>
-        <w:jc w:val="both"/>
-      </w:pPr>
-      <w:r>
-        <w:rPr>
-          <w:rFonts w:ascii="Times New Roman" w:hAnsi="Times New Roman"/>
-          <w:b w:val="0"/>
-          <w:sz w:val="28"/>
-        </w:rPr>
-        <w:t xml:space="preserve">• </w:t>
-      </w:r>
-      <w:r>
-        <w:rPr>
-          <w:rFonts w:ascii="Times New Roman" w:hAnsi="Times New Roman"/>
-          <w:sz w:val="28"/>
-        </w:rPr>
-        <w:t>`Curriculum Manager`: управление версиями, семестрами и структурой дисциплин УП;</w:t>
-      </w:r>
-    </w:p>
-    <w:p>
-      <w:pPr>
-        <w:spacing w:line="276" w:lineRule="auto" w:after="60"/>
-        <w:ind w:left="992"/>
-        <w:jc w:val="both"/>
-      </w:pPr>
-      <w:r>
-        <w:rPr>
-          <w:rFonts w:ascii="Times New Roman" w:hAnsi="Times New Roman"/>
-          <w:b w:val="0"/>
-          <w:sz w:val="28"/>
-        </w:rPr>
-        <w:t xml:space="preserve">• </w:t>
-      </w:r>
-      <w:r>
-        <w:rPr>
-          <w:rFonts w:ascii="Times New Roman" w:hAnsi="Times New Roman"/>
-          <w:sz w:val="28"/>
-        </w:rPr>
-        <w:t>`FGOS Validation Engine`: алгоритмическая верификация контрольных нормативов стандартов 3++;</w:t>
-      </w:r>
-    </w:p>
-    <w:p>
-      <w:pPr>
-        <w:spacing w:line="276" w:lineRule="auto" w:after="60"/>
-        <w:ind w:left="992"/>
-        <w:jc w:val="both"/>
-      </w:pPr>
-      <w:r>
-        <w:rPr>
-          <w:rFonts w:ascii="Times New Roman" w:hAnsi="Times New Roman"/>
-          <w:b w:val="0"/>
-          <w:sz w:val="28"/>
-        </w:rPr>
-        <w:t xml:space="preserve">• </w:t>
-      </w:r>
-      <w:r>
-        <w:rPr>
-          <w:rFonts w:ascii="Times New Roman" w:hAnsi="Times New Roman"/>
-          <w:sz w:val="28"/>
-        </w:rPr>
-        <w:t>`Workflow &amp; Sign Service`: маршрутизация электронных виз, криптографических штампов и состояний документов;</w:t>
-      </w:r>
-    </w:p>
-    <w:p>
-      <w:pPr>
-        <w:spacing w:line="276" w:lineRule="auto" w:after="60"/>
-        <w:ind w:left="992"/>
-        <w:jc w:val="both"/>
-      </w:pPr>
-      <w:r>
-        <w:rPr>
-          <w:rFonts w:ascii="Times New Roman" w:hAnsi="Times New Roman"/>
-          <w:b w:val="0"/>
-          <w:sz w:val="28"/>
-        </w:rPr>
-        <w:t xml:space="preserve">• </w:t>
-      </w:r>
-      <w:r>
-        <w:rPr>
-          <w:rFonts w:ascii="Times New Roman" w:hAnsi="Times New Roman"/>
-          <w:sz w:val="28"/>
-        </w:rPr>
-        <w:t>`Service Note Processor`: обработка служебных записок, версионирование и сопоставительный Diff-анализ;</w:t>
-      </w:r>
-    </w:p>
-    <w:p>
-      <w:pPr>
-        <w:spacing w:line="276" w:lineRule="auto" w:after="60"/>
-        <w:ind w:left="992"/>
-        <w:jc w:val="both"/>
-      </w:pPr>
-      <w:r>
-        <w:rPr>
-          <w:rFonts w:ascii="Times New Roman" w:hAnsi="Times New Roman"/>
-          <w:b w:val="0"/>
-          <w:sz w:val="28"/>
-        </w:rPr>
-        <w:t xml:space="preserve">• </w:t>
-      </w:r>
-      <w:r>
-        <w:rPr>
-          <w:rFonts w:ascii="Times New Roman" w:hAnsi="Times New Roman"/>
-          <w:sz w:val="28"/>
-        </w:rPr>
-        <w:t>`Catalog &amp; Search Engine`: публичный реестр, категоризация и фильтрация;</w:t>
-      </w:r>
-    </w:p>
-    <w:p>
-      <w:pPr>
-        <w:spacing w:line="276" w:lineRule="auto" w:after="60"/>
-        <w:ind w:left="992"/>
-        <w:jc w:val="both"/>
-      </w:pPr>
-      <w:r>
-        <w:rPr>
-          <w:rFonts w:ascii="Times New Roman" w:hAnsi="Times New Roman"/>
-          <w:b w:val="0"/>
-          <w:sz w:val="28"/>
-        </w:rPr>
-        <w:t xml:space="preserve">• </w:t>
-      </w:r>
-      <w:r>
-        <w:rPr>
-          <w:rFonts w:ascii="Times New Roman" w:hAnsi="Times New Roman"/>
-          <w:sz w:val="28"/>
-        </w:rPr>
-        <w:t>`Export &amp; Print Service`: генерация PDF/Excel бланков и титульных листов.</w:t>
-      </w:r>
-    </w:p>
-    <w:p>
-      <w:pPr>
-        <w:spacing w:line="276" w:lineRule="auto" w:after="60"/>
-        <w:ind w:left="709"/>
-        <w:jc w:val="both"/>
-      </w:pPr>
-      <w:r>
-        <w:rPr>
-          <w:rFonts w:ascii="Times New Roman" w:hAnsi="Times New Roman"/>
-          <w:b w:val="0"/>
-          <w:sz w:val="28"/>
-        </w:rPr>
-        <w:t xml:space="preserve">• </w:t>
-      </w:r>
-      <w:r>
-        <w:rPr>
-          <w:rFonts w:ascii="Times New Roman" w:hAnsi="Times New Roman"/>
-          <w:sz w:val="28"/>
-        </w:rPr>
-      </w:r>
-      <w:r>
-        <w:rPr>
-          <w:rFonts w:ascii="Times New Roman" w:hAnsi="Times New Roman"/>
-          <w:b/>
-          <w:sz w:val="28"/>
-        </w:rPr>
-        <w:t>Data Access &amp; Storage Layer (Уровень доступа к данным):</w:t>
-      </w:r>
-      <w:r>
-        <w:rPr>
-          <w:rFonts w:ascii="Times New Roman" w:hAnsi="Times New Roman"/>
-          <w:sz w:val="28"/>
-        </w:rPr>
-        <w:t xml:space="preserve"> `Database Engine`, `Audit Logger`, хранилище реляционных данных и цифровых слепков документов.</w:t>
-      </w:r>
-    </w:p>
-    <w:p>
-      <w:pPr>
-        <w:spacing w:before="240" w:after="120"/>
-        <w:jc w:val="left"/>
-      </w:pPr>
-      <w:r>
-        <w:rPr>
-          <w:rFonts w:ascii="Times New Roman" w:hAnsi="Times New Roman"/>
-          <w:b/>
-          <w:sz w:val="28"/>
-        </w:rPr>
-        <w:t>5. Диаграмма развертывания (Deployment Diagram)</w:t>
-      </w:r>
-    </w:p>
-    <w:p>
-      <w:pPr>
-        <w:spacing w:line="276" w:lineRule="auto" w:after="120"/>
-        <w:ind w:firstLine="709"/>
-        <w:jc w:val="both"/>
-      </w:pPr>
-      <w:r>
-        <w:rPr>
-          <w:rFonts w:ascii="Times New Roman" w:hAnsi="Times New Roman"/>
-          <w:sz w:val="28"/>
-        </w:rPr>
-        <w:t>Диаграмма развертывания специфицирует физическую топологию серверов, узлов и сетевых протоколов.</w:t>
-      </w:r>
-    </w:p>
-    <w:p>
-      <w:pPr>
-        <w:spacing w:before="200" w:after="80"/>
-        <w:jc w:val="center"/>
-      </w:pPr>
-      <w:r>
-        <w:drawing>
-          <wp:inline xmlns:a="http://schemas.openxmlformats.org/drawingml/2006/main" xmlns:pic="http://schemas.openxmlformats.org/drawingml/2006/picture">
-            <wp:extent cx="5760000" cy="3931429"/>
-            <wp:docPr id="4" name="Picture 4"/>
-            <wp:cNvGraphicFramePr>
-              <a:graphicFrameLocks noChangeAspect="1"/>
-            </wp:cNvGraphicFramePr>
-            <a:graphic>
-              <a:graphicData uri="http://schemas.openxmlformats.org/drawingml/2006/picture">
-                <pic:pic>
-                  <pic:nvPicPr>
-                    <pic:cNvPr id="0" name="deployment_diagram.png"/>
-                    <pic:cNvPicPr/>
-                  </pic:nvPicPr>
-                  <pic:blipFill>
-                    <a:blip r:embed="rId13"/>
-                    <a:stretch>
-                      <a:fillRect/>
-                    </a:stretch>
-                  </pic:blipFill>
-                  <pic:spPr>
-                    <a:xfrm>
-                      <a:off x="0" y="0"/>
-                      <a:ext cx="5760000" cy="3931429"/>
-                    </a:xfrm>
-                    <a:prstGeom prst="rect"/>
-                  </pic:spPr>
-                </pic:pic>
-              </a:graphicData>
-            </a:graphic>
-          </wp:inline>
-        </w:drawing>
-      </w:r>
-    </w:p>
-    <w:p>
-      <w:pPr>
-        <w:spacing w:before="80" w:after="240"/>
-        <w:jc w:val="center"/>
-      </w:pPr>
-      <w:r>
-        <w:rPr>
-          <w:rFonts w:ascii="Times New Roman" w:hAnsi="Times New Roman"/>
-          <w:i/>
-          <w:sz w:val="24"/>
-        </w:rPr>
-        <w:t>Рисунок 4 — Диаграмма развертывания</w:t>
-      </w:r>
-    </w:p>
-    <w:p>
-      <w:pPr>
-        <w:spacing w:before="160" w:after="80"/>
-        <w:jc w:val="left"/>
-      </w:pPr>
-      <w:r>
-        <w:rPr>
-          <w:rFonts w:ascii="Times New Roman" w:hAnsi="Times New Roman"/>
-          <w:b/>
-          <w:sz w:val="26"/>
-        </w:rPr>
-        <w:t>Топологические узлы:</w:t>
-      </w:r>
-    </w:p>
-    <w:p>
-      <w:pPr>
-        <w:spacing w:line="276" w:lineRule="auto" w:after="60"/>
-        <w:ind w:left="709"/>
-        <w:jc w:val="both"/>
-      </w:pPr>
-      <w:r>
-        <w:rPr>
-          <w:rFonts w:ascii="Times New Roman" w:hAnsi="Times New Roman"/>
-          <w:b w:val="0"/>
-          <w:sz w:val="28"/>
-        </w:rPr>
-        <w:t xml:space="preserve">• </w:t>
-      </w:r>
-      <w:r>
-        <w:rPr>
-          <w:rFonts w:ascii="Times New Roman" w:hAnsi="Times New Roman"/>
-          <w:sz w:val="28"/>
-        </w:rPr>
-      </w:r>
-      <w:r>
-        <w:rPr>
-          <w:rFonts w:ascii="Times New Roman" w:hAnsi="Times New Roman"/>
-          <w:b/>
-          <w:sz w:val="28"/>
-        </w:rPr>
-        <w:t>Client Workstation (Рабочая станция клиента):</w:t>
-      </w:r>
-      <w:r>
-        <w:rPr>
-          <w:rFonts w:ascii="Times New Roman" w:hAnsi="Times New Roman"/>
-          <w:sz w:val="28"/>
-        </w:rPr>
-        <w:t xml:space="preserve"> веб-браузер пользователя (HTTPS, порт 443).</w:t>
-      </w:r>
-    </w:p>
-    <w:p>
-      <w:pPr>
-        <w:spacing w:line="276" w:lineRule="auto" w:after="60"/>
-        <w:ind w:left="709"/>
-        <w:jc w:val="both"/>
-      </w:pPr>
-      <w:r>
-        <w:rPr>
-          <w:rFonts w:ascii="Times New Roman" w:hAnsi="Times New Roman"/>
-          <w:b w:val="0"/>
-          <w:sz w:val="28"/>
-        </w:rPr>
-        <w:t xml:space="preserve">• </w:t>
-      </w:r>
-      <w:r>
-        <w:rPr>
-          <w:rFonts w:ascii="Times New Roman" w:hAnsi="Times New Roman"/>
-          <w:sz w:val="28"/>
-        </w:rPr>
-      </w:r>
-      <w:r>
-        <w:rPr>
-          <w:rFonts w:ascii="Times New Roman" w:hAnsi="Times New Roman"/>
-          <w:b/>
-          <w:sz w:val="28"/>
-        </w:rPr>
-        <w:t>Web / Reverse Proxy Server (Nginx):</w:t>
-      </w:r>
-      <w:r>
-        <w:rPr>
-          <w:rFonts w:ascii="Times New Roman" w:hAnsi="Times New Roman"/>
-          <w:sz w:val="28"/>
-        </w:rPr>
-        <w:t xml:space="preserve"> терминация SSL/TLS, статический кэш, защита от сетевых угроз WAF.</w:t>
-      </w:r>
-    </w:p>
-    <w:p>
-      <w:pPr>
-        <w:spacing w:line="276" w:lineRule="auto" w:after="60"/>
-        <w:ind w:left="709"/>
-        <w:jc w:val="both"/>
-      </w:pPr>
-      <w:r>
-        <w:rPr>
-          <w:rFonts w:ascii="Times New Roman" w:hAnsi="Times New Roman"/>
-          <w:b w:val="0"/>
-          <w:sz w:val="28"/>
-        </w:rPr>
-        <w:t xml:space="preserve">• </w:t>
-      </w:r>
-      <w:r>
-        <w:rPr>
-          <w:rFonts w:ascii="Times New Roman" w:hAnsi="Times New Roman"/>
-          <w:sz w:val="28"/>
-        </w:rPr>
-      </w:r>
-      <w:r>
-        <w:rPr>
-          <w:rFonts w:ascii="Times New Roman" w:hAnsi="Times New Roman"/>
-          <w:b/>
-          <w:sz w:val="28"/>
-        </w:rPr>
-        <w:t>Application Server (Python/Flask WSGI):</w:t>
-      </w:r>
-      <w:r>
-        <w:rPr>
-          <w:rFonts w:ascii="Times New Roman" w:hAnsi="Times New Roman"/>
-          <w:sz w:val="28"/>
-        </w:rPr>
-        <w:t xml:space="preserve"> исполняемая среда ядра веб-портала и кастомных модулей АНОК, пул воркеров Gunicorn.</w:t>
-      </w:r>
-    </w:p>
-    <w:p>
-      <w:pPr>
-        <w:spacing w:line="276" w:lineRule="auto" w:after="60"/>
-        <w:ind w:left="709"/>
-        <w:jc w:val="both"/>
-      </w:pPr>
-      <w:r>
-        <w:rPr>
-          <w:rFonts w:ascii="Times New Roman" w:hAnsi="Times New Roman"/>
-          <w:b w:val="0"/>
-          <w:sz w:val="28"/>
-        </w:rPr>
-        <w:t xml:space="preserve">• </w:t>
-      </w:r>
-      <w:r>
-        <w:rPr>
-          <w:rFonts w:ascii="Times New Roman" w:hAnsi="Times New Roman"/>
-          <w:sz w:val="28"/>
-        </w:rPr>
-      </w:r>
-      <w:r>
-        <w:rPr>
-          <w:rFonts w:ascii="Times New Roman" w:hAnsi="Times New Roman"/>
-          <w:b/>
-          <w:sz w:val="28"/>
-        </w:rPr>
-        <w:t>Database Server (MariaDB / SQLite):</w:t>
-      </w:r>
-      <w:r>
-        <w:rPr>
-          <w:rFonts w:ascii="Times New Roman" w:hAnsi="Times New Roman"/>
-          <w:sz w:val="28"/>
-        </w:rPr>
-        <w:t xml:space="preserve"> хранилище нормализованных данных, транзакционный журнал и журналы аудита (порт 3306 / локальный файл).</w:t>
-      </w:r>
-    </w:p>
-    <w:p>
-      <w:pPr>
-        <w:spacing w:line="276" w:lineRule="auto" w:after="60"/>
-        <w:ind w:left="709"/>
-        <w:jc w:val="both"/>
-      </w:pPr>
-      <w:r>
-        <w:rPr>
-          <w:rFonts w:ascii="Times New Roman" w:hAnsi="Times New Roman"/>
-          <w:b w:val="0"/>
-          <w:sz w:val="28"/>
-        </w:rPr>
-        <w:t xml:space="preserve">• </w:t>
-      </w:r>
-      <w:r>
-        <w:rPr>
-          <w:rFonts w:ascii="Times New Roman" w:hAnsi="Times New Roman"/>
-          <w:sz w:val="28"/>
-        </w:rPr>
-      </w:r>
-      <w:r>
-        <w:rPr>
-          <w:rFonts w:ascii="Times New Roman" w:hAnsi="Times New Roman"/>
-          <w:b/>
-          <w:sz w:val="28"/>
-        </w:rPr>
-        <w:t>File &amp; Document Storage:</w:t>
-      </w:r>
-      <w:r>
-        <w:rPr>
-          <w:rFonts w:ascii="Times New Roman" w:hAnsi="Times New Roman"/>
-          <w:sz w:val="28"/>
-        </w:rPr>
-        <w:t xml:space="preserve"> хранение сформированных отчетов в форматах PDF/Excel и протоколов валидации.</w:t>
-      </w:r>
-    </w:p>
-    <w:p>
-      <w:pPr>
-        <w:spacing w:before="240" w:after="120"/>
-        <w:jc w:val="left"/>
-      </w:pPr>
-      <w:r>
-        <w:rPr>
-          <w:rFonts w:ascii="Times New Roman" w:hAnsi="Times New Roman"/>
-          <w:b/>
-          <w:sz w:val="28"/>
-        </w:rPr>
-        <w:t>6. Структура и схема базы данных</w:t>
-      </w:r>
-    </w:p>
-    <w:p>
-      <w:pPr>
-        <w:spacing w:line="276" w:lineRule="auto" w:after="120"/>
-        <w:ind w:firstLine="709"/>
-        <w:jc w:val="both"/>
-      </w:pPr>
-      <w:r>
-        <w:rPr>
-          <w:rFonts w:ascii="Times New Roman" w:hAnsi="Times New Roman"/>
-          <w:sz w:val="28"/>
-        </w:rPr>
-        <w:t>Реляционная модель спроектирована в 3-й нормальной форме (3NF) и обеспечивает полную ссылочную целостность данных за счет внешних ключей `FOREIGN KEY` и уникальных индексов.</w:t>
+        <w:t>Рисунок 4 — Диаграмма последовательности</w:t>
       </w:r>
     </w:p>
     <w:p>
@@ -1619,1429 +437,8 @@
           <w:i/>
           <w:sz w:val="24"/>
         </w:rPr>
-        <w:t>Рисунок 5 — Схема базы данных ERD</w:t>
+        <w:t>Рисунок 5 — Схема базы данных</w:t>
       </w:r>
-    </w:p>
-    <w:p>
-      <w:pPr>
-        <w:spacing w:before="160" w:after="80"/>
-        <w:ind w:firstLine="709"/>
-        <w:jc w:val="left"/>
-      </w:pPr>
-      <w:r>
-        <w:rPr>
-          <w:rFonts w:ascii="Times New Roman" w:hAnsi="Times New Roman"/>
-          <w:b/>
-          <w:sz w:val="24"/>
-        </w:rPr>
-        <w:t>Таблица 1 — Спецификация данных</w:t>
-      </w:r>
-    </w:p>
-    <w:tbl>
-      <w:tblPr>
-        <w:tblW w:type="auto" w:w="0"/>
-        <w:jc w:val="center"/>
-        <w:tblLook w:firstColumn="1" w:firstRow="1" w:lastColumn="0" w:lastRow="0" w:noHBand="0" w:noVBand="1" w:val="04A0"/>
-        <w:tblBorders>
-          <w:top w:val="single" w:sz="4" w:space="0" w:color="CBD5E1"/>
-          <w:bottom w:val="single" w:sz="4" w:space="0" w:color="CBD5E1"/>
-          <w:insideH w:val="single" w:sz="4" w:space="0" w:color="CBD5E1"/>
-          <w:insideV w:val="single" w:sz="4" w:space="0" w:color="CBD5E1"/>
-          <w:left w:val="single" w:sz="4" w:space="0" w:color="CBD5E1"/>
-          <w:right w:val="single" w:sz="4" w:space="0" w:color="CBD5E1"/>
-        </w:tblBorders>
-      </w:tblPr>
-      <w:tblGrid>
-        <w:gridCol w:w="2339"/>
-        <w:gridCol w:w="2339"/>
-        <w:gridCol w:w="2339"/>
-        <w:gridCol w:w="2339"/>
-      </w:tblGrid>
-      <w:tr>
-        <w:tc>
-          <w:tcPr>
-            <w:tcW w:type="dxa" w:w="2339"/>
-            <w:tcMar>
-              <w:top w:w="100" w:type="dxa"/>
-              <w:bottom w:w="100" w:type="dxa"/>
-              <w:left w:w="150" w:type="dxa"/>
-              <w:right w:w="150" w:type="dxa"/>
-            </w:tcMar>
-            <w:shd w:fill="E2E8F0"/>
-          </w:tcPr>
-          <w:p>
-            <w:pPr>
-              <w:spacing w:before="40" w:after="40" w:line="252" w:lineRule="auto"/>
-              <w:jc w:val="left"/>
-            </w:pPr>
-            <w:r>
-              <w:rPr>
-                <w:rFonts w:ascii="Times New Roman" w:hAnsi="Times New Roman"/>
-                <w:b/>
-                <w:sz w:val="22"/>
-              </w:rPr>
-              <w:t>Таблица</w:t>
-            </w:r>
-          </w:p>
-        </w:tc>
-        <w:tc>
-          <w:tcPr>
-            <w:tcW w:type="dxa" w:w="2339"/>
-            <w:tcMar>
-              <w:top w:w="100" w:type="dxa"/>
-              <w:bottom w:w="100" w:type="dxa"/>
-              <w:left w:w="150" w:type="dxa"/>
-              <w:right w:w="150" w:type="dxa"/>
-            </w:tcMar>
-            <w:shd w:fill="E2E8F0"/>
-          </w:tcPr>
-          <w:p>
-            <w:pPr>
-              <w:spacing w:before="40" w:after="40" w:line="252" w:lineRule="auto"/>
-              <w:jc w:val="left"/>
-            </w:pPr>
-            <w:r>
-              <w:rPr>
-                <w:rFonts w:ascii="Times New Roman" w:hAnsi="Times New Roman"/>
-                <w:b/>
-                <w:sz w:val="22"/>
-              </w:rPr>
-              <w:t>Первичный ключ</w:t>
-            </w:r>
-          </w:p>
-        </w:tc>
-        <w:tc>
-          <w:tcPr>
-            <w:tcW w:type="dxa" w:w="2339"/>
-            <w:tcMar>
-              <w:top w:w="100" w:type="dxa"/>
-              <w:bottom w:w="100" w:type="dxa"/>
-              <w:left w:w="150" w:type="dxa"/>
-              <w:right w:w="150" w:type="dxa"/>
-            </w:tcMar>
-            <w:shd w:fill="E2E8F0"/>
-          </w:tcPr>
-          <w:p>
-            <w:pPr>
-              <w:spacing w:before="40" w:after="40" w:line="252" w:lineRule="auto"/>
-              <w:jc w:val="left"/>
-            </w:pPr>
-            <w:r>
-              <w:rPr>
-                <w:rFonts w:ascii="Times New Roman" w:hAnsi="Times New Roman"/>
-                <w:b/>
-                <w:sz w:val="22"/>
-              </w:rPr>
-              <w:t>Внешние ключи</w:t>
-            </w:r>
-          </w:p>
-        </w:tc>
-        <w:tc>
-          <w:tcPr>
-            <w:tcW w:type="dxa" w:w="2339"/>
-            <w:tcMar>
-              <w:top w:w="100" w:type="dxa"/>
-              <w:bottom w:w="100" w:type="dxa"/>
-              <w:left w:w="150" w:type="dxa"/>
-              <w:right w:w="150" w:type="dxa"/>
-            </w:tcMar>
-            <w:shd w:fill="E2E8F0"/>
-          </w:tcPr>
-          <w:p>
-            <w:pPr>
-              <w:spacing w:before="40" w:after="40" w:line="252" w:lineRule="auto"/>
-              <w:jc w:val="left"/>
-            </w:pPr>
-            <w:r>
-              <w:rPr>
-                <w:rFonts w:ascii="Times New Roman" w:hAnsi="Times New Roman"/>
-                <w:b/>
-                <w:sz w:val="22"/>
-              </w:rPr>
-              <w:t>Описание назначения сущности</w:t>
-            </w:r>
-          </w:p>
-        </w:tc>
-      </w:tr>
-      <w:tr>
-        <w:tc>
-          <w:tcPr>
-            <w:tcW w:type="dxa" w:w="2339"/>
-            <w:tcMar>
-              <w:top w:w="100" w:type="dxa"/>
-              <w:bottom w:w="100" w:type="dxa"/>
-              <w:left w:w="150" w:type="dxa"/>
-              <w:right w:w="150" w:type="dxa"/>
-            </w:tcMar>
-          </w:tcPr>
-          <w:p>
-            <w:pPr>
-              <w:spacing w:before="40" w:after="40" w:line="252" w:lineRule="auto"/>
-              <w:jc w:val="left"/>
-            </w:pPr>
-            <w:r>
-              <w:rPr>
-                <w:rFonts w:ascii="Times New Roman" w:hAnsi="Times New Roman"/>
-                <w:sz w:val="22"/>
-              </w:rPr>
-              <w:t>`roles`</w:t>
-            </w:r>
-          </w:p>
-        </w:tc>
-        <w:tc>
-          <w:tcPr>
-            <w:tcW w:type="dxa" w:w="2339"/>
-            <w:tcMar>
-              <w:top w:w="100" w:type="dxa"/>
-              <w:bottom w:w="100" w:type="dxa"/>
-              <w:left w:w="150" w:type="dxa"/>
-              <w:right w:w="150" w:type="dxa"/>
-            </w:tcMar>
-          </w:tcPr>
-          <w:p>
-            <w:pPr>
-              <w:spacing w:before="40" w:after="40" w:line="252" w:lineRule="auto"/>
-              <w:jc w:val="left"/>
-            </w:pPr>
-            <w:r>
-              <w:rPr>
-                <w:rFonts w:ascii="Times New Roman" w:hAnsi="Times New Roman"/>
-                <w:sz w:val="22"/>
-              </w:rPr>
-              <w:t>`id`</w:t>
-            </w:r>
-          </w:p>
-        </w:tc>
-        <w:tc>
-          <w:tcPr>
-            <w:tcW w:type="dxa" w:w="2339"/>
-            <w:tcMar>
-              <w:top w:w="100" w:type="dxa"/>
-              <w:bottom w:w="100" w:type="dxa"/>
-              <w:left w:w="150" w:type="dxa"/>
-              <w:right w:w="150" w:type="dxa"/>
-            </w:tcMar>
-          </w:tcPr>
-          <w:p>
-            <w:pPr>
-              <w:spacing w:before="40" w:after="40" w:line="252" w:lineRule="auto"/>
-              <w:jc w:val="left"/>
-            </w:pPr>
-            <w:r>
-              <w:rPr>
-                <w:rFonts w:ascii="Times New Roman" w:hAnsi="Times New Roman"/>
-                <w:sz w:val="22"/>
-              </w:rPr>
-              <w:t>—</w:t>
-            </w:r>
-          </w:p>
-        </w:tc>
-        <w:tc>
-          <w:tcPr>
-            <w:tcW w:type="dxa" w:w="2339"/>
-            <w:tcMar>
-              <w:top w:w="100" w:type="dxa"/>
-              <w:bottom w:w="100" w:type="dxa"/>
-              <w:left w:w="150" w:type="dxa"/>
-              <w:right w:w="150" w:type="dxa"/>
-            </w:tcMar>
-          </w:tcPr>
-          <w:p>
-            <w:pPr>
-              <w:spacing w:before="40" w:after="40" w:line="252" w:lineRule="auto"/>
-              <w:jc w:val="left"/>
-            </w:pPr>
-            <w:r>
-              <w:rPr>
-                <w:rFonts w:ascii="Times New Roman" w:hAnsi="Times New Roman"/>
-                <w:sz w:val="22"/>
-              </w:rPr>
-              <w:t>Ролевые профили пользователей (RBAC-матрица)</w:t>
-            </w:r>
-          </w:p>
-        </w:tc>
-      </w:tr>
-      <w:tr>
-        <w:tc>
-          <w:tcPr>
-            <w:tcW w:type="dxa" w:w="2339"/>
-            <w:tcMar>
-              <w:top w:w="100" w:type="dxa"/>
-              <w:bottom w:w="100" w:type="dxa"/>
-              <w:left w:w="150" w:type="dxa"/>
-              <w:right w:w="150" w:type="dxa"/>
-            </w:tcMar>
-          </w:tcPr>
-          <w:p>
-            <w:pPr>
-              <w:spacing w:before="40" w:after="40" w:line="252" w:lineRule="auto"/>
-              <w:jc w:val="left"/>
-            </w:pPr>
-            <w:r>
-              <w:rPr>
-                <w:rFonts w:ascii="Times New Roman" w:hAnsi="Times New Roman"/>
-                <w:sz w:val="22"/>
-              </w:rPr>
-              <w:t>`departments`</w:t>
-            </w:r>
-          </w:p>
-        </w:tc>
-        <w:tc>
-          <w:tcPr>
-            <w:tcW w:type="dxa" w:w="2339"/>
-            <w:tcMar>
-              <w:top w:w="100" w:type="dxa"/>
-              <w:bottom w:w="100" w:type="dxa"/>
-              <w:left w:w="150" w:type="dxa"/>
-              <w:right w:w="150" w:type="dxa"/>
-            </w:tcMar>
-          </w:tcPr>
-          <w:p>
-            <w:pPr>
-              <w:spacing w:before="40" w:after="40" w:line="252" w:lineRule="auto"/>
-              <w:jc w:val="left"/>
-            </w:pPr>
-            <w:r>
-              <w:rPr>
-                <w:rFonts w:ascii="Times New Roman" w:hAnsi="Times New Roman"/>
-                <w:sz w:val="22"/>
-              </w:rPr>
-              <w:t>`id`</w:t>
-            </w:r>
-          </w:p>
-        </w:tc>
-        <w:tc>
-          <w:tcPr>
-            <w:tcW w:type="dxa" w:w="2339"/>
-            <w:tcMar>
-              <w:top w:w="100" w:type="dxa"/>
-              <w:bottom w:w="100" w:type="dxa"/>
-              <w:left w:w="150" w:type="dxa"/>
-              <w:right w:w="150" w:type="dxa"/>
-            </w:tcMar>
-          </w:tcPr>
-          <w:p>
-            <w:pPr>
-              <w:spacing w:before="40" w:after="40" w:line="252" w:lineRule="auto"/>
-              <w:jc w:val="left"/>
-            </w:pPr>
-            <w:r>
-              <w:rPr>
-                <w:rFonts w:ascii="Times New Roman" w:hAnsi="Times New Roman"/>
-                <w:sz w:val="22"/>
-              </w:rPr>
-              <w:t>`head_user_id → users.id`</w:t>
-            </w:r>
-          </w:p>
-        </w:tc>
-        <w:tc>
-          <w:tcPr>
-            <w:tcW w:type="dxa" w:w="2339"/>
-            <w:tcMar>
-              <w:top w:w="100" w:type="dxa"/>
-              <w:bottom w:w="100" w:type="dxa"/>
-              <w:left w:w="150" w:type="dxa"/>
-              <w:right w:w="150" w:type="dxa"/>
-            </w:tcMar>
-          </w:tcPr>
-          <w:p>
-            <w:pPr>
-              <w:spacing w:before="40" w:after="40" w:line="252" w:lineRule="auto"/>
-              <w:jc w:val="left"/>
-            </w:pPr>
-            <w:r>
-              <w:rPr>
-                <w:rFonts w:ascii="Times New Roman" w:hAnsi="Times New Roman"/>
-                <w:sz w:val="22"/>
-              </w:rPr>
-              <w:t>Кафедры, факультеты и административные подразделения</w:t>
-            </w:r>
-          </w:p>
-        </w:tc>
-      </w:tr>
-      <w:tr>
-        <w:tc>
-          <w:tcPr>
-            <w:tcW w:type="dxa" w:w="2339"/>
-            <w:tcMar>
-              <w:top w:w="100" w:type="dxa"/>
-              <w:bottom w:w="100" w:type="dxa"/>
-              <w:left w:w="150" w:type="dxa"/>
-              <w:right w:w="150" w:type="dxa"/>
-            </w:tcMar>
-          </w:tcPr>
-          <w:p>
-            <w:pPr>
-              <w:spacing w:before="40" w:after="40" w:line="252" w:lineRule="auto"/>
-              <w:jc w:val="left"/>
-            </w:pPr>
-            <w:r>
-              <w:rPr>
-                <w:rFonts w:ascii="Times New Roman" w:hAnsi="Times New Roman"/>
-                <w:sz w:val="22"/>
-              </w:rPr>
-              <w:t>`users`</w:t>
-            </w:r>
-          </w:p>
-        </w:tc>
-        <w:tc>
-          <w:tcPr>
-            <w:tcW w:type="dxa" w:w="2339"/>
-            <w:tcMar>
-              <w:top w:w="100" w:type="dxa"/>
-              <w:bottom w:w="100" w:type="dxa"/>
-              <w:left w:w="150" w:type="dxa"/>
-              <w:right w:w="150" w:type="dxa"/>
-            </w:tcMar>
-          </w:tcPr>
-          <w:p>
-            <w:pPr>
-              <w:spacing w:before="40" w:after="40" w:line="252" w:lineRule="auto"/>
-              <w:jc w:val="left"/>
-            </w:pPr>
-            <w:r>
-              <w:rPr>
-                <w:rFonts w:ascii="Times New Roman" w:hAnsi="Times New Roman"/>
-                <w:sz w:val="22"/>
-              </w:rPr>
-              <w:t>`id`</w:t>
-            </w:r>
-          </w:p>
-        </w:tc>
-        <w:tc>
-          <w:tcPr>
-            <w:tcW w:type="dxa" w:w="2339"/>
-            <w:tcMar>
-              <w:top w:w="100" w:type="dxa"/>
-              <w:bottom w:w="100" w:type="dxa"/>
-              <w:left w:w="150" w:type="dxa"/>
-              <w:right w:w="150" w:type="dxa"/>
-            </w:tcMar>
-          </w:tcPr>
-          <w:p>
-            <w:pPr>
-              <w:spacing w:before="40" w:after="40" w:line="252" w:lineRule="auto"/>
-              <w:jc w:val="left"/>
-            </w:pPr>
-            <w:r>
-              <w:rPr>
-                <w:rFonts w:ascii="Times New Roman" w:hAnsi="Times New Roman"/>
-                <w:sz w:val="22"/>
-              </w:rPr>
-              <w:t>`role_id → roles.id`, `dept_id → departments.id`</w:t>
-            </w:r>
-          </w:p>
-        </w:tc>
-        <w:tc>
-          <w:tcPr>
-            <w:tcW w:type="dxa" w:w="2339"/>
-            <w:tcMar>
-              <w:top w:w="100" w:type="dxa"/>
-              <w:bottom w:w="100" w:type="dxa"/>
-              <w:left w:w="150" w:type="dxa"/>
-              <w:right w:w="150" w:type="dxa"/>
-            </w:tcMar>
-          </w:tcPr>
-          <w:p>
-            <w:pPr>
-              <w:spacing w:before="40" w:after="40" w:line="252" w:lineRule="auto"/>
-              <w:jc w:val="left"/>
-            </w:pPr>
-            <w:r>
-              <w:rPr>
-                <w:rFonts w:ascii="Times New Roman" w:hAnsi="Times New Roman"/>
-                <w:sz w:val="22"/>
-              </w:rPr>
-              <w:t>Учетные записи сотрудников университета</w:t>
-            </w:r>
-          </w:p>
-        </w:tc>
-      </w:tr>
-      <w:tr>
-        <w:tc>
-          <w:tcPr>
-            <w:tcW w:type="dxa" w:w="2339"/>
-            <w:tcMar>
-              <w:top w:w="100" w:type="dxa"/>
-              <w:bottom w:w="100" w:type="dxa"/>
-              <w:left w:w="150" w:type="dxa"/>
-              <w:right w:w="150" w:type="dxa"/>
-            </w:tcMar>
-          </w:tcPr>
-          <w:p>
-            <w:pPr>
-              <w:spacing w:before="40" w:after="40" w:line="252" w:lineRule="auto"/>
-              <w:jc w:val="left"/>
-            </w:pPr>
-            <w:r>
-              <w:rPr>
-                <w:rFonts w:ascii="Times New Roman" w:hAnsi="Times New Roman"/>
-                <w:sz w:val="22"/>
-              </w:rPr>
-              <w:t>`standards_fgos`</w:t>
-            </w:r>
-          </w:p>
-        </w:tc>
-        <w:tc>
-          <w:tcPr>
-            <w:tcW w:type="dxa" w:w="2339"/>
-            <w:tcMar>
-              <w:top w:w="100" w:type="dxa"/>
-              <w:bottom w:w="100" w:type="dxa"/>
-              <w:left w:w="150" w:type="dxa"/>
-              <w:right w:w="150" w:type="dxa"/>
-            </w:tcMar>
-          </w:tcPr>
-          <w:p>
-            <w:pPr>
-              <w:spacing w:before="40" w:after="40" w:line="252" w:lineRule="auto"/>
-              <w:jc w:val="left"/>
-            </w:pPr>
-            <w:r>
-              <w:rPr>
-                <w:rFonts w:ascii="Times New Roman" w:hAnsi="Times New Roman"/>
-                <w:sz w:val="22"/>
-              </w:rPr>
-              <w:t>`id`</w:t>
-            </w:r>
-          </w:p>
-        </w:tc>
-        <w:tc>
-          <w:tcPr>
-            <w:tcW w:type="dxa" w:w="2339"/>
-            <w:tcMar>
-              <w:top w:w="100" w:type="dxa"/>
-              <w:bottom w:w="100" w:type="dxa"/>
-              <w:left w:w="150" w:type="dxa"/>
-              <w:right w:w="150" w:type="dxa"/>
-            </w:tcMar>
-          </w:tcPr>
-          <w:p>
-            <w:pPr>
-              <w:spacing w:before="40" w:after="40" w:line="252" w:lineRule="auto"/>
-              <w:jc w:val="left"/>
-            </w:pPr>
-            <w:r>
-              <w:rPr>
-                <w:rFonts w:ascii="Times New Roman" w:hAnsi="Times New Roman"/>
-                <w:sz w:val="22"/>
-              </w:rPr>
-              <w:t>—</w:t>
-            </w:r>
-          </w:p>
-        </w:tc>
-        <w:tc>
-          <w:tcPr>
-            <w:tcW w:type="dxa" w:w="2339"/>
-            <w:tcMar>
-              <w:top w:w="100" w:type="dxa"/>
-              <w:bottom w:w="100" w:type="dxa"/>
-              <w:left w:w="150" w:type="dxa"/>
-              <w:right w:w="150" w:type="dxa"/>
-            </w:tcMar>
-          </w:tcPr>
-          <w:p>
-            <w:pPr>
-              <w:spacing w:before="40" w:after="40" w:line="252" w:lineRule="auto"/>
-              <w:jc w:val="left"/>
-            </w:pPr>
-            <w:r>
-              <w:rPr>
-                <w:rFonts w:ascii="Times New Roman" w:hAnsi="Times New Roman"/>
-                <w:sz w:val="22"/>
-              </w:rPr>
-              <w:t>Нормативные стандарты ФГОС ВО 3++ и числовые лимиты</w:t>
-            </w:r>
-          </w:p>
-        </w:tc>
-      </w:tr>
-      <w:tr>
-        <w:tc>
-          <w:tcPr>
-            <w:tcW w:type="dxa" w:w="2339"/>
-            <w:tcMar>
-              <w:top w:w="100" w:type="dxa"/>
-              <w:bottom w:w="100" w:type="dxa"/>
-              <w:left w:w="150" w:type="dxa"/>
-              <w:right w:w="150" w:type="dxa"/>
-            </w:tcMar>
-          </w:tcPr>
-          <w:p>
-            <w:pPr>
-              <w:spacing w:before="40" w:after="40" w:line="252" w:lineRule="auto"/>
-              <w:jc w:val="left"/>
-            </w:pPr>
-            <w:r>
-              <w:rPr>
-                <w:rFonts w:ascii="Times New Roman" w:hAnsi="Times New Roman"/>
-                <w:sz w:val="22"/>
-              </w:rPr>
-              <w:t>`educational_programs`</w:t>
-            </w:r>
-          </w:p>
-        </w:tc>
-        <w:tc>
-          <w:tcPr>
-            <w:tcW w:type="dxa" w:w="2339"/>
-            <w:tcMar>
-              <w:top w:w="100" w:type="dxa"/>
-              <w:bottom w:w="100" w:type="dxa"/>
-              <w:left w:w="150" w:type="dxa"/>
-              <w:right w:w="150" w:type="dxa"/>
-            </w:tcMar>
-          </w:tcPr>
-          <w:p>
-            <w:pPr>
-              <w:spacing w:before="40" w:after="40" w:line="252" w:lineRule="auto"/>
-              <w:jc w:val="left"/>
-            </w:pPr>
-            <w:r>
-              <w:rPr>
-                <w:rFonts w:ascii="Times New Roman" w:hAnsi="Times New Roman"/>
-                <w:sz w:val="22"/>
-              </w:rPr>
-              <w:t>`id`</w:t>
-            </w:r>
-          </w:p>
-        </w:tc>
-        <w:tc>
-          <w:tcPr>
-            <w:tcW w:type="dxa" w:w="2339"/>
-            <w:tcMar>
-              <w:top w:w="100" w:type="dxa"/>
-              <w:bottom w:w="100" w:type="dxa"/>
-              <w:left w:w="150" w:type="dxa"/>
-              <w:right w:w="150" w:type="dxa"/>
-            </w:tcMar>
-          </w:tcPr>
-          <w:p>
-            <w:pPr>
-              <w:spacing w:before="40" w:after="40" w:line="252" w:lineRule="auto"/>
-              <w:jc w:val="left"/>
-            </w:pPr>
-            <w:r>
-              <w:rPr>
-                <w:rFonts w:ascii="Times New Roman" w:hAnsi="Times New Roman"/>
-                <w:sz w:val="22"/>
-              </w:rPr>
-              <w:t>`fgos_id → standards_fgos.id`, `dept_id → departments.id`</w:t>
-            </w:r>
-          </w:p>
-        </w:tc>
-        <w:tc>
-          <w:tcPr>
-            <w:tcW w:type="dxa" w:w="2339"/>
-            <w:tcMar>
-              <w:top w:w="100" w:type="dxa"/>
-              <w:bottom w:w="100" w:type="dxa"/>
-              <w:left w:w="150" w:type="dxa"/>
-              <w:right w:w="150" w:type="dxa"/>
-            </w:tcMar>
-          </w:tcPr>
-          <w:p>
-            <w:pPr>
-              <w:spacing w:before="40" w:after="40" w:line="252" w:lineRule="auto"/>
-              <w:jc w:val="left"/>
-            </w:pPr>
-            <w:r>
-              <w:rPr>
-                <w:rFonts w:ascii="Times New Roman" w:hAnsi="Times New Roman"/>
-                <w:sz w:val="22"/>
-              </w:rPr>
-              <w:t>Образовательные программы бакалавриата и магистратуры</w:t>
-            </w:r>
-          </w:p>
-        </w:tc>
-      </w:tr>
-      <w:tr>
-        <w:tc>
-          <w:tcPr>
-            <w:tcW w:type="dxa" w:w="2339"/>
-            <w:tcMar>
-              <w:top w:w="100" w:type="dxa"/>
-              <w:bottom w:w="100" w:type="dxa"/>
-              <w:left w:w="150" w:type="dxa"/>
-              <w:right w:w="150" w:type="dxa"/>
-            </w:tcMar>
-          </w:tcPr>
-          <w:p>
-            <w:pPr>
-              <w:spacing w:before="40" w:after="40" w:line="252" w:lineRule="auto"/>
-              <w:jc w:val="left"/>
-            </w:pPr>
-            <w:r>
-              <w:rPr>
-                <w:rFonts w:ascii="Times New Roman" w:hAnsi="Times New Roman"/>
-                <w:sz w:val="22"/>
-              </w:rPr>
-              <w:t>`curriculums`</w:t>
-            </w:r>
-          </w:p>
-        </w:tc>
-        <w:tc>
-          <w:tcPr>
-            <w:tcW w:type="dxa" w:w="2339"/>
-            <w:tcMar>
-              <w:top w:w="100" w:type="dxa"/>
-              <w:bottom w:w="100" w:type="dxa"/>
-              <w:left w:w="150" w:type="dxa"/>
-              <w:right w:w="150" w:type="dxa"/>
-            </w:tcMar>
-          </w:tcPr>
-          <w:p>
-            <w:pPr>
-              <w:spacing w:before="40" w:after="40" w:line="252" w:lineRule="auto"/>
-              <w:jc w:val="left"/>
-            </w:pPr>
-            <w:r>
-              <w:rPr>
-                <w:rFonts w:ascii="Times New Roman" w:hAnsi="Times New Roman"/>
-                <w:sz w:val="22"/>
-              </w:rPr>
-              <w:t>`id`</w:t>
-            </w:r>
-          </w:p>
-        </w:tc>
-        <w:tc>
-          <w:tcPr>
-            <w:tcW w:type="dxa" w:w="2339"/>
-            <w:tcMar>
-              <w:top w:w="100" w:type="dxa"/>
-              <w:bottom w:w="100" w:type="dxa"/>
-              <w:left w:w="150" w:type="dxa"/>
-              <w:right w:w="150" w:type="dxa"/>
-            </w:tcMar>
-          </w:tcPr>
-          <w:p>
-            <w:pPr>
-              <w:spacing w:before="40" w:after="40" w:line="252" w:lineRule="auto"/>
-              <w:jc w:val="left"/>
-            </w:pPr>
-            <w:r>
-              <w:rPr>
-                <w:rFonts w:ascii="Times New Roman" w:hAnsi="Times New Roman"/>
-                <w:sz w:val="22"/>
-              </w:rPr>
-              <w:t>`program_id → educational_programs.id`</w:t>
-            </w:r>
-          </w:p>
-        </w:tc>
-        <w:tc>
-          <w:tcPr>
-            <w:tcW w:type="dxa" w:w="2339"/>
-            <w:tcMar>
-              <w:top w:w="100" w:type="dxa"/>
-              <w:bottom w:w="100" w:type="dxa"/>
-              <w:left w:w="150" w:type="dxa"/>
-              <w:right w:w="150" w:type="dxa"/>
-            </w:tcMar>
-          </w:tcPr>
-          <w:p>
-            <w:pPr>
-              <w:spacing w:before="40" w:after="40" w:line="252" w:lineRule="auto"/>
-              <w:jc w:val="left"/>
-            </w:pPr>
-            <w:r>
-              <w:rPr>
-                <w:rFonts w:ascii="Times New Roman" w:hAnsi="Times New Roman"/>
-                <w:sz w:val="22"/>
-              </w:rPr>
-              <w:t>Экземпляры учебных планов (версии v1.0, v1.1, статусы)</w:t>
-            </w:r>
-          </w:p>
-        </w:tc>
-      </w:tr>
-      <w:tr>
-        <w:tc>
-          <w:tcPr>
-            <w:tcW w:type="dxa" w:w="2339"/>
-            <w:tcMar>
-              <w:top w:w="100" w:type="dxa"/>
-              <w:bottom w:w="100" w:type="dxa"/>
-              <w:left w:w="150" w:type="dxa"/>
-              <w:right w:w="150" w:type="dxa"/>
-            </w:tcMar>
-          </w:tcPr>
-          <w:p>
-            <w:pPr>
-              <w:spacing w:before="40" w:after="40" w:line="252" w:lineRule="auto"/>
-              <w:jc w:val="left"/>
-            </w:pPr>
-            <w:r>
-              <w:rPr>
-                <w:rFonts w:ascii="Times New Roman" w:hAnsi="Times New Roman"/>
-                <w:sz w:val="22"/>
-              </w:rPr>
-              <w:t>`curriculum_disciplines`</w:t>
-            </w:r>
-          </w:p>
-        </w:tc>
-        <w:tc>
-          <w:tcPr>
-            <w:tcW w:type="dxa" w:w="2339"/>
-            <w:tcMar>
-              <w:top w:w="100" w:type="dxa"/>
-              <w:bottom w:w="100" w:type="dxa"/>
-              <w:left w:w="150" w:type="dxa"/>
-              <w:right w:w="150" w:type="dxa"/>
-            </w:tcMar>
-          </w:tcPr>
-          <w:p>
-            <w:pPr>
-              <w:spacing w:before="40" w:after="40" w:line="252" w:lineRule="auto"/>
-              <w:jc w:val="left"/>
-            </w:pPr>
-            <w:r>
-              <w:rPr>
-                <w:rFonts w:ascii="Times New Roman" w:hAnsi="Times New Roman"/>
-                <w:sz w:val="22"/>
-              </w:rPr>
-              <w:t>`id`</w:t>
-            </w:r>
-          </w:p>
-        </w:tc>
-        <w:tc>
-          <w:tcPr>
-            <w:tcW w:type="dxa" w:w="2339"/>
-            <w:tcMar>
-              <w:top w:w="100" w:type="dxa"/>
-              <w:bottom w:w="100" w:type="dxa"/>
-              <w:left w:w="150" w:type="dxa"/>
-              <w:right w:w="150" w:type="dxa"/>
-            </w:tcMar>
-          </w:tcPr>
-          <w:p>
-            <w:pPr>
-              <w:spacing w:before="40" w:after="40" w:line="252" w:lineRule="auto"/>
-              <w:jc w:val="left"/>
-            </w:pPr>
-            <w:r>
-              <w:rPr>
-                <w:rFonts w:ascii="Times New Roman" w:hAnsi="Times New Roman"/>
-                <w:sz w:val="22"/>
-              </w:rPr>
-              <w:t>`curriculum_id → curriculums.id`, `dept_id → departments.id`</w:t>
-            </w:r>
-          </w:p>
-        </w:tc>
-        <w:tc>
-          <w:tcPr>
-            <w:tcW w:type="dxa" w:w="2339"/>
-            <w:tcMar>
-              <w:top w:w="100" w:type="dxa"/>
-              <w:bottom w:w="100" w:type="dxa"/>
-              <w:left w:w="150" w:type="dxa"/>
-              <w:right w:w="150" w:type="dxa"/>
-            </w:tcMar>
-          </w:tcPr>
-          <w:p>
-            <w:pPr>
-              <w:spacing w:before="40" w:after="40" w:line="252" w:lineRule="auto"/>
-              <w:jc w:val="left"/>
-            </w:pPr>
-            <w:r>
-              <w:rPr>
-                <w:rFonts w:ascii="Times New Roman" w:hAnsi="Times New Roman"/>
-                <w:sz w:val="22"/>
-              </w:rPr>
-              <w:t>51 дисциплина 1–8 семестров с трудоемкостью в часах и з.е.</w:t>
-            </w:r>
-          </w:p>
-        </w:tc>
-      </w:tr>
-      <w:tr>
-        <w:tc>
-          <w:tcPr>
-            <w:tcW w:type="dxa" w:w="2339"/>
-            <w:tcMar>
-              <w:top w:w="100" w:type="dxa"/>
-              <w:bottom w:w="100" w:type="dxa"/>
-              <w:left w:w="150" w:type="dxa"/>
-              <w:right w:w="150" w:type="dxa"/>
-            </w:tcMar>
-          </w:tcPr>
-          <w:p>
-            <w:pPr>
-              <w:spacing w:before="40" w:after="40" w:line="252" w:lineRule="auto"/>
-              <w:jc w:val="left"/>
-            </w:pPr>
-            <w:r>
-              <w:rPr>
-                <w:rFonts w:ascii="Times New Roman" w:hAnsi="Times New Roman"/>
-                <w:sz w:val="22"/>
-              </w:rPr>
-              <w:t>`service_notes`</w:t>
-            </w:r>
-          </w:p>
-        </w:tc>
-        <w:tc>
-          <w:tcPr>
-            <w:tcW w:type="dxa" w:w="2339"/>
-            <w:tcMar>
-              <w:top w:w="100" w:type="dxa"/>
-              <w:bottom w:w="100" w:type="dxa"/>
-              <w:left w:w="150" w:type="dxa"/>
-              <w:right w:w="150" w:type="dxa"/>
-            </w:tcMar>
-          </w:tcPr>
-          <w:p>
-            <w:pPr>
-              <w:spacing w:before="40" w:after="40" w:line="252" w:lineRule="auto"/>
-              <w:jc w:val="left"/>
-            </w:pPr>
-            <w:r>
-              <w:rPr>
-                <w:rFonts w:ascii="Times New Roman" w:hAnsi="Times New Roman"/>
-                <w:sz w:val="22"/>
-              </w:rPr>
-              <w:t>`id`</w:t>
-            </w:r>
-          </w:p>
-        </w:tc>
-        <w:tc>
-          <w:tcPr>
-            <w:tcW w:type="dxa" w:w="2339"/>
-            <w:tcMar>
-              <w:top w:w="100" w:type="dxa"/>
-              <w:bottom w:w="100" w:type="dxa"/>
-              <w:left w:w="150" w:type="dxa"/>
-              <w:right w:w="150" w:type="dxa"/>
-            </w:tcMar>
-          </w:tcPr>
-          <w:p>
-            <w:pPr>
-              <w:spacing w:before="40" w:after="40" w:line="252" w:lineRule="auto"/>
-              <w:jc w:val="left"/>
-            </w:pPr>
-            <w:r>
-              <w:rPr>
-                <w:rFonts w:ascii="Times New Roman" w:hAnsi="Times New Roman"/>
-                <w:sz w:val="22"/>
-              </w:rPr>
-              <w:t>`curriculum_id → curriculums.id`, `user_id → users.id`</w:t>
-            </w:r>
-          </w:p>
-        </w:tc>
-        <w:tc>
-          <w:tcPr>
-            <w:tcW w:type="dxa" w:w="2339"/>
-            <w:tcMar>
-              <w:top w:w="100" w:type="dxa"/>
-              <w:bottom w:w="100" w:type="dxa"/>
-              <w:left w:w="150" w:type="dxa"/>
-              <w:right w:w="150" w:type="dxa"/>
-            </w:tcMar>
-          </w:tcPr>
-          <w:p>
-            <w:pPr>
-              <w:spacing w:before="40" w:after="40" w:line="252" w:lineRule="auto"/>
-              <w:jc w:val="left"/>
-            </w:pPr>
-            <w:r>
-              <w:rPr>
-                <w:rFonts w:ascii="Times New Roman" w:hAnsi="Times New Roman"/>
-                <w:sz w:val="22"/>
-              </w:rPr>
-              <w:t>Служебные записки на корректировку учебных планов</w:t>
-            </w:r>
-          </w:p>
-        </w:tc>
-      </w:tr>
-      <w:tr>
-        <w:tc>
-          <w:tcPr>
-            <w:tcW w:type="dxa" w:w="2339"/>
-            <w:tcMar>
-              <w:top w:w="100" w:type="dxa"/>
-              <w:bottom w:w="100" w:type="dxa"/>
-              <w:left w:w="150" w:type="dxa"/>
-              <w:right w:w="150" w:type="dxa"/>
-            </w:tcMar>
-          </w:tcPr>
-          <w:p>
-            <w:pPr>
-              <w:spacing w:before="40" w:after="40" w:line="252" w:lineRule="auto"/>
-              <w:jc w:val="left"/>
-            </w:pPr>
-            <w:r>
-              <w:rPr>
-                <w:rFonts w:ascii="Times New Roman" w:hAnsi="Times New Roman"/>
-                <w:sz w:val="22"/>
-              </w:rPr>
-              <w:t>`service_note_items`</w:t>
-            </w:r>
-          </w:p>
-        </w:tc>
-        <w:tc>
-          <w:tcPr>
-            <w:tcW w:type="dxa" w:w="2339"/>
-            <w:tcMar>
-              <w:top w:w="100" w:type="dxa"/>
-              <w:bottom w:w="100" w:type="dxa"/>
-              <w:left w:w="150" w:type="dxa"/>
-              <w:right w:w="150" w:type="dxa"/>
-            </w:tcMar>
-          </w:tcPr>
-          <w:p>
-            <w:pPr>
-              <w:spacing w:before="40" w:after="40" w:line="252" w:lineRule="auto"/>
-              <w:jc w:val="left"/>
-            </w:pPr>
-            <w:r>
-              <w:rPr>
-                <w:rFonts w:ascii="Times New Roman" w:hAnsi="Times New Roman"/>
-                <w:sz w:val="22"/>
-              </w:rPr>
-              <w:t>`id`</w:t>
-            </w:r>
-          </w:p>
-        </w:tc>
-        <w:tc>
-          <w:tcPr>
-            <w:tcW w:type="dxa" w:w="2339"/>
-            <w:tcMar>
-              <w:top w:w="100" w:type="dxa"/>
-              <w:bottom w:w="100" w:type="dxa"/>
-              <w:left w:w="150" w:type="dxa"/>
-              <w:right w:w="150" w:type="dxa"/>
-            </w:tcMar>
-          </w:tcPr>
-          <w:p>
-            <w:pPr>
-              <w:spacing w:before="40" w:after="40" w:line="252" w:lineRule="auto"/>
-              <w:jc w:val="left"/>
-            </w:pPr>
-            <w:r>
-              <w:rPr>
-                <w:rFonts w:ascii="Times New Roman" w:hAnsi="Times New Roman"/>
-                <w:sz w:val="22"/>
-              </w:rPr>
-              <w:t>`note_id → service_notes.id`, `disc_id → disciplines.id`</w:t>
-            </w:r>
-          </w:p>
-        </w:tc>
-        <w:tc>
-          <w:tcPr>
-            <w:tcW w:type="dxa" w:w="2339"/>
-            <w:tcMar>
-              <w:top w:w="100" w:type="dxa"/>
-              <w:bottom w:w="100" w:type="dxa"/>
-              <w:left w:w="150" w:type="dxa"/>
-              <w:right w:w="150" w:type="dxa"/>
-            </w:tcMar>
-          </w:tcPr>
-          <w:p>
-            <w:pPr>
-              <w:spacing w:before="40" w:after="40" w:line="252" w:lineRule="auto"/>
-              <w:jc w:val="left"/>
-            </w:pPr>
-            <w:r>
-              <w:rPr>
-                <w:rFonts w:ascii="Times New Roman" w:hAnsi="Times New Roman"/>
-                <w:sz w:val="22"/>
-              </w:rPr>
-              <w:t>Строки изменений дисциплин (JSON «Было / Стало»)</w:t>
-            </w:r>
-          </w:p>
-        </w:tc>
-      </w:tr>
-      <w:tr>
-        <w:tc>
-          <w:tcPr>
-            <w:tcW w:type="dxa" w:w="2339"/>
-            <w:tcMar>
-              <w:top w:w="100" w:type="dxa"/>
-              <w:bottom w:w="100" w:type="dxa"/>
-              <w:left w:w="150" w:type="dxa"/>
-              <w:right w:w="150" w:type="dxa"/>
-            </w:tcMar>
-          </w:tcPr>
-          <w:p>
-            <w:pPr>
-              <w:spacing w:before="40" w:after="40" w:line="252" w:lineRule="auto"/>
-              <w:jc w:val="left"/>
-            </w:pPr>
-            <w:r>
-              <w:rPr>
-                <w:rFonts w:ascii="Times New Roman" w:hAnsi="Times New Roman"/>
-                <w:sz w:val="22"/>
-              </w:rPr>
-              <w:t>`document_signatures`</w:t>
-            </w:r>
-          </w:p>
-        </w:tc>
-        <w:tc>
-          <w:tcPr>
-            <w:tcW w:type="dxa" w:w="2339"/>
-            <w:tcMar>
-              <w:top w:w="100" w:type="dxa"/>
-              <w:bottom w:w="100" w:type="dxa"/>
-              <w:left w:w="150" w:type="dxa"/>
-              <w:right w:w="150" w:type="dxa"/>
-            </w:tcMar>
-          </w:tcPr>
-          <w:p>
-            <w:pPr>
-              <w:spacing w:before="40" w:after="40" w:line="252" w:lineRule="auto"/>
-              <w:jc w:val="left"/>
-            </w:pPr>
-            <w:r>
-              <w:rPr>
-                <w:rFonts w:ascii="Times New Roman" w:hAnsi="Times New Roman"/>
-                <w:sz w:val="22"/>
-              </w:rPr>
-              <w:t>`id`</w:t>
-            </w:r>
-          </w:p>
-        </w:tc>
-        <w:tc>
-          <w:tcPr>
-            <w:tcW w:type="dxa" w:w="2339"/>
-            <w:tcMar>
-              <w:top w:w="100" w:type="dxa"/>
-              <w:bottom w:w="100" w:type="dxa"/>
-              <w:left w:w="150" w:type="dxa"/>
-              <w:right w:w="150" w:type="dxa"/>
-            </w:tcMar>
-          </w:tcPr>
-          <w:p>
-            <w:pPr>
-              <w:spacing w:before="40" w:after="40" w:line="252" w:lineRule="auto"/>
-              <w:jc w:val="left"/>
-            </w:pPr>
-            <w:r>
-              <w:rPr>
-                <w:rFonts w:ascii="Times New Roman" w:hAnsi="Times New Roman"/>
-                <w:sz w:val="22"/>
-              </w:rPr>
-              <w:t>`user_id → users.id`</w:t>
-            </w:r>
-          </w:p>
-        </w:tc>
-        <w:tc>
-          <w:tcPr>
-            <w:tcW w:type="dxa" w:w="2339"/>
-            <w:tcMar>
-              <w:top w:w="100" w:type="dxa"/>
-              <w:bottom w:w="100" w:type="dxa"/>
-              <w:left w:w="150" w:type="dxa"/>
-              <w:right w:w="150" w:type="dxa"/>
-            </w:tcMar>
-          </w:tcPr>
-          <w:p>
-            <w:pPr>
-              <w:spacing w:before="40" w:after="40" w:line="252" w:lineRule="auto"/>
-              <w:jc w:val="left"/>
-            </w:pPr>
-            <w:r>
-              <w:rPr>
-                <w:rFonts w:ascii="Times New Roman" w:hAnsi="Times New Roman"/>
-                <w:sz w:val="22"/>
-              </w:rPr>
-              <w:t>Журнал электронного визирования со слепком SHA-256</w:t>
-            </w:r>
-          </w:p>
-        </w:tc>
-      </w:tr>
-      <w:tr>
-        <w:tc>
-          <w:tcPr>
-            <w:tcW w:type="dxa" w:w="2339"/>
-            <w:tcMar>
-              <w:top w:w="100" w:type="dxa"/>
-              <w:bottom w:w="100" w:type="dxa"/>
-              <w:left w:w="150" w:type="dxa"/>
-              <w:right w:w="150" w:type="dxa"/>
-            </w:tcMar>
-          </w:tcPr>
-          <w:p>
-            <w:pPr>
-              <w:spacing w:before="40" w:after="40" w:line="252" w:lineRule="auto"/>
-              <w:jc w:val="left"/>
-            </w:pPr>
-            <w:r>
-              <w:rPr>
-                <w:rFonts w:ascii="Times New Roman" w:hAnsi="Times New Roman"/>
-                <w:sz w:val="22"/>
-              </w:rPr>
-              <w:t>`audit_logs`</w:t>
-            </w:r>
-          </w:p>
-        </w:tc>
-        <w:tc>
-          <w:tcPr>
-            <w:tcW w:type="dxa" w:w="2339"/>
-            <w:tcMar>
-              <w:top w:w="100" w:type="dxa"/>
-              <w:bottom w:w="100" w:type="dxa"/>
-              <w:left w:w="150" w:type="dxa"/>
-              <w:right w:w="150" w:type="dxa"/>
-            </w:tcMar>
-          </w:tcPr>
-          <w:p>
-            <w:pPr>
-              <w:spacing w:before="40" w:after="40" w:line="252" w:lineRule="auto"/>
-              <w:jc w:val="left"/>
-            </w:pPr>
-            <w:r>
-              <w:rPr>
-                <w:rFonts w:ascii="Times New Roman" w:hAnsi="Times New Roman"/>
-                <w:sz w:val="22"/>
-              </w:rPr>
-              <w:t>`id`</w:t>
-            </w:r>
-          </w:p>
-        </w:tc>
-        <w:tc>
-          <w:tcPr>
-            <w:tcW w:type="dxa" w:w="2339"/>
-            <w:tcMar>
-              <w:top w:w="100" w:type="dxa"/>
-              <w:bottom w:w="100" w:type="dxa"/>
-              <w:left w:w="150" w:type="dxa"/>
-              <w:right w:w="150" w:type="dxa"/>
-            </w:tcMar>
-          </w:tcPr>
-          <w:p>
-            <w:pPr>
-              <w:spacing w:before="40" w:after="40" w:line="252" w:lineRule="auto"/>
-              <w:jc w:val="left"/>
-            </w:pPr>
-            <w:r>
-              <w:rPr>
-                <w:rFonts w:ascii="Times New Roman" w:hAnsi="Times New Roman"/>
-                <w:sz w:val="22"/>
-              </w:rPr>
-              <w:t>`user_id → users.id`</w:t>
-            </w:r>
-          </w:p>
-        </w:tc>
-        <w:tc>
-          <w:tcPr>
-            <w:tcW w:type="dxa" w:w="2339"/>
-            <w:tcMar>
-              <w:top w:w="100" w:type="dxa"/>
-              <w:bottom w:w="100" w:type="dxa"/>
-              <w:left w:w="150" w:type="dxa"/>
-              <w:right w:w="150" w:type="dxa"/>
-            </w:tcMar>
-          </w:tcPr>
-          <w:p>
-            <w:pPr>
-              <w:spacing w:before="40" w:after="40" w:line="252" w:lineRule="auto"/>
-              <w:jc w:val="left"/>
-            </w:pPr>
-            <w:r>
-              <w:rPr>
-                <w:rFonts w:ascii="Times New Roman" w:hAnsi="Times New Roman"/>
-                <w:sz w:val="22"/>
-              </w:rPr>
-              <w:t>Журнал безопасности и фиксация критических действий</w:t>
-            </w:r>
-          </w:p>
-        </w:tc>
-      </w:tr>
-      <w:tr>
-        <w:tc>
-          <w:tcPr>
-            <w:tcW w:type="dxa" w:w="2339"/>
-            <w:tcMar>
-              <w:top w:w="100" w:type="dxa"/>
-              <w:bottom w:w="100" w:type="dxa"/>
-              <w:left w:w="150" w:type="dxa"/>
-              <w:right w:w="150" w:type="dxa"/>
-            </w:tcMar>
-          </w:tcPr>
-          <w:p>
-            <w:pPr>
-              <w:spacing w:before="40" w:after="40" w:line="252" w:lineRule="auto"/>
-              <w:jc w:val="left"/>
-            </w:pPr>
-            <w:r>
-              <w:rPr>
-                <w:rFonts w:ascii="Times New Roman" w:hAnsi="Times New Roman"/>
-                <w:sz w:val="22"/>
-              </w:rPr>
-              <w:t>`competencies`</w:t>
-            </w:r>
-          </w:p>
-        </w:tc>
-        <w:tc>
-          <w:tcPr>
-            <w:tcW w:type="dxa" w:w="2339"/>
-            <w:tcMar>
-              <w:top w:w="100" w:type="dxa"/>
-              <w:bottom w:w="100" w:type="dxa"/>
-              <w:left w:w="150" w:type="dxa"/>
-              <w:right w:w="150" w:type="dxa"/>
-            </w:tcMar>
-          </w:tcPr>
-          <w:p>
-            <w:pPr>
-              <w:spacing w:before="40" w:after="40" w:line="252" w:lineRule="auto"/>
-              <w:jc w:val="left"/>
-            </w:pPr>
-            <w:r>
-              <w:rPr>
-                <w:rFonts w:ascii="Times New Roman" w:hAnsi="Times New Roman"/>
-                <w:sz w:val="22"/>
-              </w:rPr>
-              <w:t>`id`</w:t>
-            </w:r>
-          </w:p>
-        </w:tc>
-        <w:tc>
-          <w:tcPr>
-            <w:tcW w:type="dxa" w:w="2339"/>
-            <w:tcMar>
-              <w:top w:w="100" w:type="dxa"/>
-              <w:bottom w:w="100" w:type="dxa"/>
-              <w:left w:w="150" w:type="dxa"/>
-              <w:right w:w="150" w:type="dxa"/>
-            </w:tcMar>
-          </w:tcPr>
-          <w:p>
-            <w:pPr>
-              <w:spacing w:before="40" w:after="40" w:line="252" w:lineRule="auto"/>
-              <w:jc w:val="left"/>
-            </w:pPr>
-            <w:r>
-              <w:rPr>
-                <w:rFonts w:ascii="Times New Roman" w:hAnsi="Times New Roman"/>
-                <w:sz w:val="22"/>
-              </w:rPr>
-              <w:t>`standard_id → standards_fgos.id`</w:t>
-            </w:r>
-          </w:p>
-        </w:tc>
-        <w:tc>
-          <w:tcPr>
-            <w:tcW w:type="dxa" w:w="2339"/>
-            <w:tcMar>
-              <w:top w:w="100" w:type="dxa"/>
-              <w:bottom w:w="100" w:type="dxa"/>
-              <w:left w:w="150" w:type="dxa"/>
-              <w:right w:w="150" w:type="dxa"/>
-            </w:tcMar>
-          </w:tcPr>
-          <w:p>
-            <w:pPr>
-              <w:spacing w:before="40" w:after="40" w:line="252" w:lineRule="auto"/>
-              <w:jc w:val="left"/>
-            </w:pPr>
-            <w:r>
-              <w:rPr>
-                <w:rFonts w:ascii="Times New Roman" w:hAnsi="Times New Roman"/>
-                <w:sz w:val="22"/>
-              </w:rPr>
-              <w:t>Справочник универсальных, общепрофессиональных и проф. компетенций</w:t>
-            </w:r>
-          </w:p>
-        </w:tc>
-      </w:tr>
-      <w:tr>
-        <w:tc>
-          <w:tcPr>
-            <w:tcW w:type="dxa" w:w="2339"/>
-            <w:tcMar>
-              <w:top w:w="100" w:type="dxa"/>
-              <w:bottom w:w="100" w:type="dxa"/>
-              <w:left w:w="150" w:type="dxa"/>
-              <w:right w:w="150" w:type="dxa"/>
-            </w:tcMar>
-          </w:tcPr>
-          <w:p>
-            <w:pPr>
-              <w:spacing w:before="40" w:after="40" w:line="252" w:lineRule="auto"/>
-              <w:jc w:val="left"/>
-            </w:pPr>
-            <w:r>
-              <w:rPr>
-                <w:rFonts w:ascii="Times New Roman" w:hAnsi="Times New Roman"/>
-                <w:sz w:val="22"/>
-              </w:rPr>
-              <w:t>`announcements`</w:t>
-            </w:r>
-          </w:p>
-        </w:tc>
-        <w:tc>
-          <w:tcPr>
-            <w:tcW w:type="dxa" w:w="2339"/>
-            <w:tcMar>
-              <w:top w:w="100" w:type="dxa"/>
-              <w:bottom w:w="100" w:type="dxa"/>
-              <w:left w:w="150" w:type="dxa"/>
-              <w:right w:w="150" w:type="dxa"/>
-            </w:tcMar>
-          </w:tcPr>
-          <w:p>
-            <w:pPr>
-              <w:spacing w:before="40" w:after="40" w:line="252" w:lineRule="auto"/>
-              <w:jc w:val="left"/>
-            </w:pPr>
-            <w:r>
-              <w:rPr>
-                <w:rFonts w:ascii="Times New Roman" w:hAnsi="Times New Roman"/>
-                <w:sz w:val="22"/>
-              </w:rPr>
-              <w:t>`id`</w:t>
-            </w:r>
-          </w:p>
-        </w:tc>
-        <w:tc>
-          <w:tcPr>
-            <w:tcW w:type="dxa" w:w="2339"/>
-            <w:tcMar>
-              <w:top w:w="100" w:type="dxa"/>
-              <w:bottom w:w="100" w:type="dxa"/>
-              <w:left w:w="150" w:type="dxa"/>
-              <w:right w:w="150" w:type="dxa"/>
-            </w:tcMar>
-          </w:tcPr>
-          <w:p>
-            <w:pPr>
-              <w:spacing w:before="40" w:after="40" w:line="252" w:lineRule="auto"/>
-              <w:jc w:val="left"/>
-            </w:pPr>
-            <w:r>
-              <w:rPr>
-                <w:rFonts w:ascii="Times New Roman" w:hAnsi="Times New Roman"/>
-                <w:sz w:val="22"/>
-              </w:rPr>
-              <w:t>`author_id → users.id`</w:t>
-            </w:r>
-          </w:p>
-        </w:tc>
-        <w:tc>
-          <w:tcPr>
-            <w:tcW w:type="dxa" w:w="2339"/>
-            <w:tcMar>
-              <w:top w:w="100" w:type="dxa"/>
-              <w:bottom w:w="100" w:type="dxa"/>
-              <w:left w:w="150" w:type="dxa"/>
-              <w:right w:w="150" w:type="dxa"/>
-            </w:tcMar>
-          </w:tcPr>
-          <w:p>
-            <w:pPr>
-              <w:spacing w:before="40" w:after="40" w:line="252" w:lineRule="auto"/>
-              <w:jc w:val="left"/>
-            </w:pPr>
-            <w:r>
-              <w:rPr>
-                <w:rFonts w:ascii="Times New Roman" w:hAnsi="Times New Roman"/>
-                <w:sz w:val="22"/>
-              </w:rPr>
-              <w:t>Нормативные объявления и графики заседаний АНОК</w:t>
-            </w:r>
-          </w:p>
-        </w:tc>
-      </w:tr>
-    </w:tbl>
-    <w:p>
-      <w:pPr>
-        <w:spacing w:after="120"/>
-      </w:pPr>
     </w:p>
     <w:p>
       <w:pPr>
@@ -3054,21 +451,7 @@
           <w:b/>
           <w:sz w:val="28"/>
         </w:rPr>
-        <w:t>7. Примеры работы установленного и настроенного ПО</w:t>
-      </w:r>
-    </w:p>
-    <w:p>
-      <w:pPr>
-        <w:spacing w:before="160" w:after="80"/>
-        <w:jc w:val="left"/>
-      </w:pPr>
-      <w:r>
-        <w:rPr>
-          <w:rFonts w:ascii="Times New Roman" w:hAnsi="Times New Roman"/>
-          <w:b/>
-          <w:sz w:val="26"/>
-        </w:rPr>
-        <w:t>7.1. Главная панель управления (Dashboard) и реестр планов</w:t>
+        <w:t>3. База данных</w:t>
       </w:r>
     </w:p>
     <w:p>
@@ -3082,75 +465,158 @@
           <w:rFonts w:ascii="Times New Roman" w:hAnsi="Times New Roman"/>
           <w:sz w:val="28"/>
         </w:rPr>
-        <w:t>Отображение сводной статистики, активных документов и реестра утвержденных учебных планов.</w:t>
+        <w:t>В базе предусмотрены таблицы ролей, пользователей, подразделений, стандартов ФГОС, образовательных программ, учебных планов, дисциплин, служебных записок, согласований, компетенций, объявлений и аудита. Схема находится в `portal/database/schema.sql`, демонстрационные записи — в `portal/database/seed.sql`.</w:t>
       </w:r>
     </w:p>
     <w:p>
       <w:pPr>
-        <w:spacing w:before="200" w:after="80"/>
-        <w:jc w:val="center"/>
-      </w:pPr>
-      <w:r>
-        <w:drawing>
-          <wp:inline xmlns:a="http://schemas.openxmlformats.org/drawingml/2006/main" xmlns:pic="http://schemas.openxmlformats.org/drawingml/2006/picture">
-            <wp:extent cx="5760000" cy="3948679"/>
-            <wp:docPr id="6" name="Picture 6"/>
-            <wp:cNvGraphicFramePr>
-              <a:graphicFrameLocks noChangeAspect="1"/>
-            </wp:cNvGraphicFramePr>
-            <a:graphic>
-              <a:graphicData uri="http://schemas.openxmlformats.org/drawingml/2006/picture">
-                <pic:pic>
-                  <pic:nvPicPr>
-                    <pic:cNvPr id="0" name="screen_dashboard.png"/>
-                    <pic:cNvPicPr/>
-                  </pic:nvPicPr>
-                  <pic:blipFill>
-                    <a:blip r:embed="rId15"/>
-                    <a:stretch>
-                      <a:fillRect/>
-                    </a:stretch>
-                  </pic:blipFill>
-                  <pic:spPr>
-                    <a:xfrm>
-                      <a:off x="0" y="0"/>
-                      <a:ext cx="5760000" cy="3948679"/>
-                    </a:xfrm>
-                    <a:prstGeom prst="rect"/>
-                  </pic:spPr>
-                </pic:pic>
-              </a:graphicData>
-            </a:graphic>
-          </wp:inline>
-        </w:drawing>
-      </w:r>
-    </w:p>
-    <w:p>
-      <w:pPr>
-        <w:spacing w:before="80" w:after="240"/>
-        <w:jc w:val="center"/>
-      </w:pPr>
-      <w:r>
-        <w:rPr>
-          <w:rFonts w:ascii="Times New Roman" w:hAnsi="Times New Roman"/>
-          <w:i/>
-          <w:sz w:val="24"/>
-        </w:rPr>
-        <w:t>Рисунок 6 — Интерфейс Dashboard</w:t>
-      </w:r>
-    </w:p>
-    <w:p>
-      <w:pPr>
-        <w:spacing w:before="160" w:after="80"/>
+        <w:spacing w:before="240" w:after="120"/>
         <w:jc w:val="left"/>
       </w:pPr>
       <w:r>
         <w:rPr>
           <w:rFonts w:ascii="Times New Roman" w:hAnsi="Times New Roman"/>
           <w:b/>
-          <w:sz w:val="26"/>
+          <w:sz w:val="28"/>
         </w:rPr>
-        <w:t>7.2. Просмотр и редактирование структуры учебного плана</w:t>
+        <w:t>4. Развёртывание</w:t>
+      </w:r>
+    </w:p>
+    <w:p>
+      <w:pPr>
+        <w:spacing w:line="276" w:lineRule="auto" w:after="60"/>
+        <w:ind w:left="709"/>
+        <w:jc w:val="both"/>
+      </w:pPr>
+      <w:r>
+        <w:rPr>
+          <w:rFonts w:ascii="Times New Roman" w:hAnsi="Times New Roman"/>
+          <w:b/>
+          <w:sz w:val="28"/>
+        </w:rPr>
+        <w:t xml:space="preserve">1. </w:t>
+      </w:r>
+      <w:r>
+        <w:rPr>
+          <w:rFonts w:ascii="Times New Roman" w:hAnsi="Times New Roman"/>
+          <w:sz w:val="28"/>
+        </w:rPr>
+        <w:t>Создать базу `anok_portal` в MySQL/MariaDB.</w:t>
+      </w:r>
+    </w:p>
+    <w:p>
+      <w:pPr>
+        <w:spacing w:line="276" w:lineRule="auto" w:after="60"/>
+        <w:ind w:left="709"/>
+        <w:jc w:val="both"/>
+      </w:pPr>
+      <w:r>
+        <w:rPr>
+          <w:rFonts w:ascii="Times New Roman" w:hAnsi="Times New Roman"/>
+          <w:b/>
+          <w:sz w:val="28"/>
+        </w:rPr>
+        <w:t xml:space="preserve">2. </w:t>
+      </w:r>
+      <w:r>
+        <w:rPr>
+          <w:rFonts w:ascii="Times New Roman" w:hAnsi="Times New Roman"/>
+          <w:sz w:val="28"/>
+        </w:rPr>
+        <w:t>Выполнить `portal/database/schema.sql`.</w:t>
+      </w:r>
+    </w:p>
+    <w:p>
+      <w:pPr>
+        <w:spacing w:line="276" w:lineRule="auto" w:after="60"/>
+        <w:ind w:left="709"/>
+        <w:jc w:val="both"/>
+      </w:pPr>
+      <w:r>
+        <w:rPr>
+          <w:rFonts w:ascii="Times New Roman" w:hAnsi="Times New Roman"/>
+          <w:b/>
+          <w:sz w:val="28"/>
+        </w:rPr>
+        <w:t xml:space="preserve">3. </w:t>
+      </w:r>
+      <w:r>
+        <w:rPr>
+          <w:rFonts w:ascii="Times New Roman" w:hAnsi="Times New Roman"/>
+          <w:sz w:val="28"/>
+        </w:rPr>
+        <w:t>Выполнить `portal/database/seed.sql`.</w:t>
+      </w:r>
+    </w:p>
+    <w:p>
+      <w:pPr>
+        <w:spacing w:line="276" w:lineRule="auto" w:after="60"/>
+        <w:ind w:left="709"/>
+        <w:jc w:val="both"/>
+      </w:pPr>
+      <w:r>
+        <w:rPr>
+          <w:rFonts w:ascii="Times New Roman" w:hAnsi="Times New Roman"/>
+          <w:b/>
+          <w:sz w:val="28"/>
+        </w:rPr>
+        <w:t xml:space="preserve">4. </w:t>
+      </w:r>
+      <w:r>
+        <w:rPr>
+          <w:rFonts w:ascii="Times New Roman" w:hAnsi="Times New Roman"/>
+          <w:sz w:val="28"/>
+        </w:rPr>
+        <w:t>Указать переменные `DB_HOST`, `DB_PORT`, `DB_NAME`, `DB_USER`, `DB_PASSWORD`.</w:t>
+      </w:r>
+    </w:p>
+    <w:p>
+      <w:pPr>
+        <w:spacing w:line="276" w:lineRule="auto" w:after="60"/>
+        <w:ind w:left="709"/>
+        <w:jc w:val="both"/>
+      </w:pPr>
+      <w:r>
+        <w:rPr>
+          <w:rFonts w:ascii="Times New Roman" w:hAnsi="Times New Roman"/>
+          <w:b/>
+          <w:sz w:val="28"/>
+        </w:rPr>
+        <w:t xml:space="preserve">5. </w:t>
+      </w:r>
+      <w:r>
+        <w:rPr>
+          <w:rFonts w:ascii="Times New Roman" w:hAnsi="Times New Roman"/>
+          <w:sz w:val="28"/>
+        </w:rPr>
+        <w:t>Запустить PHP-сервер:</w:t>
+      </w:r>
+    </w:p>
+    <w:p>
+      <w:pPr>
+        <w:spacing w:before="120" w:after="120"/>
+        <w:ind w:left="567"/>
+      </w:pPr>
+      <w:r>
+        <w:rPr>
+          <w:rFonts w:ascii="Courier New" w:hAnsi="Courier New"/>
+          <w:sz w:val="20"/>
+        </w:rPr>
+        <w:t>php -S 127.0.0.1:8000 -t portal</w:t>
+      </w:r>
+    </w:p>
+    <w:p>
+      <w:pPr>
+        <w:spacing w:before="240" w:after="120"/>
+        <w:jc w:val="left"/>
+      </w:pPr>
+      <w:r>
+        <w:rPr>
+          <w:rFonts w:ascii="Times New Roman" w:hAnsi="Times New Roman"/>
+          <w:b/>
+          <w:sz w:val="28"/>
+        </w:rPr>
+        <w:t>5. Примеры работы</w:t>
       </w:r>
     </w:p>
     <w:p>
@@ -3164,75 +630,21 @@
           <w:rFonts w:ascii="Times New Roman" w:hAnsi="Times New Roman"/>
           <w:sz w:val="28"/>
         </w:rPr>
-        <w:t>Детальная таблица дисциплин по семестрам 1–8 с распределением часов, зачетных единиц и форм контроля.</w:t>
+        <w:t>В приложении доступны сводная панель, учебные планы, просмотр дисциплин по семестрам, стандарты ФГОС, программы, подразделения, компетенции, служебные записки, согласование, объявления и аудит.</w:t>
       </w:r>
     </w:p>
     <w:p>
       <w:pPr>
-        <w:spacing w:before="200" w:after="80"/>
-        <w:jc w:val="center"/>
-      </w:pPr>
-      <w:r>
-        <w:drawing>
-          <wp:inline xmlns:a="http://schemas.openxmlformats.org/drawingml/2006/main" xmlns:pic="http://schemas.openxmlformats.org/drawingml/2006/picture">
-            <wp:extent cx="5760000" cy="3948679"/>
-            <wp:docPr id="7" name="Picture 7"/>
-            <wp:cNvGraphicFramePr>
-              <a:graphicFrameLocks noChangeAspect="1"/>
-            </wp:cNvGraphicFramePr>
-            <a:graphic>
-              <a:graphicData uri="http://schemas.openxmlformats.org/drawingml/2006/picture">
-                <pic:pic>
-                  <pic:nvPicPr>
-                    <pic:cNvPr id="0" name="screen_plan_grid.png"/>
-                    <pic:cNvPicPr/>
-                  </pic:nvPicPr>
-                  <pic:blipFill>
-                    <a:blip r:embed="rId16"/>
-                    <a:stretch>
-                      <a:fillRect/>
-                    </a:stretch>
-                  </pic:blipFill>
-                  <pic:spPr>
-                    <a:xfrm>
-                      <a:off x="0" y="0"/>
-                      <a:ext cx="5760000" cy="3948679"/>
-                    </a:xfrm>
-                    <a:prstGeom prst="rect"/>
-                  </pic:spPr>
-                </pic:pic>
-              </a:graphicData>
-            </a:graphic>
-          </wp:inline>
-        </w:drawing>
-      </w:r>
-    </w:p>
-    <w:p>
-      <w:pPr>
-        <w:spacing w:before="80" w:after="240"/>
-        <w:jc w:val="center"/>
-      </w:pPr>
-      <w:r>
-        <w:rPr>
-          <w:rFonts w:ascii="Times New Roman" w:hAnsi="Times New Roman"/>
-          <w:i/>
-          <w:sz w:val="24"/>
-        </w:rPr>
-        <w:t>Рисунок 7 — Интерфейс сетки плана</w:t>
-      </w:r>
-    </w:p>
-    <w:p>
-      <w:pPr>
-        <w:spacing w:before="160" w:after="80"/>
+        <w:spacing w:before="240" w:after="120"/>
         <w:jc w:val="left"/>
       </w:pPr>
       <w:r>
         <w:rPr>
           <w:rFonts w:ascii="Times New Roman" w:hAnsi="Times New Roman"/>
           <w:b/>
-          <w:sz w:val="26"/>
+          <w:sz w:val="28"/>
         </w:rPr>
-        <w:t>7.3. Модуль автоматизированной экспертизы ФГОС 3++</w:t>
+        <w:t>Заключение</w:t>
       </w:r>
     </w:p>
     <w:p>
@@ -3246,171 +658,7 @@
           <w:rFonts w:ascii="Times New Roman" w:hAnsi="Times New Roman"/>
           <w:sz w:val="28"/>
         </w:rPr>
-        <w:t>Автоматическая проверка контрольных соотношений (240 з.е., баланс блоков, ограничения сессий).</w:t>
-      </w:r>
-    </w:p>
-    <w:p>
-      <w:pPr>
-        <w:spacing w:before="200" w:after="80"/>
-        <w:jc w:val="center"/>
-      </w:pPr>
-      <w:r>
-        <w:drawing>
-          <wp:inline xmlns:a="http://schemas.openxmlformats.org/drawingml/2006/main" xmlns:pic="http://schemas.openxmlformats.org/drawingml/2006/picture">
-            <wp:extent cx="5760000" cy="3948679"/>
-            <wp:docPr id="8" name="Picture 8"/>
-            <wp:cNvGraphicFramePr>
-              <a:graphicFrameLocks noChangeAspect="1"/>
-            </wp:cNvGraphicFramePr>
-            <a:graphic>
-              <a:graphicData uri="http://schemas.openxmlformats.org/drawingml/2006/picture">
-                <pic:pic>
-                  <pic:nvPicPr>
-                    <pic:cNvPr id="0" name="screen_fgos_validation.png"/>
-                    <pic:cNvPicPr/>
-                  </pic:nvPicPr>
-                  <pic:blipFill>
-                    <a:blip r:embed="rId17"/>
-                    <a:stretch>
-                      <a:fillRect/>
-                    </a:stretch>
-                  </pic:blipFill>
-                  <pic:spPr>
-                    <a:xfrm>
-                      <a:off x="0" y="0"/>
-                      <a:ext cx="5760000" cy="3948679"/>
-                    </a:xfrm>
-                    <a:prstGeom prst="rect"/>
-                  </pic:spPr>
-                </pic:pic>
-              </a:graphicData>
-            </a:graphic>
-          </wp:inline>
-        </w:drawing>
-      </w:r>
-    </w:p>
-    <w:p>
-      <w:pPr>
-        <w:spacing w:before="80" w:after="240"/>
-        <w:jc w:val="center"/>
-      </w:pPr>
-      <w:r>
-        <w:rPr>
-          <w:rFonts w:ascii="Times New Roman" w:hAnsi="Times New Roman"/>
-          <w:i/>
-          <w:sz w:val="24"/>
-        </w:rPr>
-        <w:t>Рисунок 8 — Интерфейс валидации ФГОС</w:t>
-      </w:r>
-    </w:p>
-    <w:p>
-      <w:pPr>
-        <w:spacing w:before="160" w:after="80"/>
-        <w:jc w:val="left"/>
-      </w:pPr>
-      <w:r>
-        <w:rPr>
-          <w:rFonts w:ascii="Times New Roman" w:hAnsi="Times New Roman"/>
-          <w:b/>
-          <w:sz w:val="26"/>
-        </w:rPr>
-        <w:t>7.4. Модуль служебных записок на изменение УП</w:t>
-      </w:r>
-    </w:p>
-    <w:p>
-      <w:pPr>
-        <w:spacing w:line="276" w:lineRule="auto" w:after="120"/>
-        <w:ind w:firstLine="709"/>
-        <w:jc w:val="both"/>
-      </w:pPr>
-      <w:r>
-        <w:rPr>
-          <w:rFonts w:ascii="Times New Roman" w:hAnsi="Times New Roman"/>
-          <w:sz w:val="28"/>
-        </w:rPr>
-        <w:t>Электронное согласование служебных записок до начала семестра с протоколом «Было» / «Стало» и внесением правок в АНОК.</w:t>
-      </w:r>
-    </w:p>
-    <w:p>
-      <w:pPr>
-        <w:spacing w:before="200" w:after="80"/>
-        <w:jc w:val="center"/>
-      </w:pPr>
-      <w:r>
-        <w:drawing>
-          <wp:inline xmlns:a="http://schemas.openxmlformats.org/drawingml/2006/main" xmlns:pic="http://schemas.openxmlformats.org/drawingml/2006/picture">
-            <wp:extent cx="5760000" cy="3948679"/>
-            <wp:docPr id="9" name="Picture 9"/>
-            <wp:cNvGraphicFramePr>
-              <a:graphicFrameLocks noChangeAspect="1"/>
-            </wp:cNvGraphicFramePr>
-            <a:graphic>
-              <a:graphicData uri="http://schemas.openxmlformats.org/drawingml/2006/picture">
-                <pic:pic>
-                  <pic:nvPicPr>
-                    <pic:cNvPr id="0" name="screen_service_notes.png"/>
-                    <pic:cNvPicPr/>
-                  </pic:nvPicPr>
-                  <pic:blipFill>
-                    <a:blip r:embed="rId18"/>
-                    <a:stretch>
-                      <a:fillRect/>
-                    </a:stretch>
-                  </pic:blipFill>
-                  <pic:spPr>
-                    <a:xfrm>
-                      <a:off x="0" y="0"/>
-                      <a:ext cx="5760000" cy="3948679"/>
-                    </a:xfrm>
-                    <a:prstGeom prst="rect"/>
-                  </pic:spPr>
-                </pic:pic>
-              </a:graphicData>
-            </a:graphic>
-          </wp:inline>
-        </w:drawing>
-      </w:r>
-    </w:p>
-    <w:p>
-      <w:pPr>
-        <w:spacing w:before="80" w:after="240"/>
-        <w:jc w:val="center"/>
-      </w:pPr>
-      <w:r>
-        <w:rPr>
-          <w:rFonts w:ascii="Times New Roman" w:hAnsi="Times New Roman"/>
-          <w:i/>
-          <w:sz w:val="24"/>
-        </w:rPr>
-        <w:t>Рисунок 9 — Интерфейс служебных записок</w:t>
-      </w:r>
-    </w:p>
-    <w:p>
-      <w:pPr>
-        <w:spacing w:before="240" w:after="120"/>
-        <w:jc w:val="left"/>
-      </w:pPr>
-      <w:r>
-        <w:rPr>
-          <w:rFonts w:ascii="Times New Roman" w:hAnsi="Times New Roman"/>
-          <w:b/>
-          <w:sz w:val="28"/>
-        </w:rPr>
-        <w:t>8. Заключение к лабораторной работе № 2</w:t>
-      </w:r>
-    </w:p>
-    <w:p>
-      <w:pPr>
-        <w:spacing w:line="276" w:lineRule="auto" w:after="120"/>
-        <w:ind w:firstLine="709"/>
-        <w:jc w:val="both"/>
-      </w:pPr>
-      <w:r>
-        <w:rPr>
-          <w:rFonts w:ascii="Times New Roman" w:hAnsi="Times New Roman"/>
-          <w:sz w:val="28"/>
-        </w:rPr>
-        <w:t>В ходе выполнения работы спроектирована полная архитектура корпоративного портала университета (модуль АНОК). Разработаны 4 UML-диаграммы (классов, последовательности, компонентов, развертывания), создана нормализованная схема базы данных из 13 таблиц и развернут действующий прототип веб-портала с демонстрацией ключевых пользовательских сценариев.</w:t>
+        <w:t>Подготовлены диаграммы, MySQL/MariaDB-схема и PHP-приложение с инструкцией развертывания.</w:t>
       </w:r>
     </w:p>
     <w:sectPr>

</xml_diff>